<commit_message>
Fix repository Prettier gate and document PR workflow
</commit_message>
<xml_diff>
--- a/architecture/ContractOps-项目更新记录.docx
+++ b/architecture/ContractOps-项目更新记录.docx
@@ -218,7 +218,7 @@
                 <w:color w:val="000000"/>
                 <w:sz w:val="19"/>
               </w:rPr>
-              <w:t>0.4</w:t>
+              <w:t>0.5</w:t>
             </w:r>
           </w:p>
         </w:tc>
@@ -273,7 +273,7 @@
                 <w:color w:val="000000"/>
                 <w:sz w:val="19"/>
               </w:rPr>
-              <w:t>2026 年 9 月 25 日</w:t>
+              <w:t>2026 年 9 月 26 日</w:t>
             </w:r>
           </w:p>
         </w:tc>
@@ -2017,7 +2017,138 @@
                 <w:color w:val="000000"/>
                 <w:sz w:val="17"/>
               </w:rPr>
-              <w:t>本地复现成功路径和预期失败路径 GitHub 复跑待推送</w:t>
+              <w:t>GitHub 自检已通过 完整检查暴露既有 Prettier 问题</w:t>
+            </w:r>
+          </w:p>
+        </w:tc>
+      </w:tr>
+      <w:tr>
+        <w:trPr>
+          <w:cantSplit/>
+        </w:trPr>
+        <w:tc>
+          <w:tcPr>
+            <w:tcW w:type="dxa" w:w="1008"/>
+            <w:tcMar>
+              <w:top w:w="100" w:type="dxa"/>
+              <w:start w:w="120" w:type="dxa"/>
+              <w:bottom w:w="100" w:type="dxa"/>
+              <w:end w:w="120" w:type="dxa"/>
+            </w:tcMar>
+            <w:vAlign w:val="center"/>
+          </w:tcPr>
+          <w:p>
+            <w:pPr>
+              <w:spacing w:after="0" w:line="259" w:lineRule="auto"/>
+              <w:jc w:val="center"/>
+            </w:pPr>
+            <w:r>
+              <w:rPr>
+                <w:rFonts w:ascii="Aptos" w:hAnsi="Aptos" w:eastAsia="Microsoft YaHei"/>
+                <w:color w:val="000000"/>
+                <w:sz w:val="17"/>
+              </w:rPr>
+              <w:t>UPD 005</w:t>
+            </w:r>
+          </w:p>
+        </w:tc>
+        <w:tc>
+          <w:tcPr>
+            <w:tcW w:type="dxa" w:w="1296"/>
+            <w:tcMar>
+              <w:top w:w="100" w:type="dxa"/>
+              <w:start w:w="120" w:type="dxa"/>
+              <w:bottom w:w="100" w:type="dxa"/>
+              <w:end w:w="120" w:type="dxa"/>
+            </w:tcMar>
+            <w:vAlign w:val="center"/>
+          </w:tcPr>
+          <w:p>
+            <w:pPr>
+              <w:spacing w:after="0" w:line="259" w:lineRule="auto"/>
+            </w:pPr>
+            <w:r>
+              <w:rPr>
+                <w:rFonts w:ascii="Aptos" w:hAnsi="Aptos" w:eastAsia="Microsoft YaHei"/>
+                <w:color w:val="000000"/>
+                <w:sz w:val="17"/>
+              </w:rPr>
+              <w:t>2026 09 26</w:t>
+            </w:r>
+          </w:p>
+        </w:tc>
+        <w:tc>
+          <w:tcPr>
+            <w:tcW w:type="dxa" w:w="2880"/>
+            <w:tcMar>
+              <w:top w:w="100" w:type="dxa"/>
+              <w:start w:w="120" w:type="dxa"/>
+              <w:bottom w:w="100" w:type="dxa"/>
+              <w:end w:w="120" w:type="dxa"/>
+            </w:tcMar>
+            <w:vAlign w:val="center"/>
+          </w:tcPr>
+          <w:p>
+            <w:pPr>
+              <w:spacing w:after="0" w:line="259" w:lineRule="auto"/>
+            </w:pPr>
+            <w:r>
+              <w:rPr>
+                <w:rFonts w:ascii="Aptos" w:hAnsi="Aptos" w:eastAsia="Microsoft YaHei"/>
+                <w:color w:val="000000"/>
+                <w:sz w:val="17"/>
+              </w:rPr>
+              <w:t>清理模型网关格式债并建立阶段 PR 审批流程</w:t>
+            </w:r>
+          </w:p>
+        </w:tc>
+        <w:tc>
+          <w:tcPr>
+            <w:tcW w:type="dxa" w:w="3024"/>
+            <w:tcMar>
+              <w:top w:w="100" w:type="dxa"/>
+              <w:start w:w="120" w:type="dxa"/>
+              <w:bottom w:w="100" w:type="dxa"/>
+              <w:end w:w="120" w:type="dxa"/>
+            </w:tcMar>
+            <w:vAlign w:val="center"/>
+          </w:tcPr>
+          <w:p>
+            <w:pPr>
+              <w:spacing w:after="0" w:line="259" w:lineRule="auto"/>
+            </w:pPr>
+            <w:r>
+              <w:rPr>
+                <w:rFonts w:ascii="Aptos" w:hAnsi="Aptos" w:eastAsia="Microsoft YaHei"/>
+                <w:color w:val="000000"/>
+                <w:sz w:val="17"/>
+              </w:rPr>
+              <w:t>格式化日志命中的八个文件并改用独立分支交付</w:t>
+            </w:r>
+          </w:p>
+        </w:tc>
+        <w:tc>
+          <w:tcPr>
+            <w:tcW w:type="dxa" w:w="1944"/>
+            <w:tcMar>
+              <w:top w:w="100" w:type="dxa"/>
+              <w:start w:w="120" w:type="dxa"/>
+              <w:bottom w:w="100" w:type="dxa"/>
+              <w:end w:w="120" w:type="dxa"/>
+            </w:tcMar>
+            <w:vAlign w:val="center"/>
+          </w:tcPr>
+          <w:p>
+            <w:pPr>
+              <w:spacing w:after="0" w:line="259" w:lineRule="auto"/>
+            </w:pPr>
+            <w:r>
+              <w:rPr>
+                <w:rFonts w:ascii="Aptos" w:hAnsi="Aptos" w:eastAsia="Microsoft YaHei"/>
+                <w:color w:val="000000"/>
+                <w:sz w:val="17"/>
+              </w:rPr>
+              <w:t>完整 Prettier 检查通过 PR CI 待运行</w:t>
             </w:r>
           </w:p>
         </w:tc>
@@ -12738,7 +12869,7 @@
                 <w:color w:val="000000"/>
                 <w:sz w:val="17"/>
               </w:rPr>
-              <w:t>GitHub Actions 复跑</w:t>
+              <w:t>GitHub Actions 自检</w:t>
             </w:r>
           </w:p>
         </w:tc>
@@ -12763,7 +12894,7 @@
                 <w:color w:val="000000"/>
                 <w:sz w:val="17"/>
               </w:rPr>
-              <w:t>未执行</w:t>
+              <w:t>通过</w:t>
             </w:r>
           </w:p>
         </w:tc>
@@ -12788,7 +12919,91 @@
                 <w:color w:val="000000"/>
                 <w:sz w:val="17"/>
               </w:rPr>
-              <w:t>修改尚未提交和推送</w:t>
+              <w:t>运行 36138239412 的 Parallel runner self test 已通过</w:t>
+            </w:r>
+          </w:p>
+        </w:tc>
+      </w:tr>
+      <w:tr>
+        <w:trPr>
+          <w:cantSplit/>
+        </w:trPr>
+        <w:tc>
+          <w:tcPr>
+            <w:tcW w:type="dxa" w:w="2376"/>
+            <w:tcMar>
+              <w:top w:w="100" w:type="dxa"/>
+              <w:start w:w="120" w:type="dxa"/>
+              <w:bottom w:w="100" w:type="dxa"/>
+              <w:end w:w="120" w:type="dxa"/>
+            </w:tcMar>
+            <w:vAlign w:val="center"/>
+            <w:shd w:fill="EAF2F8"/>
+          </w:tcPr>
+          <w:p>
+            <w:pPr>
+              <w:spacing w:after="0" w:line="259" w:lineRule="auto"/>
+              <w:jc w:val="center"/>
+            </w:pPr>
+            <w:r>
+              <w:rPr>
+                <w:rFonts w:ascii="Aptos" w:hAnsi="Aptos" w:eastAsia="Microsoft YaHei"/>
+                <w:color w:val="000000"/>
+                <w:sz w:val="17"/>
+              </w:rPr>
+              <w:t>完整质量检查</w:t>
+            </w:r>
+          </w:p>
+        </w:tc>
+        <w:tc>
+          <w:tcPr>
+            <w:tcW w:type="dxa" w:w="1440"/>
+            <w:tcMar>
+              <w:top w:w="100" w:type="dxa"/>
+              <w:start w:w="120" w:type="dxa"/>
+              <w:bottom w:w="100" w:type="dxa"/>
+              <w:end w:w="120" w:type="dxa"/>
+            </w:tcMar>
+            <w:vAlign w:val="center"/>
+            <w:shd w:fill="EAF2F8"/>
+          </w:tcPr>
+          <w:p>
+            <w:pPr>
+              <w:spacing w:after="0" w:line="259" w:lineRule="auto"/>
+            </w:pPr>
+            <w:r>
+              <w:rPr>
+                <w:rFonts w:ascii="Aptos" w:hAnsi="Aptos" w:eastAsia="Microsoft YaHei"/>
+                <w:color w:val="000000"/>
+                <w:sz w:val="17"/>
+              </w:rPr>
+              <w:t>发现后续问题</w:t>
+            </w:r>
+          </w:p>
+        </w:tc>
+        <w:tc>
+          <w:tcPr>
+            <w:tcW w:type="dxa" w:w="6192"/>
+            <w:tcMar>
+              <w:top w:w="100" w:type="dxa"/>
+              <w:start w:w="120" w:type="dxa"/>
+              <w:bottom w:w="100" w:type="dxa"/>
+              <w:end w:w="120" w:type="dxa"/>
+            </w:tcMar>
+            <w:vAlign w:val="center"/>
+            <w:shd w:fill="EAF2F8"/>
+          </w:tcPr>
+          <w:p>
+            <w:pPr>
+              <w:spacing w:after="0" w:line="259" w:lineRule="auto"/>
+            </w:pPr>
+            <w:r>
+              <w:rPr>
+                <w:rFonts w:ascii="Aptos" w:hAnsi="Aptos" w:eastAsia="Microsoft YaHei"/>
+                <w:color w:val="000000"/>
+                <w:sz w:val="17"/>
+              </w:rPr>
+              <w:t>脚本权限问题消失 后续 Prettier 检查发现八个既有格式文件</w:t>
             </w:r>
           </w:p>
         </w:tc>
@@ -12825,7 +13040,7 @@
           <w:rFonts w:ascii="Aptos" w:hAnsi="Aptos" w:eastAsia="Microsoft YaHei"/>
           <w:color w:val="000000"/>
         </w:rPr>
-        <w:t>1.  提交并推送 CI 修复以及当前 ContractOps M0 修改</w:t>
+        <w:t>1.  将后续格式修复放入独立阶段分支并创建 PR</w:t>
       </w:r>
     </w:p>
     <w:p>
@@ -12838,7 +13053,7 @@
           <w:rFonts w:ascii="Aptos" w:hAnsi="Aptos" w:eastAsia="Microsoft YaHei"/>
           <w:color w:val="000000"/>
         </w:rPr>
-        <w:t>2.  观察新的 CI 运行是否继续通过依赖安装和完整质量检查</w:t>
+        <w:t>2.  观察 PR CI 是否通过完整质量检查</w:t>
       </w:r>
     </w:p>
     <w:p>
@@ -12851,7 +13066,7 @@
           <w:rFonts w:ascii="Aptos" w:hAnsi="Aptos" w:eastAsia="Microsoft YaHei"/>
           <w:color w:val="000000"/>
         </w:rPr>
-        <w:t>3.  若出现后续错误 按实际失败步骤新增记录而不是覆盖本次根因</w:t>
+        <w:t>3.  由项目负责人审批后再合并到远端 main</w:t>
       </w:r>
     </w:p>
     <w:p>
@@ -12867,7 +13082,73 @@
           <w:color w:val="000000"/>
           <w:sz w:val="32"/>
         </w:rPr>
-        <w:t>九 当前决策记录</w:t>
+        <w:t>九 更新记录 UPD 005</w:t>
+      </w:r>
+    </w:p>
+    <w:p>
+      <w:pPr>
+        <w:pStyle w:val="Heading2"/>
+        <w:keepNext/>
+        <w:keepLines/>
+      </w:pPr>
+      <w:r>
+        <w:rPr>
+          <w:rFonts w:ascii="Aptos" w:hAnsi="Aptos" w:eastAsia="Microsoft YaHei"/>
+          <w:b/>
+          <w:color w:val="000000"/>
+          <w:sz w:val="26"/>
+        </w:rPr>
+        <w:t>九一 更新目标</w:t>
+      </w:r>
+    </w:p>
+    <w:p>
+      <w:r>
+        <w:rPr>
+          <w:rFonts w:ascii="Aptos" w:hAnsi="Aptos" w:eastAsia="Microsoft YaHei"/>
+          <w:color w:val="000000"/>
+        </w:rPr>
+        <w:t>处理脚本权限修复后继续暴露的 Prettier 失败 同时把阶段交付调整为独立分支和 PR 审批流程 避免后续阶段直接更新远端 main</w:t>
+      </w:r>
+    </w:p>
+    <w:p>
+      <w:pPr>
+        <w:pStyle w:val="Heading2"/>
+        <w:keepNext/>
+        <w:keepLines/>
+      </w:pPr>
+      <w:r>
+        <w:rPr>
+          <w:rFonts w:ascii="Aptos" w:hAnsi="Aptos" w:eastAsia="Microsoft YaHei"/>
+          <w:b/>
+          <w:color w:val="000000"/>
+          <w:sz w:val="26"/>
+        </w:rPr>
+        <w:t>九二 问题定位</w:t>
+      </w:r>
+    </w:p>
+    <w:p>
+      <w:r>
+        <w:rPr>
+          <w:rFonts w:ascii="Aptos" w:hAnsi="Aptos" w:eastAsia="Microsoft YaHei"/>
+          <w:color w:val="000000"/>
+        </w:rPr>
+        <w:t>GitHub Actions 运行 36138239412 已确认 Parallel runner self test 通过 随后 Prettier 3 8 1 报告 services model gateway 下八个既有 JSON CSS 和无扩展名 README 不符合根仓库格式规则 其余 E2E Render Service Issue Triage 和 Main image 均通过</w:t>
+      </w:r>
+    </w:p>
+    <w:p>
+      <w:pPr>
+        <w:pStyle w:val="Heading2"/>
+        <w:keepNext/>
+        <w:keepLines/>
+      </w:pPr>
+      <w:r>
+        <w:rPr>
+          <w:rFonts w:ascii="Aptos" w:hAnsi="Aptos" w:eastAsia="Microsoft YaHei"/>
+          <w:b/>
+          <w:color w:val="000000"/>
+          <w:sz w:val="26"/>
+        </w:rPr>
+        <w:t>九三 方案选择</w:t>
       </w:r>
     </w:p>
     <w:tbl>
@@ -12898,7 +13179,7 @@
         </w:trPr>
         <w:tc>
           <w:tcPr>
-            <w:tcW w:type="dxa" w:w="1152"/>
+            <w:tcW w:type="dxa" w:w="2520"/>
             <w:shd w:fill="1F4E78"/>
             <w:tcMar>
               <w:top w:w="100" w:type="dxa"/>
@@ -12920,13 +13201,13 @@
                 <w:color w:val="FFFFFF"/>
                 <w:sz w:val="17"/>
               </w:rPr>
-              <w:t>编号</w:t>
-            </w:r>
-          </w:p>
-        </w:tc>
-        <w:tc>
-          <w:tcPr>
-            <w:tcW w:type="dxa" w:w="2304"/>
+              <w:t>候选方案</w:t>
+            </w:r>
+          </w:p>
+        </w:tc>
+        <w:tc>
+          <w:tcPr>
+            <w:tcW w:type="dxa" w:w="2880"/>
             <w:shd w:fill="1F4E78"/>
             <w:tcMar>
               <w:top w:w="100" w:type="dxa"/>
@@ -12948,13 +13229,13 @@
                 <w:color w:val="FFFFFF"/>
                 <w:sz w:val="17"/>
               </w:rPr>
-              <w:t>决策</w:t>
-            </w:r>
-          </w:p>
-        </w:tc>
-        <w:tc>
-          <w:tcPr>
-            <w:tcW w:type="dxa" w:w="3744"/>
+              <w:t>优点</w:t>
+            </w:r>
+          </w:p>
+        </w:tc>
+        <w:tc>
+          <w:tcPr>
+            <w:tcW w:type="dxa" w:w="3240"/>
             <w:shd w:fill="1F4E78"/>
             <w:tcMar>
               <w:top w:w="100" w:type="dxa"/>
@@ -12976,13 +13257,13 @@
                 <w:color w:val="FFFFFF"/>
                 <w:sz w:val="17"/>
               </w:rPr>
-              <w:t>原因</w:t>
-            </w:r>
-          </w:p>
-        </w:tc>
-        <w:tc>
-          <w:tcPr>
-            <w:tcW w:type="dxa" w:w="2736"/>
+              <w:t>限制</w:t>
+            </w:r>
+          </w:p>
+        </w:tc>
+        <w:tc>
+          <w:tcPr>
+            <w:tcW w:type="dxa" w:w="1440"/>
             <w:shd w:fill="1F4E78"/>
             <w:tcMar>
               <w:top w:w="100" w:type="dxa"/>
@@ -13004,7 +13285,7 @@
                 <w:color w:val="FFFFFF"/>
                 <w:sz w:val="17"/>
               </w:rPr>
-              <w:t>重新评估条件</w:t>
+              <w:t>决定</w:t>
             </w:r>
           </w:p>
         </w:tc>
@@ -13015,7 +13296,7 @@
         </w:trPr>
         <w:tc>
           <w:tcPr>
-            <w:tcW w:type="dxa" w:w="1152"/>
+            <w:tcW w:type="dxa" w:w="2520"/>
             <w:tcMar>
               <w:top w:w="100" w:type="dxa"/>
               <w:start w:w="120" w:type="dxa"/>
@@ -13035,13 +13316,13 @@
                 <w:color w:val="000000"/>
                 <w:sz w:val="17"/>
               </w:rPr>
-              <w:t>ADR 001</w:t>
-            </w:r>
-          </w:p>
-        </w:tc>
-        <w:tc>
-          <w:tcPr>
-            <w:tcW w:type="dxa" w:w="2304"/>
+              <w:t>只格式化日志命中的八个文件</w:t>
+            </w:r>
+          </w:p>
+        </w:tc>
+        <w:tc>
+          <w:tcPr>
+            <w:tcW w:type="dxa" w:w="2880"/>
             <w:tcMar>
               <w:top w:w="100" w:type="dxa"/>
               <w:start w:w="120" w:type="dxa"/>
@@ -13060,13 +13341,13 @@
                 <w:color w:val="000000"/>
                 <w:sz w:val="17"/>
               </w:rPr>
-              <w:t>主线改为 ContractOps</w:t>
-            </w:r>
-          </w:p>
-        </w:tc>
-        <w:tc>
-          <w:tcPr>
-            <w:tcW w:type="dxa" w:w="3744"/>
+              <w:t>改动可审查 不改变检查标准</w:t>
+            </w:r>
+          </w:p>
+        </w:tc>
+        <w:tc>
+          <w:tcPr>
+            <w:tcW w:type="dxa" w:w="3240"/>
             <w:tcMar>
               <w:top w:w="100" w:type="dxa"/>
               <w:start w:w="120" w:type="dxa"/>
@@ -13085,13 +13366,13 @@
                 <w:color w:val="000000"/>
                 <w:sz w:val="17"/>
               </w:rPr>
-              <w:t>缩小范围并提高后端实现深度</w:t>
-            </w:r>
-          </w:p>
-        </w:tc>
-        <w:tc>
-          <w:tcPr>
-            <w:tcW w:type="dxa" w:w="2736"/>
+              <w:t>会产生较大的纯格式差异</w:t>
+            </w:r>
+          </w:p>
+        </w:tc>
+        <w:tc>
+          <w:tcPr>
+            <w:tcW w:type="dxa" w:w="1440"/>
             <w:tcMar>
               <w:top w:w="100" w:type="dxa"/>
               <w:start w:w="120" w:type="dxa"/>
@@ -13110,7 +13391,7 @@
                 <w:color w:val="000000"/>
                 <w:sz w:val="17"/>
               </w:rPr>
-              <w:t>合同场景缺少可用数据或无法形成闭环</w:t>
+              <w:t>采用</w:t>
             </w:r>
           </w:p>
         </w:tc>
@@ -13121,7 +13402,7 @@
         </w:trPr>
         <w:tc>
           <w:tcPr>
-            <w:tcW w:type="dxa" w:w="1152"/>
+            <w:tcW w:type="dxa" w:w="2520"/>
             <w:tcMar>
               <w:top w:w="100" w:type="dxa"/>
               <w:start w:w="120" w:type="dxa"/>
@@ -13142,13 +13423,13 @@
                 <w:color w:val="000000"/>
                 <w:sz w:val="17"/>
               </w:rPr>
-              <w:t>ADR 002</w:t>
-            </w:r>
-          </w:p>
-        </w:tc>
-        <w:tc>
-          <w:tcPr>
-            <w:tcW w:type="dxa" w:w="2304"/>
+              <w:t>把模型网关目录加入 Prettier ignore</w:t>
+            </w:r>
+          </w:p>
+        </w:tc>
+        <w:tc>
+          <w:tcPr>
+            <w:tcW w:type="dxa" w:w="2880"/>
             <w:tcMar>
               <w:top w:w="100" w:type="dxa"/>
               <w:start w:w="120" w:type="dxa"/>
@@ -13168,13 +13449,13 @@
                 <w:color w:val="000000"/>
                 <w:sz w:val="17"/>
               </w:rPr>
-              <w:t>模块化单体加 Worker</w:t>
-            </w:r>
-          </w:p>
-        </w:tc>
-        <w:tc>
-          <w:tcPr>
-            <w:tcW w:type="dxa" w:w="3744"/>
+              <w:t>改动最少</w:t>
+            </w:r>
+          </w:p>
+        </w:tc>
+        <w:tc>
+          <w:tcPr>
+            <w:tcW w:type="dxa" w:w="3240"/>
             <w:tcMar>
               <w:top w:w="100" w:type="dxa"/>
               <w:start w:w="120" w:type="dxa"/>
@@ -13194,13 +13475,13 @@
                 <w:color w:val="000000"/>
                 <w:sz w:val="17"/>
               </w:rPr>
-              <w:t>保留领域事务并隔离长任务</w:t>
-            </w:r>
-          </w:p>
-        </w:tc>
-        <w:tc>
-          <w:tcPr>
-            <w:tcW w:type="dxa" w:w="2736"/>
+              <w:t>隐藏持续存在的格式债并降低门禁覆盖</w:t>
+            </w:r>
+          </w:p>
+        </w:tc>
+        <w:tc>
+          <w:tcPr>
+            <w:tcW w:type="dxa" w:w="1440"/>
             <w:tcMar>
               <w:top w:w="100" w:type="dxa"/>
               <w:start w:w="120" w:type="dxa"/>
@@ -13220,7 +13501,7 @@
                 <w:color w:val="000000"/>
                 <w:sz w:val="17"/>
               </w:rPr>
-              <w:t>检索或调度需要独立扩容</w:t>
+              <w:t>不采用</w:t>
             </w:r>
           </w:p>
         </w:tc>
@@ -13231,7 +13512,7 @@
         </w:trPr>
         <w:tc>
           <w:tcPr>
-            <w:tcW w:type="dxa" w:w="1152"/>
+            <w:tcW w:type="dxa" w:w="2520"/>
             <w:tcMar>
               <w:top w:w="100" w:type="dxa"/>
               <w:start w:w="120" w:type="dxa"/>
@@ -13251,13 +13532,13 @@
                 <w:color w:val="000000"/>
                 <w:sz w:val="17"/>
               </w:rPr>
-              <w:t>ADR 003</w:t>
-            </w:r>
-          </w:p>
-        </w:tc>
-        <w:tc>
-          <w:tcPr>
-            <w:tcW w:type="dxa" w:w="2304"/>
+              <w:t>关闭或放宽 Prettier 门禁</w:t>
+            </w:r>
+          </w:p>
+        </w:tc>
+        <w:tc>
+          <w:tcPr>
+            <w:tcW w:type="dxa" w:w="2880"/>
             <w:tcMar>
               <w:top w:w="100" w:type="dxa"/>
               <w:start w:w="120" w:type="dxa"/>
@@ -13276,13 +13557,13 @@
                 <w:color w:val="000000"/>
                 <w:sz w:val="17"/>
               </w:rPr>
-              <w:t>PostgreSQL 加 pgvector</w:t>
-            </w:r>
-          </w:p>
-        </w:tc>
-        <w:tc>
-          <w:tcPr>
-            <w:tcW w:type="dxa" w:w="3744"/>
+              <w:t>CI 可以快速变绿</w:t>
+            </w:r>
+          </w:p>
+        </w:tc>
+        <w:tc>
+          <w:tcPr>
+            <w:tcW w:type="dxa" w:w="3240"/>
             <w:tcMar>
               <w:top w:w="100" w:type="dxa"/>
               <w:start w:w="120" w:type="dxa"/>
@@ -13301,13 +13582,13 @@
                 <w:color w:val="000000"/>
                 <w:sz w:val="17"/>
               </w:rPr>
-              <w:t>一个系统完成事务 全文和向量存储</w:t>
-            </w:r>
-          </w:p>
-        </w:tc>
-        <w:tc>
-          <w:tcPr>
-            <w:tcW w:type="dxa" w:w="2736"/>
+              <w:t>破坏仓库统一质量标准</w:t>
+            </w:r>
+          </w:p>
+        </w:tc>
+        <w:tc>
+          <w:tcPr>
+            <w:tcW w:type="dxa" w:w="1440"/>
             <w:tcMar>
               <w:top w:w="100" w:type="dxa"/>
               <w:start w:w="120" w:type="dxa"/>
@@ -13326,871 +13607,7 @@
                 <w:color w:val="000000"/>
                 <w:sz w:val="17"/>
               </w:rPr>
-              <w:t>规模或中文召回达到明确瓶颈</w:t>
-            </w:r>
-          </w:p>
-        </w:tc>
-      </w:tr>
-      <w:tr>
-        <w:trPr>
-          <w:cantSplit/>
-        </w:trPr>
-        <w:tc>
-          <w:tcPr>
-            <w:tcW w:type="dxa" w:w="1152"/>
-            <w:tcMar>
-              <w:top w:w="100" w:type="dxa"/>
-              <w:start w:w="120" w:type="dxa"/>
-              <w:bottom w:w="100" w:type="dxa"/>
-              <w:end w:w="120" w:type="dxa"/>
-            </w:tcMar>
-            <w:vAlign w:val="center"/>
-            <w:shd w:fill="EAF2F8"/>
-          </w:tcPr>
-          <w:p>
-            <w:pPr>
-              <w:spacing w:after="0" w:line="259" w:lineRule="auto"/>
-              <w:jc w:val="center"/>
-            </w:pPr>
-            <w:r>
-              <w:rPr>
-                <w:rFonts w:ascii="Aptos" w:hAnsi="Aptos" w:eastAsia="Microsoft YaHei"/>
-                <w:color w:val="000000"/>
-                <w:sz w:val="17"/>
-              </w:rPr>
-              <w:t>ADR 004</w:t>
-            </w:r>
-          </w:p>
-        </w:tc>
-        <w:tc>
-          <w:tcPr>
-            <w:tcW w:type="dxa" w:w="2304"/>
-            <w:tcMar>
-              <w:top w:w="100" w:type="dxa"/>
-              <w:start w:w="120" w:type="dxa"/>
-              <w:bottom w:w="100" w:type="dxa"/>
-              <w:end w:w="120" w:type="dxa"/>
-            </w:tcMar>
-            <w:vAlign w:val="center"/>
-            <w:shd w:fill="EAF2F8"/>
-          </w:tcPr>
-          <w:p>
-            <w:pPr>
-              <w:spacing w:after="0" w:line="259" w:lineRule="auto"/>
-            </w:pPr>
-            <w:r>
-              <w:rPr>
-                <w:rFonts w:ascii="Aptos" w:hAnsi="Aptos" w:eastAsia="Microsoft YaHei"/>
-                <w:color w:val="000000"/>
-                <w:sz w:val="17"/>
-              </w:rPr>
-              <w:t>Redis Streams 作为首版队列</w:t>
-            </w:r>
-          </w:p>
-        </w:tc>
-        <w:tc>
-          <w:tcPr>
-            <w:tcW w:type="dxa" w:w="3744"/>
-            <w:tcMar>
-              <w:top w:w="100" w:type="dxa"/>
-              <w:start w:w="120" w:type="dxa"/>
-              <w:bottom w:w="100" w:type="dxa"/>
-              <w:end w:w="120" w:type="dxa"/>
-            </w:tcMar>
-            <w:vAlign w:val="center"/>
-            <w:shd w:fill="EAF2F8"/>
-          </w:tcPr>
-          <w:p>
-            <w:pPr>
-              <w:spacing w:after="0" w:line="259" w:lineRule="auto"/>
-            </w:pPr>
-            <w:r>
-              <w:rPr>
-                <w:rFonts w:ascii="Aptos" w:hAnsi="Aptos" w:eastAsia="Microsoft YaHei"/>
-                <w:color w:val="000000"/>
-                <w:sz w:val="17"/>
-              </w:rPr>
-              <w:t>本地成本低 支持消费组和消息重领</w:t>
-            </w:r>
-          </w:p>
-        </w:tc>
-        <w:tc>
-          <w:tcPr>
-            <w:tcW w:type="dxa" w:w="2736"/>
-            <w:tcMar>
-              <w:top w:w="100" w:type="dxa"/>
-              <w:start w:w="120" w:type="dxa"/>
-              <w:bottom w:w="100" w:type="dxa"/>
-              <w:end w:w="120" w:type="dxa"/>
-            </w:tcMar>
-            <w:vAlign w:val="center"/>
-            <w:shd w:fill="EAF2F8"/>
-          </w:tcPr>
-          <w:p>
-            <w:pPr>
-              <w:spacing w:after="0" w:line="259" w:lineRule="auto"/>
-            </w:pPr>
-            <w:r>
-              <w:rPr>
-                <w:rFonts w:ascii="Aptos" w:hAnsi="Aptos" w:eastAsia="Microsoft YaHei"/>
-                <w:color w:val="000000"/>
-                <w:sz w:val="17"/>
-              </w:rPr>
-              <w:t>需要长期回放或更高吞吐</w:t>
-            </w:r>
-          </w:p>
-        </w:tc>
-      </w:tr>
-      <w:tr>
-        <w:trPr>
-          <w:cantSplit/>
-        </w:trPr>
-        <w:tc>
-          <w:tcPr>
-            <w:tcW w:type="dxa" w:w="1152"/>
-            <w:tcMar>
-              <w:top w:w="100" w:type="dxa"/>
-              <w:start w:w="120" w:type="dxa"/>
-              <w:bottom w:w="100" w:type="dxa"/>
-              <w:end w:w="120" w:type="dxa"/>
-            </w:tcMar>
-            <w:vAlign w:val="center"/>
-          </w:tcPr>
-          <w:p>
-            <w:pPr>
-              <w:spacing w:after="0" w:line="259" w:lineRule="auto"/>
-              <w:jc w:val="center"/>
-            </w:pPr>
-            <w:r>
-              <w:rPr>
-                <w:rFonts w:ascii="Aptos" w:hAnsi="Aptos" w:eastAsia="Microsoft YaHei"/>
-                <w:color w:val="000000"/>
-                <w:sz w:val="17"/>
-              </w:rPr>
-              <w:t>ADR 005</w:t>
-            </w:r>
-          </w:p>
-        </w:tc>
-        <w:tc>
-          <w:tcPr>
-            <w:tcW w:type="dxa" w:w="2304"/>
-            <w:tcMar>
-              <w:top w:w="100" w:type="dxa"/>
-              <w:start w:w="120" w:type="dxa"/>
-              <w:bottom w:w="100" w:type="dxa"/>
-              <w:end w:w="120" w:type="dxa"/>
-            </w:tcMar>
-            <w:vAlign w:val="center"/>
-          </w:tcPr>
-          <w:p>
-            <w:pPr>
-              <w:spacing w:after="0" w:line="259" w:lineRule="auto"/>
-            </w:pPr>
-            <w:r>
-              <w:rPr>
-                <w:rFonts w:ascii="Aptos" w:hAnsi="Aptos" w:eastAsia="Microsoft YaHei"/>
-                <w:color w:val="000000"/>
-                <w:sz w:val="17"/>
-              </w:rPr>
-              <w:t>应用权限加 PostgreSQL RLS</w:t>
-            </w:r>
-          </w:p>
-        </w:tc>
-        <w:tc>
-          <w:tcPr>
-            <w:tcW w:type="dxa" w:w="3744"/>
-            <w:tcMar>
-              <w:top w:w="100" w:type="dxa"/>
-              <w:start w:w="120" w:type="dxa"/>
-              <w:bottom w:w="100" w:type="dxa"/>
-              <w:end w:w="120" w:type="dxa"/>
-            </w:tcMar>
-            <w:vAlign w:val="center"/>
-          </w:tcPr>
-          <w:p>
-            <w:pPr>
-              <w:spacing w:after="0" w:line="259" w:lineRule="auto"/>
-            </w:pPr>
-            <w:r>
-              <w:rPr>
-                <w:rFonts w:ascii="Aptos" w:hAnsi="Aptos" w:eastAsia="Microsoft YaHei"/>
-                <w:color w:val="000000"/>
-                <w:sz w:val="17"/>
-              </w:rPr>
-              <w:t>防止查询条件遗漏导致跨租户读取</w:t>
-            </w:r>
-          </w:p>
-        </w:tc>
-        <w:tc>
-          <w:tcPr>
-            <w:tcW w:type="dxa" w:w="2736"/>
-            <w:tcMar>
-              <w:top w:w="100" w:type="dxa"/>
-              <w:start w:w="120" w:type="dxa"/>
-              <w:bottom w:w="100" w:type="dxa"/>
-              <w:end w:w="120" w:type="dxa"/>
-            </w:tcMar>
-            <w:vAlign w:val="center"/>
-          </w:tcPr>
-          <w:p>
-            <w:pPr>
-              <w:spacing w:after="0" w:line="259" w:lineRule="auto"/>
-            </w:pPr>
-            <w:r>
-              <w:rPr>
-                <w:rFonts w:ascii="Aptos" w:hAnsi="Aptos" w:eastAsia="Microsoft YaHei"/>
-                <w:color w:val="000000"/>
-                <w:sz w:val="17"/>
-              </w:rPr>
-              <w:t>不能删除 只允许调整实现</w:t>
-            </w:r>
-          </w:p>
-        </w:tc>
-      </w:tr>
-      <w:tr>
-        <w:trPr>
-          <w:cantSplit/>
-        </w:trPr>
-        <w:tc>
-          <w:tcPr>
-            <w:tcW w:type="dxa" w:w="1152"/>
-            <w:tcMar>
-              <w:top w:w="100" w:type="dxa"/>
-              <w:start w:w="120" w:type="dxa"/>
-              <w:bottom w:w="100" w:type="dxa"/>
-              <w:end w:w="120" w:type="dxa"/>
-            </w:tcMar>
-            <w:vAlign w:val="center"/>
-            <w:shd w:fill="EAF2F8"/>
-          </w:tcPr>
-          <w:p>
-            <w:pPr>
-              <w:spacing w:after="0" w:line="259" w:lineRule="auto"/>
-              <w:jc w:val="center"/>
-            </w:pPr>
-            <w:r>
-              <w:rPr>
-                <w:rFonts w:ascii="Aptos" w:hAnsi="Aptos" w:eastAsia="Microsoft YaHei"/>
-                <w:color w:val="000000"/>
-                <w:sz w:val="17"/>
-              </w:rPr>
-              <w:t>ADR 006</w:t>
-            </w:r>
-          </w:p>
-        </w:tc>
-        <w:tc>
-          <w:tcPr>
-            <w:tcW w:type="dxa" w:w="2304"/>
-            <w:tcMar>
-              <w:top w:w="100" w:type="dxa"/>
-              <w:start w:w="120" w:type="dxa"/>
-              <w:bottom w:w="100" w:type="dxa"/>
-              <w:end w:w="120" w:type="dxa"/>
-            </w:tcMar>
-            <w:vAlign w:val="center"/>
-            <w:shd w:fill="EAF2F8"/>
-          </w:tcPr>
-          <w:p>
-            <w:pPr>
-              <w:spacing w:after="0" w:line="259" w:lineRule="auto"/>
-            </w:pPr>
-            <w:r>
-              <w:rPr>
-                <w:rFonts w:ascii="Aptos" w:hAnsi="Aptos" w:eastAsia="Microsoft YaHei"/>
-                <w:color w:val="000000"/>
-                <w:sz w:val="17"/>
-              </w:rPr>
-              <w:t>关键法律和审批决定由人完成</w:t>
-            </w:r>
-          </w:p>
-        </w:tc>
-        <w:tc>
-          <w:tcPr>
-            <w:tcW w:type="dxa" w:w="3744"/>
-            <w:tcMar>
-              <w:top w:w="100" w:type="dxa"/>
-              <w:start w:w="120" w:type="dxa"/>
-              <w:bottom w:w="100" w:type="dxa"/>
-              <w:end w:w="120" w:type="dxa"/>
-            </w:tcMar>
-            <w:vAlign w:val="center"/>
-            <w:shd w:fill="EAF2F8"/>
-          </w:tcPr>
-          <w:p>
-            <w:pPr>
-              <w:spacing w:after="0" w:line="259" w:lineRule="auto"/>
-            </w:pPr>
-            <w:r>
-              <w:rPr>
-                <w:rFonts w:ascii="Aptos" w:hAnsi="Aptos" w:eastAsia="Microsoft YaHei"/>
-                <w:color w:val="000000"/>
-                <w:sz w:val="17"/>
-              </w:rPr>
-              <w:t>模型输出存在错误和法律责任边界</w:t>
-            </w:r>
-          </w:p>
-        </w:tc>
-        <w:tc>
-          <w:tcPr>
-            <w:tcW w:type="dxa" w:w="2736"/>
-            <w:tcMar>
-              <w:top w:w="100" w:type="dxa"/>
-              <w:start w:w="120" w:type="dxa"/>
-              <w:bottom w:w="100" w:type="dxa"/>
-              <w:end w:w="120" w:type="dxa"/>
-            </w:tcMar>
-            <w:vAlign w:val="center"/>
-            <w:shd w:fill="EAF2F8"/>
-          </w:tcPr>
-          <w:p>
-            <w:pPr>
-              <w:spacing w:after="0" w:line="259" w:lineRule="auto"/>
-            </w:pPr>
-            <w:r>
-              <w:rPr>
-                <w:rFonts w:ascii="Aptos" w:hAnsi="Aptos" w:eastAsia="Microsoft YaHei"/>
-                <w:color w:val="000000"/>
-                <w:sz w:val="17"/>
-              </w:rPr>
-              <w:t>不能删除</w:t>
-            </w:r>
-          </w:p>
-        </w:tc>
-      </w:tr>
-      <w:tr>
-        <w:trPr>
-          <w:cantSplit/>
-        </w:trPr>
-        <w:tc>
-          <w:tcPr>
-            <w:tcW w:type="dxa" w:w="1152"/>
-            <w:tcMar>
-              <w:top w:w="100" w:type="dxa"/>
-              <w:start w:w="120" w:type="dxa"/>
-              <w:bottom w:w="100" w:type="dxa"/>
-              <w:end w:w="120" w:type="dxa"/>
-            </w:tcMar>
-            <w:vAlign w:val="center"/>
-          </w:tcPr>
-          <w:p>
-            <w:pPr>
-              <w:spacing w:after="0" w:line="259" w:lineRule="auto"/>
-              <w:jc w:val="center"/>
-            </w:pPr>
-            <w:r>
-              <w:rPr>
-                <w:rFonts w:ascii="Aptos" w:hAnsi="Aptos" w:eastAsia="Microsoft YaHei"/>
-                <w:color w:val="000000"/>
-                <w:sz w:val="17"/>
-              </w:rPr>
-              <w:t>ADR 007</w:t>
-            </w:r>
-          </w:p>
-        </w:tc>
-        <w:tc>
-          <w:tcPr>
-            <w:tcW w:type="dxa" w:w="2304"/>
-            <w:tcMar>
-              <w:top w:w="100" w:type="dxa"/>
-              <w:start w:w="120" w:type="dxa"/>
-              <w:bottom w:w="100" w:type="dxa"/>
-              <w:end w:w="120" w:type="dxa"/>
-            </w:tcMar>
-            <w:vAlign w:val="center"/>
-          </w:tcPr>
-          <w:p>
-            <w:pPr>
-              <w:spacing w:after="0" w:line="259" w:lineRule="auto"/>
-            </w:pPr>
-            <w:r>
-              <w:rPr>
-                <w:rFonts w:ascii="Aptos" w:hAnsi="Aptos" w:eastAsia="Microsoft YaHei"/>
-                <w:color w:val="000000"/>
-                <w:sz w:val="17"/>
-              </w:rPr>
-              <w:t>主线改为审批与履约风控</w:t>
-            </w:r>
-          </w:p>
-        </w:tc>
-        <w:tc>
-          <w:tcPr>
-            <w:tcW w:type="dxa" w:w="3744"/>
-            <w:tcMar>
-              <w:top w:w="100" w:type="dxa"/>
-              <w:start w:w="120" w:type="dxa"/>
-              <w:bottom w:w="100" w:type="dxa"/>
-              <w:end w:w="120" w:type="dxa"/>
-            </w:tcMar>
-            <w:vAlign w:val="center"/>
-          </w:tcPr>
-          <w:p>
-            <w:pPr>
-              <w:spacing w:after="0" w:line="259" w:lineRule="auto"/>
-            </w:pPr>
-            <w:r>
-              <w:rPr>
-                <w:rFonts w:ascii="Aptos" w:hAnsi="Aptos" w:eastAsia="Microsoft YaHei"/>
-                <w:color w:val="000000"/>
-                <w:sz w:val="17"/>
-              </w:rPr>
-              <w:t>避免退化为 PDF 检查工具并突出企业后端能力</w:t>
-            </w:r>
-          </w:p>
-        </w:tc>
-        <w:tc>
-          <w:tcPr>
-            <w:tcW w:type="dxa" w:w="2736"/>
-            <w:tcMar>
-              <w:top w:w="100" w:type="dxa"/>
-              <w:start w:w="120" w:type="dxa"/>
-              <w:bottom w:w="100" w:type="dxa"/>
-              <w:end w:w="120" w:type="dxa"/>
-            </w:tcMar>
-            <w:vAlign w:val="center"/>
-          </w:tcPr>
-          <w:p>
-            <w:pPr>
-              <w:spacing w:after="0" w:line="259" w:lineRule="auto"/>
-            </w:pPr>
-            <w:r>
-              <w:rPr>
-                <w:rFonts w:ascii="Aptos" w:hAnsi="Aptos" w:eastAsia="Microsoft YaHei"/>
-                <w:color w:val="000000"/>
-                <w:sz w:val="17"/>
-              </w:rPr>
-              <w:t>审批或履约场景无法形成可运行闭环</w:t>
-            </w:r>
-          </w:p>
-        </w:tc>
-      </w:tr>
-      <w:tr>
-        <w:trPr>
-          <w:cantSplit/>
-        </w:trPr>
-        <w:tc>
-          <w:tcPr>
-            <w:tcW w:type="dxa" w:w="1152"/>
-            <w:tcMar>
-              <w:top w:w="100" w:type="dxa"/>
-              <w:start w:w="120" w:type="dxa"/>
-              <w:bottom w:w="100" w:type="dxa"/>
-              <w:end w:w="120" w:type="dxa"/>
-            </w:tcMar>
-            <w:vAlign w:val="center"/>
-            <w:shd w:fill="EAF2F8"/>
-          </w:tcPr>
-          <w:p>
-            <w:pPr>
-              <w:spacing w:after="0" w:line="259" w:lineRule="auto"/>
-              <w:jc w:val="center"/>
-            </w:pPr>
-            <w:r>
-              <w:rPr>
-                <w:rFonts w:ascii="Aptos" w:hAnsi="Aptos" w:eastAsia="Microsoft YaHei"/>
-                <w:color w:val="000000"/>
-                <w:sz w:val="17"/>
-              </w:rPr>
-              <w:t>ADR 008</w:t>
-            </w:r>
-          </w:p>
-        </w:tc>
-        <w:tc>
-          <w:tcPr>
-            <w:tcW w:type="dxa" w:w="2304"/>
-            <w:tcMar>
-              <w:top w:w="100" w:type="dxa"/>
-              <w:start w:w="120" w:type="dxa"/>
-              <w:bottom w:w="100" w:type="dxa"/>
-              <w:end w:w="120" w:type="dxa"/>
-            </w:tcMar>
-            <w:vAlign w:val="center"/>
-            <w:shd w:fill="EAF2F8"/>
-          </w:tcPr>
-          <w:p>
-            <w:pPr>
-              <w:spacing w:after="0" w:line="259" w:lineRule="auto"/>
-            </w:pPr>
-            <w:r>
-              <w:rPr>
-                <w:rFonts w:ascii="Aptos" w:hAnsi="Aptos" w:eastAsia="Microsoft YaHei"/>
-                <w:color w:val="000000"/>
-                <w:sz w:val="17"/>
-              </w:rPr>
-              <w:t>审批实例保存策略快照</w:t>
-            </w:r>
-          </w:p>
-        </w:tc>
-        <w:tc>
-          <w:tcPr>
-            <w:tcW w:type="dxa" w:w="3744"/>
-            <w:tcMar>
-              <w:top w:w="100" w:type="dxa"/>
-              <w:start w:w="120" w:type="dxa"/>
-              <w:bottom w:w="100" w:type="dxa"/>
-              <w:end w:w="120" w:type="dxa"/>
-            </w:tcMar>
-            <w:vAlign w:val="center"/>
-            <w:shd w:fill="EAF2F8"/>
-          </w:tcPr>
-          <w:p>
-            <w:pPr>
-              <w:spacing w:after="0" w:line="259" w:lineRule="auto"/>
-            </w:pPr>
-            <w:r>
-              <w:rPr>
-                <w:rFonts w:ascii="Aptos" w:hAnsi="Aptos" w:eastAsia="Microsoft YaHei"/>
-                <w:color w:val="000000"/>
-                <w:sz w:val="17"/>
-              </w:rPr>
-              <w:t>避免流程中途因策略变更产生不一致</w:t>
-            </w:r>
-          </w:p>
-        </w:tc>
-        <w:tc>
-          <w:tcPr>
-            <w:tcW w:type="dxa" w:w="2736"/>
-            <w:tcMar>
-              <w:top w:w="100" w:type="dxa"/>
-              <w:start w:w="120" w:type="dxa"/>
-              <w:bottom w:w="100" w:type="dxa"/>
-              <w:end w:w="120" w:type="dxa"/>
-            </w:tcMar>
-            <w:vAlign w:val="center"/>
-            <w:shd w:fill="EAF2F8"/>
-          </w:tcPr>
-          <w:p>
-            <w:pPr>
-              <w:spacing w:after="0" w:line="259" w:lineRule="auto"/>
-            </w:pPr>
-            <w:r>
-              <w:rPr>
-                <w:rFonts w:ascii="Aptos" w:hAnsi="Aptos" w:eastAsia="Microsoft YaHei"/>
-                <w:color w:val="000000"/>
-                <w:sz w:val="17"/>
-              </w:rPr>
-              <w:t>只允许优化快照存储方式</w:t>
-            </w:r>
-          </w:p>
-        </w:tc>
-      </w:tr>
-      <w:tr>
-        <w:trPr>
-          <w:cantSplit/>
-        </w:trPr>
-        <w:tc>
-          <w:tcPr>
-            <w:tcW w:type="dxa" w:w="1152"/>
-            <w:tcMar>
-              <w:top w:w="100" w:type="dxa"/>
-              <w:start w:w="120" w:type="dxa"/>
-              <w:bottom w:w="100" w:type="dxa"/>
-              <w:end w:w="120" w:type="dxa"/>
-            </w:tcMar>
-            <w:vAlign w:val="center"/>
-          </w:tcPr>
-          <w:p>
-            <w:pPr>
-              <w:spacing w:after="0" w:line="259" w:lineRule="auto"/>
-              <w:jc w:val="center"/>
-            </w:pPr>
-            <w:r>
-              <w:rPr>
-                <w:rFonts w:ascii="Aptos" w:hAnsi="Aptos" w:eastAsia="Microsoft YaHei"/>
-                <w:color w:val="000000"/>
-                <w:sz w:val="17"/>
-              </w:rPr>
-              <w:t>ADR 009</w:t>
-            </w:r>
-          </w:p>
-        </w:tc>
-        <w:tc>
-          <w:tcPr>
-            <w:tcW w:type="dxa" w:w="2304"/>
-            <w:tcMar>
-              <w:top w:w="100" w:type="dxa"/>
-              <w:start w:w="120" w:type="dxa"/>
-              <w:bottom w:w="100" w:type="dxa"/>
-              <w:end w:w="120" w:type="dxa"/>
-            </w:tcMar>
-            <w:vAlign w:val="center"/>
-          </w:tcPr>
-          <w:p>
-            <w:pPr>
-              <w:spacing w:after="0" w:line="259" w:lineRule="auto"/>
-            </w:pPr>
-            <w:r>
-              <w:rPr>
-                <w:rFonts w:ascii="Aptos" w:hAnsi="Aptos" w:eastAsia="Microsoft YaHei"/>
-                <w:color w:val="000000"/>
-                <w:sz w:val="17"/>
-              </w:rPr>
-              <w:t>Alembic 管理数据库版本</w:t>
-            </w:r>
-          </w:p>
-        </w:tc>
-        <w:tc>
-          <w:tcPr>
-            <w:tcW w:type="dxa" w:w="3744"/>
-            <w:tcMar>
-              <w:top w:w="100" w:type="dxa"/>
-              <w:start w:w="120" w:type="dxa"/>
-              <w:bottom w:w="100" w:type="dxa"/>
-              <w:end w:w="120" w:type="dxa"/>
-            </w:tcMar>
-            <w:vAlign w:val="center"/>
-          </w:tcPr>
-          <w:p>
-            <w:pPr>
-              <w:spacing w:after="0" w:line="259" w:lineRule="auto"/>
-            </w:pPr>
-            <w:r>
-              <w:rPr>
-                <w:rFonts w:ascii="Aptos" w:hAnsi="Aptos" w:eastAsia="Microsoft YaHei"/>
-                <w:color w:val="000000"/>
-                <w:sz w:val="17"/>
-              </w:rPr>
-              <w:t>让升级 回滚和部署顺序可以复现</w:t>
-            </w:r>
-          </w:p>
-        </w:tc>
-        <w:tc>
-          <w:tcPr>
-            <w:tcW w:type="dxa" w:w="2736"/>
-            <w:tcMar>
-              <w:top w:w="100" w:type="dxa"/>
-              <w:start w:w="120" w:type="dxa"/>
-              <w:bottom w:w="100" w:type="dxa"/>
-              <w:end w:w="120" w:type="dxa"/>
-            </w:tcMar>
-            <w:vAlign w:val="center"/>
-          </w:tcPr>
-          <w:p>
-            <w:pPr>
-              <w:spacing w:after="0" w:line="259" w:lineRule="auto"/>
-            </w:pPr>
-            <w:r>
-              <w:rPr>
-                <w:rFonts w:ascii="Aptos" w:hAnsi="Aptos" w:eastAsia="Microsoft YaHei"/>
-                <w:color w:val="000000"/>
-                <w:sz w:val="17"/>
-              </w:rPr>
-              <w:t>不能退回容器初始化目录直接建业务表</w:t>
-            </w:r>
-          </w:p>
-        </w:tc>
-      </w:tr>
-      <w:tr>
-        <w:trPr>
-          <w:cantSplit/>
-        </w:trPr>
-        <w:tc>
-          <w:tcPr>
-            <w:tcW w:type="dxa" w:w="1152"/>
-            <w:tcMar>
-              <w:top w:w="100" w:type="dxa"/>
-              <w:start w:w="120" w:type="dxa"/>
-              <w:bottom w:w="100" w:type="dxa"/>
-              <w:end w:w="120" w:type="dxa"/>
-            </w:tcMar>
-            <w:vAlign w:val="center"/>
-            <w:shd w:fill="EAF2F8"/>
-          </w:tcPr>
-          <w:p>
-            <w:pPr>
-              <w:spacing w:after="0" w:line="259" w:lineRule="auto"/>
-              <w:jc w:val="center"/>
-            </w:pPr>
-            <w:r>
-              <w:rPr>
-                <w:rFonts w:ascii="Aptos" w:hAnsi="Aptos" w:eastAsia="Microsoft YaHei"/>
-                <w:color w:val="000000"/>
-                <w:sz w:val="17"/>
-              </w:rPr>
-              <w:t>ADR 010</w:t>
-            </w:r>
-          </w:p>
-        </w:tc>
-        <w:tc>
-          <w:tcPr>
-            <w:tcW w:type="dxa" w:w="2304"/>
-            <w:tcMar>
-              <w:top w:w="100" w:type="dxa"/>
-              <w:start w:w="120" w:type="dxa"/>
-              <w:bottom w:w="100" w:type="dxa"/>
-              <w:end w:w="120" w:type="dxa"/>
-            </w:tcMar>
-            <w:vAlign w:val="center"/>
-            <w:shd w:fill="EAF2F8"/>
-          </w:tcPr>
-          <w:p>
-            <w:pPr>
-              <w:spacing w:after="0" w:line="259" w:lineRule="auto"/>
-            </w:pPr>
-            <w:r>
-              <w:rPr>
-                <w:rFonts w:ascii="Aptos" w:hAnsi="Aptos" w:eastAsia="Microsoft YaHei"/>
-                <w:color w:val="000000"/>
-                <w:sz w:val="17"/>
-              </w:rPr>
-              <w:t>统一错误信封和请求上下文</w:t>
-            </w:r>
-          </w:p>
-        </w:tc>
-        <w:tc>
-          <w:tcPr>
-            <w:tcW w:type="dxa" w:w="3744"/>
-            <w:tcMar>
-              <w:top w:w="100" w:type="dxa"/>
-              <w:start w:w="120" w:type="dxa"/>
-              <w:bottom w:w="100" w:type="dxa"/>
-              <w:end w:w="120" w:type="dxa"/>
-            </w:tcMar>
-            <w:vAlign w:val="center"/>
-            <w:shd w:fill="EAF2F8"/>
-          </w:tcPr>
-          <w:p>
-            <w:pPr>
-              <w:spacing w:after="0" w:line="259" w:lineRule="auto"/>
-            </w:pPr>
-            <w:r>
-              <w:rPr>
-                <w:rFonts w:ascii="Aptos" w:hAnsi="Aptos" w:eastAsia="Microsoft YaHei"/>
-                <w:color w:val="000000"/>
-                <w:sz w:val="17"/>
-              </w:rPr>
-              <w:t>客户端和审计可以依靠稳定错误码和请求 ID</w:t>
-            </w:r>
-          </w:p>
-        </w:tc>
-        <w:tc>
-          <w:tcPr>
-            <w:tcW w:type="dxa" w:w="2736"/>
-            <w:tcMar>
-              <w:top w:w="100" w:type="dxa"/>
-              <w:start w:w="120" w:type="dxa"/>
-              <w:bottom w:w="100" w:type="dxa"/>
-              <w:end w:w="120" w:type="dxa"/>
-            </w:tcMar>
-            <w:vAlign w:val="center"/>
-            <w:shd w:fill="EAF2F8"/>
-          </w:tcPr>
-          <w:p>
-            <w:pPr>
-              <w:spacing w:after="0" w:line="259" w:lineRule="auto"/>
-            </w:pPr>
-            <w:r>
-              <w:rPr>
-                <w:rFonts w:ascii="Aptos" w:hAnsi="Aptos" w:eastAsia="Microsoft YaHei"/>
-                <w:color w:val="000000"/>
-                <w:sz w:val="17"/>
-              </w:rPr>
-              <w:t>只允许兼容性扩展</w:t>
-            </w:r>
-          </w:p>
-        </w:tc>
-      </w:tr>
-      <w:tr>
-        <w:trPr>
-          <w:cantSplit/>
-        </w:trPr>
-        <w:tc>
-          <w:tcPr>
-            <w:tcW w:type="dxa" w:w="1152"/>
-            <w:tcMar>
-              <w:top w:w="100" w:type="dxa"/>
-              <w:start w:w="120" w:type="dxa"/>
-              <w:bottom w:w="100" w:type="dxa"/>
-              <w:end w:w="120" w:type="dxa"/>
-            </w:tcMar>
-            <w:vAlign w:val="center"/>
-          </w:tcPr>
-          <w:p>
-            <w:pPr>
-              <w:spacing w:after="0" w:line="259" w:lineRule="auto"/>
-              <w:jc w:val="center"/>
-            </w:pPr>
-            <w:r>
-              <w:rPr>
-                <w:rFonts w:ascii="Aptos" w:hAnsi="Aptos" w:eastAsia="Microsoft YaHei"/>
-                <w:color w:val="000000"/>
-                <w:sz w:val="17"/>
-              </w:rPr>
-              <w:t>ADR 011</w:t>
-            </w:r>
-          </w:p>
-        </w:tc>
-        <w:tc>
-          <w:tcPr>
-            <w:tcW w:type="dxa" w:w="2304"/>
-            <w:tcMar>
-              <w:top w:w="100" w:type="dxa"/>
-              <w:start w:w="120" w:type="dxa"/>
-              <w:bottom w:w="100" w:type="dxa"/>
-              <w:end w:w="120" w:type="dxa"/>
-            </w:tcMar>
-            <w:vAlign w:val="center"/>
-          </w:tcPr>
-          <w:p>
-            <w:pPr>
-              <w:spacing w:after="0" w:line="259" w:lineRule="auto"/>
-            </w:pPr>
-            <w:r>
-              <w:rPr>
-                <w:rFonts w:ascii="Aptos" w:hAnsi="Aptos" w:eastAsia="Microsoft YaHei"/>
-                <w:color w:val="000000"/>
-                <w:sz w:val="17"/>
-              </w:rPr>
-              <w:t>CI Shell 脚本由 Bash 显式调用</w:t>
-            </w:r>
-          </w:p>
-        </w:tc>
-        <w:tc>
-          <w:tcPr>
-            <w:tcW w:type="dxa" w:w="3744"/>
-            <w:tcMar>
-              <w:top w:w="100" w:type="dxa"/>
-              <w:start w:w="120" w:type="dxa"/>
-              <w:bottom w:w="100" w:type="dxa"/>
-              <w:end w:w="120" w:type="dxa"/>
-            </w:tcMar>
-            <w:vAlign w:val="center"/>
-          </w:tcPr>
-          <w:p>
-            <w:pPr>
-              <w:spacing w:after="0" w:line="259" w:lineRule="auto"/>
-            </w:pPr>
-            <w:r>
-              <w:rPr>
-                <w:rFonts w:ascii="Aptos" w:hAnsi="Aptos" w:eastAsia="Microsoft YaHei"/>
-                <w:color w:val="000000"/>
-                <w:sz w:val="17"/>
-              </w:rPr>
-              <w:t>避免 Windows 和 API 上传丢失可执行位</w:t>
-            </w:r>
-          </w:p>
-        </w:tc>
-        <w:tc>
-          <w:tcPr>
-            <w:tcW w:type="dxa" w:w="2736"/>
-            <w:tcMar>
-              <w:top w:w="100" w:type="dxa"/>
-              <w:start w:w="120" w:type="dxa"/>
-              <w:bottom w:w="100" w:type="dxa"/>
-              <w:end w:w="120" w:type="dxa"/>
-            </w:tcMar>
-            <w:vAlign w:val="center"/>
-          </w:tcPr>
-          <w:p>
-            <w:pPr>
-              <w:spacing w:after="0" w:line="259" w:lineRule="auto"/>
-            </w:pPr>
-            <w:r>
-              <w:rPr>
-                <w:rFonts w:ascii="Aptos" w:hAnsi="Aptos" w:eastAsia="Microsoft YaHei"/>
-                <w:color w:val="000000"/>
-                <w:sz w:val="17"/>
-              </w:rPr>
-              <w:t>只有上传链路稳定保留 100755 时才评估简化</w:t>
+              <w:t>不采用</w:t>
             </w:r>
           </w:p>
         </w:tc>
@@ -14200,6 +13617,672 @@
       <w:pPr>
         <w:spacing w:after="40"/>
       </w:pPr>
+    </w:p>
+    <w:p>
+      <w:pPr>
+        <w:pStyle w:val="Heading2"/>
+        <w:keepNext/>
+        <w:keepLines/>
+      </w:pPr>
+      <w:r>
+        <w:rPr>
+          <w:rFonts w:ascii="Aptos" w:hAnsi="Aptos" w:eastAsia="Microsoft YaHei"/>
+          <w:b/>
+          <w:color w:val="000000"/>
+          <w:sz w:val="26"/>
+        </w:rPr>
+        <w:t>九四 实现内容</w:t>
+      </w:r>
+    </w:p>
+    <w:p>
+      <w:pPr>
+        <w:pStyle w:val="ListBullet"/>
+        <w:spacing w:after="50"/>
+      </w:pPr>
+      <w:r>
+        <w:rPr>
+          <w:rFonts w:ascii="Aptos" w:hAnsi="Aptos" w:eastAsia="Microsoft YaHei"/>
+          <w:color w:val="000000"/>
+        </w:rPr>
+        <w:t>新建 fix ci prettier gate 阶段分支</w:t>
+      </w:r>
+    </w:p>
+    <w:p>
+      <w:pPr>
+        <w:pStyle w:val="ListBullet"/>
+        <w:spacing w:after="50"/>
+      </w:pPr>
+      <w:r>
+        <w:rPr>
+          <w:rFonts w:ascii="Aptos" w:hAnsi="Aptos" w:eastAsia="Microsoft YaHei"/>
+          <w:color w:val="000000"/>
+        </w:rPr>
+        <w:t>使用仓库锁定的 Prettier 3 8 1 仅格式化 CI 日志列出的八个文件</w:t>
+      </w:r>
+    </w:p>
+    <w:p>
+      <w:pPr>
+        <w:pStyle w:val="ListBullet"/>
+        <w:spacing w:after="50"/>
+      </w:pPr>
+      <w:r>
+        <w:rPr>
+          <w:rFonts w:ascii="Aptos" w:hAnsi="Aptos" w:eastAsia="Microsoft YaHei"/>
+          <w:color w:val="000000"/>
+        </w:rPr>
+        <w:t>保留现有 Prettier ignore 和检查命令 不降低质量门禁</w:t>
+      </w:r>
+    </w:p>
+    <w:p>
+      <w:pPr>
+        <w:pStyle w:val="ListBullet"/>
+        <w:spacing w:after="50"/>
+      </w:pPr>
+      <w:r>
+        <w:rPr>
+          <w:rFonts w:ascii="Aptos" w:hAnsi="Aptos" w:eastAsia="Microsoft YaHei"/>
+          <w:color w:val="000000"/>
+        </w:rPr>
+        <w:t>阶段完成后创建 PR 等待项目负责人审批 再合并到远端 main</w:t>
+      </w:r>
+    </w:p>
+    <w:p>
+      <w:pPr>
+        <w:pStyle w:val="Heading2"/>
+        <w:keepNext/>
+        <w:keepLines/>
+      </w:pPr>
+      <w:r>
+        <w:rPr>
+          <w:rFonts w:ascii="Aptos" w:hAnsi="Aptos" w:eastAsia="Microsoft YaHei"/>
+          <w:b/>
+          <w:color w:val="000000"/>
+          <w:sz w:val="26"/>
+        </w:rPr>
+        <w:t>九五 验证结果</w:t>
+      </w:r>
+    </w:p>
+    <w:tbl>
+      <w:tblPr>
+        <w:tblW w:type="auto" w:w="0"/>
+        <w:jc w:val="center"/>
+        <w:tblLayout w:type="fixed"/>
+        <w:tblLook w:firstColumn="1" w:firstRow="1" w:lastColumn="0" w:lastRow="0" w:noHBand="0" w:noVBand="1" w:val="04A0"/>
+        <w:tblBorders>
+          <w:top w:val="single" w:sz="6" w:space="0" w:color="D9D9D9"/>
+          <w:left w:val="single" w:sz="6" w:space="0" w:color="D9D9D9"/>
+          <w:bottom w:val="single" w:sz="6" w:space="0" w:color="D9D9D9"/>
+          <w:right w:val="single" w:sz="6" w:space="0" w:color="D9D9D9"/>
+          <w:insideH w:val="single" w:sz="6" w:space="0" w:color="D9D9D9"/>
+          <w:insideV w:val="single" w:sz="6" w:space="0" w:color="D9D9D9"/>
+        </w:tblBorders>
+      </w:tblPr>
+      <w:tblGrid>
+        <w:gridCol w:w="3331"/>
+        <w:gridCol w:w="3331"/>
+        <w:gridCol w:w="3331"/>
+      </w:tblGrid>
+      <w:tr>
+        <w:trPr>
+          <w:tblHeader w:val="true"/>
+          <w:cantSplit/>
+        </w:trPr>
+        <w:tc>
+          <w:tcPr>
+            <w:tcW w:type="dxa" w:w="2376"/>
+            <w:shd w:fill="1F4E78"/>
+            <w:tcMar>
+              <w:top w:w="100" w:type="dxa"/>
+              <w:start w:w="120" w:type="dxa"/>
+              <w:bottom w:w="100" w:type="dxa"/>
+              <w:end w:w="120" w:type="dxa"/>
+            </w:tcMar>
+            <w:vAlign w:val="center"/>
+          </w:tcPr>
+          <w:p>
+            <w:pPr>
+              <w:spacing w:after="0"/>
+              <w:jc w:val="center"/>
+            </w:pPr>
+            <w:r>
+              <w:rPr>
+                <w:rFonts w:ascii="Aptos" w:hAnsi="Aptos" w:eastAsia="Microsoft YaHei"/>
+                <w:b/>
+                <w:color w:val="FFFFFF"/>
+                <w:sz w:val="17"/>
+              </w:rPr>
+              <w:t>验证项</w:t>
+            </w:r>
+          </w:p>
+        </w:tc>
+        <w:tc>
+          <w:tcPr>
+            <w:tcW w:type="dxa" w:w="1440"/>
+            <w:shd w:fill="1F4E78"/>
+            <w:tcMar>
+              <w:top w:w="100" w:type="dxa"/>
+              <w:start w:w="120" w:type="dxa"/>
+              <w:bottom w:w="100" w:type="dxa"/>
+              <w:end w:w="120" w:type="dxa"/>
+            </w:tcMar>
+            <w:vAlign w:val="center"/>
+          </w:tcPr>
+          <w:p>
+            <w:pPr>
+              <w:spacing w:after="0"/>
+              <w:jc w:val="center"/>
+            </w:pPr>
+            <w:r>
+              <w:rPr>
+                <w:rFonts w:ascii="Aptos" w:hAnsi="Aptos" w:eastAsia="Microsoft YaHei"/>
+                <w:b/>
+                <w:color w:val="FFFFFF"/>
+                <w:sz w:val="17"/>
+              </w:rPr>
+              <w:t>结果</w:t>
+            </w:r>
+          </w:p>
+        </w:tc>
+        <w:tc>
+          <w:tcPr>
+            <w:tcW w:type="dxa" w:w="6192"/>
+            <w:shd w:fill="1F4E78"/>
+            <w:tcMar>
+              <w:top w:w="100" w:type="dxa"/>
+              <w:start w:w="120" w:type="dxa"/>
+              <w:bottom w:w="100" w:type="dxa"/>
+              <w:end w:w="120" w:type="dxa"/>
+            </w:tcMar>
+            <w:vAlign w:val="center"/>
+          </w:tcPr>
+          <w:p>
+            <w:pPr>
+              <w:spacing w:after="0"/>
+              <w:jc w:val="center"/>
+            </w:pPr>
+            <w:r>
+              <w:rPr>
+                <w:rFonts w:ascii="Aptos" w:hAnsi="Aptos" w:eastAsia="Microsoft YaHei"/>
+                <w:b/>
+                <w:color w:val="FFFFFF"/>
+                <w:sz w:val="17"/>
+              </w:rPr>
+              <w:t>证据或限制</w:t>
+            </w:r>
+          </w:p>
+        </w:tc>
+      </w:tr>
+      <w:tr>
+        <w:trPr>
+          <w:cantSplit/>
+        </w:trPr>
+        <w:tc>
+          <w:tcPr>
+            <w:tcW w:type="dxa" w:w="2376"/>
+            <w:tcMar>
+              <w:top w:w="100" w:type="dxa"/>
+              <w:start w:w="120" w:type="dxa"/>
+              <w:bottom w:w="100" w:type="dxa"/>
+              <w:end w:w="120" w:type="dxa"/>
+            </w:tcMar>
+            <w:vAlign w:val="center"/>
+          </w:tcPr>
+          <w:p>
+            <w:pPr>
+              <w:spacing w:after="0" w:line="259" w:lineRule="auto"/>
+              <w:jc w:val="center"/>
+            </w:pPr>
+            <w:r>
+              <w:rPr>
+                <w:rFonts w:ascii="Aptos" w:hAnsi="Aptos" w:eastAsia="Microsoft YaHei"/>
+                <w:color w:val="000000"/>
+                <w:sz w:val="17"/>
+              </w:rPr>
+              <w:t>原权限故障</w:t>
+            </w:r>
+          </w:p>
+        </w:tc>
+        <w:tc>
+          <w:tcPr>
+            <w:tcW w:type="dxa" w:w="1440"/>
+            <w:tcMar>
+              <w:top w:w="100" w:type="dxa"/>
+              <w:start w:w="120" w:type="dxa"/>
+              <w:bottom w:w="100" w:type="dxa"/>
+              <w:end w:w="120" w:type="dxa"/>
+            </w:tcMar>
+            <w:vAlign w:val="center"/>
+          </w:tcPr>
+          <w:p>
+            <w:pPr>
+              <w:spacing w:after="0" w:line="259" w:lineRule="auto"/>
+            </w:pPr>
+            <w:r>
+              <w:rPr>
+                <w:rFonts w:ascii="Aptos" w:hAnsi="Aptos" w:eastAsia="Microsoft YaHei"/>
+                <w:color w:val="000000"/>
+                <w:sz w:val="17"/>
+              </w:rPr>
+              <w:t>通过</w:t>
+            </w:r>
+          </w:p>
+        </w:tc>
+        <w:tc>
+          <w:tcPr>
+            <w:tcW w:type="dxa" w:w="6192"/>
+            <w:tcMar>
+              <w:top w:w="100" w:type="dxa"/>
+              <w:start w:w="120" w:type="dxa"/>
+              <w:bottom w:w="100" w:type="dxa"/>
+              <w:end w:w="120" w:type="dxa"/>
+            </w:tcMar>
+            <w:vAlign w:val="center"/>
+          </w:tcPr>
+          <w:p>
+            <w:pPr>
+              <w:spacing w:after="0" w:line="259" w:lineRule="auto"/>
+            </w:pPr>
+            <w:r>
+              <w:rPr>
+                <w:rFonts w:ascii="Aptos" w:hAnsi="Aptos" w:eastAsia="Microsoft YaHei"/>
+                <w:color w:val="000000"/>
+                <w:sz w:val="17"/>
+              </w:rPr>
+              <w:t>GitHub Runner 上 Parallel runner self test 已通过</w:t>
+            </w:r>
+          </w:p>
+        </w:tc>
+      </w:tr>
+      <w:tr>
+        <w:trPr>
+          <w:cantSplit/>
+        </w:trPr>
+        <w:tc>
+          <w:tcPr>
+            <w:tcW w:type="dxa" w:w="2376"/>
+            <w:tcMar>
+              <w:top w:w="100" w:type="dxa"/>
+              <w:start w:w="120" w:type="dxa"/>
+              <w:bottom w:w="100" w:type="dxa"/>
+              <w:end w:w="120" w:type="dxa"/>
+            </w:tcMar>
+            <w:vAlign w:val="center"/>
+            <w:shd w:fill="EAF2F8"/>
+          </w:tcPr>
+          <w:p>
+            <w:pPr>
+              <w:spacing w:after="0" w:line="259" w:lineRule="auto"/>
+              <w:jc w:val="center"/>
+            </w:pPr>
+            <w:r>
+              <w:rPr>
+                <w:rFonts w:ascii="Aptos" w:hAnsi="Aptos" w:eastAsia="Microsoft YaHei"/>
+                <w:color w:val="000000"/>
+                <w:sz w:val="17"/>
+              </w:rPr>
+              <w:t>完整 Prettier 检查</w:t>
+            </w:r>
+          </w:p>
+        </w:tc>
+        <w:tc>
+          <w:tcPr>
+            <w:tcW w:type="dxa" w:w="1440"/>
+            <w:tcMar>
+              <w:top w:w="100" w:type="dxa"/>
+              <w:start w:w="120" w:type="dxa"/>
+              <w:bottom w:w="100" w:type="dxa"/>
+              <w:end w:w="120" w:type="dxa"/>
+            </w:tcMar>
+            <w:vAlign w:val="center"/>
+            <w:shd w:fill="EAF2F8"/>
+          </w:tcPr>
+          <w:p>
+            <w:pPr>
+              <w:spacing w:after="0" w:line="259" w:lineRule="auto"/>
+            </w:pPr>
+            <w:r>
+              <w:rPr>
+                <w:rFonts w:ascii="Aptos" w:hAnsi="Aptos" w:eastAsia="Microsoft YaHei"/>
+                <w:color w:val="000000"/>
+                <w:sz w:val="17"/>
+              </w:rPr>
+              <w:t>通过</w:t>
+            </w:r>
+          </w:p>
+        </w:tc>
+        <w:tc>
+          <w:tcPr>
+            <w:tcW w:type="dxa" w:w="6192"/>
+            <w:tcMar>
+              <w:top w:w="100" w:type="dxa"/>
+              <w:start w:w="120" w:type="dxa"/>
+              <w:bottom w:w="100" w:type="dxa"/>
+              <w:end w:w="120" w:type="dxa"/>
+            </w:tcMar>
+            <w:vAlign w:val="center"/>
+            <w:shd w:fill="EAF2F8"/>
+          </w:tcPr>
+          <w:p>
+            <w:pPr>
+              <w:spacing w:after="0" w:line="259" w:lineRule="auto"/>
+            </w:pPr>
+            <w:r>
+              <w:rPr>
+                <w:rFonts w:ascii="Aptos" w:hAnsi="Aptos" w:eastAsia="Microsoft YaHei"/>
+                <w:color w:val="000000"/>
+                <w:sz w:val="17"/>
+              </w:rPr>
+              <w:t>Prettier 3 8 1 检查整个仓库并返回全部匹配</w:t>
+            </w:r>
+          </w:p>
+        </w:tc>
+      </w:tr>
+      <w:tr>
+        <w:trPr>
+          <w:cantSplit/>
+        </w:trPr>
+        <w:tc>
+          <w:tcPr>
+            <w:tcW w:type="dxa" w:w="2376"/>
+            <w:tcMar>
+              <w:top w:w="100" w:type="dxa"/>
+              <w:start w:w="120" w:type="dxa"/>
+              <w:bottom w:w="100" w:type="dxa"/>
+              <w:end w:w="120" w:type="dxa"/>
+            </w:tcMar>
+            <w:vAlign w:val="center"/>
+          </w:tcPr>
+          <w:p>
+            <w:pPr>
+              <w:spacing w:after="0" w:line="259" w:lineRule="auto"/>
+              <w:jc w:val="center"/>
+            </w:pPr>
+            <w:r>
+              <w:rPr>
+                <w:rFonts w:ascii="Aptos" w:hAnsi="Aptos" w:eastAsia="Microsoft YaHei"/>
+                <w:color w:val="000000"/>
+                <w:sz w:val="17"/>
+              </w:rPr>
+              <w:t>ContractOps 后端门禁</w:t>
+            </w:r>
+          </w:p>
+        </w:tc>
+        <w:tc>
+          <w:tcPr>
+            <w:tcW w:type="dxa" w:w="1440"/>
+            <w:tcMar>
+              <w:top w:w="100" w:type="dxa"/>
+              <w:start w:w="120" w:type="dxa"/>
+              <w:bottom w:w="100" w:type="dxa"/>
+              <w:end w:w="120" w:type="dxa"/>
+            </w:tcMar>
+            <w:vAlign w:val="center"/>
+          </w:tcPr>
+          <w:p>
+            <w:pPr>
+              <w:spacing w:after="0" w:line="259" w:lineRule="auto"/>
+            </w:pPr>
+            <w:r>
+              <w:rPr>
+                <w:rFonts w:ascii="Aptos" w:hAnsi="Aptos" w:eastAsia="Microsoft YaHei"/>
+                <w:color w:val="000000"/>
+                <w:sz w:val="17"/>
+              </w:rPr>
+              <w:t>通过</w:t>
+            </w:r>
+          </w:p>
+        </w:tc>
+        <w:tc>
+          <w:tcPr>
+            <w:tcW w:type="dxa" w:w="6192"/>
+            <w:tcMar>
+              <w:top w:w="100" w:type="dxa"/>
+              <w:start w:w="120" w:type="dxa"/>
+              <w:bottom w:w="100" w:type="dxa"/>
+              <w:end w:w="120" w:type="dxa"/>
+            </w:tcMar>
+            <w:vAlign w:val="center"/>
+          </w:tcPr>
+          <w:p>
+            <w:pPr>
+              <w:spacing w:after="0" w:line="259" w:lineRule="auto"/>
+            </w:pPr>
+            <w:r>
+              <w:rPr>
+                <w:rFonts w:ascii="Aptos" w:hAnsi="Aptos" w:eastAsia="Microsoft YaHei"/>
+                <w:color w:val="000000"/>
+                <w:sz w:val="17"/>
+              </w:rPr>
+              <w:t>Ruff mypy strict 和 24 项 pytest 通过</w:t>
+            </w:r>
+          </w:p>
+        </w:tc>
+      </w:tr>
+      <w:tr>
+        <w:trPr>
+          <w:cantSplit/>
+        </w:trPr>
+        <w:tc>
+          <w:tcPr>
+            <w:tcW w:type="dxa" w:w="2376"/>
+            <w:tcMar>
+              <w:top w:w="100" w:type="dxa"/>
+              <w:start w:w="120" w:type="dxa"/>
+              <w:bottom w:w="100" w:type="dxa"/>
+              <w:end w:w="120" w:type="dxa"/>
+            </w:tcMar>
+            <w:vAlign w:val="center"/>
+            <w:shd w:fill="EAF2F8"/>
+          </w:tcPr>
+          <w:p>
+            <w:pPr>
+              <w:spacing w:after="0" w:line="259" w:lineRule="auto"/>
+              <w:jc w:val="center"/>
+            </w:pPr>
+            <w:r>
+              <w:rPr>
+                <w:rFonts w:ascii="Aptos" w:hAnsi="Aptos" w:eastAsia="Microsoft YaHei"/>
+                <w:color w:val="000000"/>
+                <w:sz w:val="17"/>
+              </w:rPr>
+              <w:t>PR CI</w:t>
+            </w:r>
+          </w:p>
+        </w:tc>
+        <w:tc>
+          <w:tcPr>
+            <w:tcW w:type="dxa" w:w="1440"/>
+            <w:tcMar>
+              <w:top w:w="100" w:type="dxa"/>
+              <w:start w:w="120" w:type="dxa"/>
+              <w:bottom w:w="100" w:type="dxa"/>
+              <w:end w:w="120" w:type="dxa"/>
+            </w:tcMar>
+            <w:vAlign w:val="center"/>
+            <w:shd w:fill="EAF2F8"/>
+          </w:tcPr>
+          <w:p>
+            <w:pPr>
+              <w:spacing w:after="0" w:line="259" w:lineRule="auto"/>
+            </w:pPr>
+            <w:r>
+              <w:rPr>
+                <w:rFonts w:ascii="Aptos" w:hAnsi="Aptos" w:eastAsia="Microsoft YaHei"/>
+                <w:color w:val="000000"/>
+                <w:sz w:val="17"/>
+              </w:rPr>
+              <w:t>待执行</w:t>
+            </w:r>
+          </w:p>
+        </w:tc>
+        <w:tc>
+          <w:tcPr>
+            <w:tcW w:type="dxa" w:w="6192"/>
+            <w:tcMar>
+              <w:top w:w="100" w:type="dxa"/>
+              <w:start w:w="120" w:type="dxa"/>
+              <w:bottom w:w="100" w:type="dxa"/>
+              <w:end w:w="120" w:type="dxa"/>
+            </w:tcMar>
+            <w:vAlign w:val="center"/>
+            <w:shd w:fill="EAF2F8"/>
+          </w:tcPr>
+          <w:p>
+            <w:pPr>
+              <w:spacing w:after="0" w:line="259" w:lineRule="auto"/>
+            </w:pPr>
+            <w:r>
+              <w:rPr>
+                <w:rFonts w:ascii="Aptos" w:hAnsi="Aptos" w:eastAsia="Microsoft YaHei"/>
+                <w:color w:val="000000"/>
+                <w:sz w:val="17"/>
+              </w:rPr>
+              <w:t>分支提交和 PR 尚待创建</w:t>
+            </w:r>
+          </w:p>
+        </w:tc>
+      </w:tr>
+      <w:tr>
+        <w:trPr>
+          <w:cantSplit/>
+        </w:trPr>
+        <w:tc>
+          <w:tcPr>
+            <w:tcW w:type="dxa" w:w="2376"/>
+            <w:tcMar>
+              <w:top w:w="100" w:type="dxa"/>
+              <w:start w:w="120" w:type="dxa"/>
+              <w:bottom w:w="100" w:type="dxa"/>
+              <w:end w:w="120" w:type="dxa"/>
+            </w:tcMar>
+            <w:vAlign w:val="center"/>
+          </w:tcPr>
+          <w:p>
+            <w:pPr>
+              <w:spacing w:after="0" w:line="259" w:lineRule="auto"/>
+              <w:jc w:val="center"/>
+            </w:pPr>
+            <w:r>
+              <w:rPr>
+                <w:rFonts w:ascii="Aptos" w:hAnsi="Aptos" w:eastAsia="Microsoft YaHei"/>
+                <w:color w:val="000000"/>
+                <w:sz w:val="17"/>
+              </w:rPr>
+              <w:t>合并 main</w:t>
+            </w:r>
+          </w:p>
+        </w:tc>
+        <w:tc>
+          <w:tcPr>
+            <w:tcW w:type="dxa" w:w="1440"/>
+            <w:tcMar>
+              <w:top w:w="100" w:type="dxa"/>
+              <w:start w:w="120" w:type="dxa"/>
+              <w:bottom w:w="100" w:type="dxa"/>
+              <w:end w:w="120" w:type="dxa"/>
+            </w:tcMar>
+            <w:vAlign w:val="center"/>
+          </w:tcPr>
+          <w:p>
+            <w:pPr>
+              <w:spacing w:after="0" w:line="259" w:lineRule="auto"/>
+            </w:pPr>
+            <w:r>
+              <w:rPr>
+                <w:rFonts w:ascii="Aptos" w:hAnsi="Aptos" w:eastAsia="Microsoft YaHei"/>
+                <w:color w:val="000000"/>
+                <w:sz w:val="17"/>
+              </w:rPr>
+              <w:t>待审批</w:t>
+            </w:r>
+          </w:p>
+        </w:tc>
+        <w:tc>
+          <w:tcPr>
+            <w:tcW w:type="dxa" w:w="6192"/>
+            <w:tcMar>
+              <w:top w:w="100" w:type="dxa"/>
+              <w:start w:w="120" w:type="dxa"/>
+              <w:bottom w:w="100" w:type="dxa"/>
+              <w:end w:w="120" w:type="dxa"/>
+            </w:tcMar>
+            <w:vAlign w:val="center"/>
+          </w:tcPr>
+          <w:p>
+            <w:pPr>
+              <w:spacing w:after="0" w:line="259" w:lineRule="auto"/>
+            </w:pPr>
+            <w:r>
+              <w:rPr>
+                <w:rFonts w:ascii="Aptos" w:hAnsi="Aptos" w:eastAsia="Microsoft YaHei"/>
+                <w:color w:val="000000"/>
+                <w:sz w:val="17"/>
+              </w:rPr>
+              <w:t>只有项目负责人批准后执行</w:t>
+            </w:r>
+          </w:p>
+        </w:tc>
+      </w:tr>
+    </w:tbl>
+    <w:p>
+      <w:pPr>
+        <w:spacing w:after="40"/>
+      </w:pPr>
+    </w:p>
+    <w:p>
+      <w:pPr>
+        <w:pStyle w:val="Heading2"/>
+        <w:keepNext/>
+        <w:keepLines/>
+      </w:pPr>
+      <w:r>
+        <w:rPr>
+          <w:rFonts w:ascii="Aptos" w:hAnsi="Aptos" w:eastAsia="Microsoft YaHei"/>
+          <w:b/>
+          <w:color w:val="000000"/>
+          <w:sz w:val="26"/>
+        </w:rPr>
+        <w:t>九六 后续动作</w:t>
+      </w:r>
+    </w:p>
+    <w:p>
+      <w:pPr>
+        <w:spacing w:after="60"/>
+        <w:ind w:left="317" w:hanging="317"/>
+      </w:pPr>
+      <w:r>
+        <w:rPr>
+          <w:rFonts w:ascii="Aptos" w:hAnsi="Aptos" w:eastAsia="Microsoft YaHei"/>
+          <w:color w:val="000000"/>
+        </w:rPr>
+        <w:t>1.  提交阶段分支并通过 GitHub API 推送远端分支</w:t>
+      </w:r>
+    </w:p>
+    <w:p>
+      <w:pPr>
+        <w:spacing w:after="60"/>
+        <w:ind w:left="317" w:hanging="317"/>
+      </w:pPr>
+      <w:r>
+        <w:rPr>
+          <w:rFonts w:ascii="Aptos" w:hAnsi="Aptos" w:eastAsia="Microsoft YaHei"/>
+          <w:color w:val="000000"/>
+        </w:rPr>
+        <w:t>2.  创建 PR 并观察全部 Actions 结果</w:t>
+      </w:r>
+    </w:p>
+    <w:p>
+      <w:pPr>
+        <w:spacing w:after="60"/>
+        <w:ind w:left="317" w:hanging="317"/>
+      </w:pPr>
+      <w:r>
+        <w:rPr>
+          <w:rFonts w:ascii="Aptos" w:hAnsi="Aptos" w:eastAsia="Microsoft YaHei"/>
+          <w:color w:val="000000"/>
+        </w:rPr>
+        <w:t>3.  向项目负责人提交 PR 链接和验证证据 等待明确审批</w:t>
+      </w:r>
     </w:p>
     <w:p>
       <w:pPr>
@@ -14214,7 +14297,7 @@
           <w:color w:val="000000"/>
           <w:sz w:val="32"/>
         </w:rPr>
-        <w:t>十 风险登记</w:t>
+        <w:t>十 当前决策记录</w:t>
       </w:r>
     </w:p>
     <w:tbl>
@@ -14245,7 +14328,7 @@
         </w:trPr>
         <w:tc>
           <w:tcPr>
-            <w:tcW w:type="dxa" w:w="2088"/>
+            <w:tcW w:type="dxa" w:w="1152"/>
             <w:shd w:fill="1F4E78"/>
             <w:tcMar>
               <w:top w:w="100" w:type="dxa"/>
@@ -14267,13 +14350,13 @@
                 <w:color w:val="FFFFFF"/>
                 <w:sz w:val="17"/>
               </w:rPr>
-              <w:t>风险</w:t>
-            </w:r>
-          </w:p>
-        </w:tc>
-        <w:tc>
-          <w:tcPr>
-            <w:tcW w:type="dxa" w:w="2232"/>
+              <w:t>编号</w:t>
+            </w:r>
+          </w:p>
+        </w:tc>
+        <w:tc>
+          <w:tcPr>
+            <w:tcW w:type="dxa" w:w="2304"/>
             <w:shd w:fill="1F4E78"/>
             <w:tcMar>
               <w:top w:w="100" w:type="dxa"/>
@@ -14295,13 +14378,13 @@
                 <w:color w:val="FFFFFF"/>
                 <w:sz w:val="17"/>
               </w:rPr>
-              <w:t>影响</w:t>
-            </w:r>
-          </w:p>
-        </w:tc>
-        <w:tc>
-          <w:tcPr>
-            <w:tcW w:type="dxa" w:w="3528"/>
+              <w:t>决策</w:t>
+            </w:r>
+          </w:p>
+        </w:tc>
+        <w:tc>
+          <w:tcPr>
+            <w:tcW w:type="dxa" w:w="3744"/>
             <w:shd w:fill="1F4E78"/>
             <w:tcMar>
               <w:top w:w="100" w:type="dxa"/>
@@ -14323,13 +14406,13 @@
                 <w:color w:val="FFFFFF"/>
                 <w:sz w:val="17"/>
               </w:rPr>
-              <w:t>当前控制</w:t>
-            </w:r>
-          </w:p>
-        </w:tc>
-        <w:tc>
-          <w:tcPr>
-            <w:tcW w:type="dxa" w:w="2088"/>
+              <w:t>原因</w:t>
+            </w:r>
+          </w:p>
+        </w:tc>
+        <w:tc>
+          <w:tcPr>
+            <w:tcW w:type="dxa" w:w="2736"/>
             <w:shd w:fill="1F4E78"/>
             <w:tcMar>
               <w:top w:w="100" w:type="dxa"/>
@@ -14351,7 +14434,7 @@
                 <w:color w:val="FFFFFF"/>
                 <w:sz w:val="17"/>
               </w:rPr>
-              <w:t>后续验证</w:t>
+              <w:t>重新评估条件</w:t>
             </w:r>
           </w:p>
         </w:tc>
@@ -14362,7 +14445,7 @@
         </w:trPr>
         <w:tc>
           <w:tcPr>
-            <w:tcW w:type="dxa" w:w="2088"/>
+            <w:tcW w:type="dxa" w:w="1152"/>
             <w:tcMar>
               <w:top w:w="100" w:type="dxa"/>
               <w:start w:w="120" w:type="dxa"/>
@@ -14382,13 +14465,13 @@
                 <w:color w:val="000000"/>
                 <w:sz w:val="17"/>
               </w:rPr>
-              <w:t>审批策略配置错误</w:t>
-            </w:r>
-          </w:p>
-        </w:tc>
-        <w:tc>
-          <w:tcPr>
-            <w:tcW w:type="dxa" w:w="2232"/>
+              <w:t>ADR 001</w:t>
+            </w:r>
+          </w:p>
+        </w:tc>
+        <w:tc>
+          <w:tcPr>
+            <w:tcW w:type="dxa" w:w="2304"/>
             <w:tcMar>
               <w:top w:w="100" w:type="dxa"/>
               <w:start w:w="120" w:type="dxa"/>
@@ -14407,13 +14490,13 @@
                 <w:color w:val="000000"/>
                 <w:sz w:val="17"/>
               </w:rPr>
-              <w:t>错误人员审批或必要步骤被跳过</w:t>
-            </w:r>
-          </w:p>
-        </w:tc>
-        <w:tc>
-          <w:tcPr>
-            <w:tcW w:type="dxa" w:w="3528"/>
+              <w:t>主线改为 ContractOps</w:t>
+            </w:r>
+          </w:p>
+        </w:tc>
+        <w:tc>
+          <w:tcPr>
+            <w:tcW w:type="dxa" w:w="3744"/>
             <w:tcMar>
               <w:top w:w="100" w:type="dxa"/>
               <w:start w:w="120" w:type="dxa"/>
@@ -14432,13 +14515,13 @@
                 <w:color w:val="000000"/>
                 <w:sz w:val="17"/>
               </w:rPr>
-              <w:t>受控条件 策略发布和实例快照</w:t>
-            </w:r>
-          </w:p>
-        </w:tc>
-        <w:tc>
-          <w:tcPr>
-            <w:tcW w:type="dxa" w:w="2088"/>
+              <w:t>缩小范围并提高后端实现深度</w:t>
+            </w:r>
+          </w:p>
+        </w:tc>
+        <w:tc>
+          <w:tcPr>
+            <w:tcW w:type="dxa" w:w="2736"/>
             <w:tcMar>
               <w:top w:w="100" w:type="dxa"/>
               <w:start w:w="120" w:type="dxa"/>
@@ -14457,7 +14540,7 @@
                 <w:color w:val="000000"/>
                 <w:sz w:val="17"/>
               </w:rPr>
-              <w:t>策略模拟测试和高金额样本回放</w:t>
+              <w:t>合同场景缺少可用数据或无法形成闭环</w:t>
             </w:r>
           </w:p>
         </w:tc>
@@ -14468,7 +14551,7 @@
         </w:trPr>
         <w:tc>
           <w:tcPr>
-            <w:tcW w:type="dxa" w:w="2088"/>
+            <w:tcW w:type="dxa" w:w="1152"/>
             <w:tcMar>
               <w:top w:w="100" w:type="dxa"/>
               <w:start w:w="120" w:type="dxa"/>
@@ -14489,13 +14572,13 @@
                 <w:color w:val="000000"/>
                 <w:sz w:val="17"/>
               </w:rPr>
-              <w:t>模型生成无依据风险</w:t>
-            </w:r>
-          </w:p>
-        </w:tc>
-        <w:tc>
-          <w:tcPr>
-            <w:tcW w:type="dxa" w:w="2232"/>
+              <w:t>ADR 002</w:t>
+            </w:r>
+          </w:p>
+        </w:tc>
+        <w:tc>
+          <w:tcPr>
+            <w:tcW w:type="dxa" w:w="2304"/>
             <w:tcMar>
               <w:top w:w="100" w:type="dxa"/>
               <w:start w:w="120" w:type="dxa"/>
@@ -14515,13 +14598,13 @@
                 <w:color w:val="000000"/>
                 <w:sz w:val="17"/>
               </w:rPr>
-              <w:t>错误提示或遗漏关键条款</w:t>
-            </w:r>
-          </w:p>
-        </w:tc>
-        <w:tc>
-          <w:tcPr>
-            <w:tcW w:type="dxa" w:w="3528"/>
+              <w:t>模块化单体加 Worker</w:t>
+            </w:r>
+          </w:p>
+        </w:tc>
+        <w:tc>
+          <w:tcPr>
+            <w:tcW w:type="dxa" w:w="3744"/>
             <w:tcMar>
               <w:top w:w="100" w:type="dxa"/>
               <w:start w:w="120" w:type="dxa"/>
@@ -14541,13 +14624,13 @@
                 <w:color w:val="000000"/>
                 <w:sz w:val="17"/>
               </w:rPr>
-              <w:t>模型只生成草稿并保存版本 页码和原文</w:t>
-            </w:r>
-          </w:p>
-        </w:tc>
-        <w:tc>
-          <w:tcPr>
-            <w:tcW w:type="dxa" w:w="2088"/>
+              <w:t>保留领域事务并隔离长任务</w:t>
+            </w:r>
+          </w:p>
+        </w:tc>
+        <w:tc>
+          <w:tcPr>
+            <w:tcW w:type="dxa" w:w="2736"/>
             <w:tcMar>
               <w:top w:w="100" w:type="dxa"/>
               <w:start w:w="120" w:type="dxa"/>
@@ -14567,7 +14650,7 @@
                 <w:color w:val="000000"/>
                 <w:sz w:val="17"/>
               </w:rPr>
-              <w:t>建立引用准确率和风险召回评测集</w:t>
+              <w:t>检索或调度需要独立扩容</w:t>
             </w:r>
           </w:p>
         </w:tc>
@@ -14578,7 +14661,7 @@
         </w:trPr>
         <w:tc>
           <w:tcPr>
-            <w:tcW w:type="dxa" w:w="2088"/>
+            <w:tcW w:type="dxa" w:w="1152"/>
             <w:tcMar>
               <w:top w:w="100" w:type="dxa"/>
               <w:start w:w="120" w:type="dxa"/>
@@ -14598,13 +14681,13 @@
                 <w:color w:val="000000"/>
                 <w:sz w:val="17"/>
               </w:rPr>
-              <w:t>跨租户数据泄露</w:t>
-            </w:r>
-          </w:p>
-        </w:tc>
-        <w:tc>
-          <w:tcPr>
-            <w:tcW w:type="dxa" w:w="2232"/>
+              <w:t>ADR 003</w:t>
+            </w:r>
+          </w:p>
+        </w:tc>
+        <w:tc>
+          <w:tcPr>
+            <w:tcW w:type="dxa" w:w="2304"/>
             <w:tcMar>
               <w:top w:w="100" w:type="dxa"/>
               <w:start w:w="120" w:type="dxa"/>
@@ -14623,13 +14706,13 @@
                 <w:color w:val="000000"/>
                 <w:sz w:val="17"/>
               </w:rPr>
-              <w:t>合同和商业信息外泄</w:t>
-            </w:r>
-          </w:p>
-        </w:tc>
-        <w:tc>
-          <w:tcPr>
-            <w:tcW w:type="dxa" w:w="3528"/>
+              <w:t>PostgreSQL 加 pgvector</w:t>
+            </w:r>
+          </w:p>
+        </w:tc>
+        <w:tc>
+          <w:tcPr>
+            <w:tcW w:type="dxa" w:w="3744"/>
             <w:tcMar>
               <w:top w:w="100" w:type="dxa"/>
               <w:start w:w="120" w:type="dxa"/>
@@ -14648,13 +14731,13 @@
                 <w:color w:val="000000"/>
                 <w:sz w:val="17"/>
               </w:rPr>
-              <w:t>独立应用角色 FORCE RLS 对象键带租户</w:t>
-            </w:r>
-          </w:p>
-        </w:tc>
-        <w:tc>
-          <w:tcPr>
-            <w:tcW w:type="dxa" w:w="2088"/>
+              <w:t>一个系统完成事务 全文和向量存储</w:t>
+            </w:r>
+          </w:p>
+        </w:tc>
+        <w:tc>
+          <w:tcPr>
+            <w:tcW w:type="dxa" w:w="2736"/>
             <w:tcMar>
               <w:top w:w="100" w:type="dxa"/>
               <w:start w:w="120" w:type="dxa"/>
@@ -14673,7 +14756,7 @@
                 <w:color w:val="000000"/>
                 <w:sz w:val="17"/>
               </w:rPr>
-              <w:t>集成测试和恶意越权测试</w:t>
+              <w:t>规模或中文召回达到明确瓶颈</w:t>
             </w:r>
           </w:p>
         </w:tc>
@@ -14684,7 +14767,7 @@
         </w:trPr>
         <w:tc>
           <w:tcPr>
-            <w:tcW w:type="dxa" w:w="2088"/>
+            <w:tcW w:type="dxa" w:w="1152"/>
             <w:tcMar>
               <w:top w:w="100" w:type="dxa"/>
               <w:start w:w="120" w:type="dxa"/>
@@ -14705,13 +14788,13 @@
                 <w:color w:val="000000"/>
                 <w:sz w:val="17"/>
               </w:rPr>
-              <w:t>恶意合同内容</w:t>
-            </w:r>
-          </w:p>
-        </w:tc>
-        <w:tc>
-          <w:tcPr>
-            <w:tcW w:type="dxa" w:w="2232"/>
+              <w:t>ADR 004</w:t>
+            </w:r>
+          </w:p>
+        </w:tc>
+        <w:tc>
+          <w:tcPr>
+            <w:tcW w:type="dxa" w:w="2304"/>
             <w:tcMar>
               <w:top w:w="100" w:type="dxa"/>
               <w:start w:w="120" w:type="dxa"/>
@@ -14731,13 +14814,13 @@
                 <w:color w:val="000000"/>
                 <w:sz w:val="17"/>
               </w:rPr>
-              <w:t>Prompt 注入或解析器攻击</w:t>
-            </w:r>
-          </w:p>
-        </w:tc>
-        <w:tc>
-          <w:tcPr>
-            <w:tcW w:type="dxa" w:w="3528"/>
+              <w:t>Redis Streams 作为首版队列</w:t>
+            </w:r>
+          </w:p>
+        </w:tc>
+        <w:tc>
+          <w:tcPr>
+            <w:tcW w:type="dxa" w:w="3744"/>
             <w:tcMar>
               <w:top w:w="100" w:type="dxa"/>
               <w:start w:w="120" w:type="dxa"/>
@@ -14757,13 +14840,13 @@
                 <w:color w:val="000000"/>
                 <w:sz w:val="17"/>
               </w:rPr>
-              <w:t>模型不执行合同内指令 工具默认关闭</w:t>
-            </w:r>
-          </w:p>
-        </w:tc>
-        <w:tc>
-          <w:tcPr>
-            <w:tcW w:type="dxa" w:w="2088"/>
+              <w:t>本地成本低 支持消费组和消息重领</w:t>
+            </w:r>
+          </w:p>
+        </w:tc>
+        <w:tc>
+          <w:tcPr>
+            <w:tcW w:type="dxa" w:w="2736"/>
             <w:tcMar>
               <w:top w:w="100" w:type="dxa"/>
               <w:start w:w="120" w:type="dxa"/>
@@ -14783,7 +14866,7 @@
                 <w:color w:val="000000"/>
                 <w:sz w:val="17"/>
               </w:rPr>
-              <w:t>恶意样本和文件沙箱测试</w:t>
+              <w:t>需要长期回放或更高吞吐</w:t>
             </w:r>
           </w:p>
         </w:tc>
@@ -14794,7 +14877,7 @@
         </w:trPr>
         <w:tc>
           <w:tcPr>
-            <w:tcW w:type="dxa" w:w="2088"/>
+            <w:tcW w:type="dxa" w:w="1152"/>
             <w:tcMar>
               <w:top w:w="100" w:type="dxa"/>
               <w:start w:w="120" w:type="dxa"/>
@@ -14814,13 +14897,13 @@
                 <w:color w:val="000000"/>
                 <w:sz w:val="17"/>
               </w:rPr>
-              <w:t>重复任务和提醒</w:t>
-            </w:r>
-          </w:p>
-        </w:tc>
-        <w:tc>
-          <w:tcPr>
-            <w:tcW w:type="dxa" w:w="2232"/>
+              <w:t>ADR 005</w:t>
+            </w:r>
+          </w:p>
+        </w:tc>
+        <w:tc>
+          <w:tcPr>
+            <w:tcW w:type="dxa" w:w="2304"/>
             <w:tcMar>
               <w:top w:w="100" w:type="dxa"/>
               <w:start w:w="120" w:type="dxa"/>
@@ -14839,13 +14922,13 @@
                 <w:color w:val="000000"/>
                 <w:sz w:val="17"/>
               </w:rPr>
-              <w:t>重复审查 重复通知</w:t>
-            </w:r>
-          </w:p>
-        </w:tc>
-        <w:tc>
-          <w:tcPr>
-            <w:tcW w:type="dxa" w:w="3528"/>
+              <w:t>应用权限加 PostgreSQL RLS</w:t>
+            </w:r>
+          </w:p>
+        </w:tc>
+        <w:tc>
+          <w:tcPr>
+            <w:tcW w:type="dxa" w:w="3744"/>
             <w:tcMar>
               <w:top w:w="100" w:type="dxa"/>
               <w:start w:w="120" w:type="dxa"/>
@@ -14864,13 +14947,13 @@
                 <w:color w:val="000000"/>
                 <w:sz w:val="17"/>
               </w:rPr>
-              <w:t>幂等表 Outbox 唯一键设计</w:t>
-            </w:r>
-          </w:p>
-        </w:tc>
-        <w:tc>
-          <w:tcPr>
-            <w:tcW w:type="dxa" w:w="2088"/>
+              <w:t>防止查询条件遗漏导致跨租户读取</w:t>
+            </w:r>
+          </w:p>
+        </w:tc>
+        <w:tc>
+          <w:tcPr>
+            <w:tcW w:type="dxa" w:w="2736"/>
             <w:tcMar>
               <w:top w:w="100" w:type="dxa"/>
               <w:start w:w="120" w:type="dxa"/>
@@ -14889,7 +14972,7 @@
                 <w:color w:val="000000"/>
                 <w:sz w:val="17"/>
               </w:rPr>
-              <w:t>Worker 崩溃和重复投递测试</w:t>
+              <w:t>不能删除 只允许调整实现</w:t>
             </w:r>
           </w:p>
         </w:tc>
@@ -14900,7 +14983,7 @@
         </w:trPr>
         <w:tc>
           <w:tcPr>
-            <w:tcW w:type="dxa" w:w="2088"/>
+            <w:tcW w:type="dxa" w:w="1152"/>
             <w:tcMar>
               <w:top w:w="100" w:type="dxa"/>
               <w:start w:w="120" w:type="dxa"/>
@@ -14921,13 +15004,13 @@
                 <w:color w:val="000000"/>
                 <w:sz w:val="17"/>
               </w:rPr>
-              <w:t>解析定位错误</w:t>
-            </w:r>
-          </w:p>
-        </w:tc>
-        <w:tc>
-          <w:tcPr>
-            <w:tcW w:type="dxa" w:w="2232"/>
+              <w:t>ADR 006</w:t>
+            </w:r>
+          </w:p>
+        </w:tc>
+        <w:tc>
+          <w:tcPr>
+            <w:tcW w:type="dxa" w:w="2304"/>
             <w:tcMar>
               <w:top w:w="100" w:type="dxa"/>
               <w:start w:w="120" w:type="dxa"/>
@@ -14947,13 +15030,13 @@
                 <w:color w:val="000000"/>
                 <w:sz w:val="17"/>
               </w:rPr>
-              <w:t>引用页码不准确</w:t>
-            </w:r>
-          </w:p>
-        </w:tc>
-        <w:tc>
-          <w:tcPr>
-            <w:tcW w:type="dxa" w:w="3528"/>
+              <w:t>关键法律和审批决定由人完成</w:t>
+            </w:r>
+          </w:p>
+        </w:tc>
+        <w:tc>
+          <w:tcPr>
+            <w:tcW w:type="dxa" w:w="3744"/>
             <w:tcMar>
               <w:top w:w="100" w:type="dxa"/>
               <w:start w:w="120" w:type="dxa"/>
@@ -14973,13 +15056,13 @@
                 <w:color w:val="000000"/>
                 <w:sz w:val="17"/>
               </w:rPr>
-              <w:t>保存版本 Chunk 页码和 parser version</w:t>
-            </w:r>
-          </w:p>
-        </w:tc>
-        <w:tc>
-          <w:tcPr>
-            <w:tcW w:type="dxa" w:w="2088"/>
+              <w:t>模型输出存在错误和法律责任边界</w:t>
+            </w:r>
+          </w:p>
+        </w:tc>
+        <w:tc>
+          <w:tcPr>
+            <w:tcW w:type="dxa" w:w="2736"/>
             <w:tcMar>
               <w:top w:w="100" w:type="dxa"/>
               <w:start w:w="120" w:type="dxa"/>
@@ -14999,7 +15082,7 @@
                 <w:color w:val="000000"/>
                 <w:sz w:val="17"/>
               </w:rPr>
-              <w:t>人工标注样本比对</w:t>
+              <w:t>不能删除</w:t>
             </w:r>
           </w:p>
         </w:tc>
@@ -15010,7 +15093,7 @@
         </w:trPr>
         <w:tc>
           <w:tcPr>
-            <w:tcW w:type="dxa" w:w="2088"/>
+            <w:tcW w:type="dxa" w:w="1152"/>
             <w:tcMar>
               <w:top w:w="100" w:type="dxa"/>
               <w:start w:w="120" w:type="dxa"/>
@@ -15030,13 +15113,13 @@
                 <w:color w:val="000000"/>
                 <w:sz w:val="17"/>
               </w:rPr>
-              <w:t>合同修订覆盖历史</w:t>
-            </w:r>
-          </w:p>
-        </w:tc>
-        <w:tc>
-          <w:tcPr>
-            <w:tcW w:type="dxa" w:w="2232"/>
+              <w:t>ADR 007</w:t>
+            </w:r>
+          </w:p>
+        </w:tc>
+        <w:tc>
+          <w:tcPr>
+            <w:tcW w:type="dxa" w:w="2304"/>
             <w:tcMar>
               <w:top w:w="100" w:type="dxa"/>
               <w:start w:w="120" w:type="dxa"/>
@@ -15055,13 +15138,13 @@
                 <w:color w:val="000000"/>
                 <w:sz w:val="17"/>
               </w:rPr>
-              <w:t>审计链丢失</w:t>
-            </w:r>
-          </w:p>
-        </w:tc>
-        <w:tc>
-          <w:tcPr>
-            <w:tcW w:type="dxa" w:w="3528"/>
+              <w:t>主线改为审批与履约风控</w:t>
+            </w:r>
+          </w:p>
+        </w:tc>
+        <w:tc>
+          <w:tcPr>
+            <w:tcW w:type="dxa" w:w="3744"/>
             <w:tcMar>
               <w:top w:w="100" w:type="dxa"/>
               <w:start w:w="120" w:type="dxa"/>
@@ -15080,13 +15163,13 @@
                 <w:color w:val="000000"/>
                 <w:sz w:val="17"/>
               </w:rPr>
-              <w:t>版本不可变 驳回后创建新版本</w:t>
-            </w:r>
-          </w:p>
-        </w:tc>
-        <w:tc>
-          <w:tcPr>
-            <w:tcW w:type="dxa" w:w="2088"/>
+              <w:t>避免退化为 PDF 检查工具并突出企业后端能力</w:t>
+            </w:r>
+          </w:p>
+        </w:tc>
+        <w:tc>
+          <w:tcPr>
+            <w:tcW w:type="dxa" w:w="2736"/>
             <w:tcMar>
               <w:top w:w="100" w:type="dxa"/>
               <w:start w:w="120" w:type="dxa"/>
@@ -15105,7 +15188,7 @@
                 <w:color w:val="000000"/>
                 <w:sz w:val="17"/>
               </w:rPr>
-              <w:t>版本 Diff 和回滚测试</w:t>
+              <w:t>审批或履约场景无法形成可运行闭环</w:t>
             </w:r>
           </w:p>
         </w:tc>
@@ -15116,7 +15199,7 @@
         </w:trPr>
         <w:tc>
           <w:tcPr>
-            <w:tcW w:type="dxa" w:w="2088"/>
+            <w:tcW w:type="dxa" w:w="1152"/>
             <w:tcMar>
               <w:top w:w="100" w:type="dxa"/>
               <w:start w:w="120" w:type="dxa"/>
@@ -15137,13 +15220,13 @@
                 <w:color w:val="000000"/>
                 <w:sz w:val="17"/>
               </w:rPr>
-              <w:t>迁移权限泄露给运行服务</w:t>
-            </w:r>
-          </w:p>
-        </w:tc>
-        <w:tc>
-          <w:tcPr>
-            <w:tcW w:type="dxa" w:w="2232"/>
+              <w:t>ADR 008</w:t>
+            </w:r>
+          </w:p>
+        </w:tc>
+        <w:tc>
+          <w:tcPr>
+            <w:tcW w:type="dxa" w:w="2304"/>
             <w:tcMar>
               <w:top w:w="100" w:type="dxa"/>
               <w:start w:w="120" w:type="dxa"/>
@@ -15163,13 +15246,13 @@
                 <w:color w:val="000000"/>
                 <w:sz w:val="17"/>
               </w:rPr>
-              <w:t>应用漏洞可能修改结构或绕过隔离</w:t>
-            </w:r>
-          </w:p>
-        </w:tc>
-        <w:tc>
-          <w:tcPr>
-            <w:tcW w:type="dxa" w:w="3528"/>
+              <w:t>审批实例保存策略快照</w:t>
+            </w:r>
+          </w:p>
+        </w:tc>
+        <w:tc>
+          <w:tcPr>
+            <w:tcW w:type="dxa" w:w="3744"/>
             <w:tcMar>
               <w:top w:w="100" w:type="dxa"/>
               <w:start w:w="120" w:type="dxa"/>
@@ -15189,13 +15272,13 @@
                 <w:color w:val="000000"/>
                 <w:sz w:val="17"/>
               </w:rPr>
-              <w:t>迁移 URL 与运行 URL 分离 migrate 服务短期运行</w:t>
-            </w:r>
-          </w:p>
-        </w:tc>
-        <w:tc>
-          <w:tcPr>
-            <w:tcW w:type="dxa" w:w="2088"/>
+              <w:t>避免流程中途因策略变更产生不一致</w:t>
+            </w:r>
+          </w:p>
+        </w:tc>
+        <w:tc>
+          <w:tcPr>
+            <w:tcW w:type="dxa" w:w="2736"/>
             <w:tcMar>
               <w:top w:w="100" w:type="dxa"/>
               <w:start w:w="120" w:type="dxa"/>
@@ -15215,7 +15298,7 @@
                 <w:color w:val="000000"/>
                 <w:sz w:val="17"/>
               </w:rPr>
-              <w:t>CI 检查运行角色权限和生产密钥配置</w:t>
+              <w:t>只允许优化快照存储方式</w:t>
             </w:r>
           </w:p>
         </w:tc>
@@ -15226,7 +15309,7 @@
         </w:trPr>
         <w:tc>
           <w:tcPr>
-            <w:tcW w:type="dxa" w:w="2088"/>
+            <w:tcW w:type="dxa" w:w="1152"/>
             <w:tcMar>
               <w:top w:w="100" w:type="dxa"/>
               <w:start w:w="120" w:type="dxa"/>
@@ -15246,13 +15329,13 @@
                 <w:color w:val="000000"/>
                 <w:sz w:val="17"/>
               </w:rPr>
-              <w:t>跨平台文件模式丢失</w:t>
-            </w:r>
-          </w:p>
-        </w:tc>
-        <w:tc>
-          <w:tcPr>
-            <w:tcW w:type="dxa" w:w="2232"/>
+              <w:t>ADR 009</w:t>
+            </w:r>
+          </w:p>
+        </w:tc>
+        <w:tc>
+          <w:tcPr>
+            <w:tcW w:type="dxa" w:w="2304"/>
             <w:tcMar>
               <w:top w:w="100" w:type="dxa"/>
               <w:start w:w="120" w:type="dxa"/>
@@ -15271,13 +15354,13 @@
                 <w:color w:val="000000"/>
                 <w:sz w:val="17"/>
               </w:rPr>
-              <w:t>Linux CI 脚本在任务开始时退出 126</w:t>
-            </w:r>
-          </w:p>
-        </w:tc>
-        <w:tc>
-          <w:tcPr>
-            <w:tcW w:type="dxa" w:w="3528"/>
+              <w:t>Alembic 管理数据库版本</w:t>
+            </w:r>
+          </w:p>
+        </w:tc>
+        <w:tc>
+          <w:tcPr>
+            <w:tcW w:type="dxa" w:w="3744"/>
             <w:tcMar>
               <w:top w:w="100" w:type="dxa"/>
               <w:start w:w="120" w:type="dxa"/>
@@ -15296,13 +15379,13 @@
                 <w:color w:val="000000"/>
                 <w:sz w:val="17"/>
               </w:rPr>
-              <w:t>工作流显式使用 Bash 调用脚本</w:t>
-            </w:r>
-          </w:p>
-        </w:tc>
-        <w:tc>
-          <w:tcPr>
-            <w:tcW w:type="dxa" w:w="2088"/>
+              <w:t>让升级 回滚和部署顺序可以复现</w:t>
+            </w:r>
+          </w:p>
+        </w:tc>
+        <w:tc>
+          <w:tcPr>
+            <w:tcW w:type="dxa" w:w="2736"/>
             <w:tcMar>
               <w:top w:w="100" w:type="dxa"/>
               <w:start w:w="120" w:type="dxa"/>
@@ -15321,7 +15404,333 @@
                 <w:color w:val="000000"/>
                 <w:sz w:val="17"/>
               </w:rPr>
-              <w:t>每次迁移上传方式后观察 CI 自检</w:t>
+              <w:t>不能退回容器初始化目录直接建业务表</w:t>
+            </w:r>
+          </w:p>
+        </w:tc>
+      </w:tr>
+      <w:tr>
+        <w:trPr>
+          <w:cantSplit/>
+        </w:trPr>
+        <w:tc>
+          <w:tcPr>
+            <w:tcW w:type="dxa" w:w="1152"/>
+            <w:tcMar>
+              <w:top w:w="100" w:type="dxa"/>
+              <w:start w:w="120" w:type="dxa"/>
+              <w:bottom w:w="100" w:type="dxa"/>
+              <w:end w:w="120" w:type="dxa"/>
+            </w:tcMar>
+            <w:vAlign w:val="center"/>
+            <w:shd w:fill="EAF2F8"/>
+          </w:tcPr>
+          <w:p>
+            <w:pPr>
+              <w:spacing w:after="0" w:line="259" w:lineRule="auto"/>
+              <w:jc w:val="center"/>
+            </w:pPr>
+            <w:r>
+              <w:rPr>
+                <w:rFonts w:ascii="Aptos" w:hAnsi="Aptos" w:eastAsia="Microsoft YaHei"/>
+                <w:color w:val="000000"/>
+                <w:sz w:val="17"/>
+              </w:rPr>
+              <w:t>ADR 010</w:t>
+            </w:r>
+          </w:p>
+        </w:tc>
+        <w:tc>
+          <w:tcPr>
+            <w:tcW w:type="dxa" w:w="2304"/>
+            <w:tcMar>
+              <w:top w:w="100" w:type="dxa"/>
+              <w:start w:w="120" w:type="dxa"/>
+              <w:bottom w:w="100" w:type="dxa"/>
+              <w:end w:w="120" w:type="dxa"/>
+            </w:tcMar>
+            <w:vAlign w:val="center"/>
+            <w:shd w:fill="EAF2F8"/>
+          </w:tcPr>
+          <w:p>
+            <w:pPr>
+              <w:spacing w:after="0" w:line="259" w:lineRule="auto"/>
+            </w:pPr>
+            <w:r>
+              <w:rPr>
+                <w:rFonts w:ascii="Aptos" w:hAnsi="Aptos" w:eastAsia="Microsoft YaHei"/>
+                <w:color w:val="000000"/>
+                <w:sz w:val="17"/>
+              </w:rPr>
+              <w:t>统一错误信封和请求上下文</w:t>
+            </w:r>
+          </w:p>
+        </w:tc>
+        <w:tc>
+          <w:tcPr>
+            <w:tcW w:type="dxa" w:w="3744"/>
+            <w:tcMar>
+              <w:top w:w="100" w:type="dxa"/>
+              <w:start w:w="120" w:type="dxa"/>
+              <w:bottom w:w="100" w:type="dxa"/>
+              <w:end w:w="120" w:type="dxa"/>
+            </w:tcMar>
+            <w:vAlign w:val="center"/>
+            <w:shd w:fill="EAF2F8"/>
+          </w:tcPr>
+          <w:p>
+            <w:pPr>
+              <w:spacing w:after="0" w:line="259" w:lineRule="auto"/>
+            </w:pPr>
+            <w:r>
+              <w:rPr>
+                <w:rFonts w:ascii="Aptos" w:hAnsi="Aptos" w:eastAsia="Microsoft YaHei"/>
+                <w:color w:val="000000"/>
+                <w:sz w:val="17"/>
+              </w:rPr>
+              <w:t>客户端和审计可以依靠稳定错误码和请求 ID</w:t>
+            </w:r>
+          </w:p>
+        </w:tc>
+        <w:tc>
+          <w:tcPr>
+            <w:tcW w:type="dxa" w:w="2736"/>
+            <w:tcMar>
+              <w:top w:w="100" w:type="dxa"/>
+              <w:start w:w="120" w:type="dxa"/>
+              <w:bottom w:w="100" w:type="dxa"/>
+              <w:end w:w="120" w:type="dxa"/>
+            </w:tcMar>
+            <w:vAlign w:val="center"/>
+            <w:shd w:fill="EAF2F8"/>
+          </w:tcPr>
+          <w:p>
+            <w:pPr>
+              <w:spacing w:after="0" w:line="259" w:lineRule="auto"/>
+            </w:pPr>
+            <w:r>
+              <w:rPr>
+                <w:rFonts w:ascii="Aptos" w:hAnsi="Aptos" w:eastAsia="Microsoft YaHei"/>
+                <w:color w:val="000000"/>
+                <w:sz w:val="17"/>
+              </w:rPr>
+              <w:t>只允许兼容性扩展</w:t>
+            </w:r>
+          </w:p>
+        </w:tc>
+      </w:tr>
+      <w:tr>
+        <w:trPr>
+          <w:cantSplit/>
+        </w:trPr>
+        <w:tc>
+          <w:tcPr>
+            <w:tcW w:type="dxa" w:w="1152"/>
+            <w:tcMar>
+              <w:top w:w="100" w:type="dxa"/>
+              <w:start w:w="120" w:type="dxa"/>
+              <w:bottom w:w="100" w:type="dxa"/>
+              <w:end w:w="120" w:type="dxa"/>
+            </w:tcMar>
+            <w:vAlign w:val="center"/>
+          </w:tcPr>
+          <w:p>
+            <w:pPr>
+              <w:spacing w:after="0" w:line="259" w:lineRule="auto"/>
+              <w:jc w:val="center"/>
+            </w:pPr>
+            <w:r>
+              <w:rPr>
+                <w:rFonts w:ascii="Aptos" w:hAnsi="Aptos" w:eastAsia="Microsoft YaHei"/>
+                <w:color w:val="000000"/>
+                <w:sz w:val="17"/>
+              </w:rPr>
+              <w:t>ADR 011</w:t>
+            </w:r>
+          </w:p>
+        </w:tc>
+        <w:tc>
+          <w:tcPr>
+            <w:tcW w:type="dxa" w:w="2304"/>
+            <w:tcMar>
+              <w:top w:w="100" w:type="dxa"/>
+              <w:start w:w="120" w:type="dxa"/>
+              <w:bottom w:w="100" w:type="dxa"/>
+              <w:end w:w="120" w:type="dxa"/>
+            </w:tcMar>
+            <w:vAlign w:val="center"/>
+          </w:tcPr>
+          <w:p>
+            <w:pPr>
+              <w:spacing w:after="0" w:line="259" w:lineRule="auto"/>
+            </w:pPr>
+            <w:r>
+              <w:rPr>
+                <w:rFonts w:ascii="Aptos" w:hAnsi="Aptos" w:eastAsia="Microsoft YaHei"/>
+                <w:color w:val="000000"/>
+                <w:sz w:val="17"/>
+              </w:rPr>
+              <w:t>CI Shell 脚本由 Bash 显式调用</w:t>
+            </w:r>
+          </w:p>
+        </w:tc>
+        <w:tc>
+          <w:tcPr>
+            <w:tcW w:type="dxa" w:w="3744"/>
+            <w:tcMar>
+              <w:top w:w="100" w:type="dxa"/>
+              <w:start w:w="120" w:type="dxa"/>
+              <w:bottom w:w="100" w:type="dxa"/>
+              <w:end w:w="120" w:type="dxa"/>
+            </w:tcMar>
+            <w:vAlign w:val="center"/>
+          </w:tcPr>
+          <w:p>
+            <w:pPr>
+              <w:spacing w:after="0" w:line="259" w:lineRule="auto"/>
+            </w:pPr>
+            <w:r>
+              <w:rPr>
+                <w:rFonts w:ascii="Aptos" w:hAnsi="Aptos" w:eastAsia="Microsoft YaHei"/>
+                <w:color w:val="000000"/>
+                <w:sz w:val="17"/>
+              </w:rPr>
+              <w:t>避免 Windows 和 API 上传丢失可执行位</w:t>
+            </w:r>
+          </w:p>
+        </w:tc>
+        <w:tc>
+          <w:tcPr>
+            <w:tcW w:type="dxa" w:w="2736"/>
+            <w:tcMar>
+              <w:top w:w="100" w:type="dxa"/>
+              <w:start w:w="120" w:type="dxa"/>
+              <w:bottom w:w="100" w:type="dxa"/>
+              <w:end w:w="120" w:type="dxa"/>
+            </w:tcMar>
+            <w:vAlign w:val="center"/>
+          </w:tcPr>
+          <w:p>
+            <w:pPr>
+              <w:spacing w:after="0" w:line="259" w:lineRule="auto"/>
+            </w:pPr>
+            <w:r>
+              <w:rPr>
+                <w:rFonts w:ascii="Aptos" w:hAnsi="Aptos" w:eastAsia="Microsoft YaHei"/>
+                <w:color w:val="000000"/>
+                <w:sz w:val="17"/>
+              </w:rPr>
+              <w:t>只有上传链路稳定保留 100755 时才评估简化</w:t>
+            </w:r>
+          </w:p>
+        </w:tc>
+      </w:tr>
+      <w:tr>
+        <w:trPr>
+          <w:cantSplit/>
+        </w:trPr>
+        <w:tc>
+          <w:tcPr>
+            <w:tcW w:type="dxa" w:w="1152"/>
+            <w:tcMar>
+              <w:top w:w="100" w:type="dxa"/>
+              <w:start w:w="120" w:type="dxa"/>
+              <w:bottom w:w="100" w:type="dxa"/>
+              <w:end w:w="120" w:type="dxa"/>
+            </w:tcMar>
+            <w:vAlign w:val="center"/>
+            <w:shd w:fill="EAF2F8"/>
+          </w:tcPr>
+          <w:p>
+            <w:pPr>
+              <w:spacing w:after="0" w:line="259" w:lineRule="auto"/>
+              <w:jc w:val="center"/>
+            </w:pPr>
+            <w:r>
+              <w:rPr>
+                <w:rFonts w:ascii="Aptos" w:hAnsi="Aptos" w:eastAsia="Microsoft YaHei"/>
+                <w:color w:val="000000"/>
+                <w:sz w:val="17"/>
+              </w:rPr>
+              <w:t>ADR 012</w:t>
+            </w:r>
+          </w:p>
+        </w:tc>
+        <w:tc>
+          <w:tcPr>
+            <w:tcW w:type="dxa" w:w="2304"/>
+            <w:tcMar>
+              <w:top w:w="100" w:type="dxa"/>
+              <w:start w:w="120" w:type="dxa"/>
+              <w:bottom w:w="100" w:type="dxa"/>
+              <w:end w:w="120" w:type="dxa"/>
+            </w:tcMar>
+            <w:vAlign w:val="center"/>
+            <w:shd w:fill="EAF2F8"/>
+          </w:tcPr>
+          <w:p>
+            <w:pPr>
+              <w:spacing w:after="0" w:line="259" w:lineRule="auto"/>
+            </w:pPr>
+            <w:r>
+              <w:rPr>
+                <w:rFonts w:ascii="Aptos" w:hAnsi="Aptos" w:eastAsia="Microsoft YaHei"/>
+                <w:color w:val="000000"/>
+                <w:sz w:val="17"/>
+              </w:rPr>
+              <w:t>阶段成果使用独立分支和 PR 审批</w:t>
+            </w:r>
+          </w:p>
+        </w:tc>
+        <w:tc>
+          <w:tcPr>
+            <w:tcW w:type="dxa" w:w="3744"/>
+            <w:tcMar>
+              <w:top w:w="100" w:type="dxa"/>
+              <w:start w:w="120" w:type="dxa"/>
+              <w:bottom w:w="100" w:type="dxa"/>
+              <w:end w:w="120" w:type="dxa"/>
+            </w:tcMar>
+            <w:vAlign w:val="center"/>
+            <w:shd w:fill="EAF2F8"/>
+          </w:tcPr>
+          <w:p>
+            <w:pPr>
+              <w:spacing w:after="0" w:line="259" w:lineRule="auto"/>
+            </w:pPr>
+            <w:r>
+              <w:rPr>
+                <w:rFonts w:ascii="Aptos" w:hAnsi="Aptos" w:eastAsia="Microsoft YaHei"/>
+                <w:color w:val="000000"/>
+                <w:sz w:val="17"/>
+              </w:rPr>
+              <w:t>让 main 只接收经过检查和人工批准的变更</w:t>
+            </w:r>
+          </w:p>
+        </w:tc>
+        <w:tc>
+          <w:tcPr>
+            <w:tcW w:type="dxa" w:w="2736"/>
+            <w:tcMar>
+              <w:top w:w="100" w:type="dxa"/>
+              <w:start w:w="120" w:type="dxa"/>
+              <w:bottom w:w="100" w:type="dxa"/>
+              <w:end w:w="120" w:type="dxa"/>
+            </w:tcMar>
+            <w:vAlign w:val="center"/>
+            <w:shd w:fill="EAF2F8"/>
+          </w:tcPr>
+          <w:p>
+            <w:pPr>
+              <w:spacing w:after="0" w:line="259" w:lineRule="auto"/>
+            </w:pPr>
+            <w:r>
+              <w:rPr>
+                <w:rFonts w:ascii="Aptos" w:hAnsi="Aptos" w:eastAsia="Microsoft YaHei"/>
+                <w:color w:val="000000"/>
+                <w:sz w:val="17"/>
+              </w:rPr>
+              <w:t>只有项目负责人明确调整交付流程时变更</w:t>
             </w:r>
           </w:p>
         </w:tc>
@@ -15345,7 +15754,1248 @@
           <w:color w:val="000000"/>
           <w:sz w:val="32"/>
         </w:rPr>
-        <w:t>十一 后续更新记录模板</w:t>
+        <w:t>十一 风险登记</w:t>
+      </w:r>
+    </w:p>
+    <w:tbl>
+      <w:tblPr>
+        <w:tblW w:type="auto" w:w="0"/>
+        <w:jc w:val="center"/>
+        <w:tblLayout w:type="fixed"/>
+        <w:tblLook w:firstColumn="1" w:firstRow="1" w:lastColumn="0" w:lastRow="0" w:noHBand="0" w:noVBand="1" w:val="04A0"/>
+        <w:tblBorders>
+          <w:top w:val="single" w:sz="6" w:space="0" w:color="D9D9D9"/>
+          <w:left w:val="single" w:sz="6" w:space="0" w:color="D9D9D9"/>
+          <w:bottom w:val="single" w:sz="6" w:space="0" w:color="D9D9D9"/>
+          <w:right w:val="single" w:sz="6" w:space="0" w:color="D9D9D9"/>
+          <w:insideH w:val="single" w:sz="6" w:space="0" w:color="D9D9D9"/>
+          <w:insideV w:val="single" w:sz="6" w:space="0" w:color="D9D9D9"/>
+        </w:tblBorders>
+      </w:tblPr>
+      <w:tblGrid>
+        <w:gridCol w:w="2498"/>
+        <w:gridCol w:w="2498"/>
+        <w:gridCol w:w="2498"/>
+        <w:gridCol w:w="2498"/>
+      </w:tblGrid>
+      <w:tr>
+        <w:trPr>
+          <w:tblHeader w:val="true"/>
+          <w:cantSplit/>
+        </w:trPr>
+        <w:tc>
+          <w:tcPr>
+            <w:tcW w:type="dxa" w:w="2088"/>
+            <w:shd w:fill="1F4E78"/>
+            <w:tcMar>
+              <w:top w:w="100" w:type="dxa"/>
+              <w:start w:w="120" w:type="dxa"/>
+              <w:bottom w:w="100" w:type="dxa"/>
+              <w:end w:w="120" w:type="dxa"/>
+            </w:tcMar>
+            <w:vAlign w:val="center"/>
+          </w:tcPr>
+          <w:p>
+            <w:pPr>
+              <w:spacing w:after="0"/>
+              <w:jc w:val="center"/>
+            </w:pPr>
+            <w:r>
+              <w:rPr>
+                <w:rFonts w:ascii="Aptos" w:hAnsi="Aptos" w:eastAsia="Microsoft YaHei"/>
+                <w:b/>
+                <w:color w:val="FFFFFF"/>
+                <w:sz w:val="17"/>
+              </w:rPr>
+              <w:t>风险</w:t>
+            </w:r>
+          </w:p>
+        </w:tc>
+        <w:tc>
+          <w:tcPr>
+            <w:tcW w:type="dxa" w:w="2232"/>
+            <w:shd w:fill="1F4E78"/>
+            <w:tcMar>
+              <w:top w:w="100" w:type="dxa"/>
+              <w:start w:w="120" w:type="dxa"/>
+              <w:bottom w:w="100" w:type="dxa"/>
+              <w:end w:w="120" w:type="dxa"/>
+            </w:tcMar>
+            <w:vAlign w:val="center"/>
+          </w:tcPr>
+          <w:p>
+            <w:pPr>
+              <w:spacing w:after="0"/>
+              <w:jc w:val="center"/>
+            </w:pPr>
+            <w:r>
+              <w:rPr>
+                <w:rFonts w:ascii="Aptos" w:hAnsi="Aptos" w:eastAsia="Microsoft YaHei"/>
+                <w:b/>
+                <w:color w:val="FFFFFF"/>
+                <w:sz w:val="17"/>
+              </w:rPr>
+              <w:t>影响</w:t>
+            </w:r>
+          </w:p>
+        </w:tc>
+        <w:tc>
+          <w:tcPr>
+            <w:tcW w:type="dxa" w:w="3528"/>
+            <w:shd w:fill="1F4E78"/>
+            <w:tcMar>
+              <w:top w:w="100" w:type="dxa"/>
+              <w:start w:w="120" w:type="dxa"/>
+              <w:bottom w:w="100" w:type="dxa"/>
+              <w:end w:w="120" w:type="dxa"/>
+            </w:tcMar>
+            <w:vAlign w:val="center"/>
+          </w:tcPr>
+          <w:p>
+            <w:pPr>
+              <w:spacing w:after="0"/>
+              <w:jc w:val="center"/>
+            </w:pPr>
+            <w:r>
+              <w:rPr>
+                <w:rFonts w:ascii="Aptos" w:hAnsi="Aptos" w:eastAsia="Microsoft YaHei"/>
+                <w:b/>
+                <w:color w:val="FFFFFF"/>
+                <w:sz w:val="17"/>
+              </w:rPr>
+              <w:t>当前控制</w:t>
+            </w:r>
+          </w:p>
+        </w:tc>
+        <w:tc>
+          <w:tcPr>
+            <w:tcW w:type="dxa" w:w="2088"/>
+            <w:shd w:fill="1F4E78"/>
+            <w:tcMar>
+              <w:top w:w="100" w:type="dxa"/>
+              <w:start w:w="120" w:type="dxa"/>
+              <w:bottom w:w="100" w:type="dxa"/>
+              <w:end w:w="120" w:type="dxa"/>
+            </w:tcMar>
+            <w:vAlign w:val="center"/>
+          </w:tcPr>
+          <w:p>
+            <w:pPr>
+              <w:spacing w:after="0"/>
+              <w:jc w:val="center"/>
+            </w:pPr>
+            <w:r>
+              <w:rPr>
+                <w:rFonts w:ascii="Aptos" w:hAnsi="Aptos" w:eastAsia="Microsoft YaHei"/>
+                <w:b/>
+                <w:color w:val="FFFFFF"/>
+                <w:sz w:val="17"/>
+              </w:rPr>
+              <w:t>后续验证</w:t>
+            </w:r>
+          </w:p>
+        </w:tc>
+      </w:tr>
+      <w:tr>
+        <w:trPr>
+          <w:cantSplit/>
+        </w:trPr>
+        <w:tc>
+          <w:tcPr>
+            <w:tcW w:type="dxa" w:w="2088"/>
+            <w:tcMar>
+              <w:top w:w="100" w:type="dxa"/>
+              <w:start w:w="120" w:type="dxa"/>
+              <w:bottom w:w="100" w:type="dxa"/>
+              <w:end w:w="120" w:type="dxa"/>
+            </w:tcMar>
+            <w:vAlign w:val="center"/>
+          </w:tcPr>
+          <w:p>
+            <w:pPr>
+              <w:spacing w:after="0" w:line="259" w:lineRule="auto"/>
+              <w:jc w:val="center"/>
+            </w:pPr>
+            <w:r>
+              <w:rPr>
+                <w:rFonts w:ascii="Aptos" w:hAnsi="Aptos" w:eastAsia="Microsoft YaHei"/>
+                <w:color w:val="000000"/>
+                <w:sz w:val="17"/>
+              </w:rPr>
+              <w:t>审批策略配置错误</w:t>
+            </w:r>
+          </w:p>
+        </w:tc>
+        <w:tc>
+          <w:tcPr>
+            <w:tcW w:type="dxa" w:w="2232"/>
+            <w:tcMar>
+              <w:top w:w="100" w:type="dxa"/>
+              <w:start w:w="120" w:type="dxa"/>
+              <w:bottom w:w="100" w:type="dxa"/>
+              <w:end w:w="120" w:type="dxa"/>
+            </w:tcMar>
+            <w:vAlign w:val="center"/>
+          </w:tcPr>
+          <w:p>
+            <w:pPr>
+              <w:spacing w:after="0" w:line="259" w:lineRule="auto"/>
+            </w:pPr>
+            <w:r>
+              <w:rPr>
+                <w:rFonts w:ascii="Aptos" w:hAnsi="Aptos" w:eastAsia="Microsoft YaHei"/>
+                <w:color w:val="000000"/>
+                <w:sz w:val="17"/>
+              </w:rPr>
+              <w:t>错误人员审批或必要步骤被跳过</w:t>
+            </w:r>
+          </w:p>
+        </w:tc>
+        <w:tc>
+          <w:tcPr>
+            <w:tcW w:type="dxa" w:w="3528"/>
+            <w:tcMar>
+              <w:top w:w="100" w:type="dxa"/>
+              <w:start w:w="120" w:type="dxa"/>
+              <w:bottom w:w="100" w:type="dxa"/>
+              <w:end w:w="120" w:type="dxa"/>
+            </w:tcMar>
+            <w:vAlign w:val="center"/>
+          </w:tcPr>
+          <w:p>
+            <w:pPr>
+              <w:spacing w:after="0" w:line="259" w:lineRule="auto"/>
+            </w:pPr>
+            <w:r>
+              <w:rPr>
+                <w:rFonts w:ascii="Aptos" w:hAnsi="Aptos" w:eastAsia="Microsoft YaHei"/>
+                <w:color w:val="000000"/>
+                <w:sz w:val="17"/>
+              </w:rPr>
+              <w:t>受控条件 策略发布和实例快照</w:t>
+            </w:r>
+          </w:p>
+        </w:tc>
+        <w:tc>
+          <w:tcPr>
+            <w:tcW w:type="dxa" w:w="2088"/>
+            <w:tcMar>
+              <w:top w:w="100" w:type="dxa"/>
+              <w:start w:w="120" w:type="dxa"/>
+              <w:bottom w:w="100" w:type="dxa"/>
+              <w:end w:w="120" w:type="dxa"/>
+            </w:tcMar>
+            <w:vAlign w:val="center"/>
+          </w:tcPr>
+          <w:p>
+            <w:pPr>
+              <w:spacing w:after="0" w:line="259" w:lineRule="auto"/>
+            </w:pPr>
+            <w:r>
+              <w:rPr>
+                <w:rFonts w:ascii="Aptos" w:hAnsi="Aptos" w:eastAsia="Microsoft YaHei"/>
+                <w:color w:val="000000"/>
+                <w:sz w:val="17"/>
+              </w:rPr>
+              <w:t>策略模拟测试和高金额样本回放</w:t>
+            </w:r>
+          </w:p>
+        </w:tc>
+      </w:tr>
+      <w:tr>
+        <w:trPr>
+          <w:cantSplit/>
+        </w:trPr>
+        <w:tc>
+          <w:tcPr>
+            <w:tcW w:type="dxa" w:w="2088"/>
+            <w:tcMar>
+              <w:top w:w="100" w:type="dxa"/>
+              <w:start w:w="120" w:type="dxa"/>
+              <w:bottom w:w="100" w:type="dxa"/>
+              <w:end w:w="120" w:type="dxa"/>
+            </w:tcMar>
+            <w:vAlign w:val="center"/>
+            <w:shd w:fill="EAF2F8"/>
+          </w:tcPr>
+          <w:p>
+            <w:pPr>
+              <w:spacing w:after="0" w:line="259" w:lineRule="auto"/>
+              <w:jc w:val="center"/>
+            </w:pPr>
+            <w:r>
+              <w:rPr>
+                <w:rFonts w:ascii="Aptos" w:hAnsi="Aptos" w:eastAsia="Microsoft YaHei"/>
+                <w:color w:val="000000"/>
+                <w:sz w:val="17"/>
+              </w:rPr>
+              <w:t>模型生成无依据风险</w:t>
+            </w:r>
+          </w:p>
+        </w:tc>
+        <w:tc>
+          <w:tcPr>
+            <w:tcW w:type="dxa" w:w="2232"/>
+            <w:tcMar>
+              <w:top w:w="100" w:type="dxa"/>
+              <w:start w:w="120" w:type="dxa"/>
+              <w:bottom w:w="100" w:type="dxa"/>
+              <w:end w:w="120" w:type="dxa"/>
+            </w:tcMar>
+            <w:vAlign w:val="center"/>
+            <w:shd w:fill="EAF2F8"/>
+          </w:tcPr>
+          <w:p>
+            <w:pPr>
+              <w:spacing w:after="0" w:line="259" w:lineRule="auto"/>
+            </w:pPr>
+            <w:r>
+              <w:rPr>
+                <w:rFonts w:ascii="Aptos" w:hAnsi="Aptos" w:eastAsia="Microsoft YaHei"/>
+                <w:color w:val="000000"/>
+                <w:sz w:val="17"/>
+              </w:rPr>
+              <w:t>错误提示或遗漏关键条款</w:t>
+            </w:r>
+          </w:p>
+        </w:tc>
+        <w:tc>
+          <w:tcPr>
+            <w:tcW w:type="dxa" w:w="3528"/>
+            <w:tcMar>
+              <w:top w:w="100" w:type="dxa"/>
+              <w:start w:w="120" w:type="dxa"/>
+              <w:bottom w:w="100" w:type="dxa"/>
+              <w:end w:w="120" w:type="dxa"/>
+            </w:tcMar>
+            <w:vAlign w:val="center"/>
+            <w:shd w:fill="EAF2F8"/>
+          </w:tcPr>
+          <w:p>
+            <w:pPr>
+              <w:spacing w:after="0" w:line="259" w:lineRule="auto"/>
+            </w:pPr>
+            <w:r>
+              <w:rPr>
+                <w:rFonts w:ascii="Aptos" w:hAnsi="Aptos" w:eastAsia="Microsoft YaHei"/>
+                <w:color w:val="000000"/>
+                <w:sz w:val="17"/>
+              </w:rPr>
+              <w:t>模型只生成草稿并保存版本 页码和原文</w:t>
+            </w:r>
+          </w:p>
+        </w:tc>
+        <w:tc>
+          <w:tcPr>
+            <w:tcW w:type="dxa" w:w="2088"/>
+            <w:tcMar>
+              <w:top w:w="100" w:type="dxa"/>
+              <w:start w:w="120" w:type="dxa"/>
+              <w:bottom w:w="100" w:type="dxa"/>
+              <w:end w:w="120" w:type="dxa"/>
+            </w:tcMar>
+            <w:vAlign w:val="center"/>
+            <w:shd w:fill="EAF2F8"/>
+          </w:tcPr>
+          <w:p>
+            <w:pPr>
+              <w:spacing w:after="0" w:line="259" w:lineRule="auto"/>
+            </w:pPr>
+            <w:r>
+              <w:rPr>
+                <w:rFonts w:ascii="Aptos" w:hAnsi="Aptos" w:eastAsia="Microsoft YaHei"/>
+                <w:color w:val="000000"/>
+                <w:sz w:val="17"/>
+              </w:rPr>
+              <w:t>建立引用准确率和风险召回评测集</w:t>
+            </w:r>
+          </w:p>
+        </w:tc>
+      </w:tr>
+      <w:tr>
+        <w:trPr>
+          <w:cantSplit/>
+        </w:trPr>
+        <w:tc>
+          <w:tcPr>
+            <w:tcW w:type="dxa" w:w="2088"/>
+            <w:tcMar>
+              <w:top w:w="100" w:type="dxa"/>
+              <w:start w:w="120" w:type="dxa"/>
+              <w:bottom w:w="100" w:type="dxa"/>
+              <w:end w:w="120" w:type="dxa"/>
+            </w:tcMar>
+            <w:vAlign w:val="center"/>
+          </w:tcPr>
+          <w:p>
+            <w:pPr>
+              <w:spacing w:after="0" w:line="259" w:lineRule="auto"/>
+              <w:jc w:val="center"/>
+            </w:pPr>
+            <w:r>
+              <w:rPr>
+                <w:rFonts w:ascii="Aptos" w:hAnsi="Aptos" w:eastAsia="Microsoft YaHei"/>
+                <w:color w:val="000000"/>
+                <w:sz w:val="17"/>
+              </w:rPr>
+              <w:t>跨租户数据泄露</w:t>
+            </w:r>
+          </w:p>
+        </w:tc>
+        <w:tc>
+          <w:tcPr>
+            <w:tcW w:type="dxa" w:w="2232"/>
+            <w:tcMar>
+              <w:top w:w="100" w:type="dxa"/>
+              <w:start w:w="120" w:type="dxa"/>
+              <w:bottom w:w="100" w:type="dxa"/>
+              <w:end w:w="120" w:type="dxa"/>
+            </w:tcMar>
+            <w:vAlign w:val="center"/>
+          </w:tcPr>
+          <w:p>
+            <w:pPr>
+              <w:spacing w:after="0" w:line="259" w:lineRule="auto"/>
+            </w:pPr>
+            <w:r>
+              <w:rPr>
+                <w:rFonts w:ascii="Aptos" w:hAnsi="Aptos" w:eastAsia="Microsoft YaHei"/>
+                <w:color w:val="000000"/>
+                <w:sz w:val="17"/>
+              </w:rPr>
+              <w:t>合同和商业信息外泄</w:t>
+            </w:r>
+          </w:p>
+        </w:tc>
+        <w:tc>
+          <w:tcPr>
+            <w:tcW w:type="dxa" w:w="3528"/>
+            <w:tcMar>
+              <w:top w:w="100" w:type="dxa"/>
+              <w:start w:w="120" w:type="dxa"/>
+              <w:bottom w:w="100" w:type="dxa"/>
+              <w:end w:w="120" w:type="dxa"/>
+            </w:tcMar>
+            <w:vAlign w:val="center"/>
+          </w:tcPr>
+          <w:p>
+            <w:pPr>
+              <w:spacing w:after="0" w:line="259" w:lineRule="auto"/>
+            </w:pPr>
+            <w:r>
+              <w:rPr>
+                <w:rFonts w:ascii="Aptos" w:hAnsi="Aptos" w:eastAsia="Microsoft YaHei"/>
+                <w:color w:val="000000"/>
+                <w:sz w:val="17"/>
+              </w:rPr>
+              <w:t>独立应用角色 FORCE RLS 对象键带租户</w:t>
+            </w:r>
+          </w:p>
+        </w:tc>
+        <w:tc>
+          <w:tcPr>
+            <w:tcW w:type="dxa" w:w="2088"/>
+            <w:tcMar>
+              <w:top w:w="100" w:type="dxa"/>
+              <w:start w:w="120" w:type="dxa"/>
+              <w:bottom w:w="100" w:type="dxa"/>
+              <w:end w:w="120" w:type="dxa"/>
+            </w:tcMar>
+            <w:vAlign w:val="center"/>
+          </w:tcPr>
+          <w:p>
+            <w:pPr>
+              <w:spacing w:after="0" w:line="259" w:lineRule="auto"/>
+            </w:pPr>
+            <w:r>
+              <w:rPr>
+                <w:rFonts w:ascii="Aptos" w:hAnsi="Aptos" w:eastAsia="Microsoft YaHei"/>
+                <w:color w:val="000000"/>
+                <w:sz w:val="17"/>
+              </w:rPr>
+              <w:t>集成测试和恶意越权测试</w:t>
+            </w:r>
+          </w:p>
+        </w:tc>
+      </w:tr>
+      <w:tr>
+        <w:trPr>
+          <w:cantSplit/>
+        </w:trPr>
+        <w:tc>
+          <w:tcPr>
+            <w:tcW w:type="dxa" w:w="2088"/>
+            <w:tcMar>
+              <w:top w:w="100" w:type="dxa"/>
+              <w:start w:w="120" w:type="dxa"/>
+              <w:bottom w:w="100" w:type="dxa"/>
+              <w:end w:w="120" w:type="dxa"/>
+            </w:tcMar>
+            <w:vAlign w:val="center"/>
+            <w:shd w:fill="EAF2F8"/>
+          </w:tcPr>
+          <w:p>
+            <w:pPr>
+              <w:spacing w:after="0" w:line="259" w:lineRule="auto"/>
+              <w:jc w:val="center"/>
+            </w:pPr>
+            <w:r>
+              <w:rPr>
+                <w:rFonts w:ascii="Aptos" w:hAnsi="Aptos" w:eastAsia="Microsoft YaHei"/>
+                <w:color w:val="000000"/>
+                <w:sz w:val="17"/>
+              </w:rPr>
+              <w:t>恶意合同内容</w:t>
+            </w:r>
+          </w:p>
+        </w:tc>
+        <w:tc>
+          <w:tcPr>
+            <w:tcW w:type="dxa" w:w="2232"/>
+            <w:tcMar>
+              <w:top w:w="100" w:type="dxa"/>
+              <w:start w:w="120" w:type="dxa"/>
+              <w:bottom w:w="100" w:type="dxa"/>
+              <w:end w:w="120" w:type="dxa"/>
+            </w:tcMar>
+            <w:vAlign w:val="center"/>
+            <w:shd w:fill="EAF2F8"/>
+          </w:tcPr>
+          <w:p>
+            <w:pPr>
+              <w:spacing w:after="0" w:line="259" w:lineRule="auto"/>
+            </w:pPr>
+            <w:r>
+              <w:rPr>
+                <w:rFonts w:ascii="Aptos" w:hAnsi="Aptos" w:eastAsia="Microsoft YaHei"/>
+                <w:color w:val="000000"/>
+                <w:sz w:val="17"/>
+              </w:rPr>
+              <w:t>Prompt 注入或解析器攻击</w:t>
+            </w:r>
+          </w:p>
+        </w:tc>
+        <w:tc>
+          <w:tcPr>
+            <w:tcW w:type="dxa" w:w="3528"/>
+            <w:tcMar>
+              <w:top w:w="100" w:type="dxa"/>
+              <w:start w:w="120" w:type="dxa"/>
+              <w:bottom w:w="100" w:type="dxa"/>
+              <w:end w:w="120" w:type="dxa"/>
+            </w:tcMar>
+            <w:vAlign w:val="center"/>
+            <w:shd w:fill="EAF2F8"/>
+          </w:tcPr>
+          <w:p>
+            <w:pPr>
+              <w:spacing w:after="0" w:line="259" w:lineRule="auto"/>
+            </w:pPr>
+            <w:r>
+              <w:rPr>
+                <w:rFonts w:ascii="Aptos" w:hAnsi="Aptos" w:eastAsia="Microsoft YaHei"/>
+                <w:color w:val="000000"/>
+                <w:sz w:val="17"/>
+              </w:rPr>
+              <w:t>模型不执行合同内指令 工具默认关闭</w:t>
+            </w:r>
+          </w:p>
+        </w:tc>
+        <w:tc>
+          <w:tcPr>
+            <w:tcW w:type="dxa" w:w="2088"/>
+            <w:tcMar>
+              <w:top w:w="100" w:type="dxa"/>
+              <w:start w:w="120" w:type="dxa"/>
+              <w:bottom w:w="100" w:type="dxa"/>
+              <w:end w:w="120" w:type="dxa"/>
+            </w:tcMar>
+            <w:vAlign w:val="center"/>
+            <w:shd w:fill="EAF2F8"/>
+          </w:tcPr>
+          <w:p>
+            <w:pPr>
+              <w:spacing w:after="0" w:line="259" w:lineRule="auto"/>
+            </w:pPr>
+            <w:r>
+              <w:rPr>
+                <w:rFonts w:ascii="Aptos" w:hAnsi="Aptos" w:eastAsia="Microsoft YaHei"/>
+                <w:color w:val="000000"/>
+                <w:sz w:val="17"/>
+              </w:rPr>
+              <w:t>恶意样本和文件沙箱测试</w:t>
+            </w:r>
+          </w:p>
+        </w:tc>
+      </w:tr>
+      <w:tr>
+        <w:trPr>
+          <w:cantSplit/>
+        </w:trPr>
+        <w:tc>
+          <w:tcPr>
+            <w:tcW w:type="dxa" w:w="2088"/>
+            <w:tcMar>
+              <w:top w:w="100" w:type="dxa"/>
+              <w:start w:w="120" w:type="dxa"/>
+              <w:bottom w:w="100" w:type="dxa"/>
+              <w:end w:w="120" w:type="dxa"/>
+            </w:tcMar>
+            <w:vAlign w:val="center"/>
+          </w:tcPr>
+          <w:p>
+            <w:pPr>
+              <w:spacing w:after="0" w:line="259" w:lineRule="auto"/>
+              <w:jc w:val="center"/>
+            </w:pPr>
+            <w:r>
+              <w:rPr>
+                <w:rFonts w:ascii="Aptos" w:hAnsi="Aptos" w:eastAsia="Microsoft YaHei"/>
+                <w:color w:val="000000"/>
+                <w:sz w:val="17"/>
+              </w:rPr>
+              <w:t>重复任务和提醒</w:t>
+            </w:r>
+          </w:p>
+        </w:tc>
+        <w:tc>
+          <w:tcPr>
+            <w:tcW w:type="dxa" w:w="2232"/>
+            <w:tcMar>
+              <w:top w:w="100" w:type="dxa"/>
+              <w:start w:w="120" w:type="dxa"/>
+              <w:bottom w:w="100" w:type="dxa"/>
+              <w:end w:w="120" w:type="dxa"/>
+            </w:tcMar>
+            <w:vAlign w:val="center"/>
+          </w:tcPr>
+          <w:p>
+            <w:pPr>
+              <w:spacing w:after="0" w:line="259" w:lineRule="auto"/>
+            </w:pPr>
+            <w:r>
+              <w:rPr>
+                <w:rFonts w:ascii="Aptos" w:hAnsi="Aptos" w:eastAsia="Microsoft YaHei"/>
+                <w:color w:val="000000"/>
+                <w:sz w:val="17"/>
+              </w:rPr>
+              <w:t>重复审查 重复通知</w:t>
+            </w:r>
+          </w:p>
+        </w:tc>
+        <w:tc>
+          <w:tcPr>
+            <w:tcW w:type="dxa" w:w="3528"/>
+            <w:tcMar>
+              <w:top w:w="100" w:type="dxa"/>
+              <w:start w:w="120" w:type="dxa"/>
+              <w:bottom w:w="100" w:type="dxa"/>
+              <w:end w:w="120" w:type="dxa"/>
+            </w:tcMar>
+            <w:vAlign w:val="center"/>
+          </w:tcPr>
+          <w:p>
+            <w:pPr>
+              <w:spacing w:after="0" w:line="259" w:lineRule="auto"/>
+            </w:pPr>
+            <w:r>
+              <w:rPr>
+                <w:rFonts w:ascii="Aptos" w:hAnsi="Aptos" w:eastAsia="Microsoft YaHei"/>
+                <w:color w:val="000000"/>
+                <w:sz w:val="17"/>
+              </w:rPr>
+              <w:t>幂等表 Outbox 唯一键设计</w:t>
+            </w:r>
+          </w:p>
+        </w:tc>
+        <w:tc>
+          <w:tcPr>
+            <w:tcW w:type="dxa" w:w="2088"/>
+            <w:tcMar>
+              <w:top w:w="100" w:type="dxa"/>
+              <w:start w:w="120" w:type="dxa"/>
+              <w:bottom w:w="100" w:type="dxa"/>
+              <w:end w:w="120" w:type="dxa"/>
+            </w:tcMar>
+            <w:vAlign w:val="center"/>
+          </w:tcPr>
+          <w:p>
+            <w:pPr>
+              <w:spacing w:after="0" w:line="259" w:lineRule="auto"/>
+            </w:pPr>
+            <w:r>
+              <w:rPr>
+                <w:rFonts w:ascii="Aptos" w:hAnsi="Aptos" w:eastAsia="Microsoft YaHei"/>
+                <w:color w:val="000000"/>
+                <w:sz w:val="17"/>
+              </w:rPr>
+              <w:t>Worker 崩溃和重复投递测试</w:t>
+            </w:r>
+          </w:p>
+        </w:tc>
+      </w:tr>
+      <w:tr>
+        <w:trPr>
+          <w:cantSplit/>
+        </w:trPr>
+        <w:tc>
+          <w:tcPr>
+            <w:tcW w:type="dxa" w:w="2088"/>
+            <w:tcMar>
+              <w:top w:w="100" w:type="dxa"/>
+              <w:start w:w="120" w:type="dxa"/>
+              <w:bottom w:w="100" w:type="dxa"/>
+              <w:end w:w="120" w:type="dxa"/>
+            </w:tcMar>
+            <w:vAlign w:val="center"/>
+            <w:shd w:fill="EAF2F8"/>
+          </w:tcPr>
+          <w:p>
+            <w:pPr>
+              <w:spacing w:after="0" w:line="259" w:lineRule="auto"/>
+              <w:jc w:val="center"/>
+            </w:pPr>
+            <w:r>
+              <w:rPr>
+                <w:rFonts w:ascii="Aptos" w:hAnsi="Aptos" w:eastAsia="Microsoft YaHei"/>
+                <w:color w:val="000000"/>
+                <w:sz w:val="17"/>
+              </w:rPr>
+              <w:t>解析定位错误</w:t>
+            </w:r>
+          </w:p>
+        </w:tc>
+        <w:tc>
+          <w:tcPr>
+            <w:tcW w:type="dxa" w:w="2232"/>
+            <w:tcMar>
+              <w:top w:w="100" w:type="dxa"/>
+              <w:start w:w="120" w:type="dxa"/>
+              <w:bottom w:w="100" w:type="dxa"/>
+              <w:end w:w="120" w:type="dxa"/>
+            </w:tcMar>
+            <w:vAlign w:val="center"/>
+            <w:shd w:fill="EAF2F8"/>
+          </w:tcPr>
+          <w:p>
+            <w:pPr>
+              <w:spacing w:after="0" w:line="259" w:lineRule="auto"/>
+            </w:pPr>
+            <w:r>
+              <w:rPr>
+                <w:rFonts w:ascii="Aptos" w:hAnsi="Aptos" w:eastAsia="Microsoft YaHei"/>
+                <w:color w:val="000000"/>
+                <w:sz w:val="17"/>
+              </w:rPr>
+              <w:t>引用页码不准确</w:t>
+            </w:r>
+          </w:p>
+        </w:tc>
+        <w:tc>
+          <w:tcPr>
+            <w:tcW w:type="dxa" w:w="3528"/>
+            <w:tcMar>
+              <w:top w:w="100" w:type="dxa"/>
+              <w:start w:w="120" w:type="dxa"/>
+              <w:bottom w:w="100" w:type="dxa"/>
+              <w:end w:w="120" w:type="dxa"/>
+            </w:tcMar>
+            <w:vAlign w:val="center"/>
+            <w:shd w:fill="EAF2F8"/>
+          </w:tcPr>
+          <w:p>
+            <w:pPr>
+              <w:spacing w:after="0" w:line="259" w:lineRule="auto"/>
+            </w:pPr>
+            <w:r>
+              <w:rPr>
+                <w:rFonts w:ascii="Aptos" w:hAnsi="Aptos" w:eastAsia="Microsoft YaHei"/>
+                <w:color w:val="000000"/>
+                <w:sz w:val="17"/>
+              </w:rPr>
+              <w:t>保存版本 Chunk 页码和 parser version</w:t>
+            </w:r>
+          </w:p>
+        </w:tc>
+        <w:tc>
+          <w:tcPr>
+            <w:tcW w:type="dxa" w:w="2088"/>
+            <w:tcMar>
+              <w:top w:w="100" w:type="dxa"/>
+              <w:start w:w="120" w:type="dxa"/>
+              <w:bottom w:w="100" w:type="dxa"/>
+              <w:end w:w="120" w:type="dxa"/>
+            </w:tcMar>
+            <w:vAlign w:val="center"/>
+            <w:shd w:fill="EAF2F8"/>
+          </w:tcPr>
+          <w:p>
+            <w:pPr>
+              <w:spacing w:after="0" w:line="259" w:lineRule="auto"/>
+            </w:pPr>
+            <w:r>
+              <w:rPr>
+                <w:rFonts w:ascii="Aptos" w:hAnsi="Aptos" w:eastAsia="Microsoft YaHei"/>
+                <w:color w:val="000000"/>
+                <w:sz w:val="17"/>
+              </w:rPr>
+              <w:t>人工标注样本比对</w:t>
+            </w:r>
+          </w:p>
+        </w:tc>
+      </w:tr>
+      <w:tr>
+        <w:trPr>
+          <w:cantSplit/>
+        </w:trPr>
+        <w:tc>
+          <w:tcPr>
+            <w:tcW w:type="dxa" w:w="2088"/>
+            <w:tcMar>
+              <w:top w:w="100" w:type="dxa"/>
+              <w:start w:w="120" w:type="dxa"/>
+              <w:bottom w:w="100" w:type="dxa"/>
+              <w:end w:w="120" w:type="dxa"/>
+            </w:tcMar>
+            <w:vAlign w:val="center"/>
+          </w:tcPr>
+          <w:p>
+            <w:pPr>
+              <w:spacing w:after="0" w:line="259" w:lineRule="auto"/>
+              <w:jc w:val="center"/>
+            </w:pPr>
+            <w:r>
+              <w:rPr>
+                <w:rFonts w:ascii="Aptos" w:hAnsi="Aptos" w:eastAsia="Microsoft YaHei"/>
+                <w:color w:val="000000"/>
+                <w:sz w:val="17"/>
+              </w:rPr>
+              <w:t>合同修订覆盖历史</w:t>
+            </w:r>
+          </w:p>
+        </w:tc>
+        <w:tc>
+          <w:tcPr>
+            <w:tcW w:type="dxa" w:w="2232"/>
+            <w:tcMar>
+              <w:top w:w="100" w:type="dxa"/>
+              <w:start w:w="120" w:type="dxa"/>
+              <w:bottom w:w="100" w:type="dxa"/>
+              <w:end w:w="120" w:type="dxa"/>
+            </w:tcMar>
+            <w:vAlign w:val="center"/>
+          </w:tcPr>
+          <w:p>
+            <w:pPr>
+              <w:spacing w:after="0" w:line="259" w:lineRule="auto"/>
+            </w:pPr>
+            <w:r>
+              <w:rPr>
+                <w:rFonts w:ascii="Aptos" w:hAnsi="Aptos" w:eastAsia="Microsoft YaHei"/>
+                <w:color w:val="000000"/>
+                <w:sz w:val="17"/>
+              </w:rPr>
+              <w:t>审计链丢失</w:t>
+            </w:r>
+          </w:p>
+        </w:tc>
+        <w:tc>
+          <w:tcPr>
+            <w:tcW w:type="dxa" w:w="3528"/>
+            <w:tcMar>
+              <w:top w:w="100" w:type="dxa"/>
+              <w:start w:w="120" w:type="dxa"/>
+              <w:bottom w:w="100" w:type="dxa"/>
+              <w:end w:w="120" w:type="dxa"/>
+            </w:tcMar>
+            <w:vAlign w:val="center"/>
+          </w:tcPr>
+          <w:p>
+            <w:pPr>
+              <w:spacing w:after="0" w:line="259" w:lineRule="auto"/>
+            </w:pPr>
+            <w:r>
+              <w:rPr>
+                <w:rFonts w:ascii="Aptos" w:hAnsi="Aptos" w:eastAsia="Microsoft YaHei"/>
+                <w:color w:val="000000"/>
+                <w:sz w:val="17"/>
+              </w:rPr>
+              <w:t>版本不可变 驳回后创建新版本</w:t>
+            </w:r>
+          </w:p>
+        </w:tc>
+        <w:tc>
+          <w:tcPr>
+            <w:tcW w:type="dxa" w:w="2088"/>
+            <w:tcMar>
+              <w:top w:w="100" w:type="dxa"/>
+              <w:start w:w="120" w:type="dxa"/>
+              <w:bottom w:w="100" w:type="dxa"/>
+              <w:end w:w="120" w:type="dxa"/>
+            </w:tcMar>
+            <w:vAlign w:val="center"/>
+          </w:tcPr>
+          <w:p>
+            <w:pPr>
+              <w:spacing w:after="0" w:line="259" w:lineRule="auto"/>
+            </w:pPr>
+            <w:r>
+              <w:rPr>
+                <w:rFonts w:ascii="Aptos" w:hAnsi="Aptos" w:eastAsia="Microsoft YaHei"/>
+                <w:color w:val="000000"/>
+                <w:sz w:val="17"/>
+              </w:rPr>
+              <w:t>版本 Diff 和回滚测试</w:t>
+            </w:r>
+          </w:p>
+        </w:tc>
+      </w:tr>
+      <w:tr>
+        <w:trPr>
+          <w:cantSplit/>
+        </w:trPr>
+        <w:tc>
+          <w:tcPr>
+            <w:tcW w:type="dxa" w:w="2088"/>
+            <w:tcMar>
+              <w:top w:w="100" w:type="dxa"/>
+              <w:start w:w="120" w:type="dxa"/>
+              <w:bottom w:w="100" w:type="dxa"/>
+              <w:end w:w="120" w:type="dxa"/>
+            </w:tcMar>
+            <w:vAlign w:val="center"/>
+            <w:shd w:fill="EAF2F8"/>
+          </w:tcPr>
+          <w:p>
+            <w:pPr>
+              <w:spacing w:after="0" w:line="259" w:lineRule="auto"/>
+              <w:jc w:val="center"/>
+            </w:pPr>
+            <w:r>
+              <w:rPr>
+                <w:rFonts w:ascii="Aptos" w:hAnsi="Aptos" w:eastAsia="Microsoft YaHei"/>
+                <w:color w:val="000000"/>
+                <w:sz w:val="17"/>
+              </w:rPr>
+              <w:t>迁移权限泄露给运行服务</w:t>
+            </w:r>
+          </w:p>
+        </w:tc>
+        <w:tc>
+          <w:tcPr>
+            <w:tcW w:type="dxa" w:w="2232"/>
+            <w:tcMar>
+              <w:top w:w="100" w:type="dxa"/>
+              <w:start w:w="120" w:type="dxa"/>
+              <w:bottom w:w="100" w:type="dxa"/>
+              <w:end w:w="120" w:type="dxa"/>
+            </w:tcMar>
+            <w:vAlign w:val="center"/>
+            <w:shd w:fill="EAF2F8"/>
+          </w:tcPr>
+          <w:p>
+            <w:pPr>
+              <w:spacing w:after="0" w:line="259" w:lineRule="auto"/>
+            </w:pPr>
+            <w:r>
+              <w:rPr>
+                <w:rFonts w:ascii="Aptos" w:hAnsi="Aptos" w:eastAsia="Microsoft YaHei"/>
+                <w:color w:val="000000"/>
+                <w:sz w:val="17"/>
+              </w:rPr>
+              <w:t>应用漏洞可能修改结构或绕过隔离</w:t>
+            </w:r>
+          </w:p>
+        </w:tc>
+        <w:tc>
+          <w:tcPr>
+            <w:tcW w:type="dxa" w:w="3528"/>
+            <w:tcMar>
+              <w:top w:w="100" w:type="dxa"/>
+              <w:start w:w="120" w:type="dxa"/>
+              <w:bottom w:w="100" w:type="dxa"/>
+              <w:end w:w="120" w:type="dxa"/>
+            </w:tcMar>
+            <w:vAlign w:val="center"/>
+            <w:shd w:fill="EAF2F8"/>
+          </w:tcPr>
+          <w:p>
+            <w:pPr>
+              <w:spacing w:after="0" w:line="259" w:lineRule="auto"/>
+            </w:pPr>
+            <w:r>
+              <w:rPr>
+                <w:rFonts w:ascii="Aptos" w:hAnsi="Aptos" w:eastAsia="Microsoft YaHei"/>
+                <w:color w:val="000000"/>
+                <w:sz w:val="17"/>
+              </w:rPr>
+              <w:t>迁移 URL 与运行 URL 分离 migrate 服务短期运行</w:t>
+            </w:r>
+          </w:p>
+        </w:tc>
+        <w:tc>
+          <w:tcPr>
+            <w:tcW w:type="dxa" w:w="2088"/>
+            <w:tcMar>
+              <w:top w:w="100" w:type="dxa"/>
+              <w:start w:w="120" w:type="dxa"/>
+              <w:bottom w:w="100" w:type="dxa"/>
+              <w:end w:w="120" w:type="dxa"/>
+            </w:tcMar>
+            <w:vAlign w:val="center"/>
+            <w:shd w:fill="EAF2F8"/>
+          </w:tcPr>
+          <w:p>
+            <w:pPr>
+              <w:spacing w:after="0" w:line="259" w:lineRule="auto"/>
+            </w:pPr>
+            <w:r>
+              <w:rPr>
+                <w:rFonts w:ascii="Aptos" w:hAnsi="Aptos" w:eastAsia="Microsoft YaHei"/>
+                <w:color w:val="000000"/>
+                <w:sz w:val="17"/>
+              </w:rPr>
+              <w:t>CI 检查运行角色权限和生产密钥配置</w:t>
+            </w:r>
+          </w:p>
+        </w:tc>
+      </w:tr>
+      <w:tr>
+        <w:trPr>
+          <w:cantSplit/>
+        </w:trPr>
+        <w:tc>
+          <w:tcPr>
+            <w:tcW w:type="dxa" w:w="2088"/>
+            <w:tcMar>
+              <w:top w:w="100" w:type="dxa"/>
+              <w:start w:w="120" w:type="dxa"/>
+              <w:bottom w:w="100" w:type="dxa"/>
+              <w:end w:w="120" w:type="dxa"/>
+            </w:tcMar>
+            <w:vAlign w:val="center"/>
+          </w:tcPr>
+          <w:p>
+            <w:pPr>
+              <w:spacing w:after="0" w:line="259" w:lineRule="auto"/>
+              <w:jc w:val="center"/>
+            </w:pPr>
+            <w:r>
+              <w:rPr>
+                <w:rFonts w:ascii="Aptos" w:hAnsi="Aptos" w:eastAsia="Microsoft YaHei"/>
+                <w:color w:val="000000"/>
+                <w:sz w:val="17"/>
+              </w:rPr>
+              <w:t>跨平台文件模式丢失</w:t>
+            </w:r>
+          </w:p>
+        </w:tc>
+        <w:tc>
+          <w:tcPr>
+            <w:tcW w:type="dxa" w:w="2232"/>
+            <w:tcMar>
+              <w:top w:w="100" w:type="dxa"/>
+              <w:start w:w="120" w:type="dxa"/>
+              <w:bottom w:w="100" w:type="dxa"/>
+              <w:end w:w="120" w:type="dxa"/>
+            </w:tcMar>
+            <w:vAlign w:val="center"/>
+          </w:tcPr>
+          <w:p>
+            <w:pPr>
+              <w:spacing w:after="0" w:line="259" w:lineRule="auto"/>
+            </w:pPr>
+            <w:r>
+              <w:rPr>
+                <w:rFonts w:ascii="Aptos" w:hAnsi="Aptos" w:eastAsia="Microsoft YaHei"/>
+                <w:color w:val="000000"/>
+                <w:sz w:val="17"/>
+              </w:rPr>
+              <w:t>Linux CI 脚本在任务开始时退出 126</w:t>
+            </w:r>
+          </w:p>
+        </w:tc>
+        <w:tc>
+          <w:tcPr>
+            <w:tcW w:type="dxa" w:w="3528"/>
+            <w:tcMar>
+              <w:top w:w="100" w:type="dxa"/>
+              <w:start w:w="120" w:type="dxa"/>
+              <w:bottom w:w="100" w:type="dxa"/>
+              <w:end w:w="120" w:type="dxa"/>
+            </w:tcMar>
+            <w:vAlign w:val="center"/>
+          </w:tcPr>
+          <w:p>
+            <w:pPr>
+              <w:spacing w:after="0" w:line="259" w:lineRule="auto"/>
+            </w:pPr>
+            <w:r>
+              <w:rPr>
+                <w:rFonts w:ascii="Aptos" w:hAnsi="Aptos" w:eastAsia="Microsoft YaHei"/>
+                <w:color w:val="000000"/>
+                <w:sz w:val="17"/>
+              </w:rPr>
+              <w:t>工作流显式使用 Bash 调用脚本</w:t>
+            </w:r>
+          </w:p>
+        </w:tc>
+        <w:tc>
+          <w:tcPr>
+            <w:tcW w:type="dxa" w:w="2088"/>
+            <w:tcMar>
+              <w:top w:w="100" w:type="dxa"/>
+              <w:start w:w="120" w:type="dxa"/>
+              <w:bottom w:w="100" w:type="dxa"/>
+              <w:end w:w="120" w:type="dxa"/>
+            </w:tcMar>
+            <w:vAlign w:val="center"/>
+          </w:tcPr>
+          <w:p>
+            <w:pPr>
+              <w:spacing w:after="0" w:line="259" w:lineRule="auto"/>
+            </w:pPr>
+            <w:r>
+              <w:rPr>
+                <w:rFonts w:ascii="Aptos" w:hAnsi="Aptos" w:eastAsia="Microsoft YaHei"/>
+                <w:color w:val="000000"/>
+                <w:sz w:val="17"/>
+              </w:rPr>
+              <w:t>每次迁移上传方式后观察 CI 自检</w:t>
+            </w:r>
+          </w:p>
+        </w:tc>
+      </w:tr>
+      <w:tr>
+        <w:trPr>
+          <w:cantSplit/>
+        </w:trPr>
+        <w:tc>
+          <w:tcPr>
+            <w:tcW w:type="dxa" w:w="2088"/>
+            <w:tcMar>
+              <w:top w:w="100" w:type="dxa"/>
+              <w:start w:w="120" w:type="dxa"/>
+              <w:bottom w:w="100" w:type="dxa"/>
+              <w:end w:w="120" w:type="dxa"/>
+            </w:tcMar>
+            <w:vAlign w:val="center"/>
+            <w:shd w:fill="EAF2F8"/>
+          </w:tcPr>
+          <w:p>
+            <w:pPr>
+              <w:spacing w:after="0" w:line="259" w:lineRule="auto"/>
+              <w:jc w:val="center"/>
+            </w:pPr>
+            <w:r>
+              <w:rPr>
+                <w:rFonts w:ascii="Aptos" w:hAnsi="Aptos" w:eastAsia="Microsoft YaHei"/>
+                <w:color w:val="000000"/>
+                <w:sz w:val="17"/>
+              </w:rPr>
+              <w:t>上游格式债阻断阶段交付</w:t>
+            </w:r>
+          </w:p>
+        </w:tc>
+        <w:tc>
+          <w:tcPr>
+            <w:tcW w:type="dxa" w:w="2232"/>
+            <w:tcMar>
+              <w:top w:w="100" w:type="dxa"/>
+              <w:start w:w="120" w:type="dxa"/>
+              <w:bottom w:w="100" w:type="dxa"/>
+              <w:end w:w="120" w:type="dxa"/>
+            </w:tcMar>
+            <w:vAlign w:val="center"/>
+            <w:shd w:fill="EAF2F8"/>
+          </w:tcPr>
+          <w:p>
+            <w:pPr>
+              <w:spacing w:after="0" w:line="259" w:lineRule="auto"/>
+            </w:pPr>
+            <w:r>
+              <w:rPr>
+                <w:rFonts w:ascii="Aptos" w:hAnsi="Aptos" w:eastAsia="Microsoft YaHei"/>
+                <w:color w:val="000000"/>
+                <w:sz w:val="17"/>
+              </w:rPr>
+              <w:t>业务代码通过但根仓库质量门禁失败</w:t>
+            </w:r>
+          </w:p>
+        </w:tc>
+        <w:tc>
+          <w:tcPr>
+            <w:tcW w:type="dxa" w:w="3528"/>
+            <w:tcMar>
+              <w:top w:w="100" w:type="dxa"/>
+              <w:start w:w="120" w:type="dxa"/>
+              <w:bottom w:w="100" w:type="dxa"/>
+              <w:end w:w="120" w:type="dxa"/>
+            </w:tcMar>
+            <w:vAlign w:val="center"/>
+            <w:shd w:fill="EAF2F8"/>
+          </w:tcPr>
+          <w:p>
+            <w:pPr>
+              <w:spacing w:after="0" w:line="259" w:lineRule="auto"/>
+            </w:pPr>
+            <w:r>
+              <w:rPr>
+                <w:rFonts w:ascii="Aptos" w:hAnsi="Aptos" w:eastAsia="Microsoft YaHei"/>
+                <w:color w:val="000000"/>
+                <w:sz w:val="17"/>
+              </w:rPr>
+              <w:t>按日志修复具体文件 不扩大忽略范围</w:t>
+            </w:r>
+          </w:p>
+        </w:tc>
+        <w:tc>
+          <w:tcPr>
+            <w:tcW w:type="dxa" w:w="2088"/>
+            <w:tcMar>
+              <w:top w:w="100" w:type="dxa"/>
+              <w:start w:w="120" w:type="dxa"/>
+              <w:bottom w:w="100" w:type="dxa"/>
+              <w:end w:w="120" w:type="dxa"/>
+            </w:tcMar>
+            <w:vAlign w:val="center"/>
+            <w:shd w:fill="EAF2F8"/>
+          </w:tcPr>
+          <w:p>
+            <w:pPr>
+              <w:spacing w:after="0" w:line="259" w:lineRule="auto"/>
+            </w:pPr>
+            <w:r>
+              <w:rPr>
+                <w:rFonts w:ascii="Aptos" w:hAnsi="Aptos" w:eastAsia="Microsoft YaHei"/>
+                <w:color w:val="000000"/>
+                <w:sz w:val="17"/>
+              </w:rPr>
+              <w:t>PR 中运行完整 Prettier 和现有 CI</w:t>
+            </w:r>
+          </w:p>
+        </w:tc>
+      </w:tr>
+    </w:tbl>
+    <w:p>
+      <w:pPr>
+        <w:spacing w:after="40"/>
+      </w:pPr>
+    </w:p>
+    <w:p>
+      <w:pPr>
+        <w:pStyle w:val="Heading1"/>
+        <w:keepNext/>
+        <w:keepLines/>
+      </w:pPr>
+      <w:r>
+        <w:rPr>
+          <w:rFonts w:ascii="Aptos" w:hAnsi="Aptos" w:eastAsia="Microsoft YaHei"/>
+          <w:b/>
+          <w:color w:val="000000"/>
+          <w:sz w:val="32"/>
+        </w:rPr>
+        <w:t>十二 后续更新记录模板</w:t>
       </w:r>
     </w:p>
     <w:p>
@@ -16014,20 +17664,7 @@
           <w:rFonts w:ascii="Aptos" w:hAnsi="Aptos" w:eastAsia="Microsoft YaHei"/>
           <w:color w:val="000000"/>
         </w:rPr>
-        <w:t>新增决策已经同步到当前决策记录</w:t>
-      </w:r>
-    </w:p>
-    <w:p>
-      <w:pPr>
-        <w:pStyle w:val="ListBullet"/>
-        <w:spacing w:after="50"/>
-      </w:pPr>
-      <w:r>
-        <w:rPr>
-          <w:rFonts w:ascii="Aptos" w:hAnsi="Aptos" w:eastAsia="Microsoft YaHei"/>
-          <w:color w:val="000000"/>
-        </w:rPr>
-        <w:t>新增风险已经同步到风险登记</w:t>
+        <w:t>新增决策和新增风险已经分别同步到当前决策记录与风险登记</w:t>
       </w:r>
     </w:p>
     <w:sectPr>
@@ -16078,7 +17715,7 @@
         <w:color w:val="000000"/>
         <w:sz w:val="17"/>
       </w:rPr>
-      <w:t>ContractOps 项目更新记录  版本 0.4</w:t>
+      <w:t>ContractOps 项目更新记录  版本 0.5</w:t>
     </w:r>
   </w:p>
 </w:hdr>

</xml_diff>

<commit_message>
Remove obsolete ClawHub publish test subsystem
</commit_message>
<xml_diff>
--- a/architecture/ContractOps-项目更新记录.docx
+++ b/architecture/ContractOps-项目更新记录.docx
@@ -218,7 +218,7 @@
                 <w:color w:val="000000"/>
                 <w:sz w:val="19"/>
               </w:rPr>
-              <w:t>0.5</w:t>
+              <w:t>0.6</w:t>
             </w:r>
           </w:p>
         </w:tc>
@@ -2148,7 +2148,143 @@
                 <w:color w:val="000000"/>
                 <w:sz w:val="17"/>
               </w:rPr>
-              <w:t>完整 Prettier 检查通过 PR CI 待运行</w:t>
+              <w:t>完整 Prettier 检查和 PR 静态检查通过</w:t>
+            </w:r>
+          </w:p>
+        </w:tc>
+      </w:tr>
+      <w:tr>
+        <w:trPr>
+          <w:cantSplit/>
+        </w:trPr>
+        <w:tc>
+          <w:tcPr>
+            <w:tcW w:type="dxa" w:w="1008"/>
+            <w:tcMar>
+              <w:top w:w="100" w:type="dxa"/>
+              <w:start w:w="120" w:type="dxa"/>
+              <w:bottom w:w="100" w:type="dxa"/>
+              <w:end w:w="120" w:type="dxa"/>
+            </w:tcMar>
+            <w:vAlign w:val="center"/>
+            <w:shd w:fill="F5F6F7"/>
+          </w:tcPr>
+          <w:p>
+            <w:pPr>
+              <w:spacing w:after="0" w:line="259" w:lineRule="auto"/>
+              <w:jc w:val="center"/>
+            </w:pPr>
+            <w:r>
+              <w:rPr>
+                <w:rFonts w:ascii="Aptos" w:hAnsi="Aptos" w:eastAsia="Microsoft YaHei"/>
+                <w:color w:val="000000"/>
+                <w:sz w:val="17"/>
+              </w:rPr>
+              <w:t>UPD 006</w:t>
+            </w:r>
+          </w:p>
+        </w:tc>
+        <w:tc>
+          <w:tcPr>
+            <w:tcW w:type="dxa" w:w="1296"/>
+            <w:tcMar>
+              <w:top w:w="100" w:type="dxa"/>
+              <w:start w:w="120" w:type="dxa"/>
+              <w:bottom w:w="100" w:type="dxa"/>
+              <w:end w:w="120" w:type="dxa"/>
+            </w:tcMar>
+            <w:vAlign w:val="center"/>
+            <w:shd w:fill="F5F6F7"/>
+          </w:tcPr>
+          <w:p>
+            <w:pPr>
+              <w:spacing w:after="0" w:line="259" w:lineRule="auto"/>
+            </w:pPr>
+            <w:r>
+              <w:rPr>
+                <w:rFonts w:ascii="Aptos" w:hAnsi="Aptos" w:eastAsia="Microsoft YaHei"/>
+                <w:color w:val="000000"/>
+                <w:sz w:val="17"/>
+              </w:rPr>
+              <w:t>2026 09 26</w:t>
+            </w:r>
+          </w:p>
+        </w:tc>
+        <w:tc>
+          <w:tcPr>
+            <w:tcW w:type="dxa" w:w="2880"/>
+            <w:tcMar>
+              <w:top w:w="100" w:type="dxa"/>
+              <w:start w:w="120" w:type="dxa"/>
+              <w:bottom w:w="100" w:type="dxa"/>
+              <w:end w:w="120" w:type="dxa"/>
+            </w:tcMar>
+            <w:vAlign w:val="center"/>
+            <w:shd w:fill="F5F6F7"/>
+          </w:tcPr>
+          <w:p>
+            <w:pPr>
+              <w:spacing w:after="0" w:line="259" w:lineRule="auto"/>
+            </w:pPr>
+            <w:r>
+              <w:rPr>
+                <w:rFonts w:ascii="Aptos" w:hAnsi="Aptos" w:eastAsia="Microsoft YaHei"/>
+                <w:color w:val="000000"/>
+                <w:sz w:val="17"/>
+              </w:rPr>
+              <w:t>移除失去工作流的 ClawHub 发布测试子系统</w:t>
+            </w:r>
+          </w:p>
+        </w:tc>
+        <w:tc>
+          <w:tcPr>
+            <w:tcW w:type="dxa" w:w="3024"/>
+            <w:tcMar>
+              <w:top w:w="100" w:type="dxa"/>
+              <w:start w:w="120" w:type="dxa"/>
+              <w:bottom w:w="100" w:type="dxa"/>
+              <w:end w:w="120" w:type="dxa"/>
+            </w:tcMar>
+            <w:vAlign w:val="center"/>
+            <w:shd w:fill="F5F6F7"/>
+          </w:tcPr>
+          <w:p>
+            <w:pPr>
+              <w:spacing w:after="0" w:line="259" w:lineRule="auto"/>
+            </w:pPr>
+            <w:r>
+              <w:rPr>
+                <w:rFonts w:ascii="Aptos" w:hAnsi="Aptos" w:eastAsia="Microsoft YaHei"/>
+                <w:color w:val="000000"/>
+                <w:sz w:val="17"/>
+              </w:rPr>
+              <w:t>删除两个发布脚本及其两组专用测试</w:t>
+            </w:r>
+          </w:p>
+        </w:tc>
+        <w:tc>
+          <w:tcPr>
+            <w:tcW w:type="dxa" w:w="1944"/>
+            <w:tcMar>
+              <w:top w:w="100" w:type="dxa"/>
+              <w:start w:w="120" w:type="dxa"/>
+              <w:bottom w:w="100" w:type="dxa"/>
+              <w:end w:w="120" w:type="dxa"/>
+            </w:tcMar>
+            <w:vAlign w:val="center"/>
+            <w:shd w:fill="F5F6F7"/>
+          </w:tcPr>
+          <w:p>
+            <w:pPr>
+              <w:spacing w:after="0" w:line="259" w:lineRule="auto"/>
+            </w:pPr>
+            <w:r>
+              <w:rPr>
+                <w:rFonts w:ascii="Aptos" w:hAnsi="Aptos" w:eastAsia="Microsoft YaHei"/>
+                <w:color w:val="000000"/>
+                <w:sz w:val="17"/>
+              </w:rPr>
+              <w:t>引用清理通过 PR 完整单测待复跑</w:t>
             </w:r>
           </w:p>
         </w:tc>
@@ -14297,7 +14433,73 @@
           <w:color w:val="000000"/>
           <w:sz w:val="32"/>
         </w:rPr>
-        <w:t>十 当前决策记录</w:t>
+        <w:t>十 更新记录 UPD 006</w:t>
+      </w:r>
+    </w:p>
+    <w:p>
+      <w:pPr>
+        <w:pStyle w:val="Heading2"/>
+        <w:keepNext/>
+        <w:keepLines/>
+      </w:pPr>
+      <w:r>
+        <w:rPr>
+          <w:rFonts w:ascii="Aptos" w:hAnsi="Aptos" w:eastAsia="Microsoft YaHei"/>
+          <w:b/>
+          <w:color w:val="000000"/>
+          <w:sz w:val="26"/>
+        </w:rPr>
+        <w:t>十之一 更新目标</w:t>
+      </w:r>
+    </w:p>
+    <w:p>
+      <w:r>
+        <w:rPr>
+          <w:rFonts w:ascii="Aptos" w:hAnsi="Aptos" w:eastAsia="Microsoft YaHei"/>
+          <w:color w:val="000000"/>
+        </w:rPr>
+        <w:t>修复 PR 质量作业在根仓库 Unit Tests 阶段出现的 ENOENT 错误 让已删除的 OpenMAIC ClawHub 发布工作流不再留下孤立脚本和失效测试</w:t>
+      </w:r>
+    </w:p>
+    <w:p>
+      <w:pPr>
+        <w:pStyle w:val="Heading2"/>
+        <w:keepNext/>
+        <w:keepLines/>
+      </w:pPr>
+      <w:r>
+        <w:rPr>
+          <w:rFonts w:ascii="Aptos" w:hAnsi="Aptos" w:eastAsia="Microsoft YaHei"/>
+          <w:b/>
+          <w:color w:val="000000"/>
+          <w:sz w:val="26"/>
+        </w:rPr>
+        <w:t>十之二 问题定位</w:t>
+      </w:r>
+    </w:p>
+    <w:p>
+      <w:r>
+        <w:rPr>
+          <w:rFonts w:ascii="Aptos" w:hAnsi="Aptos" w:eastAsia="Microsoft YaHei"/>
+          <w:color w:val="000000"/>
+        </w:rPr>
+        <w:t>PR 运行 36228333475 已通过 Prettier ESLint TypeScript 和 i18n 随后 tests ci check clawhub version test ts 的五个用例尝试读取已经删除的 publish openmaic skill yml 并返回 ENOENT 仓库仍保留两个 ClawHub 发布脚本和两组专用测试 但 ContractOps 不再有对应发布入口</w:t>
+      </w:r>
+    </w:p>
+    <w:p>
+      <w:pPr>
+        <w:pStyle w:val="Heading2"/>
+        <w:keepNext/>
+        <w:keepLines/>
+      </w:pPr>
+      <w:r>
+        <w:rPr>
+          <w:rFonts w:ascii="Aptos" w:hAnsi="Aptos" w:eastAsia="Microsoft YaHei"/>
+          <w:b/>
+          <w:color w:val="000000"/>
+          <w:sz w:val="26"/>
+        </w:rPr>
+        <w:t>十之三 方案选择</w:t>
       </w:r>
     </w:p>
     <w:tbl>
@@ -14328,7 +14530,7 @@
         </w:trPr>
         <w:tc>
           <w:tcPr>
-            <w:tcW w:type="dxa" w:w="1152"/>
+            <w:tcW w:type="dxa" w:w="2520"/>
             <w:shd w:fill="1F4E78"/>
             <w:tcMar>
               <w:top w:w="100" w:type="dxa"/>
@@ -14350,13 +14552,13 @@
                 <w:color w:val="FFFFFF"/>
                 <w:sz w:val="17"/>
               </w:rPr>
-              <w:t>编号</w:t>
-            </w:r>
-          </w:p>
-        </w:tc>
-        <w:tc>
-          <w:tcPr>
-            <w:tcW w:type="dxa" w:w="2304"/>
+              <w:t>候选方案</w:t>
+            </w:r>
+          </w:p>
+        </w:tc>
+        <w:tc>
+          <w:tcPr>
+            <w:tcW w:type="dxa" w:w="2880"/>
             <w:shd w:fill="1F4E78"/>
             <w:tcMar>
               <w:top w:w="100" w:type="dxa"/>
@@ -14378,13 +14580,13 @@
                 <w:color w:val="FFFFFF"/>
                 <w:sz w:val="17"/>
               </w:rPr>
-              <w:t>决策</w:t>
-            </w:r>
-          </w:p>
-        </w:tc>
-        <w:tc>
-          <w:tcPr>
-            <w:tcW w:type="dxa" w:w="3744"/>
+              <w:t>优点</w:t>
+            </w:r>
+          </w:p>
+        </w:tc>
+        <w:tc>
+          <w:tcPr>
+            <w:tcW w:type="dxa" w:w="3240"/>
             <w:shd w:fill="1F4E78"/>
             <w:tcMar>
               <w:top w:w="100" w:type="dxa"/>
@@ -14406,13 +14608,13 @@
                 <w:color w:val="FFFFFF"/>
                 <w:sz w:val="17"/>
               </w:rPr>
-              <w:t>原因</w:t>
-            </w:r>
-          </w:p>
-        </w:tc>
-        <w:tc>
-          <w:tcPr>
-            <w:tcW w:type="dxa" w:w="2736"/>
+              <w:t>限制</w:t>
+            </w:r>
+          </w:p>
+        </w:tc>
+        <w:tc>
+          <w:tcPr>
+            <w:tcW w:type="dxa" w:w="1440"/>
             <w:shd w:fill="1F4E78"/>
             <w:tcMar>
               <w:top w:w="100" w:type="dxa"/>
@@ -14434,7 +14636,7 @@
                 <w:color w:val="FFFFFF"/>
                 <w:sz w:val="17"/>
               </w:rPr>
-              <w:t>重新评估条件</w:t>
+              <w:t>决定</w:t>
             </w:r>
           </w:p>
         </w:tc>
@@ -14445,7 +14647,7 @@
         </w:trPr>
         <w:tc>
           <w:tcPr>
-            <w:tcW w:type="dxa" w:w="1152"/>
+            <w:tcW w:type="dxa" w:w="2520"/>
             <w:tcMar>
               <w:top w:w="100" w:type="dxa"/>
               <w:start w:w="120" w:type="dxa"/>
@@ -14465,13 +14667,13 @@
                 <w:color w:val="000000"/>
                 <w:sz w:val="17"/>
               </w:rPr>
-              <w:t>ADR 001</w:t>
-            </w:r>
-          </w:p>
-        </w:tc>
-        <w:tc>
-          <w:tcPr>
-            <w:tcW w:type="dxa" w:w="2304"/>
+              <w:t>恢复 OpenMAIC 发布工作流</w:t>
+            </w:r>
+          </w:p>
+        </w:tc>
+        <w:tc>
+          <w:tcPr>
+            <w:tcW w:type="dxa" w:w="2880"/>
             <w:tcMar>
               <w:top w:w="100" w:type="dxa"/>
               <w:start w:w="120" w:type="dxa"/>
@@ -14490,13 +14692,13 @@
                 <w:color w:val="000000"/>
                 <w:sz w:val="17"/>
               </w:rPr>
-              <w:t>主线改为 ContractOps</w:t>
-            </w:r>
-          </w:p>
-        </w:tc>
-        <w:tc>
-          <w:tcPr>
-            <w:tcW w:type="dxa" w:w="3744"/>
+              <w:t>原测试可以继续运行</w:t>
+            </w:r>
+          </w:p>
+        </w:tc>
+        <w:tc>
+          <w:tcPr>
+            <w:tcW w:type="dxa" w:w="3240"/>
             <w:tcMar>
               <w:top w:w="100" w:type="dxa"/>
               <w:start w:w="120" w:type="dxa"/>
@@ -14515,13 +14717,13 @@
                 <w:color w:val="000000"/>
                 <w:sz w:val="17"/>
               </w:rPr>
-              <w:t>缩小范围并提高后端实现深度</w:t>
-            </w:r>
-          </w:p>
-        </w:tc>
-        <w:tc>
-          <w:tcPr>
-            <w:tcW w:type="dxa" w:w="2736"/>
+              <w:t>重新引入与 ContractOps 无关的外部发布行为</w:t>
+            </w:r>
+          </w:p>
+        </w:tc>
+        <w:tc>
+          <w:tcPr>
+            <w:tcW w:type="dxa" w:w="1440"/>
             <w:tcMar>
               <w:top w:w="100" w:type="dxa"/>
               <w:start w:w="120" w:type="dxa"/>
@@ -14540,7 +14742,7 @@
                 <w:color w:val="000000"/>
                 <w:sz w:val="17"/>
               </w:rPr>
-              <w:t>合同场景缺少可用数据或无法形成闭环</w:t>
+              <w:t>不采用</w:t>
             </w:r>
           </w:p>
         </w:tc>
@@ -14551,7 +14753,7 @@
         </w:trPr>
         <w:tc>
           <w:tcPr>
-            <w:tcW w:type="dxa" w:w="1152"/>
+            <w:tcW w:type="dxa" w:w="2520"/>
             <w:tcMar>
               <w:top w:w="100" w:type="dxa"/>
               <w:start w:w="120" w:type="dxa"/>
@@ -14572,13 +14774,13 @@
                 <w:color w:val="000000"/>
                 <w:sz w:val="17"/>
               </w:rPr>
-              <w:t>ADR 002</w:t>
-            </w:r>
-          </w:p>
-        </w:tc>
-        <w:tc>
-          <w:tcPr>
-            <w:tcW w:type="dxa" w:w="2304"/>
+              <w:t>工作流不存在时跳过测试</w:t>
+            </w:r>
+          </w:p>
+        </w:tc>
+        <w:tc>
+          <w:tcPr>
+            <w:tcW w:type="dxa" w:w="2880"/>
             <w:tcMar>
               <w:top w:w="100" w:type="dxa"/>
               <w:start w:w="120" w:type="dxa"/>
@@ -14598,13 +14800,13 @@
                 <w:color w:val="000000"/>
                 <w:sz w:val="17"/>
               </w:rPr>
-              <w:t>模块化单体加 Worker</w:t>
-            </w:r>
-          </w:p>
-        </w:tc>
-        <w:tc>
-          <w:tcPr>
-            <w:tcW w:type="dxa" w:w="3744"/>
+              <w:t>改动较小</w:t>
+            </w:r>
+          </w:p>
+        </w:tc>
+        <w:tc>
+          <w:tcPr>
+            <w:tcW w:type="dxa" w:w="3240"/>
             <w:tcMar>
               <w:top w:w="100" w:type="dxa"/>
               <w:start w:w="120" w:type="dxa"/>
@@ -14624,13 +14826,13 @@
                 <w:color w:val="000000"/>
                 <w:sz w:val="17"/>
               </w:rPr>
-              <w:t>保留领域事务并隔离长任务</w:t>
-            </w:r>
-          </w:p>
-        </w:tc>
-        <w:tc>
-          <w:tcPr>
-            <w:tcW w:type="dxa" w:w="2736"/>
+              <w:t>保留无法从产品入口触发的死代码</w:t>
+            </w:r>
+          </w:p>
+        </w:tc>
+        <w:tc>
+          <w:tcPr>
+            <w:tcW w:type="dxa" w:w="1440"/>
             <w:tcMar>
               <w:top w:w="100" w:type="dxa"/>
               <w:start w:w="120" w:type="dxa"/>
@@ -14650,7 +14852,7 @@
                 <w:color w:val="000000"/>
                 <w:sz w:val="17"/>
               </w:rPr>
-              <w:t>检索或调度需要独立扩容</w:t>
+              <w:t>不采用</w:t>
             </w:r>
           </w:p>
         </w:tc>
@@ -14661,7 +14863,7 @@
         </w:trPr>
         <w:tc>
           <w:tcPr>
-            <w:tcW w:type="dxa" w:w="1152"/>
+            <w:tcW w:type="dxa" w:w="2520"/>
             <w:tcMar>
               <w:top w:w="100" w:type="dxa"/>
               <w:start w:w="120" w:type="dxa"/>
@@ -14681,13 +14883,13 @@
                 <w:color w:val="000000"/>
                 <w:sz w:val="17"/>
               </w:rPr>
-              <w:t>ADR 003</w:t>
-            </w:r>
-          </w:p>
-        </w:tc>
-        <w:tc>
-          <w:tcPr>
-            <w:tcW w:type="dxa" w:w="2304"/>
+              <w:t>删除发布脚本和专用测试</w:t>
+            </w:r>
+          </w:p>
+        </w:tc>
+        <w:tc>
+          <w:tcPr>
+            <w:tcW w:type="dxa" w:w="2880"/>
             <w:tcMar>
               <w:top w:w="100" w:type="dxa"/>
               <w:start w:w="120" w:type="dxa"/>
@@ -14706,13 +14908,13 @@
                 <w:color w:val="000000"/>
                 <w:sz w:val="17"/>
               </w:rPr>
-              <w:t>PostgreSQL 加 pgvector</w:t>
-            </w:r>
-          </w:p>
-        </w:tc>
-        <w:tc>
-          <w:tcPr>
-            <w:tcW w:type="dxa" w:w="3744"/>
+              <w:t>边界一致 消除孤立维护面</w:t>
+            </w:r>
+          </w:p>
+        </w:tc>
+        <w:tc>
+          <w:tcPr>
+            <w:tcW w:type="dxa" w:w="3240"/>
             <w:tcMar>
               <w:top w:w="100" w:type="dxa"/>
               <w:start w:w="120" w:type="dxa"/>
@@ -14731,13 +14933,13 @@
                 <w:color w:val="000000"/>
                 <w:sz w:val="17"/>
               </w:rPr>
-              <w:t>一个系统完成事务 全文和向量存储</w:t>
-            </w:r>
-          </w:p>
-        </w:tc>
-        <w:tc>
-          <w:tcPr>
-            <w:tcW w:type="dxa" w:w="2736"/>
+              <w:t>不再提供上游 ClawHub 发布能力</w:t>
+            </w:r>
+          </w:p>
+        </w:tc>
+        <w:tc>
+          <w:tcPr>
+            <w:tcW w:type="dxa" w:w="1440"/>
             <w:tcMar>
               <w:top w:w="100" w:type="dxa"/>
               <w:start w:w="120" w:type="dxa"/>
@@ -14756,981 +14958,7 @@
                 <w:color w:val="000000"/>
                 <w:sz w:val="17"/>
               </w:rPr>
-              <w:t>规模或中文召回达到明确瓶颈</w:t>
-            </w:r>
-          </w:p>
-        </w:tc>
-      </w:tr>
-      <w:tr>
-        <w:trPr>
-          <w:cantSplit/>
-        </w:trPr>
-        <w:tc>
-          <w:tcPr>
-            <w:tcW w:type="dxa" w:w="1152"/>
-            <w:tcMar>
-              <w:top w:w="100" w:type="dxa"/>
-              <w:start w:w="120" w:type="dxa"/>
-              <w:bottom w:w="100" w:type="dxa"/>
-              <w:end w:w="120" w:type="dxa"/>
-            </w:tcMar>
-            <w:vAlign w:val="center"/>
-            <w:shd w:fill="EAF2F8"/>
-          </w:tcPr>
-          <w:p>
-            <w:pPr>
-              <w:spacing w:after="0" w:line="259" w:lineRule="auto"/>
-              <w:jc w:val="center"/>
-            </w:pPr>
-            <w:r>
-              <w:rPr>
-                <w:rFonts w:ascii="Aptos" w:hAnsi="Aptos" w:eastAsia="Microsoft YaHei"/>
-                <w:color w:val="000000"/>
-                <w:sz w:val="17"/>
-              </w:rPr>
-              <w:t>ADR 004</w:t>
-            </w:r>
-          </w:p>
-        </w:tc>
-        <w:tc>
-          <w:tcPr>
-            <w:tcW w:type="dxa" w:w="2304"/>
-            <w:tcMar>
-              <w:top w:w="100" w:type="dxa"/>
-              <w:start w:w="120" w:type="dxa"/>
-              <w:bottom w:w="100" w:type="dxa"/>
-              <w:end w:w="120" w:type="dxa"/>
-            </w:tcMar>
-            <w:vAlign w:val="center"/>
-            <w:shd w:fill="EAF2F8"/>
-          </w:tcPr>
-          <w:p>
-            <w:pPr>
-              <w:spacing w:after="0" w:line="259" w:lineRule="auto"/>
-            </w:pPr>
-            <w:r>
-              <w:rPr>
-                <w:rFonts w:ascii="Aptos" w:hAnsi="Aptos" w:eastAsia="Microsoft YaHei"/>
-                <w:color w:val="000000"/>
-                <w:sz w:val="17"/>
-              </w:rPr>
-              <w:t>Redis Streams 作为首版队列</w:t>
-            </w:r>
-          </w:p>
-        </w:tc>
-        <w:tc>
-          <w:tcPr>
-            <w:tcW w:type="dxa" w:w="3744"/>
-            <w:tcMar>
-              <w:top w:w="100" w:type="dxa"/>
-              <w:start w:w="120" w:type="dxa"/>
-              <w:bottom w:w="100" w:type="dxa"/>
-              <w:end w:w="120" w:type="dxa"/>
-            </w:tcMar>
-            <w:vAlign w:val="center"/>
-            <w:shd w:fill="EAF2F8"/>
-          </w:tcPr>
-          <w:p>
-            <w:pPr>
-              <w:spacing w:after="0" w:line="259" w:lineRule="auto"/>
-            </w:pPr>
-            <w:r>
-              <w:rPr>
-                <w:rFonts w:ascii="Aptos" w:hAnsi="Aptos" w:eastAsia="Microsoft YaHei"/>
-                <w:color w:val="000000"/>
-                <w:sz w:val="17"/>
-              </w:rPr>
-              <w:t>本地成本低 支持消费组和消息重领</w:t>
-            </w:r>
-          </w:p>
-        </w:tc>
-        <w:tc>
-          <w:tcPr>
-            <w:tcW w:type="dxa" w:w="2736"/>
-            <w:tcMar>
-              <w:top w:w="100" w:type="dxa"/>
-              <w:start w:w="120" w:type="dxa"/>
-              <w:bottom w:w="100" w:type="dxa"/>
-              <w:end w:w="120" w:type="dxa"/>
-            </w:tcMar>
-            <w:vAlign w:val="center"/>
-            <w:shd w:fill="EAF2F8"/>
-          </w:tcPr>
-          <w:p>
-            <w:pPr>
-              <w:spacing w:after="0" w:line="259" w:lineRule="auto"/>
-            </w:pPr>
-            <w:r>
-              <w:rPr>
-                <w:rFonts w:ascii="Aptos" w:hAnsi="Aptos" w:eastAsia="Microsoft YaHei"/>
-                <w:color w:val="000000"/>
-                <w:sz w:val="17"/>
-              </w:rPr>
-              <w:t>需要长期回放或更高吞吐</w:t>
-            </w:r>
-          </w:p>
-        </w:tc>
-      </w:tr>
-      <w:tr>
-        <w:trPr>
-          <w:cantSplit/>
-        </w:trPr>
-        <w:tc>
-          <w:tcPr>
-            <w:tcW w:type="dxa" w:w="1152"/>
-            <w:tcMar>
-              <w:top w:w="100" w:type="dxa"/>
-              <w:start w:w="120" w:type="dxa"/>
-              <w:bottom w:w="100" w:type="dxa"/>
-              <w:end w:w="120" w:type="dxa"/>
-            </w:tcMar>
-            <w:vAlign w:val="center"/>
-          </w:tcPr>
-          <w:p>
-            <w:pPr>
-              <w:spacing w:after="0" w:line="259" w:lineRule="auto"/>
-              <w:jc w:val="center"/>
-            </w:pPr>
-            <w:r>
-              <w:rPr>
-                <w:rFonts w:ascii="Aptos" w:hAnsi="Aptos" w:eastAsia="Microsoft YaHei"/>
-                <w:color w:val="000000"/>
-                <w:sz w:val="17"/>
-              </w:rPr>
-              <w:t>ADR 005</w:t>
-            </w:r>
-          </w:p>
-        </w:tc>
-        <w:tc>
-          <w:tcPr>
-            <w:tcW w:type="dxa" w:w="2304"/>
-            <w:tcMar>
-              <w:top w:w="100" w:type="dxa"/>
-              <w:start w:w="120" w:type="dxa"/>
-              <w:bottom w:w="100" w:type="dxa"/>
-              <w:end w:w="120" w:type="dxa"/>
-            </w:tcMar>
-            <w:vAlign w:val="center"/>
-          </w:tcPr>
-          <w:p>
-            <w:pPr>
-              <w:spacing w:after="0" w:line="259" w:lineRule="auto"/>
-            </w:pPr>
-            <w:r>
-              <w:rPr>
-                <w:rFonts w:ascii="Aptos" w:hAnsi="Aptos" w:eastAsia="Microsoft YaHei"/>
-                <w:color w:val="000000"/>
-                <w:sz w:val="17"/>
-              </w:rPr>
-              <w:t>应用权限加 PostgreSQL RLS</w:t>
-            </w:r>
-          </w:p>
-        </w:tc>
-        <w:tc>
-          <w:tcPr>
-            <w:tcW w:type="dxa" w:w="3744"/>
-            <w:tcMar>
-              <w:top w:w="100" w:type="dxa"/>
-              <w:start w:w="120" w:type="dxa"/>
-              <w:bottom w:w="100" w:type="dxa"/>
-              <w:end w:w="120" w:type="dxa"/>
-            </w:tcMar>
-            <w:vAlign w:val="center"/>
-          </w:tcPr>
-          <w:p>
-            <w:pPr>
-              <w:spacing w:after="0" w:line="259" w:lineRule="auto"/>
-            </w:pPr>
-            <w:r>
-              <w:rPr>
-                <w:rFonts w:ascii="Aptos" w:hAnsi="Aptos" w:eastAsia="Microsoft YaHei"/>
-                <w:color w:val="000000"/>
-                <w:sz w:val="17"/>
-              </w:rPr>
-              <w:t>防止查询条件遗漏导致跨租户读取</w:t>
-            </w:r>
-          </w:p>
-        </w:tc>
-        <w:tc>
-          <w:tcPr>
-            <w:tcW w:type="dxa" w:w="2736"/>
-            <w:tcMar>
-              <w:top w:w="100" w:type="dxa"/>
-              <w:start w:w="120" w:type="dxa"/>
-              <w:bottom w:w="100" w:type="dxa"/>
-              <w:end w:w="120" w:type="dxa"/>
-            </w:tcMar>
-            <w:vAlign w:val="center"/>
-          </w:tcPr>
-          <w:p>
-            <w:pPr>
-              <w:spacing w:after="0" w:line="259" w:lineRule="auto"/>
-            </w:pPr>
-            <w:r>
-              <w:rPr>
-                <w:rFonts w:ascii="Aptos" w:hAnsi="Aptos" w:eastAsia="Microsoft YaHei"/>
-                <w:color w:val="000000"/>
-                <w:sz w:val="17"/>
-              </w:rPr>
-              <w:t>不能删除 只允许调整实现</w:t>
-            </w:r>
-          </w:p>
-        </w:tc>
-      </w:tr>
-      <w:tr>
-        <w:trPr>
-          <w:cantSplit/>
-        </w:trPr>
-        <w:tc>
-          <w:tcPr>
-            <w:tcW w:type="dxa" w:w="1152"/>
-            <w:tcMar>
-              <w:top w:w="100" w:type="dxa"/>
-              <w:start w:w="120" w:type="dxa"/>
-              <w:bottom w:w="100" w:type="dxa"/>
-              <w:end w:w="120" w:type="dxa"/>
-            </w:tcMar>
-            <w:vAlign w:val="center"/>
-            <w:shd w:fill="EAF2F8"/>
-          </w:tcPr>
-          <w:p>
-            <w:pPr>
-              <w:spacing w:after="0" w:line="259" w:lineRule="auto"/>
-              <w:jc w:val="center"/>
-            </w:pPr>
-            <w:r>
-              <w:rPr>
-                <w:rFonts w:ascii="Aptos" w:hAnsi="Aptos" w:eastAsia="Microsoft YaHei"/>
-                <w:color w:val="000000"/>
-                <w:sz w:val="17"/>
-              </w:rPr>
-              <w:t>ADR 006</w:t>
-            </w:r>
-          </w:p>
-        </w:tc>
-        <w:tc>
-          <w:tcPr>
-            <w:tcW w:type="dxa" w:w="2304"/>
-            <w:tcMar>
-              <w:top w:w="100" w:type="dxa"/>
-              <w:start w:w="120" w:type="dxa"/>
-              <w:bottom w:w="100" w:type="dxa"/>
-              <w:end w:w="120" w:type="dxa"/>
-            </w:tcMar>
-            <w:vAlign w:val="center"/>
-            <w:shd w:fill="EAF2F8"/>
-          </w:tcPr>
-          <w:p>
-            <w:pPr>
-              <w:spacing w:after="0" w:line="259" w:lineRule="auto"/>
-            </w:pPr>
-            <w:r>
-              <w:rPr>
-                <w:rFonts w:ascii="Aptos" w:hAnsi="Aptos" w:eastAsia="Microsoft YaHei"/>
-                <w:color w:val="000000"/>
-                <w:sz w:val="17"/>
-              </w:rPr>
-              <w:t>关键法律和审批决定由人完成</w:t>
-            </w:r>
-          </w:p>
-        </w:tc>
-        <w:tc>
-          <w:tcPr>
-            <w:tcW w:type="dxa" w:w="3744"/>
-            <w:tcMar>
-              <w:top w:w="100" w:type="dxa"/>
-              <w:start w:w="120" w:type="dxa"/>
-              <w:bottom w:w="100" w:type="dxa"/>
-              <w:end w:w="120" w:type="dxa"/>
-            </w:tcMar>
-            <w:vAlign w:val="center"/>
-            <w:shd w:fill="EAF2F8"/>
-          </w:tcPr>
-          <w:p>
-            <w:pPr>
-              <w:spacing w:after="0" w:line="259" w:lineRule="auto"/>
-            </w:pPr>
-            <w:r>
-              <w:rPr>
-                <w:rFonts w:ascii="Aptos" w:hAnsi="Aptos" w:eastAsia="Microsoft YaHei"/>
-                <w:color w:val="000000"/>
-                <w:sz w:val="17"/>
-              </w:rPr>
-              <w:t>模型输出存在错误和法律责任边界</w:t>
-            </w:r>
-          </w:p>
-        </w:tc>
-        <w:tc>
-          <w:tcPr>
-            <w:tcW w:type="dxa" w:w="2736"/>
-            <w:tcMar>
-              <w:top w:w="100" w:type="dxa"/>
-              <w:start w:w="120" w:type="dxa"/>
-              <w:bottom w:w="100" w:type="dxa"/>
-              <w:end w:w="120" w:type="dxa"/>
-            </w:tcMar>
-            <w:vAlign w:val="center"/>
-            <w:shd w:fill="EAF2F8"/>
-          </w:tcPr>
-          <w:p>
-            <w:pPr>
-              <w:spacing w:after="0" w:line="259" w:lineRule="auto"/>
-            </w:pPr>
-            <w:r>
-              <w:rPr>
-                <w:rFonts w:ascii="Aptos" w:hAnsi="Aptos" w:eastAsia="Microsoft YaHei"/>
-                <w:color w:val="000000"/>
-                <w:sz w:val="17"/>
-              </w:rPr>
-              <w:t>不能删除</w:t>
-            </w:r>
-          </w:p>
-        </w:tc>
-      </w:tr>
-      <w:tr>
-        <w:trPr>
-          <w:cantSplit/>
-        </w:trPr>
-        <w:tc>
-          <w:tcPr>
-            <w:tcW w:type="dxa" w:w="1152"/>
-            <w:tcMar>
-              <w:top w:w="100" w:type="dxa"/>
-              <w:start w:w="120" w:type="dxa"/>
-              <w:bottom w:w="100" w:type="dxa"/>
-              <w:end w:w="120" w:type="dxa"/>
-            </w:tcMar>
-            <w:vAlign w:val="center"/>
-          </w:tcPr>
-          <w:p>
-            <w:pPr>
-              <w:spacing w:after="0" w:line="259" w:lineRule="auto"/>
-              <w:jc w:val="center"/>
-            </w:pPr>
-            <w:r>
-              <w:rPr>
-                <w:rFonts w:ascii="Aptos" w:hAnsi="Aptos" w:eastAsia="Microsoft YaHei"/>
-                <w:color w:val="000000"/>
-                <w:sz w:val="17"/>
-              </w:rPr>
-              <w:t>ADR 007</w:t>
-            </w:r>
-          </w:p>
-        </w:tc>
-        <w:tc>
-          <w:tcPr>
-            <w:tcW w:type="dxa" w:w="2304"/>
-            <w:tcMar>
-              <w:top w:w="100" w:type="dxa"/>
-              <w:start w:w="120" w:type="dxa"/>
-              <w:bottom w:w="100" w:type="dxa"/>
-              <w:end w:w="120" w:type="dxa"/>
-            </w:tcMar>
-            <w:vAlign w:val="center"/>
-          </w:tcPr>
-          <w:p>
-            <w:pPr>
-              <w:spacing w:after="0" w:line="259" w:lineRule="auto"/>
-            </w:pPr>
-            <w:r>
-              <w:rPr>
-                <w:rFonts w:ascii="Aptos" w:hAnsi="Aptos" w:eastAsia="Microsoft YaHei"/>
-                <w:color w:val="000000"/>
-                <w:sz w:val="17"/>
-              </w:rPr>
-              <w:t>主线改为审批与履约风控</w:t>
-            </w:r>
-          </w:p>
-        </w:tc>
-        <w:tc>
-          <w:tcPr>
-            <w:tcW w:type="dxa" w:w="3744"/>
-            <w:tcMar>
-              <w:top w:w="100" w:type="dxa"/>
-              <w:start w:w="120" w:type="dxa"/>
-              <w:bottom w:w="100" w:type="dxa"/>
-              <w:end w:w="120" w:type="dxa"/>
-            </w:tcMar>
-            <w:vAlign w:val="center"/>
-          </w:tcPr>
-          <w:p>
-            <w:pPr>
-              <w:spacing w:after="0" w:line="259" w:lineRule="auto"/>
-            </w:pPr>
-            <w:r>
-              <w:rPr>
-                <w:rFonts w:ascii="Aptos" w:hAnsi="Aptos" w:eastAsia="Microsoft YaHei"/>
-                <w:color w:val="000000"/>
-                <w:sz w:val="17"/>
-              </w:rPr>
-              <w:t>避免退化为 PDF 检查工具并突出企业后端能力</w:t>
-            </w:r>
-          </w:p>
-        </w:tc>
-        <w:tc>
-          <w:tcPr>
-            <w:tcW w:type="dxa" w:w="2736"/>
-            <w:tcMar>
-              <w:top w:w="100" w:type="dxa"/>
-              <w:start w:w="120" w:type="dxa"/>
-              <w:bottom w:w="100" w:type="dxa"/>
-              <w:end w:w="120" w:type="dxa"/>
-            </w:tcMar>
-            <w:vAlign w:val="center"/>
-          </w:tcPr>
-          <w:p>
-            <w:pPr>
-              <w:spacing w:after="0" w:line="259" w:lineRule="auto"/>
-            </w:pPr>
-            <w:r>
-              <w:rPr>
-                <w:rFonts w:ascii="Aptos" w:hAnsi="Aptos" w:eastAsia="Microsoft YaHei"/>
-                <w:color w:val="000000"/>
-                <w:sz w:val="17"/>
-              </w:rPr>
-              <w:t>审批或履约场景无法形成可运行闭环</w:t>
-            </w:r>
-          </w:p>
-        </w:tc>
-      </w:tr>
-      <w:tr>
-        <w:trPr>
-          <w:cantSplit/>
-        </w:trPr>
-        <w:tc>
-          <w:tcPr>
-            <w:tcW w:type="dxa" w:w="1152"/>
-            <w:tcMar>
-              <w:top w:w="100" w:type="dxa"/>
-              <w:start w:w="120" w:type="dxa"/>
-              <w:bottom w:w="100" w:type="dxa"/>
-              <w:end w:w="120" w:type="dxa"/>
-            </w:tcMar>
-            <w:vAlign w:val="center"/>
-            <w:shd w:fill="EAF2F8"/>
-          </w:tcPr>
-          <w:p>
-            <w:pPr>
-              <w:spacing w:after="0" w:line="259" w:lineRule="auto"/>
-              <w:jc w:val="center"/>
-            </w:pPr>
-            <w:r>
-              <w:rPr>
-                <w:rFonts w:ascii="Aptos" w:hAnsi="Aptos" w:eastAsia="Microsoft YaHei"/>
-                <w:color w:val="000000"/>
-                <w:sz w:val="17"/>
-              </w:rPr>
-              <w:t>ADR 008</w:t>
-            </w:r>
-          </w:p>
-        </w:tc>
-        <w:tc>
-          <w:tcPr>
-            <w:tcW w:type="dxa" w:w="2304"/>
-            <w:tcMar>
-              <w:top w:w="100" w:type="dxa"/>
-              <w:start w:w="120" w:type="dxa"/>
-              <w:bottom w:w="100" w:type="dxa"/>
-              <w:end w:w="120" w:type="dxa"/>
-            </w:tcMar>
-            <w:vAlign w:val="center"/>
-            <w:shd w:fill="EAF2F8"/>
-          </w:tcPr>
-          <w:p>
-            <w:pPr>
-              <w:spacing w:after="0" w:line="259" w:lineRule="auto"/>
-            </w:pPr>
-            <w:r>
-              <w:rPr>
-                <w:rFonts w:ascii="Aptos" w:hAnsi="Aptos" w:eastAsia="Microsoft YaHei"/>
-                <w:color w:val="000000"/>
-                <w:sz w:val="17"/>
-              </w:rPr>
-              <w:t>审批实例保存策略快照</w:t>
-            </w:r>
-          </w:p>
-        </w:tc>
-        <w:tc>
-          <w:tcPr>
-            <w:tcW w:type="dxa" w:w="3744"/>
-            <w:tcMar>
-              <w:top w:w="100" w:type="dxa"/>
-              <w:start w:w="120" w:type="dxa"/>
-              <w:bottom w:w="100" w:type="dxa"/>
-              <w:end w:w="120" w:type="dxa"/>
-            </w:tcMar>
-            <w:vAlign w:val="center"/>
-            <w:shd w:fill="EAF2F8"/>
-          </w:tcPr>
-          <w:p>
-            <w:pPr>
-              <w:spacing w:after="0" w:line="259" w:lineRule="auto"/>
-            </w:pPr>
-            <w:r>
-              <w:rPr>
-                <w:rFonts w:ascii="Aptos" w:hAnsi="Aptos" w:eastAsia="Microsoft YaHei"/>
-                <w:color w:val="000000"/>
-                <w:sz w:val="17"/>
-              </w:rPr>
-              <w:t>避免流程中途因策略变更产生不一致</w:t>
-            </w:r>
-          </w:p>
-        </w:tc>
-        <w:tc>
-          <w:tcPr>
-            <w:tcW w:type="dxa" w:w="2736"/>
-            <w:tcMar>
-              <w:top w:w="100" w:type="dxa"/>
-              <w:start w:w="120" w:type="dxa"/>
-              <w:bottom w:w="100" w:type="dxa"/>
-              <w:end w:w="120" w:type="dxa"/>
-            </w:tcMar>
-            <w:vAlign w:val="center"/>
-            <w:shd w:fill="EAF2F8"/>
-          </w:tcPr>
-          <w:p>
-            <w:pPr>
-              <w:spacing w:after="0" w:line="259" w:lineRule="auto"/>
-            </w:pPr>
-            <w:r>
-              <w:rPr>
-                <w:rFonts w:ascii="Aptos" w:hAnsi="Aptos" w:eastAsia="Microsoft YaHei"/>
-                <w:color w:val="000000"/>
-                <w:sz w:val="17"/>
-              </w:rPr>
-              <w:t>只允许优化快照存储方式</w:t>
-            </w:r>
-          </w:p>
-        </w:tc>
-      </w:tr>
-      <w:tr>
-        <w:trPr>
-          <w:cantSplit/>
-        </w:trPr>
-        <w:tc>
-          <w:tcPr>
-            <w:tcW w:type="dxa" w:w="1152"/>
-            <w:tcMar>
-              <w:top w:w="100" w:type="dxa"/>
-              <w:start w:w="120" w:type="dxa"/>
-              <w:bottom w:w="100" w:type="dxa"/>
-              <w:end w:w="120" w:type="dxa"/>
-            </w:tcMar>
-            <w:vAlign w:val="center"/>
-          </w:tcPr>
-          <w:p>
-            <w:pPr>
-              <w:spacing w:after="0" w:line="259" w:lineRule="auto"/>
-              <w:jc w:val="center"/>
-            </w:pPr>
-            <w:r>
-              <w:rPr>
-                <w:rFonts w:ascii="Aptos" w:hAnsi="Aptos" w:eastAsia="Microsoft YaHei"/>
-                <w:color w:val="000000"/>
-                <w:sz w:val="17"/>
-              </w:rPr>
-              <w:t>ADR 009</w:t>
-            </w:r>
-          </w:p>
-        </w:tc>
-        <w:tc>
-          <w:tcPr>
-            <w:tcW w:type="dxa" w:w="2304"/>
-            <w:tcMar>
-              <w:top w:w="100" w:type="dxa"/>
-              <w:start w:w="120" w:type="dxa"/>
-              <w:bottom w:w="100" w:type="dxa"/>
-              <w:end w:w="120" w:type="dxa"/>
-            </w:tcMar>
-            <w:vAlign w:val="center"/>
-          </w:tcPr>
-          <w:p>
-            <w:pPr>
-              <w:spacing w:after="0" w:line="259" w:lineRule="auto"/>
-            </w:pPr>
-            <w:r>
-              <w:rPr>
-                <w:rFonts w:ascii="Aptos" w:hAnsi="Aptos" w:eastAsia="Microsoft YaHei"/>
-                <w:color w:val="000000"/>
-                <w:sz w:val="17"/>
-              </w:rPr>
-              <w:t>Alembic 管理数据库版本</w:t>
-            </w:r>
-          </w:p>
-        </w:tc>
-        <w:tc>
-          <w:tcPr>
-            <w:tcW w:type="dxa" w:w="3744"/>
-            <w:tcMar>
-              <w:top w:w="100" w:type="dxa"/>
-              <w:start w:w="120" w:type="dxa"/>
-              <w:bottom w:w="100" w:type="dxa"/>
-              <w:end w:w="120" w:type="dxa"/>
-            </w:tcMar>
-            <w:vAlign w:val="center"/>
-          </w:tcPr>
-          <w:p>
-            <w:pPr>
-              <w:spacing w:after="0" w:line="259" w:lineRule="auto"/>
-            </w:pPr>
-            <w:r>
-              <w:rPr>
-                <w:rFonts w:ascii="Aptos" w:hAnsi="Aptos" w:eastAsia="Microsoft YaHei"/>
-                <w:color w:val="000000"/>
-                <w:sz w:val="17"/>
-              </w:rPr>
-              <w:t>让升级 回滚和部署顺序可以复现</w:t>
-            </w:r>
-          </w:p>
-        </w:tc>
-        <w:tc>
-          <w:tcPr>
-            <w:tcW w:type="dxa" w:w="2736"/>
-            <w:tcMar>
-              <w:top w:w="100" w:type="dxa"/>
-              <w:start w:w="120" w:type="dxa"/>
-              <w:bottom w:w="100" w:type="dxa"/>
-              <w:end w:w="120" w:type="dxa"/>
-            </w:tcMar>
-            <w:vAlign w:val="center"/>
-          </w:tcPr>
-          <w:p>
-            <w:pPr>
-              <w:spacing w:after="0" w:line="259" w:lineRule="auto"/>
-            </w:pPr>
-            <w:r>
-              <w:rPr>
-                <w:rFonts w:ascii="Aptos" w:hAnsi="Aptos" w:eastAsia="Microsoft YaHei"/>
-                <w:color w:val="000000"/>
-                <w:sz w:val="17"/>
-              </w:rPr>
-              <w:t>不能退回容器初始化目录直接建业务表</w:t>
-            </w:r>
-          </w:p>
-        </w:tc>
-      </w:tr>
-      <w:tr>
-        <w:trPr>
-          <w:cantSplit/>
-        </w:trPr>
-        <w:tc>
-          <w:tcPr>
-            <w:tcW w:type="dxa" w:w="1152"/>
-            <w:tcMar>
-              <w:top w:w="100" w:type="dxa"/>
-              <w:start w:w="120" w:type="dxa"/>
-              <w:bottom w:w="100" w:type="dxa"/>
-              <w:end w:w="120" w:type="dxa"/>
-            </w:tcMar>
-            <w:vAlign w:val="center"/>
-            <w:shd w:fill="EAF2F8"/>
-          </w:tcPr>
-          <w:p>
-            <w:pPr>
-              <w:spacing w:after="0" w:line="259" w:lineRule="auto"/>
-              <w:jc w:val="center"/>
-            </w:pPr>
-            <w:r>
-              <w:rPr>
-                <w:rFonts w:ascii="Aptos" w:hAnsi="Aptos" w:eastAsia="Microsoft YaHei"/>
-                <w:color w:val="000000"/>
-                <w:sz w:val="17"/>
-              </w:rPr>
-              <w:t>ADR 010</w:t>
-            </w:r>
-          </w:p>
-        </w:tc>
-        <w:tc>
-          <w:tcPr>
-            <w:tcW w:type="dxa" w:w="2304"/>
-            <w:tcMar>
-              <w:top w:w="100" w:type="dxa"/>
-              <w:start w:w="120" w:type="dxa"/>
-              <w:bottom w:w="100" w:type="dxa"/>
-              <w:end w:w="120" w:type="dxa"/>
-            </w:tcMar>
-            <w:vAlign w:val="center"/>
-            <w:shd w:fill="EAF2F8"/>
-          </w:tcPr>
-          <w:p>
-            <w:pPr>
-              <w:spacing w:after="0" w:line="259" w:lineRule="auto"/>
-            </w:pPr>
-            <w:r>
-              <w:rPr>
-                <w:rFonts w:ascii="Aptos" w:hAnsi="Aptos" w:eastAsia="Microsoft YaHei"/>
-                <w:color w:val="000000"/>
-                <w:sz w:val="17"/>
-              </w:rPr>
-              <w:t>统一错误信封和请求上下文</w:t>
-            </w:r>
-          </w:p>
-        </w:tc>
-        <w:tc>
-          <w:tcPr>
-            <w:tcW w:type="dxa" w:w="3744"/>
-            <w:tcMar>
-              <w:top w:w="100" w:type="dxa"/>
-              <w:start w:w="120" w:type="dxa"/>
-              <w:bottom w:w="100" w:type="dxa"/>
-              <w:end w:w="120" w:type="dxa"/>
-            </w:tcMar>
-            <w:vAlign w:val="center"/>
-            <w:shd w:fill="EAF2F8"/>
-          </w:tcPr>
-          <w:p>
-            <w:pPr>
-              <w:spacing w:after="0" w:line="259" w:lineRule="auto"/>
-            </w:pPr>
-            <w:r>
-              <w:rPr>
-                <w:rFonts w:ascii="Aptos" w:hAnsi="Aptos" w:eastAsia="Microsoft YaHei"/>
-                <w:color w:val="000000"/>
-                <w:sz w:val="17"/>
-              </w:rPr>
-              <w:t>客户端和审计可以依靠稳定错误码和请求 ID</w:t>
-            </w:r>
-          </w:p>
-        </w:tc>
-        <w:tc>
-          <w:tcPr>
-            <w:tcW w:type="dxa" w:w="2736"/>
-            <w:tcMar>
-              <w:top w:w="100" w:type="dxa"/>
-              <w:start w:w="120" w:type="dxa"/>
-              <w:bottom w:w="100" w:type="dxa"/>
-              <w:end w:w="120" w:type="dxa"/>
-            </w:tcMar>
-            <w:vAlign w:val="center"/>
-            <w:shd w:fill="EAF2F8"/>
-          </w:tcPr>
-          <w:p>
-            <w:pPr>
-              <w:spacing w:after="0" w:line="259" w:lineRule="auto"/>
-            </w:pPr>
-            <w:r>
-              <w:rPr>
-                <w:rFonts w:ascii="Aptos" w:hAnsi="Aptos" w:eastAsia="Microsoft YaHei"/>
-                <w:color w:val="000000"/>
-                <w:sz w:val="17"/>
-              </w:rPr>
-              <w:t>只允许兼容性扩展</w:t>
-            </w:r>
-          </w:p>
-        </w:tc>
-      </w:tr>
-      <w:tr>
-        <w:trPr>
-          <w:cantSplit/>
-        </w:trPr>
-        <w:tc>
-          <w:tcPr>
-            <w:tcW w:type="dxa" w:w="1152"/>
-            <w:tcMar>
-              <w:top w:w="100" w:type="dxa"/>
-              <w:start w:w="120" w:type="dxa"/>
-              <w:bottom w:w="100" w:type="dxa"/>
-              <w:end w:w="120" w:type="dxa"/>
-            </w:tcMar>
-            <w:vAlign w:val="center"/>
-          </w:tcPr>
-          <w:p>
-            <w:pPr>
-              <w:spacing w:after="0" w:line="259" w:lineRule="auto"/>
-              <w:jc w:val="center"/>
-            </w:pPr>
-            <w:r>
-              <w:rPr>
-                <w:rFonts w:ascii="Aptos" w:hAnsi="Aptos" w:eastAsia="Microsoft YaHei"/>
-                <w:color w:val="000000"/>
-                <w:sz w:val="17"/>
-              </w:rPr>
-              <w:t>ADR 011</w:t>
-            </w:r>
-          </w:p>
-        </w:tc>
-        <w:tc>
-          <w:tcPr>
-            <w:tcW w:type="dxa" w:w="2304"/>
-            <w:tcMar>
-              <w:top w:w="100" w:type="dxa"/>
-              <w:start w:w="120" w:type="dxa"/>
-              <w:bottom w:w="100" w:type="dxa"/>
-              <w:end w:w="120" w:type="dxa"/>
-            </w:tcMar>
-            <w:vAlign w:val="center"/>
-          </w:tcPr>
-          <w:p>
-            <w:pPr>
-              <w:spacing w:after="0" w:line="259" w:lineRule="auto"/>
-            </w:pPr>
-            <w:r>
-              <w:rPr>
-                <w:rFonts w:ascii="Aptos" w:hAnsi="Aptos" w:eastAsia="Microsoft YaHei"/>
-                <w:color w:val="000000"/>
-                <w:sz w:val="17"/>
-              </w:rPr>
-              <w:t>CI Shell 脚本由 Bash 显式调用</w:t>
-            </w:r>
-          </w:p>
-        </w:tc>
-        <w:tc>
-          <w:tcPr>
-            <w:tcW w:type="dxa" w:w="3744"/>
-            <w:tcMar>
-              <w:top w:w="100" w:type="dxa"/>
-              <w:start w:w="120" w:type="dxa"/>
-              <w:bottom w:w="100" w:type="dxa"/>
-              <w:end w:w="120" w:type="dxa"/>
-            </w:tcMar>
-            <w:vAlign w:val="center"/>
-          </w:tcPr>
-          <w:p>
-            <w:pPr>
-              <w:spacing w:after="0" w:line="259" w:lineRule="auto"/>
-            </w:pPr>
-            <w:r>
-              <w:rPr>
-                <w:rFonts w:ascii="Aptos" w:hAnsi="Aptos" w:eastAsia="Microsoft YaHei"/>
-                <w:color w:val="000000"/>
-                <w:sz w:val="17"/>
-              </w:rPr>
-              <w:t>避免 Windows 和 API 上传丢失可执行位</w:t>
-            </w:r>
-          </w:p>
-        </w:tc>
-        <w:tc>
-          <w:tcPr>
-            <w:tcW w:type="dxa" w:w="2736"/>
-            <w:tcMar>
-              <w:top w:w="100" w:type="dxa"/>
-              <w:start w:w="120" w:type="dxa"/>
-              <w:bottom w:w="100" w:type="dxa"/>
-              <w:end w:w="120" w:type="dxa"/>
-            </w:tcMar>
-            <w:vAlign w:val="center"/>
-          </w:tcPr>
-          <w:p>
-            <w:pPr>
-              <w:spacing w:after="0" w:line="259" w:lineRule="auto"/>
-            </w:pPr>
-            <w:r>
-              <w:rPr>
-                <w:rFonts w:ascii="Aptos" w:hAnsi="Aptos" w:eastAsia="Microsoft YaHei"/>
-                <w:color w:val="000000"/>
-                <w:sz w:val="17"/>
-              </w:rPr>
-              <w:t>只有上传链路稳定保留 100755 时才评估简化</w:t>
-            </w:r>
-          </w:p>
-        </w:tc>
-      </w:tr>
-      <w:tr>
-        <w:trPr>
-          <w:cantSplit/>
-        </w:trPr>
-        <w:tc>
-          <w:tcPr>
-            <w:tcW w:type="dxa" w:w="1152"/>
-            <w:tcMar>
-              <w:top w:w="100" w:type="dxa"/>
-              <w:start w:w="120" w:type="dxa"/>
-              <w:bottom w:w="100" w:type="dxa"/>
-              <w:end w:w="120" w:type="dxa"/>
-            </w:tcMar>
-            <w:vAlign w:val="center"/>
-            <w:shd w:fill="EAF2F8"/>
-          </w:tcPr>
-          <w:p>
-            <w:pPr>
-              <w:spacing w:after="0" w:line="259" w:lineRule="auto"/>
-              <w:jc w:val="center"/>
-            </w:pPr>
-            <w:r>
-              <w:rPr>
-                <w:rFonts w:ascii="Aptos" w:hAnsi="Aptos" w:eastAsia="Microsoft YaHei"/>
-                <w:color w:val="000000"/>
-                <w:sz w:val="17"/>
-              </w:rPr>
-              <w:t>ADR 012</w:t>
-            </w:r>
-          </w:p>
-        </w:tc>
-        <w:tc>
-          <w:tcPr>
-            <w:tcW w:type="dxa" w:w="2304"/>
-            <w:tcMar>
-              <w:top w:w="100" w:type="dxa"/>
-              <w:start w:w="120" w:type="dxa"/>
-              <w:bottom w:w="100" w:type="dxa"/>
-              <w:end w:w="120" w:type="dxa"/>
-            </w:tcMar>
-            <w:vAlign w:val="center"/>
-            <w:shd w:fill="EAF2F8"/>
-          </w:tcPr>
-          <w:p>
-            <w:pPr>
-              <w:spacing w:after="0" w:line="259" w:lineRule="auto"/>
-            </w:pPr>
-            <w:r>
-              <w:rPr>
-                <w:rFonts w:ascii="Aptos" w:hAnsi="Aptos" w:eastAsia="Microsoft YaHei"/>
-                <w:color w:val="000000"/>
-                <w:sz w:val="17"/>
-              </w:rPr>
-              <w:t>阶段成果使用独立分支和 PR 审批</w:t>
-            </w:r>
-          </w:p>
-        </w:tc>
-        <w:tc>
-          <w:tcPr>
-            <w:tcW w:type="dxa" w:w="3744"/>
-            <w:tcMar>
-              <w:top w:w="100" w:type="dxa"/>
-              <w:start w:w="120" w:type="dxa"/>
-              <w:bottom w:w="100" w:type="dxa"/>
-              <w:end w:w="120" w:type="dxa"/>
-            </w:tcMar>
-            <w:vAlign w:val="center"/>
-            <w:shd w:fill="EAF2F8"/>
-          </w:tcPr>
-          <w:p>
-            <w:pPr>
-              <w:spacing w:after="0" w:line="259" w:lineRule="auto"/>
-            </w:pPr>
-            <w:r>
-              <w:rPr>
-                <w:rFonts w:ascii="Aptos" w:hAnsi="Aptos" w:eastAsia="Microsoft YaHei"/>
-                <w:color w:val="000000"/>
-                <w:sz w:val="17"/>
-              </w:rPr>
-              <w:t>让 main 只接收经过检查和人工批准的变更</w:t>
-            </w:r>
-          </w:p>
-        </w:tc>
-        <w:tc>
-          <w:tcPr>
-            <w:tcW w:type="dxa" w:w="2736"/>
-            <w:tcMar>
-              <w:top w:w="100" w:type="dxa"/>
-              <w:start w:w="120" w:type="dxa"/>
-              <w:bottom w:w="100" w:type="dxa"/>
-              <w:end w:w="120" w:type="dxa"/>
-            </w:tcMar>
-            <w:vAlign w:val="center"/>
-            <w:shd w:fill="EAF2F8"/>
-          </w:tcPr>
-          <w:p>
-            <w:pPr>
-              <w:spacing w:after="0" w:line="259" w:lineRule="auto"/>
-            </w:pPr>
-            <w:r>
-              <w:rPr>
-                <w:rFonts w:ascii="Aptos" w:hAnsi="Aptos" w:eastAsia="Microsoft YaHei"/>
-                <w:color w:val="000000"/>
-                <w:sz w:val="17"/>
-              </w:rPr>
-              <w:t>只有项目负责人明确调整交付流程时变更</w:t>
+              <w:t>采用</w:t>
             </w:r>
           </w:p>
         </w:tc>
@@ -15740,6 +14968,685 @@
       <w:pPr>
         <w:spacing w:after="40"/>
       </w:pPr>
+    </w:p>
+    <w:p>
+      <w:pPr>
+        <w:pStyle w:val="Heading2"/>
+        <w:keepNext/>
+        <w:keepLines/>
+      </w:pPr>
+      <w:r>
+        <w:rPr>
+          <w:rFonts w:ascii="Aptos" w:hAnsi="Aptos" w:eastAsia="Microsoft YaHei"/>
+          <w:b/>
+          <w:color w:val="000000"/>
+          <w:sz w:val="26"/>
+        </w:rPr>
+        <w:t>十之四 实现内容</w:t>
+      </w:r>
+    </w:p>
+    <w:p>
+      <w:pPr>
+        <w:pStyle w:val="ListBullet"/>
+        <w:spacing w:after="50"/>
+      </w:pPr>
+      <w:r>
+        <w:rPr>
+          <w:rFonts w:ascii="Aptos" w:hAnsi="Aptos" w:eastAsia="Microsoft YaHei"/>
+          <w:color w:val="000000"/>
+        </w:rPr>
+        <w:t>删除 github scripts check clawhub version mjs</w:t>
+      </w:r>
+    </w:p>
+    <w:p>
+      <w:pPr>
+        <w:pStyle w:val="ListBullet"/>
+        <w:spacing w:after="50"/>
+      </w:pPr>
+      <w:r>
+        <w:rPr>
+          <w:rFonts w:ascii="Aptos" w:hAnsi="Aptos" w:eastAsia="Microsoft YaHei"/>
+          <w:color w:val="000000"/>
+        </w:rPr>
+        <w:t>删除 github scripts publish openmaic skill sh</w:t>
+      </w:r>
+    </w:p>
+    <w:p>
+      <w:pPr>
+        <w:pStyle w:val="ListBullet"/>
+        <w:spacing w:after="50"/>
+      </w:pPr>
+      <w:r>
+        <w:rPr>
+          <w:rFonts w:ascii="Aptos" w:hAnsi="Aptos" w:eastAsia="Microsoft YaHei"/>
+          <w:color w:val="000000"/>
+        </w:rPr>
+        <w:t>删除 tests ci check clawhub version test ts</w:t>
+      </w:r>
+    </w:p>
+    <w:p>
+      <w:pPr>
+        <w:pStyle w:val="ListBullet"/>
+        <w:spacing w:after="50"/>
+      </w:pPr>
+      <w:r>
+        <w:rPr>
+          <w:rFonts w:ascii="Aptos" w:hAnsi="Aptos" w:eastAsia="Microsoft YaHei"/>
+          <w:color w:val="000000"/>
+        </w:rPr>
+        <w:t>删除 tests ci publish openmaic skill test ts</w:t>
+      </w:r>
+    </w:p>
+    <w:p>
+      <w:pPr>
+        <w:pStyle w:val="ListBullet"/>
+        <w:spacing w:after="50"/>
+      </w:pPr>
+      <w:r>
+        <w:rPr>
+          <w:rFonts w:ascii="Aptos" w:hAnsi="Aptos" w:eastAsia="Microsoft YaHei"/>
+          <w:color w:val="000000"/>
+        </w:rPr>
+        <w:t>全仓搜索确认没有剩余 ClawHub 发布引用</w:t>
+      </w:r>
+    </w:p>
+    <w:p>
+      <w:pPr>
+        <w:pStyle w:val="Heading2"/>
+        <w:keepNext/>
+        <w:keepLines/>
+      </w:pPr>
+      <w:r>
+        <w:rPr>
+          <w:rFonts w:ascii="Aptos" w:hAnsi="Aptos" w:eastAsia="Microsoft YaHei"/>
+          <w:b/>
+          <w:color w:val="000000"/>
+          <w:sz w:val="26"/>
+        </w:rPr>
+        <w:t>十之五 验证结果</w:t>
+      </w:r>
+    </w:p>
+    <w:tbl>
+      <w:tblPr>
+        <w:tblW w:type="auto" w:w="0"/>
+        <w:jc w:val="center"/>
+        <w:tblLayout w:type="fixed"/>
+        <w:tblLook w:firstColumn="1" w:firstRow="1" w:lastColumn="0" w:lastRow="0" w:noHBand="0" w:noVBand="1" w:val="04A0"/>
+        <w:tblBorders>
+          <w:top w:val="single" w:sz="6" w:space="0" w:color="D9D9D9"/>
+          <w:left w:val="single" w:sz="6" w:space="0" w:color="D9D9D9"/>
+          <w:bottom w:val="single" w:sz="6" w:space="0" w:color="D9D9D9"/>
+          <w:right w:val="single" w:sz="6" w:space="0" w:color="D9D9D9"/>
+          <w:insideH w:val="single" w:sz="6" w:space="0" w:color="D9D9D9"/>
+          <w:insideV w:val="single" w:sz="6" w:space="0" w:color="D9D9D9"/>
+        </w:tblBorders>
+      </w:tblPr>
+      <w:tblGrid>
+        <w:gridCol w:w="3331"/>
+        <w:gridCol w:w="3331"/>
+        <w:gridCol w:w="3331"/>
+      </w:tblGrid>
+      <w:tr>
+        <w:trPr>
+          <w:tblHeader w:val="true"/>
+          <w:cantSplit/>
+        </w:trPr>
+        <w:tc>
+          <w:tcPr>
+            <w:tcW w:type="dxa" w:w="2376"/>
+            <w:shd w:fill="1F4E78"/>
+            <w:tcMar>
+              <w:top w:w="100" w:type="dxa"/>
+              <w:start w:w="120" w:type="dxa"/>
+              <w:bottom w:w="100" w:type="dxa"/>
+              <w:end w:w="120" w:type="dxa"/>
+            </w:tcMar>
+            <w:vAlign w:val="center"/>
+          </w:tcPr>
+          <w:p>
+            <w:pPr>
+              <w:spacing w:after="0"/>
+              <w:jc w:val="center"/>
+            </w:pPr>
+            <w:r>
+              <w:rPr>
+                <w:rFonts w:ascii="Aptos" w:hAnsi="Aptos" w:eastAsia="Microsoft YaHei"/>
+                <w:b/>
+                <w:color w:val="FFFFFF"/>
+                <w:sz w:val="17"/>
+              </w:rPr>
+              <w:t>验证项</w:t>
+            </w:r>
+          </w:p>
+        </w:tc>
+        <w:tc>
+          <w:tcPr>
+            <w:tcW w:type="dxa" w:w="1440"/>
+            <w:shd w:fill="1F4E78"/>
+            <w:tcMar>
+              <w:top w:w="100" w:type="dxa"/>
+              <w:start w:w="120" w:type="dxa"/>
+              <w:bottom w:w="100" w:type="dxa"/>
+              <w:end w:w="120" w:type="dxa"/>
+            </w:tcMar>
+            <w:vAlign w:val="center"/>
+          </w:tcPr>
+          <w:p>
+            <w:pPr>
+              <w:spacing w:after="0"/>
+              <w:jc w:val="center"/>
+            </w:pPr>
+            <w:r>
+              <w:rPr>
+                <w:rFonts w:ascii="Aptos" w:hAnsi="Aptos" w:eastAsia="Microsoft YaHei"/>
+                <w:b/>
+                <w:color w:val="FFFFFF"/>
+                <w:sz w:val="17"/>
+              </w:rPr>
+              <w:t>结果</w:t>
+            </w:r>
+          </w:p>
+        </w:tc>
+        <w:tc>
+          <w:tcPr>
+            <w:tcW w:type="dxa" w:w="6192"/>
+            <w:shd w:fill="1F4E78"/>
+            <w:tcMar>
+              <w:top w:w="100" w:type="dxa"/>
+              <w:start w:w="120" w:type="dxa"/>
+              <w:bottom w:w="100" w:type="dxa"/>
+              <w:end w:w="120" w:type="dxa"/>
+            </w:tcMar>
+            <w:vAlign w:val="center"/>
+          </w:tcPr>
+          <w:p>
+            <w:pPr>
+              <w:spacing w:after="0"/>
+              <w:jc w:val="center"/>
+            </w:pPr>
+            <w:r>
+              <w:rPr>
+                <w:rFonts w:ascii="Aptos" w:hAnsi="Aptos" w:eastAsia="Microsoft YaHei"/>
+                <w:b/>
+                <w:color w:val="FFFFFF"/>
+                <w:sz w:val="17"/>
+              </w:rPr>
+              <w:t>证据或限制</w:t>
+            </w:r>
+          </w:p>
+        </w:tc>
+      </w:tr>
+      <w:tr>
+        <w:trPr>
+          <w:cantSplit/>
+        </w:trPr>
+        <w:tc>
+          <w:tcPr>
+            <w:tcW w:type="dxa" w:w="2376"/>
+            <w:tcMar>
+              <w:top w:w="100" w:type="dxa"/>
+              <w:start w:w="120" w:type="dxa"/>
+              <w:bottom w:w="100" w:type="dxa"/>
+              <w:end w:w="120" w:type="dxa"/>
+            </w:tcMar>
+            <w:vAlign w:val="center"/>
+          </w:tcPr>
+          <w:p>
+            <w:pPr>
+              <w:spacing w:after="0" w:line="259" w:lineRule="auto"/>
+              <w:jc w:val="center"/>
+            </w:pPr>
+            <w:r>
+              <w:rPr>
+                <w:rFonts w:ascii="Aptos" w:hAnsi="Aptos" w:eastAsia="Microsoft YaHei"/>
+                <w:color w:val="000000"/>
+                <w:sz w:val="17"/>
+              </w:rPr>
+              <w:t>PR 静态质量门禁</w:t>
+            </w:r>
+          </w:p>
+        </w:tc>
+        <w:tc>
+          <w:tcPr>
+            <w:tcW w:type="dxa" w:w="1440"/>
+            <w:tcMar>
+              <w:top w:w="100" w:type="dxa"/>
+              <w:start w:w="120" w:type="dxa"/>
+              <w:bottom w:w="100" w:type="dxa"/>
+              <w:end w:w="120" w:type="dxa"/>
+            </w:tcMar>
+            <w:vAlign w:val="center"/>
+          </w:tcPr>
+          <w:p>
+            <w:pPr>
+              <w:spacing w:after="0" w:line="259" w:lineRule="auto"/>
+            </w:pPr>
+            <w:r>
+              <w:rPr>
+                <w:rFonts w:ascii="Aptos" w:hAnsi="Aptos" w:eastAsia="Microsoft YaHei"/>
+                <w:color w:val="000000"/>
+                <w:sz w:val="17"/>
+              </w:rPr>
+              <w:t>通过</w:t>
+            </w:r>
+          </w:p>
+        </w:tc>
+        <w:tc>
+          <w:tcPr>
+            <w:tcW w:type="dxa" w:w="6192"/>
+            <w:tcMar>
+              <w:top w:w="100" w:type="dxa"/>
+              <w:start w:w="120" w:type="dxa"/>
+              <w:bottom w:w="100" w:type="dxa"/>
+              <w:end w:w="120" w:type="dxa"/>
+            </w:tcMar>
+            <w:vAlign w:val="center"/>
+          </w:tcPr>
+          <w:p>
+            <w:pPr>
+              <w:spacing w:after="0" w:line="259" w:lineRule="auto"/>
+            </w:pPr>
+            <w:r>
+              <w:rPr>
+                <w:rFonts w:ascii="Aptos" w:hAnsi="Aptos" w:eastAsia="Microsoft YaHei"/>
+                <w:color w:val="000000"/>
+                <w:sz w:val="17"/>
+              </w:rPr>
+              <w:t>Prettier ESLint TypeScript 和 i18n 已在 GitHub Runner 通过</w:t>
+            </w:r>
+          </w:p>
+        </w:tc>
+      </w:tr>
+      <w:tr>
+        <w:trPr>
+          <w:cantSplit/>
+        </w:trPr>
+        <w:tc>
+          <w:tcPr>
+            <w:tcW w:type="dxa" w:w="2376"/>
+            <w:tcMar>
+              <w:top w:w="100" w:type="dxa"/>
+              <w:start w:w="120" w:type="dxa"/>
+              <w:bottom w:w="100" w:type="dxa"/>
+              <w:end w:w="120" w:type="dxa"/>
+            </w:tcMar>
+            <w:vAlign w:val="center"/>
+            <w:shd w:fill="EAF2F8"/>
+          </w:tcPr>
+          <w:p>
+            <w:pPr>
+              <w:spacing w:after="0" w:line="259" w:lineRule="auto"/>
+              <w:jc w:val="center"/>
+            </w:pPr>
+            <w:r>
+              <w:rPr>
+                <w:rFonts w:ascii="Aptos" w:hAnsi="Aptos" w:eastAsia="Microsoft YaHei"/>
+                <w:color w:val="000000"/>
+                <w:sz w:val="17"/>
+              </w:rPr>
+              <w:t>失效引用搜索</w:t>
+            </w:r>
+          </w:p>
+        </w:tc>
+        <w:tc>
+          <w:tcPr>
+            <w:tcW w:type="dxa" w:w="1440"/>
+            <w:tcMar>
+              <w:top w:w="100" w:type="dxa"/>
+              <w:start w:w="120" w:type="dxa"/>
+              <w:bottom w:w="100" w:type="dxa"/>
+              <w:end w:w="120" w:type="dxa"/>
+            </w:tcMar>
+            <w:vAlign w:val="center"/>
+            <w:shd w:fill="EAF2F8"/>
+          </w:tcPr>
+          <w:p>
+            <w:pPr>
+              <w:spacing w:after="0" w:line="259" w:lineRule="auto"/>
+            </w:pPr>
+            <w:r>
+              <w:rPr>
+                <w:rFonts w:ascii="Aptos" w:hAnsi="Aptos" w:eastAsia="Microsoft YaHei"/>
+                <w:color w:val="000000"/>
+                <w:sz w:val="17"/>
+              </w:rPr>
+              <w:t>通过</w:t>
+            </w:r>
+          </w:p>
+        </w:tc>
+        <w:tc>
+          <w:tcPr>
+            <w:tcW w:type="dxa" w:w="6192"/>
+            <w:tcMar>
+              <w:top w:w="100" w:type="dxa"/>
+              <w:start w:w="120" w:type="dxa"/>
+              <w:bottom w:w="100" w:type="dxa"/>
+              <w:end w:w="120" w:type="dxa"/>
+            </w:tcMar>
+            <w:vAlign w:val="center"/>
+            <w:shd w:fill="EAF2F8"/>
+          </w:tcPr>
+          <w:p>
+            <w:pPr>
+              <w:spacing w:after="0" w:line="259" w:lineRule="auto"/>
+            </w:pPr>
+            <w:r>
+              <w:rPr>
+                <w:rFonts w:ascii="Aptos" w:hAnsi="Aptos" w:eastAsia="Microsoft YaHei"/>
+                <w:color w:val="000000"/>
+                <w:sz w:val="17"/>
+              </w:rPr>
+              <w:t>tests github scripts 和 package json 中无 ClawHub 发布引用</w:t>
+            </w:r>
+          </w:p>
+        </w:tc>
+      </w:tr>
+      <w:tr>
+        <w:trPr>
+          <w:cantSplit/>
+        </w:trPr>
+        <w:tc>
+          <w:tcPr>
+            <w:tcW w:type="dxa" w:w="2376"/>
+            <w:tcMar>
+              <w:top w:w="100" w:type="dxa"/>
+              <w:start w:w="120" w:type="dxa"/>
+              <w:bottom w:w="100" w:type="dxa"/>
+              <w:end w:w="120" w:type="dxa"/>
+            </w:tcMar>
+            <w:vAlign w:val="center"/>
+          </w:tcPr>
+          <w:p>
+            <w:pPr>
+              <w:spacing w:after="0" w:line="259" w:lineRule="auto"/>
+              <w:jc w:val="center"/>
+            </w:pPr>
+            <w:r>
+              <w:rPr>
+                <w:rFonts w:ascii="Aptos" w:hAnsi="Aptos" w:eastAsia="Microsoft YaHei"/>
+                <w:color w:val="000000"/>
+                <w:sz w:val="17"/>
+              </w:rPr>
+              <w:t>ContractOps 后端门禁</w:t>
+            </w:r>
+          </w:p>
+        </w:tc>
+        <w:tc>
+          <w:tcPr>
+            <w:tcW w:type="dxa" w:w="1440"/>
+            <w:tcMar>
+              <w:top w:w="100" w:type="dxa"/>
+              <w:start w:w="120" w:type="dxa"/>
+              <w:bottom w:w="100" w:type="dxa"/>
+              <w:end w:w="120" w:type="dxa"/>
+            </w:tcMar>
+            <w:vAlign w:val="center"/>
+          </w:tcPr>
+          <w:p>
+            <w:pPr>
+              <w:spacing w:after="0" w:line="259" w:lineRule="auto"/>
+            </w:pPr>
+            <w:r>
+              <w:rPr>
+                <w:rFonts w:ascii="Aptos" w:hAnsi="Aptos" w:eastAsia="Microsoft YaHei"/>
+                <w:color w:val="000000"/>
+                <w:sz w:val="17"/>
+              </w:rPr>
+              <w:t>通过</w:t>
+            </w:r>
+          </w:p>
+        </w:tc>
+        <w:tc>
+          <w:tcPr>
+            <w:tcW w:type="dxa" w:w="6192"/>
+            <w:tcMar>
+              <w:top w:w="100" w:type="dxa"/>
+              <w:start w:w="120" w:type="dxa"/>
+              <w:bottom w:w="100" w:type="dxa"/>
+              <w:end w:w="120" w:type="dxa"/>
+            </w:tcMar>
+            <w:vAlign w:val="center"/>
+          </w:tcPr>
+          <w:p>
+            <w:pPr>
+              <w:spacing w:after="0" w:line="259" w:lineRule="auto"/>
+            </w:pPr>
+            <w:r>
+              <w:rPr>
+                <w:rFonts w:ascii="Aptos" w:hAnsi="Aptos" w:eastAsia="Microsoft YaHei"/>
+                <w:color w:val="000000"/>
+                <w:sz w:val="17"/>
+              </w:rPr>
+              <w:t>Ruff mypy strict 和 24 项 pytest 通过</w:t>
+            </w:r>
+          </w:p>
+        </w:tc>
+      </w:tr>
+      <w:tr>
+        <w:trPr>
+          <w:cantSplit/>
+        </w:trPr>
+        <w:tc>
+          <w:tcPr>
+            <w:tcW w:type="dxa" w:w="2376"/>
+            <w:tcMar>
+              <w:top w:w="100" w:type="dxa"/>
+              <w:start w:w="120" w:type="dxa"/>
+              <w:bottom w:w="100" w:type="dxa"/>
+              <w:end w:w="120" w:type="dxa"/>
+            </w:tcMar>
+            <w:vAlign w:val="center"/>
+            <w:shd w:fill="EAF2F8"/>
+          </w:tcPr>
+          <w:p>
+            <w:pPr>
+              <w:spacing w:after="0" w:line="259" w:lineRule="auto"/>
+              <w:jc w:val="center"/>
+            </w:pPr>
+            <w:r>
+              <w:rPr>
+                <w:rFonts w:ascii="Aptos" w:hAnsi="Aptos" w:eastAsia="Microsoft YaHei"/>
+                <w:color w:val="000000"/>
+                <w:sz w:val="17"/>
+              </w:rPr>
+              <w:t>PR 根仓库单测</w:t>
+            </w:r>
+          </w:p>
+        </w:tc>
+        <w:tc>
+          <w:tcPr>
+            <w:tcW w:type="dxa" w:w="1440"/>
+            <w:tcMar>
+              <w:top w:w="100" w:type="dxa"/>
+              <w:start w:w="120" w:type="dxa"/>
+              <w:bottom w:w="100" w:type="dxa"/>
+              <w:end w:w="120" w:type="dxa"/>
+            </w:tcMar>
+            <w:vAlign w:val="center"/>
+            <w:shd w:fill="EAF2F8"/>
+          </w:tcPr>
+          <w:p>
+            <w:pPr>
+              <w:spacing w:after="0" w:line="259" w:lineRule="auto"/>
+            </w:pPr>
+            <w:r>
+              <w:rPr>
+                <w:rFonts w:ascii="Aptos" w:hAnsi="Aptos" w:eastAsia="Microsoft YaHei"/>
+                <w:color w:val="000000"/>
+                <w:sz w:val="17"/>
+              </w:rPr>
+              <w:t>待复跑</w:t>
+            </w:r>
+          </w:p>
+        </w:tc>
+        <w:tc>
+          <w:tcPr>
+            <w:tcW w:type="dxa" w:w="6192"/>
+            <w:tcMar>
+              <w:top w:w="100" w:type="dxa"/>
+              <w:start w:w="120" w:type="dxa"/>
+              <w:bottom w:w="100" w:type="dxa"/>
+              <w:end w:w="120" w:type="dxa"/>
+            </w:tcMar>
+            <w:vAlign w:val="center"/>
+            <w:shd w:fill="EAF2F8"/>
+          </w:tcPr>
+          <w:p>
+            <w:pPr>
+              <w:spacing w:after="0" w:line="259" w:lineRule="auto"/>
+            </w:pPr>
+            <w:r>
+              <w:rPr>
+                <w:rFonts w:ascii="Aptos" w:hAnsi="Aptos" w:eastAsia="Microsoft YaHei"/>
+                <w:color w:val="000000"/>
+                <w:sz w:val="17"/>
+              </w:rPr>
+              <w:t>删除孤立测试后由新提交触发</w:t>
+            </w:r>
+          </w:p>
+        </w:tc>
+      </w:tr>
+      <w:tr>
+        <w:trPr>
+          <w:cantSplit/>
+        </w:trPr>
+        <w:tc>
+          <w:tcPr>
+            <w:tcW w:type="dxa" w:w="2376"/>
+            <w:tcMar>
+              <w:top w:w="100" w:type="dxa"/>
+              <w:start w:w="120" w:type="dxa"/>
+              <w:bottom w:w="100" w:type="dxa"/>
+              <w:end w:w="120" w:type="dxa"/>
+            </w:tcMar>
+            <w:vAlign w:val="center"/>
+          </w:tcPr>
+          <w:p>
+            <w:pPr>
+              <w:spacing w:after="0" w:line="259" w:lineRule="auto"/>
+              <w:jc w:val="center"/>
+            </w:pPr>
+            <w:r>
+              <w:rPr>
+                <w:rFonts w:ascii="Aptos" w:hAnsi="Aptos" w:eastAsia="Microsoft YaHei"/>
+                <w:color w:val="000000"/>
+                <w:sz w:val="17"/>
+              </w:rPr>
+              <w:t>合并 main</w:t>
+            </w:r>
+          </w:p>
+        </w:tc>
+        <w:tc>
+          <w:tcPr>
+            <w:tcW w:type="dxa" w:w="1440"/>
+            <w:tcMar>
+              <w:top w:w="100" w:type="dxa"/>
+              <w:start w:w="120" w:type="dxa"/>
+              <w:bottom w:w="100" w:type="dxa"/>
+              <w:end w:w="120" w:type="dxa"/>
+            </w:tcMar>
+            <w:vAlign w:val="center"/>
+          </w:tcPr>
+          <w:p>
+            <w:pPr>
+              <w:spacing w:after="0" w:line="259" w:lineRule="auto"/>
+            </w:pPr>
+            <w:r>
+              <w:rPr>
+                <w:rFonts w:ascii="Aptos" w:hAnsi="Aptos" w:eastAsia="Microsoft YaHei"/>
+                <w:color w:val="000000"/>
+                <w:sz w:val="17"/>
+              </w:rPr>
+              <w:t>待审批</w:t>
+            </w:r>
+          </w:p>
+        </w:tc>
+        <w:tc>
+          <w:tcPr>
+            <w:tcW w:type="dxa" w:w="6192"/>
+            <w:tcMar>
+              <w:top w:w="100" w:type="dxa"/>
+              <w:start w:w="120" w:type="dxa"/>
+              <w:bottom w:w="100" w:type="dxa"/>
+              <w:end w:w="120" w:type="dxa"/>
+            </w:tcMar>
+            <w:vAlign w:val="center"/>
+          </w:tcPr>
+          <w:p>
+            <w:pPr>
+              <w:spacing w:after="0" w:line="259" w:lineRule="auto"/>
+            </w:pPr>
+            <w:r>
+              <w:rPr>
+                <w:rFonts w:ascii="Aptos" w:hAnsi="Aptos" w:eastAsia="Microsoft YaHei"/>
+                <w:color w:val="000000"/>
+                <w:sz w:val="17"/>
+              </w:rPr>
+              <w:t>PR 全绿后仍需项目负责人明确批准</w:t>
+            </w:r>
+          </w:p>
+        </w:tc>
+      </w:tr>
+    </w:tbl>
+    <w:p>
+      <w:pPr>
+        <w:spacing w:after="40"/>
+      </w:pPr>
+    </w:p>
+    <w:p>
+      <w:pPr>
+        <w:pStyle w:val="Heading2"/>
+        <w:keepNext/>
+        <w:keepLines/>
+      </w:pPr>
+      <w:r>
+        <w:rPr>
+          <w:rFonts w:ascii="Aptos" w:hAnsi="Aptos" w:eastAsia="Microsoft YaHei"/>
+          <w:b/>
+          <w:color w:val="000000"/>
+          <w:sz w:val="26"/>
+        </w:rPr>
+        <w:t>十之六 后续动作</w:t>
+      </w:r>
+    </w:p>
+    <w:p>
+      <w:pPr>
+        <w:spacing w:after="60"/>
+        <w:ind w:left="317" w:hanging="317"/>
+      </w:pPr>
+      <w:r>
+        <w:rPr>
+          <w:rFonts w:ascii="Aptos" w:hAnsi="Aptos" w:eastAsia="Microsoft YaHei"/>
+          <w:color w:val="000000"/>
+        </w:rPr>
+        <w:t>1.  把清理提交追加到现有 fix ci prettier gate PR 分支</w:t>
+      </w:r>
+    </w:p>
+    <w:p>
+      <w:pPr>
+        <w:spacing w:after="60"/>
+        <w:ind w:left="317" w:hanging="317"/>
+      </w:pPr>
+      <w:r>
+        <w:rPr>
+          <w:rFonts w:ascii="Aptos" w:hAnsi="Aptos" w:eastAsia="Microsoft YaHei"/>
+          <w:color w:val="000000"/>
+        </w:rPr>
+        <w:t>2.  等待 PR 的根仓库单测和主镜像构建全部完成</w:t>
+      </w:r>
+    </w:p>
+    <w:p>
+      <w:pPr>
+        <w:spacing w:after="60"/>
+        <w:ind w:left="317" w:hanging="317"/>
+      </w:pPr>
+      <w:r>
+        <w:rPr>
+          <w:rFonts w:ascii="Aptos" w:hAnsi="Aptos" w:eastAsia="Microsoft YaHei"/>
+          <w:color w:val="000000"/>
+        </w:rPr>
+        <w:t>3.  检查全部状态后向项目负责人请求审批 不自动合并</w:t>
+      </w:r>
     </w:p>
     <w:p>
       <w:pPr>
@@ -15754,7 +15661,7 @@
           <w:color w:val="000000"/>
           <w:sz w:val="32"/>
         </w:rPr>
-        <w:t>十一 风险登记</w:t>
+        <w:t>十一 当前决策记录</w:t>
       </w:r>
     </w:p>
     <w:tbl>
@@ -15785,7 +15692,7 @@
         </w:trPr>
         <w:tc>
           <w:tcPr>
-            <w:tcW w:type="dxa" w:w="2088"/>
+            <w:tcW w:type="dxa" w:w="1152"/>
             <w:shd w:fill="1F4E78"/>
             <w:tcMar>
               <w:top w:w="100" w:type="dxa"/>
@@ -15807,13 +15714,13 @@
                 <w:color w:val="FFFFFF"/>
                 <w:sz w:val="17"/>
               </w:rPr>
-              <w:t>风险</w:t>
-            </w:r>
-          </w:p>
-        </w:tc>
-        <w:tc>
-          <w:tcPr>
-            <w:tcW w:type="dxa" w:w="2232"/>
+              <w:t>编号</w:t>
+            </w:r>
+          </w:p>
+        </w:tc>
+        <w:tc>
+          <w:tcPr>
+            <w:tcW w:type="dxa" w:w="2304"/>
             <w:shd w:fill="1F4E78"/>
             <w:tcMar>
               <w:top w:w="100" w:type="dxa"/>
@@ -15835,13 +15742,13 @@
                 <w:color w:val="FFFFFF"/>
                 <w:sz w:val="17"/>
               </w:rPr>
-              <w:t>影响</w:t>
-            </w:r>
-          </w:p>
-        </w:tc>
-        <w:tc>
-          <w:tcPr>
-            <w:tcW w:type="dxa" w:w="3528"/>
+              <w:t>决策</w:t>
+            </w:r>
+          </w:p>
+        </w:tc>
+        <w:tc>
+          <w:tcPr>
+            <w:tcW w:type="dxa" w:w="3744"/>
             <w:shd w:fill="1F4E78"/>
             <w:tcMar>
               <w:top w:w="100" w:type="dxa"/>
@@ -15863,13 +15770,13 @@
                 <w:color w:val="FFFFFF"/>
                 <w:sz w:val="17"/>
               </w:rPr>
-              <w:t>当前控制</w:t>
-            </w:r>
-          </w:p>
-        </w:tc>
-        <w:tc>
-          <w:tcPr>
-            <w:tcW w:type="dxa" w:w="2088"/>
+              <w:t>原因</w:t>
+            </w:r>
+          </w:p>
+        </w:tc>
+        <w:tc>
+          <w:tcPr>
+            <w:tcW w:type="dxa" w:w="2736"/>
             <w:shd w:fill="1F4E78"/>
             <w:tcMar>
               <w:top w:w="100" w:type="dxa"/>
@@ -15891,7 +15798,7 @@
                 <w:color w:val="FFFFFF"/>
                 <w:sz w:val="17"/>
               </w:rPr>
-              <w:t>后续验证</w:t>
+              <w:t>重新评估条件</w:t>
             </w:r>
           </w:p>
         </w:tc>
@@ -15902,7 +15809,7 @@
         </w:trPr>
         <w:tc>
           <w:tcPr>
-            <w:tcW w:type="dxa" w:w="2088"/>
+            <w:tcW w:type="dxa" w:w="1152"/>
             <w:tcMar>
               <w:top w:w="100" w:type="dxa"/>
               <w:start w:w="120" w:type="dxa"/>
@@ -15922,13 +15829,13 @@
                 <w:color w:val="000000"/>
                 <w:sz w:val="17"/>
               </w:rPr>
-              <w:t>审批策略配置错误</w:t>
-            </w:r>
-          </w:p>
-        </w:tc>
-        <w:tc>
-          <w:tcPr>
-            <w:tcW w:type="dxa" w:w="2232"/>
+              <w:t>ADR 001</w:t>
+            </w:r>
+          </w:p>
+        </w:tc>
+        <w:tc>
+          <w:tcPr>
+            <w:tcW w:type="dxa" w:w="2304"/>
             <w:tcMar>
               <w:top w:w="100" w:type="dxa"/>
               <w:start w:w="120" w:type="dxa"/>
@@ -15947,13 +15854,13 @@
                 <w:color w:val="000000"/>
                 <w:sz w:val="17"/>
               </w:rPr>
-              <w:t>错误人员审批或必要步骤被跳过</w:t>
-            </w:r>
-          </w:p>
-        </w:tc>
-        <w:tc>
-          <w:tcPr>
-            <w:tcW w:type="dxa" w:w="3528"/>
+              <w:t>主线改为 ContractOps</w:t>
+            </w:r>
+          </w:p>
+        </w:tc>
+        <w:tc>
+          <w:tcPr>
+            <w:tcW w:type="dxa" w:w="3744"/>
             <w:tcMar>
               <w:top w:w="100" w:type="dxa"/>
               <w:start w:w="120" w:type="dxa"/>
@@ -15972,13 +15879,13 @@
                 <w:color w:val="000000"/>
                 <w:sz w:val="17"/>
               </w:rPr>
-              <w:t>受控条件 策略发布和实例快照</w:t>
-            </w:r>
-          </w:p>
-        </w:tc>
-        <w:tc>
-          <w:tcPr>
-            <w:tcW w:type="dxa" w:w="2088"/>
+              <w:t>缩小范围并提高后端实现深度</w:t>
+            </w:r>
+          </w:p>
+        </w:tc>
+        <w:tc>
+          <w:tcPr>
+            <w:tcW w:type="dxa" w:w="2736"/>
             <w:tcMar>
               <w:top w:w="100" w:type="dxa"/>
               <w:start w:w="120" w:type="dxa"/>
@@ -15997,7 +15904,7 @@
                 <w:color w:val="000000"/>
                 <w:sz w:val="17"/>
               </w:rPr>
-              <w:t>策略模拟测试和高金额样本回放</w:t>
+              <w:t>合同场景缺少可用数据或无法形成闭环</w:t>
             </w:r>
           </w:p>
         </w:tc>
@@ -16008,7 +15915,7 @@
         </w:trPr>
         <w:tc>
           <w:tcPr>
-            <w:tcW w:type="dxa" w:w="2088"/>
+            <w:tcW w:type="dxa" w:w="1152"/>
             <w:tcMar>
               <w:top w:w="100" w:type="dxa"/>
               <w:start w:w="120" w:type="dxa"/>
@@ -16029,13 +15936,13 @@
                 <w:color w:val="000000"/>
                 <w:sz w:val="17"/>
               </w:rPr>
-              <w:t>模型生成无依据风险</w:t>
-            </w:r>
-          </w:p>
-        </w:tc>
-        <w:tc>
-          <w:tcPr>
-            <w:tcW w:type="dxa" w:w="2232"/>
+              <w:t>ADR 002</w:t>
+            </w:r>
+          </w:p>
+        </w:tc>
+        <w:tc>
+          <w:tcPr>
+            <w:tcW w:type="dxa" w:w="2304"/>
             <w:tcMar>
               <w:top w:w="100" w:type="dxa"/>
               <w:start w:w="120" w:type="dxa"/>
@@ -16055,13 +15962,13 @@
                 <w:color w:val="000000"/>
                 <w:sz w:val="17"/>
               </w:rPr>
-              <w:t>错误提示或遗漏关键条款</w:t>
-            </w:r>
-          </w:p>
-        </w:tc>
-        <w:tc>
-          <w:tcPr>
-            <w:tcW w:type="dxa" w:w="3528"/>
+              <w:t>模块化单体加 Worker</w:t>
+            </w:r>
+          </w:p>
+        </w:tc>
+        <w:tc>
+          <w:tcPr>
+            <w:tcW w:type="dxa" w:w="3744"/>
             <w:tcMar>
               <w:top w:w="100" w:type="dxa"/>
               <w:start w:w="120" w:type="dxa"/>
@@ -16081,13 +15988,13 @@
                 <w:color w:val="000000"/>
                 <w:sz w:val="17"/>
               </w:rPr>
-              <w:t>模型只生成草稿并保存版本 页码和原文</w:t>
-            </w:r>
-          </w:p>
-        </w:tc>
-        <w:tc>
-          <w:tcPr>
-            <w:tcW w:type="dxa" w:w="2088"/>
+              <w:t>保留领域事务并隔离长任务</w:t>
+            </w:r>
+          </w:p>
+        </w:tc>
+        <w:tc>
+          <w:tcPr>
+            <w:tcW w:type="dxa" w:w="2736"/>
             <w:tcMar>
               <w:top w:w="100" w:type="dxa"/>
               <w:start w:w="120" w:type="dxa"/>
@@ -16107,7 +16014,7 @@
                 <w:color w:val="000000"/>
                 <w:sz w:val="17"/>
               </w:rPr>
-              <w:t>建立引用准确率和风险召回评测集</w:t>
+              <w:t>检索或调度需要独立扩容</w:t>
             </w:r>
           </w:p>
         </w:tc>
@@ -16118,7 +16025,7 @@
         </w:trPr>
         <w:tc>
           <w:tcPr>
-            <w:tcW w:type="dxa" w:w="2088"/>
+            <w:tcW w:type="dxa" w:w="1152"/>
             <w:tcMar>
               <w:top w:w="100" w:type="dxa"/>
               <w:start w:w="120" w:type="dxa"/>
@@ -16138,13 +16045,13 @@
                 <w:color w:val="000000"/>
                 <w:sz w:val="17"/>
               </w:rPr>
-              <w:t>跨租户数据泄露</w:t>
-            </w:r>
-          </w:p>
-        </w:tc>
-        <w:tc>
-          <w:tcPr>
-            <w:tcW w:type="dxa" w:w="2232"/>
+              <w:t>ADR 003</w:t>
+            </w:r>
+          </w:p>
+        </w:tc>
+        <w:tc>
+          <w:tcPr>
+            <w:tcW w:type="dxa" w:w="2304"/>
             <w:tcMar>
               <w:top w:w="100" w:type="dxa"/>
               <w:start w:w="120" w:type="dxa"/>
@@ -16163,13 +16070,13 @@
                 <w:color w:val="000000"/>
                 <w:sz w:val="17"/>
               </w:rPr>
-              <w:t>合同和商业信息外泄</w:t>
-            </w:r>
-          </w:p>
-        </w:tc>
-        <w:tc>
-          <w:tcPr>
-            <w:tcW w:type="dxa" w:w="3528"/>
+              <w:t>PostgreSQL 加 pgvector</w:t>
+            </w:r>
+          </w:p>
+        </w:tc>
+        <w:tc>
+          <w:tcPr>
+            <w:tcW w:type="dxa" w:w="3744"/>
             <w:tcMar>
               <w:top w:w="100" w:type="dxa"/>
               <w:start w:w="120" w:type="dxa"/>
@@ -16188,13 +16095,13 @@
                 <w:color w:val="000000"/>
                 <w:sz w:val="17"/>
               </w:rPr>
-              <w:t>独立应用角色 FORCE RLS 对象键带租户</w:t>
-            </w:r>
-          </w:p>
-        </w:tc>
-        <w:tc>
-          <w:tcPr>
-            <w:tcW w:type="dxa" w:w="2088"/>
+              <w:t>一个系统完成事务 全文和向量存储</w:t>
+            </w:r>
+          </w:p>
+        </w:tc>
+        <w:tc>
+          <w:tcPr>
+            <w:tcW w:type="dxa" w:w="2736"/>
             <w:tcMar>
               <w:top w:w="100" w:type="dxa"/>
               <w:start w:w="120" w:type="dxa"/>
@@ -16213,7 +16120,7 @@
                 <w:color w:val="000000"/>
                 <w:sz w:val="17"/>
               </w:rPr>
-              <w:t>集成测试和恶意越权测试</w:t>
+              <w:t>规模或中文召回达到明确瓶颈</w:t>
             </w:r>
           </w:p>
         </w:tc>
@@ -16224,7 +16131,7 @@
         </w:trPr>
         <w:tc>
           <w:tcPr>
-            <w:tcW w:type="dxa" w:w="2088"/>
+            <w:tcW w:type="dxa" w:w="1152"/>
             <w:tcMar>
               <w:top w:w="100" w:type="dxa"/>
               <w:start w:w="120" w:type="dxa"/>
@@ -16245,13 +16152,13 @@
                 <w:color w:val="000000"/>
                 <w:sz w:val="17"/>
               </w:rPr>
-              <w:t>恶意合同内容</w:t>
-            </w:r>
-          </w:p>
-        </w:tc>
-        <w:tc>
-          <w:tcPr>
-            <w:tcW w:type="dxa" w:w="2232"/>
+              <w:t>ADR 004</w:t>
+            </w:r>
+          </w:p>
+        </w:tc>
+        <w:tc>
+          <w:tcPr>
+            <w:tcW w:type="dxa" w:w="2304"/>
             <w:tcMar>
               <w:top w:w="100" w:type="dxa"/>
               <w:start w:w="120" w:type="dxa"/>
@@ -16271,13 +16178,13 @@
                 <w:color w:val="000000"/>
                 <w:sz w:val="17"/>
               </w:rPr>
-              <w:t>Prompt 注入或解析器攻击</w:t>
-            </w:r>
-          </w:p>
-        </w:tc>
-        <w:tc>
-          <w:tcPr>
-            <w:tcW w:type="dxa" w:w="3528"/>
+              <w:t>Redis Streams 作为首版队列</w:t>
+            </w:r>
+          </w:p>
+        </w:tc>
+        <w:tc>
+          <w:tcPr>
+            <w:tcW w:type="dxa" w:w="3744"/>
             <w:tcMar>
               <w:top w:w="100" w:type="dxa"/>
               <w:start w:w="120" w:type="dxa"/>
@@ -16297,13 +16204,13 @@
                 <w:color w:val="000000"/>
                 <w:sz w:val="17"/>
               </w:rPr>
-              <w:t>模型不执行合同内指令 工具默认关闭</w:t>
-            </w:r>
-          </w:p>
-        </w:tc>
-        <w:tc>
-          <w:tcPr>
-            <w:tcW w:type="dxa" w:w="2088"/>
+              <w:t>本地成本低 支持消费组和消息重领</w:t>
+            </w:r>
+          </w:p>
+        </w:tc>
+        <w:tc>
+          <w:tcPr>
+            <w:tcW w:type="dxa" w:w="2736"/>
             <w:tcMar>
               <w:top w:w="100" w:type="dxa"/>
               <w:start w:w="120" w:type="dxa"/>
@@ -16323,7 +16230,7 @@
                 <w:color w:val="000000"/>
                 <w:sz w:val="17"/>
               </w:rPr>
-              <w:t>恶意样本和文件沙箱测试</w:t>
+              <w:t>需要长期回放或更高吞吐</w:t>
             </w:r>
           </w:p>
         </w:tc>
@@ -16334,7 +16241,7 @@
         </w:trPr>
         <w:tc>
           <w:tcPr>
-            <w:tcW w:type="dxa" w:w="2088"/>
+            <w:tcW w:type="dxa" w:w="1152"/>
             <w:tcMar>
               <w:top w:w="100" w:type="dxa"/>
               <w:start w:w="120" w:type="dxa"/>
@@ -16354,13 +16261,13 @@
                 <w:color w:val="000000"/>
                 <w:sz w:val="17"/>
               </w:rPr>
-              <w:t>重复任务和提醒</w:t>
-            </w:r>
-          </w:p>
-        </w:tc>
-        <w:tc>
-          <w:tcPr>
-            <w:tcW w:type="dxa" w:w="2232"/>
+              <w:t>ADR 005</w:t>
+            </w:r>
+          </w:p>
+        </w:tc>
+        <w:tc>
+          <w:tcPr>
+            <w:tcW w:type="dxa" w:w="2304"/>
             <w:tcMar>
               <w:top w:w="100" w:type="dxa"/>
               <w:start w:w="120" w:type="dxa"/>
@@ -16379,13 +16286,13 @@
                 <w:color w:val="000000"/>
                 <w:sz w:val="17"/>
               </w:rPr>
-              <w:t>重复审查 重复通知</w:t>
-            </w:r>
-          </w:p>
-        </w:tc>
-        <w:tc>
-          <w:tcPr>
-            <w:tcW w:type="dxa" w:w="3528"/>
+              <w:t>应用权限加 PostgreSQL RLS</w:t>
+            </w:r>
+          </w:p>
+        </w:tc>
+        <w:tc>
+          <w:tcPr>
+            <w:tcW w:type="dxa" w:w="3744"/>
             <w:tcMar>
               <w:top w:w="100" w:type="dxa"/>
               <w:start w:w="120" w:type="dxa"/>
@@ -16404,13 +16311,13 @@
                 <w:color w:val="000000"/>
                 <w:sz w:val="17"/>
               </w:rPr>
-              <w:t>幂等表 Outbox 唯一键设计</w:t>
-            </w:r>
-          </w:p>
-        </w:tc>
-        <w:tc>
-          <w:tcPr>
-            <w:tcW w:type="dxa" w:w="2088"/>
+              <w:t>防止查询条件遗漏导致跨租户读取</w:t>
+            </w:r>
+          </w:p>
+        </w:tc>
+        <w:tc>
+          <w:tcPr>
+            <w:tcW w:type="dxa" w:w="2736"/>
             <w:tcMar>
               <w:top w:w="100" w:type="dxa"/>
               <w:start w:w="120" w:type="dxa"/>
@@ -16429,7 +16336,7 @@
                 <w:color w:val="000000"/>
                 <w:sz w:val="17"/>
               </w:rPr>
-              <w:t>Worker 崩溃和重复投递测试</w:t>
+              <w:t>不能删除 只允许调整实现</w:t>
             </w:r>
           </w:p>
         </w:tc>
@@ -16440,7 +16347,7 @@
         </w:trPr>
         <w:tc>
           <w:tcPr>
-            <w:tcW w:type="dxa" w:w="2088"/>
+            <w:tcW w:type="dxa" w:w="1152"/>
             <w:tcMar>
               <w:top w:w="100" w:type="dxa"/>
               <w:start w:w="120" w:type="dxa"/>
@@ -16461,13 +16368,13 @@
                 <w:color w:val="000000"/>
                 <w:sz w:val="17"/>
               </w:rPr>
-              <w:t>解析定位错误</w:t>
-            </w:r>
-          </w:p>
-        </w:tc>
-        <w:tc>
-          <w:tcPr>
-            <w:tcW w:type="dxa" w:w="2232"/>
+              <w:t>ADR 006</w:t>
+            </w:r>
+          </w:p>
+        </w:tc>
+        <w:tc>
+          <w:tcPr>
+            <w:tcW w:type="dxa" w:w="2304"/>
             <w:tcMar>
               <w:top w:w="100" w:type="dxa"/>
               <w:start w:w="120" w:type="dxa"/>
@@ -16487,13 +16394,13 @@
                 <w:color w:val="000000"/>
                 <w:sz w:val="17"/>
               </w:rPr>
-              <w:t>引用页码不准确</w:t>
-            </w:r>
-          </w:p>
-        </w:tc>
-        <w:tc>
-          <w:tcPr>
-            <w:tcW w:type="dxa" w:w="3528"/>
+              <w:t>关键法律和审批决定由人完成</w:t>
+            </w:r>
+          </w:p>
+        </w:tc>
+        <w:tc>
+          <w:tcPr>
+            <w:tcW w:type="dxa" w:w="3744"/>
             <w:tcMar>
               <w:top w:w="100" w:type="dxa"/>
               <w:start w:w="120" w:type="dxa"/>
@@ -16513,13 +16420,13 @@
                 <w:color w:val="000000"/>
                 <w:sz w:val="17"/>
               </w:rPr>
-              <w:t>保存版本 Chunk 页码和 parser version</w:t>
-            </w:r>
-          </w:p>
-        </w:tc>
-        <w:tc>
-          <w:tcPr>
-            <w:tcW w:type="dxa" w:w="2088"/>
+              <w:t>模型输出存在错误和法律责任边界</w:t>
+            </w:r>
+          </w:p>
+        </w:tc>
+        <w:tc>
+          <w:tcPr>
+            <w:tcW w:type="dxa" w:w="2736"/>
             <w:tcMar>
               <w:top w:w="100" w:type="dxa"/>
               <w:start w:w="120" w:type="dxa"/>
@@ -16539,7 +16446,7 @@
                 <w:color w:val="000000"/>
                 <w:sz w:val="17"/>
               </w:rPr>
-              <w:t>人工标注样本比对</w:t>
+              <w:t>不能删除</w:t>
             </w:r>
           </w:p>
         </w:tc>
@@ -16550,7 +16457,7 @@
         </w:trPr>
         <w:tc>
           <w:tcPr>
-            <w:tcW w:type="dxa" w:w="2088"/>
+            <w:tcW w:type="dxa" w:w="1152"/>
             <w:tcMar>
               <w:top w:w="100" w:type="dxa"/>
               <w:start w:w="120" w:type="dxa"/>
@@ -16570,13 +16477,13 @@
                 <w:color w:val="000000"/>
                 <w:sz w:val="17"/>
               </w:rPr>
-              <w:t>合同修订覆盖历史</w:t>
-            </w:r>
-          </w:p>
-        </w:tc>
-        <w:tc>
-          <w:tcPr>
-            <w:tcW w:type="dxa" w:w="2232"/>
+              <w:t>ADR 007</w:t>
+            </w:r>
+          </w:p>
+        </w:tc>
+        <w:tc>
+          <w:tcPr>
+            <w:tcW w:type="dxa" w:w="2304"/>
             <w:tcMar>
               <w:top w:w="100" w:type="dxa"/>
               <w:start w:w="120" w:type="dxa"/>
@@ -16595,13 +16502,13 @@
                 <w:color w:val="000000"/>
                 <w:sz w:val="17"/>
               </w:rPr>
-              <w:t>审计链丢失</w:t>
-            </w:r>
-          </w:p>
-        </w:tc>
-        <w:tc>
-          <w:tcPr>
-            <w:tcW w:type="dxa" w:w="3528"/>
+              <w:t>主线改为审批与履约风控</w:t>
+            </w:r>
+          </w:p>
+        </w:tc>
+        <w:tc>
+          <w:tcPr>
+            <w:tcW w:type="dxa" w:w="3744"/>
             <w:tcMar>
               <w:top w:w="100" w:type="dxa"/>
               <w:start w:w="120" w:type="dxa"/>
@@ -16620,13 +16527,13 @@
                 <w:color w:val="000000"/>
                 <w:sz w:val="17"/>
               </w:rPr>
-              <w:t>版本不可变 驳回后创建新版本</w:t>
-            </w:r>
-          </w:p>
-        </w:tc>
-        <w:tc>
-          <w:tcPr>
-            <w:tcW w:type="dxa" w:w="2088"/>
+              <w:t>避免退化为 PDF 检查工具并突出企业后端能力</w:t>
+            </w:r>
+          </w:p>
+        </w:tc>
+        <w:tc>
+          <w:tcPr>
+            <w:tcW w:type="dxa" w:w="2736"/>
             <w:tcMar>
               <w:top w:w="100" w:type="dxa"/>
               <w:start w:w="120" w:type="dxa"/>
@@ -16645,7 +16552,7 @@
                 <w:color w:val="000000"/>
                 <w:sz w:val="17"/>
               </w:rPr>
-              <w:t>版本 Diff 和回滚测试</w:t>
+              <w:t>审批或履约场景无法形成可运行闭环</w:t>
             </w:r>
           </w:p>
         </w:tc>
@@ -16656,7 +16563,7 @@
         </w:trPr>
         <w:tc>
           <w:tcPr>
-            <w:tcW w:type="dxa" w:w="2088"/>
+            <w:tcW w:type="dxa" w:w="1152"/>
             <w:tcMar>
               <w:top w:w="100" w:type="dxa"/>
               <w:start w:w="120" w:type="dxa"/>
@@ -16677,13 +16584,13 @@
                 <w:color w:val="000000"/>
                 <w:sz w:val="17"/>
               </w:rPr>
-              <w:t>迁移权限泄露给运行服务</w:t>
-            </w:r>
-          </w:p>
-        </w:tc>
-        <w:tc>
-          <w:tcPr>
-            <w:tcW w:type="dxa" w:w="2232"/>
+              <w:t>ADR 008</w:t>
+            </w:r>
+          </w:p>
+        </w:tc>
+        <w:tc>
+          <w:tcPr>
+            <w:tcW w:type="dxa" w:w="2304"/>
             <w:tcMar>
               <w:top w:w="100" w:type="dxa"/>
               <w:start w:w="120" w:type="dxa"/>
@@ -16703,13 +16610,13 @@
                 <w:color w:val="000000"/>
                 <w:sz w:val="17"/>
               </w:rPr>
-              <w:t>应用漏洞可能修改结构或绕过隔离</w:t>
-            </w:r>
-          </w:p>
-        </w:tc>
-        <w:tc>
-          <w:tcPr>
-            <w:tcW w:type="dxa" w:w="3528"/>
+              <w:t>审批实例保存策略快照</w:t>
+            </w:r>
+          </w:p>
+        </w:tc>
+        <w:tc>
+          <w:tcPr>
+            <w:tcW w:type="dxa" w:w="3744"/>
             <w:tcMar>
               <w:top w:w="100" w:type="dxa"/>
               <w:start w:w="120" w:type="dxa"/>
@@ -16729,13 +16636,13 @@
                 <w:color w:val="000000"/>
                 <w:sz w:val="17"/>
               </w:rPr>
-              <w:t>迁移 URL 与运行 URL 分离 migrate 服务短期运行</w:t>
-            </w:r>
-          </w:p>
-        </w:tc>
-        <w:tc>
-          <w:tcPr>
-            <w:tcW w:type="dxa" w:w="2088"/>
+              <w:t>避免流程中途因策略变更产生不一致</w:t>
+            </w:r>
+          </w:p>
+        </w:tc>
+        <w:tc>
+          <w:tcPr>
+            <w:tcW w:type="dxa" w:w="2736"/>
             <w:tcMar>
               <w:top w:w="100" w:type="dxa"/>
               <w:start w:w="120" w:type="dxa"/>
@@ -16755,7 +16662,7 @@
                 <w:color w:val="000000"/>
                 <w:sz w:val="17"/>
               </w:rPr>
-              <w:t>CI 检查运行角色权限和生产密钥配置</w:t>
+              <w:t>只允许优化快照存储方式</w:t>
             </w:r>
           </w:p>
         </w:tc>
@@ -16766,7 +16673,7 @@
         </w:trPr>
         <w:tc>
           <w:tcPr>
-            <w:tcW w:type="dxa" w:w="2088"/>
+            <w:tcW w:type="dxa" w:w="1152"/>
             <w:tcMar>
               <w:top w:w="100" w:type="dxa"/>
               <w:start w:w="120" w:type="dxa"/>
@@ -16786,13 +16693,13 @@
                 <w:color w:val="000000"/>
                 <w:sz w:val="17"/>
               </w:rPr>
-              <w:t>跨平台文件模式丢失</w:t>
-            </w:r>
-          </w:p>
-        </w:tc>
-        <w:tc>
-          <w:tcPr>
-            <w:tcW w:type="dxa" w:w="2232"/>
+              <w:t>ADR 009</w:t>
+            </w:r>
+          </w:p>
+        </w:tc>
+        <w:tc>
+          <w:tcPr>
+            <w:tcW w:type="dxa" w:w="2304"/>
             <w:tcMar>
               <w:top w:w="100" w:type="dxa"/>
               <w:start w:w="120" w:type="dxa"/>
@@ -16811,13 +16718,13 @@
                 <w:color w:val="000000"/>
                 <w:sz w:val="17"/>
               </w:rPr>
-              <w:t>Linux CI 脚本在任务开始时退出 126</w:t>
-            </w:r>
-          </w:p>
-        </w:tc>
-        <w:tc>
-          <w:tcPr>
-            <w:tcW w:type="dxa" w:w="3528"/>
+              <w:t>Alembic 管理数据库版本</w:t>
+            </w:r>
+          </w:p>
+        </w:tc>
+        <w:tc>
+          <w:tcPr>
+            <w:tcW w:type="dxa" w:w="3744"/>
             <w:tcMar>
               <w:top w:w="100" w:type="dxa"/>
               <w:start w:w="120" w:type="dxa"/>
@@ -16836,13 +16743,13 @@
                 <w:color w:val="000000"/>
                 <w:sz w:val="17"/>
               </w:rPr>
-              <w:t>工作流显式使用 Bash 调用脚本</w:t>
-            </w:r>
-          </w:p>
-        </w:tc>
-        <w:tc>
-          <w:tcPr>
-            <w:tcW w:type="dxa" w:w="2088"/>
+              <w:t>让升级 回滚和部署顺序可以复现</w:t>
+            </w:r>
+          </w:p>
+        </w:tc>
+        <w:tc>
+          <w:tcPr>
+            <w:tcW w:type="dxa" w:w="2736"/>
             <w:tcMar>
               <w:top w:w="100" w:type="dxa"/>
               <w:start w:w="120" w:type="dxa"/>
@@ -16861,7 +16768,7 @@
                 <w:color w:val="000000"/>
                 <w:sz w:val="17"/>
               </w:rPr>
-              <w:t>每次迁移上传方式后观察 CI 自检</w:t>
+              <w:t>不能退回容器初始化目录直接建业务表</w:t>
             </w:r>
           </w:p>
         </w:tc>
@@ -16872,7 +16779,7 @@
         </w:trPr>
         <w:tc>
           <w:tcPr>
-            <w:tcW w:type="dxa" w:w="2088"/>
+            <w:tcW w:type="dxa" w:w="1152"/>
             <w:tcMar>
               <w:top w:w="100" w:type="dxa"/>
               <w:start w:w="120" w:type="dxa"/>
@@ -16893,13 +16800,13 @@
                 <w:color w:val="000000"/>
                 <w:sz w:val="17"/>
               </w:rPr>
-              <w:t>上游格式债阻断阶段交付</w:t>
-            </w:r>
-          </w:p>
-        </w:tc>
-        <w:tc>
-          <w:tcPr>
-            <w:tcW w:type="dxa" w:w="2232"/>
+              <w:t>ADR 010</w:t>
+            </w:r>
+          </w:p>
+        </w:tc>
+        <w:tc>
+          <w:tcPr>
+            <w:tcW w:type="dxa" w:w="2304"/>
             <w:tcMar>
               <w:top w:w="100" w:type="dxa"/>
               <w:start w:w="120" w:type="dxa"/>
@@ -16919,13 +16826,13 @@
                 <w:color w:val="000000"/>
                 <w:sz w:val="17"/>
               </w:rPr>
-              <w:t>业务代码通过但根仓库质量门禁失败</w:t>
-            </w:r>
-          </w:p>
-        </w:tc>
-        <w:tc>
-          <w:tcPr>
-            <w:tcW w:type="dxa" w:w="3528"/>
+              <w:t>统一错误信封和请求上下文</w:t>
+            </w:r>
+          </w:p>
+        </w:tc>
+        <w:tc>
+          <w:tcPr>
+            <w:tcW w:type="dxa" w:w="3744"/>
             <w:tcMar>
               <w:top w:w="100" w:type="dxa"/>
               <w:start w:w="120" w:type="dxa"/>
@@ -16945,13 +16852,13 @@
                 <w:color w:val="000000"/>
                 <w:sz w:val="17"/>
               </w:rPr>
-              <w:t>按日志修复具体文件 不扩大忽略范围</w:t>
-            </w:r>
-          </w:p>
-        </w:tc>
-        <w:tc>
-          <w:tcPr>
-            <w:tcW w:type="dxa" w:w="2088"/>
+              <w:t>客户端和审计可以依靠稳定错误码和请求 ID</w:t>
+            </w:r>
+          </w:p>
+        </w:tc>
+        <w:tc>
+          <w:tcPr>
+            <w:tcW w:type="dxa" w:w="2736"/>
             <w:tcMar>
               <w:top w:w="100" w:type="dxa"/>
               <w:start w:w="120" w:type="dxa"/>
@@ -16971,7 +16878,329 @@
                 <w:color w:val="000000"/>
                 <w:sz w:val="17"/>
               </w:rPr>
-              <w:t>PR 中运行完整 Prettier 和现有 CI</w:t>
+              <w:t>只允许兼容性扩展</w:t>
+            </w:r>
+          </w:p>
+        </w:tc>
+      </w:tr>
+      <w:tr>
+        <w:trPr>
+          <w:cantSplit/>
+        </w:trPr>
+        <w:tc>
+          <w:tcPr>
+            <w:tcW w:type="dxa" w:w="1152"/>
+            <w:tcMar>
+              <w:top w:w="100" w:type="dxa"/>
+              <w:start w:w="120" w:type="dxa"/>
+              <w:bottom w:w="100" w:type="dxa"/>
+              <w:end w:w="120" w:type="dxa"/>
+            </w:tcMar>
+            <w:vAlign w:val="center"/>
+          </w:tcPr>
+          <w:p>
+            <w:pPr>
+              <w:spacing w:after="0" w:line="259" w:lineRule="auto"/>
+              <w:jc w:val="center"/>
+            </w:pPr>
+            <w:r>
+              <w:rPr>
+                <w:rFonts w:ascii="Aptos" w:hAnsi="Aptos" w:eastAsia="Microsoft YaHei"/>
+                <w:color w:val="000000"/>
+                <w:sz w:val="17"/>
+              </w:rPr>
+              <w:t>ADR 011</w:t>
+            </w:r>
+          </w:p>
+        </w:tc>
+        <w:tc>
+          <w:tcPr>
+            <w:tcW w:type="dxa" w:w="2304"/>
+            <w:tcMar>
+              <w:top w:w="100" w:type="dxa"/>
+              <w:start w:w="120" w:type="dxa"/>
+              <w:bottom w:w="100" w:type="dxa"/>
+              <w:end w:w="120" w:type="dxa"/>
+            </w:tcMar>
+            <w:vAlign w:val="center"/>
+          </w:tcPr>
+          <w:p>
+            <w:pPr>
+              <w:spacing w:after="0" w:line="259" w:lineRule="auto"/>
+            </w:pPr>
+            <w:r>
+              <w:rPr>
+                <w:rFonts w:ascii="Aptos" w:hAnsi="Aptos" w:eastAsia="Microsoft YaHei"/>
+                <w:color w:val="000000"/>
+                <w:sz w:val="17"/>
+              </w:rPr>
+              <w:t>CI Shell 脚本由 Bash 显式调用</w:t>
+            </w:r>
+          </w:p>
+        </w:tc>
+        <w:tc>
+          <w:tcPr>
+            <w:tcW w:type="dxa" w:w="3744"/>
+            <w:tcMar>
+              <w:top w:w="100" w:type="dxa"/>
+              <w:start w:w="120" w:type="dxa"/>
+              <w:bottom w:w="100" w:type="dxa"/>
+              <w:end w:w="120" w:type="dxa"/>
+            </w:tcMar>
+            <w:vAlign w:val="center"/>
+          </w:tcPr>
+          <w:p>
+            <w:pPr>
+              <w:spacing w:after="0" w:line="259" w:lineRule="auto"/>
+            </w:pPr>
+            <w:r>
+              <w:rPr>
+                <w:rFonts w:ascii="Aptos" w:hAnsi="Aptos" w:eastAsia="Microsoft YaHei"/>
+                <w:color w:val="000000"/>
+                <w:sz w:val="17"/>
+              </w:rPr>
+              <w:t>避免 Windows 和 API 上传丢失可执行位</w:t>
+            </w:r>
+          </w:p>
+        </w:tc>
+        <w:tc>
+          <w:tcPr>
+            <w:tcW w:type="dxa" w:w="2736"/>
+            <w:tcMar>
+              <w:top w:w="100" w:type="dxa"/>
+              <w:start w:w="120" w:type="dxa"/>
+              <w:bottom w:w="100" w:type="dxa"/>
+              <w:end w:w="120" w:type="dxa"/>
+            </w:tcMar>
+            <w:vAlign w:val="center"/>
+          </w:tcPr>
+          <w:p>
+            <w:pPr>
+              <w:spacing w:after="0" w:line="259" w:lineRule="auto"/>
+            </w:pPr>
+            <w:r>
+              <w:rPr>
+                <w:rFonts w:ascii="Aptos" w:hAnsi="Aptos" w:eastAsia="Microsoft YaHei"/>
+                <w:color w:val="000000"/>
+                <w:sz w:val="17"/>
+              </w:rPr>
+              <w:t>只有上传链路稳定保留 100755 时才评估简化</w:t>
+            </w:r>
+          </w:p>
+        </w:tc>
+      </w:tr>
+      <w:tr>
+        <w:trPr>
+          <w:cantSplit/>
+        </w:trPr>
+        <w:tc>
+          <w:tcPr>
+            <w:tcW w:type="dxa" w:w="1152"/>
+            <w:tcMar>
+              <w:top w:w="100" w:type="dxa"/>
+              <w:start w:w="120" w:type="dxa"/>
+              <w:bottom w:w="100" w:type="dxa"/>
+              <w:end w:w="120" w:type="dxa"/>
+            </w:tcMar>
+            <w:vAlign w:val="center"/>
+            <w:shd w:fill="EAF2F8"/>
+          </w:tcPr>
+          <w:p>
+            <w:pPr>
+              <w:spacing w:after="0" w:line="259" w:lineRule="auto"/>
+              <w:jc w:val="center"/>
+            </w:pPr>
+            <w:r>
+              <w:rPr>
+                <w:rFonts w:ascii="Aptos" w:hAnsi="Aptos" w:eastAsia="Microsoft YaHei"/>
+                <w:color w:val="000000"/>
+                <w:sz w:val="17"/>
+              </w:rPr>
+              <w:t>ADR 012</w:t>
+            </w:r>
+          </w:p>
+        </w:tc>
+        <w:tc>
+          <w:tcPr>
+            <w:tcW w:type="dxa" w:w="2304"/>
+            <w:tcMar>
+              <w:top w:w="100" w:type="dxa"/>
+              <w:start w:w="120" w:type="dxa"/>
+              <w:bottom w:w="100" w:type="dxa"/>
+              <w:end w:w="120" w:type="dxa"/>
+            </w:tcMar>
+            <w:vAlign w:val="center"/>
+            <w:shd w:fill="EAF2F8"/>
+          </w:tcPr>
+          <w:p>
+            <w:pPr>
+              <w:spacing w:after="0" w:line="259" w:lineRule="auto"/>
+            </w:pPr>
+            <w:r>
+              <w:rPr>
+                <w:rFonts w:ascii="Aptos" w:hAnsi="Aptos" w:eastAsia="Microsoft YaHei"/>
+                <w:color w:val="000000"/>
+                <w:sz w:val="17"/>
+              </w:rPr>
+              <w:t>阶段成果使用独立分支和 PR 审批</w:t>
+            </w:r>
+          </w:p>
+        </w:tc>
+        <w:tc>
+          <w:tcPr>
+            <w:tcW w:type="dxa" w:w="3744"/>
+            <w:tcMar>
+              <w:top w:w="100" w:type="dxa"/>
+              <w:start w:w="120" w:type="dxa"/>
+              <w:bottom w:w="100" w:type="dxa"/>
+              <w:end w:w="120" w:type="dxa"/>
+            </w:tcMar>
+            <w:vAlign w:val="center"/>
+            <w:shd w:fill="EAF2F8"/>
+          </w:tcPr>
+          <w:p>
+            <w:pPr>
+              <w:spacing w:after="0" w:line="259" w:lineRule="auto"/>
+            </w:pPr>
+            <w:r>
+              <w:rPr>
+                <w:rFonts w:ascii="Aptos" w:hAnsi="Aptos" w:eastAsia="Microsoft YaHei"/>
+                <w:color w:val="000000"/>
+                <w:sz w:val="17"/>
+              </w:rPr>
+              <w:t>让 main 只接收经过检查和人工批准的变更</w:t>
+            </w:r>
+          </w:p>
+        </w:tc>
+        <w:tc>
+          <w:tcPr>
+            <w:tcW w:type="dxa" w:w="2736"/>
+            <w:tcMar>
+              <w:top w:w="100" w:type="dxa"/>
+              <w:start w:w="120" w:type="dxa"/>
+              <w:bottom w:w="100" w:type="dxa"/>
+              <w:end w:w="120" w:type="dxa"/>
+            </w:tcMar>
+            <w:vAlign w:val="center"/>
+            <w:shd w:fill="EAF2F8"/>
+          </w:tcPr>
+          <w:p>
+            <w:pPr>
+              <w:spacing w:after="0" w:line="259" w:lineRule="auto"/>
+            </w:pPr>
+            <w:r>
+              <w:rPr>
+                <w:rFonts w:ascii="Aptos" w:hAnsi="Aptos" w:eastAsia="Microsoft YaHei"/>
+                <w:color w:val="000000"/>
+                <w:sz w:val="17"/>
+              </w:rPr>
+              <w:t>只有项目负责人明确调整交付流程时变更</w:t>
+            </w:r>
+          </w:p>
+        </w:tc>
+      </w:tr>
+      <w:tr>
+        <w:trPr>
+          <w:cantSplit/>
+        </w:trPr>
+        <w:tc>
+          <w:tcPr>
+            <w:tcW w:type="dxa" w:w="1152"/>
+            <w:tcMar>
+              <w:top w:w="100" w:type="dxa"/>
+              <w:start w:w="120" w:type="dxa"/>
+              <w:bottom w:w="100" w:type="dxa"/>
+              <w:end w:w="120" w:type="dxa"/>
+            </w:tcMar>
+            <w:vAlign w:val="center"/>
+          </w:tcPr>
+          <w:p>
+            <w:pPr>
+              <w:spacing w:after="0" w:line="259" w:lineRule="auto"/>
+              <w:jc w:val="center"/>
+            </w:pPr>
+            <w:r>
+              <w:rPr>
+                <w:rFonts w:ascii="Aptos" w:hAnsi="Aptos" w:eastAsia="Microsoft YaHei"/>
+                <w:color w:val="000000"/>
+                <w:sz w:val="17"/>
+              </w:rPr>
+              <w:t>ADR 013</w:t>
+            </w:r>
+          </w:p>
+        </w:tc>
+        <w:tc>
+          <w:tcPr>
+            <w:tcW w:type="dxa" w:w="2304"/>
+            <w:tcMar>
+              <w:top w:w="100" w:type="dxa"/>
+              <w:start w:w="120" w:type="dxa"/>
+              <w:bottom w:w="100" w:type="dxa"/>
+              <w:end w:w="120" w:type="dxa"/>
+            </w:tcMar>
+            <w:vAlign w:val="center"/>
+          </w:tcPr>
+          <w:p>
+            <w:pPr>
+              <w:spacing w:after="0" w:line="259" w:lineRule="auto"/>
+            </w:pPr>
+            <w:r>
+              <w:rPr>
+                <w:rFonts w:ascii="Aptos" w:hAnsi="Aptos" w:eastAsia="Microsoft YaHei"/>
+                <w:color w:val="000000"/>
+                <w:sz w:val="17"/>
+              </w:rPr>
+              <w:t>移除 ClawHub 发布子系统</w:t>
+            </w:r>
+          </w:p>
+        </w:tc>
+        <w:tc>
+          <w:tcPr>
+            <w:tcW w:type="dxa" w:w="3744"/>
+            <w:tcMar>
+              <w:top w:w="100" w:type="dxa"/>
+              <w:start w:w="120" w:type="dxa"/>
+              <w:bottom w:w="100" w:type="dxa"/>
+              <w:end w:w="120" w:type="dxa"/>
+            </w:tcMar>
+            <w:vAlign w:val="center"/>
+          </w:tcPr>
+          <w:p>
+            <w:pPr>
+              <w:spacing w:after="0" w:line="259" w:lineRule="auto"/>
+            </w:pPr>
+            <w:r>
+              <w:rPr>
+                <w:rFonts w:ascii="Aptos" w:hAnsi="Aptos" w:eastAsia="Microsoft YaHei"/>
+                <w:color w:val="000000"/>
+                <w:sz w:val="17"/>
+              </w:rPr>
+              <w:t>ContractOps 不发布 OpenMAIC skill 且工作流已经删除</w:t>
+            </w:r>
+          </w:p>
+        </w:tc>
+        <w:tc>
+          <w:tcPr>
+            <w:tcW w:type="dxa" w:w="2736"/>
+            <w:tcMar>
+              <w:top w:w="100" w:type="dxa"/>
+              <w:start w:w="120" w:type="dxa"/>
+              <w:bottom w:w="100" w:type="dxa"/>
+              <w:end w:w="120" w:type="dxa"/>
+            </w:tcMar>
+            <w:vAlign w:val="center"/>
+          </w:tcPr>
+          <w:p>
+            <w:pPr>
+              <w:spacing w:after="0" w:line="259" w:lineRule="auto"/>
+            </w:pPr>
+            <w:r>
+              <w:rPr>
+                <w:rFonts w:ascii="Aptos" w:hAnsi="Aptos" w:eastAsia="Microsoft YaHei"/>
+                <w:color w:val="000000"/>
+                <w:sz w:val="17"/>
+              </w:rPr>
+              <w:t>只有产品重新承担上游 skill 发布职责时重建</w:t>
             </w:r>
           </w:p>
         </w:tc>
@@ -16995,7 +17224,1354 @@
           <w:color w:val="000000"/>
           <w:sz w:val="32"/>
         </w:rPr>
-        <w:t>十二 后续更新记录模板</w:t>
+        <w:t>十二 风险登记</w:t>
+      </w:r>
+    </w:p>
+    <w:tbl>
+      <w:tblPr>
+        <w:tblW w:type="auto" w:w="0"/>
+        <w:jc w:val="center"/>
+        <w:tblLayout w:type="fixed"/>
+        <w:tblLook w:firstColumn="1" w:firstRow="1" w:lastColumn="0" w:lastRow="0" w:noHBand="0" w:noVBand="1" w:val="04A0"/>
+        <w:tblBorders>
+          <w:top w:val="single" w:sz="6" w:space="0" w:color="D9D9D9"/>
+          <w:left w:val="single" w:sz="6" w:space="0" w:color="D9D9D9"/>
+          <w:bottom w:val="single" w:sz="6" w:space="0" w:color="D9D9D9"/>
+          <w:right w:val="single" w:sz="6" w:space="0" w:color="D9D9D9"/>
+          <w:insideH w:val="single" w:sz="6" w:space="0" w:color="D9D9D9"/>
+          <w:insideV w:val="single" w:sz="6" w:space="0" w:color="D9D9D9"/>
+        </w:tblBorders>
+      </w:tblPr>
+      <w:tblGrid>
+        <w:gridCol w:w="2498"/>
+        <w:gridCol w:w="2498"/>
+        <w:gridCol w:w="2498"/>
+        <w:gridCol w:w="2498"/>
+      </w:tblGrid>
+      <w:tr>
+        <w:trPr>
+          <w:tblHeader w:val="true"/>
+          <w:cantSplit/>
+        </w:trPr>
+        <w:tc>
+          <w:tcPr>
+            <w:tcW w:type="dxa" w:w="2088"/>
+            <w:shd w:fill="1F4E78"/>
+            <w:tcMar>
+              <w:top w:w="100" w:type="dxa"/>
+              <w:start w:w="120" w:type="dxa"/>
+              <w:bottom w:w="100" w:type="dxa"/>
+              <w:end w:w="120" w:type="dxa"/>
+            </w:tcMar>
+            <w:vAlign w:val="center"/>
+          </w:tcPr>
+          <w:p>
+            <w:pPr>
+              <w:spacing w:after="0"/>
+              <w:jc w:val="center"/>
+            </w:pPr>
+            <w:r>
+              <w:rPr>
+                <w:rFonts w:ascii="Aptos" w:hAnsi="Aptos" w:eastAsia="Microsoft YaHei"/>
+                <w:b/>
+                <w:color w:val="FFFFFF"/>
+                <w:sz w:val="17"/>
+              </w:rPr>
+              <w:t>风险</w:t>
+            </w:r>
+          </w:p>
+        </w:tc>
+        <w:tc>
+          <w:tcPr>
+            <w:tcW w:type="dxa" w:w="2232"/>
+            <w:shd w:fill="1F4E78"/>
+            <w:tcMar>
+              <w:top w:w="100" w:type="dxa"/>
+              <w:start w:w="120" w:type="dxa"/>
+              <w:bottom w:w="100" w:type="dxa"/>
+              <w:end w:w="120" w:type="dxa"/>
+            </w:tcMar>
+            <w:vAlign w:val="center"/>
+          </w:tcPr>
+          <w:p>
+            <w:pPr>
+              <w:spacing w:after="0"/>
+              <w:jc w:val="center"/>
+            </w:pPr>
+            <w:r>
+              <w:rPr>
+                <w:rFonts w:ascii="Aptos" w:hAnsi="Aptos" w:eastAsia="Microsoft YaHei"/>
+                <w:b/>
+                <w:color w:val="FFFFFF"/>
+                <w:sz w:val="17"/>
+              </w:rPr>
+              <w:t>影响</w:t>
+            </w:r>
+          </w:p>
+        </w:tc>
+        <w:tc>
+          <w:tcPr>
+            <w:tcW w:type="dxa" w:w="3528"/>
+            <w:shd w:fill="1F4E78"/>
+            <w:tcMar>
+              <w:top w:w="100" w:type="dxa"/>
+              <w:start w:w="120" w:type="dxa"/>
+              <w:bottom w:w="100" w:type="dxa"/>
+              <w:end w:w="120" w:type="dxa"/>
+            </w:tcMar>
+            <w:vAlign w:val="center"/>
+          </w:tcPr>
+          <w:p>
+            <w:pPr>
+              <w:spacing w:after="0"/>
+              <w:jc w:val="center"/>
+            </w:pPr>
+            <w:r>
+              <w:rPr>
+                <w:rFonts w:ascii="Aptos" w:hAnsi="Aptos" w:eastAsia="Microsoft YaHei"/>
+                <w:b/>
+                <w:color w:val="FFFFFF"/>
+                <w:sz w:val="17"/>
+              </w:rPr>
+              <w:t>当前控制</w:t>
+            </w:r>
+          </w:p>
+        </w:tc>
+        <w:tc>
+          <w:tcPr>
+            <w:tcW w:type="dxa" w:w="2088"/>
+            <w:shd w:fill="1F4E78"/>
+            <w:tcMar>
+              <w:top w:w="100" w:type="dxa"/>
+              <w:start w:w="120" w:type="dxa"/>
+              <w:bottom w:w="100" w:type="dxa"/>
+              <w:end w:w="120" w:type="dxa"/>
+            </w:tcMar>
+            <w:vAlign w:val="center"/>
+          </w:tcPr>
+          <w:p>
+            <w:pPr>
+              <w:spacing w:after="0"/>
+              <w:jc w:val="center"/>
+            </w:pPr>
+            <w:r>
+              <w:rPr>
+                <w:rFonts w:ascii="Aptos" w:hAnsi="Aptos" w:eastAsia="Microsoft YaHei"/>
+                <w:b/>
+                <w:color w:val="FFFFFF"/>
+                <w:sz w:val="17"/>
+              </w:rPr>
+              <w:t>后续验证</w:t>
+            </w:r>
+          </w:p>
+        </w:tc>
+      </w:tr>
+      <w:tr>
+        <w:trPr>
+          <w:cantSplit/>
+        </w:trPr>
+        <w:tc>
+          <w:tcPr>
+            <w:tcW w:type="dxa" w:w="2088"/>
+            <w:tcMar>
+              <w:top w:w="100" w:type="dxa"/>
+              <w:start w:w="120" w:type="dxa"/>
+              <w:bottom w:w="100" w:type="dxa"/>
+              <w:end w:w="120" w:type="dxa"/>
+            </w:tcMar>
+            <w:vAlign w:val="center"/>
+          </w:tcPr>
+          <w:p>
+            <w:pPr>
+              <w:spacing w:after="0" w:line="259" w:lineRule="auto"/>
+              <w:jc w:val="center"/>
+            </w:pPr>
+            <w:r>
+              <w:rPr>
+                <w:rFonts w:ascii="Aptos" w:hAnsi="Aptos" w:eastAsia="Microsoft YaHei"/>
+                <w:color w:val="000000"/>
+                <w:sz w:val="17"/>
+              </w:rPr>
+              <w:t>审批策略配置错误</w:t>
+            </w:r>
+          </w:p>
+        </w:tc>
+        <w:tc>
+          <w:tcPr>
+            <w:tcW w:type="dxa" w:w="2232"/>
+            <w:tcMar>
+              <w:top w:w="100" w:type="dxa"/>
+              <w:start w:w="120" w:type="dxa"/>
+              <w:bottom w:w="100" w:type="dxa"/>
+              <w:end w:w="120" w:type="dxa"/>
+            </w:tcMar>
+            <w:vAlign w:val="center"/>
+          </w:tcPr>
+          <w:p>
+            <w:pPr>
+              <w:spacing w:after="0" w:line="259" w:lineRule="auto"/>
+            </w:pPr>
+            <w:r>
+              <w:rPr>
+                <w:rFonts w:ascii="Aptos" w:hAnsi="Aptos" w:eastAsia="Microsoft YaHei"/>
+                <w:color w:val="000000"/>
+                <w:sz w:val="17"/>
+              </w:rPr>
+              <w:t>错误人员审批或必要步骤被跳过</w:t>
+            </w:r>
+          </w:p>
+        </w:tc>
+        <w:tc>
+          <w:tcPr>
+            <w:tcW w:type="dxa" w:w="3528"/>
+            <w:tcMar>
+              <w:top w:w="100" w:type="dxa"/>
+              <w:start w:w="120" w:type="dxa"/>
+              <w:bottom w:w="100" w:type="dxa"/>
+              <w:end w:w="120" w:type="dxa"/>
+            </w:tcMar>
+            <w:vAlign w:val="center"/>
+          </w:tcPr>
+          <w:p>
+            <w:pPr>
+              <w:spacing w:after="0" w:line="259" w:lineRule="auto"/>
+            </w:pPr>
+            <w:r>
+              <w:rPr>
+                <w:rFonts w:ascii="Aptos" w:hAnsi="Aptos" w:eastAsia="Microsoft YaHei"/>
+                <w:color w:val="000000"/>
+                <w:sz w:val="17"/>
+              </w:rPr>
+              <w:t>受控条件 策略发布和实例快照</w:t>
+            </w:r>
+          </w:p>
+        </w:tc>
+        <w:tc>
+          <w:tcPr>
+            <w:tcW w:type="dxa" w:w="2088"/>
+            <w:tcMar>
+              <w:top w:w="100" w:type="dxa"/>
+              <w:start w:w="120" w:type="dxa"/>
+              <w:bottom w:w="100" w:type="dxa"/>
+              <w:end w:w="120" w:type="dxa"/>
+            </w:tcMar>
+            <w:vAlign w:val="center"/>
+          </w:tcPr>
+          <w:p>
+            <w:pPr>
+              <w:spacing w:after="0" w:line="259" w:lineRule="auto"/>
+            </w:pPr>
+            <w:r>
+              <w:rPr>
+                <w:rFonts w:ascii="Aptos" w:hAnsi="Aptos" w:eastAsia="Microsoft YaHei"/>
+                <w:color w:val="000000"/>
+                <w:sz w:val="17"/>
+              </w:rPr>
+              <w:t>策略模拟测试和高金额样本回放</w:t>
+            </w:r>
+          </w:p>
+        </w:tc>
+      </w:tr>
+      <w:tr>
+        <w:trPr>
+          <w:cantSplit/>
+        </w:trPr>
+        <w:tc>
+          <w:tcPr>
+            <w:tcW w:type="dxa" w:w="2088"/>
+            <w:tcMar>
+              <w:top w:w="100" w:type="dxa"/>
+              <w:start w:w="120" w:type="dxa"/>
+              <w:bottom w:w="100" w:type="dxa"/>
+              <w:end w:w="120" w:type="dxa"/>
+            </w:tcMar>
+            <w:vAlign w:val="center"/>
+            <w:shd w:fill="EAF2F8"/>
+          </w:tcPr>
+          <w:p>
+            <w:pPr>
+              <w:spacing w:after="0" w:line="259" w:lineRule="auto"/>
+              <w:jc w:val="center"/>
+            </w:pPr>
+            <w:r>
+              <w:rPr>
+                <w:rFonts w:ascii="Aptos" w:hAnsi="Aptos" w:eastAsia="Microsoft YaHei"/>
+                <w:color w:val="000000"/>
+                <w:sz w:val="17"/>
+              </w:rPr>
+              <w:t>模型生成无依据风险</w:t>
+            </w:r>
+          </w:p>
+        </w:tc>
+        <w:tc>
+          <w:tcPr>
+            <w:tcW w:type="dxa" w:w="2232"/>
+            <w:tcMar>
+              <w:top w:w="100" w:type="dxa"/>
+              <w:start w:w="120" w:type="dxa"/>
+              <w:bottom w:w="100" w:type="dxa"/>
+              <w:end w:w="120" w:type="dxa"/>
+            </w:tcMar>
+            <w:vAlign w:val="center"/>
+            <w:shd w:fill="EAF2F8"/>
+          </w:tcPr>
+          <w:p>
+            <w:pPr>
+              <w:spacing w:after="0" w:line="259" w:lineRule="auto"/>
+            </w:pPr>
+            <w:r>
+              <w:rPr>
+                <w:rFonts w:ascii="Aptos" w:hAnsi="Aptos" w:eastAsia="Microsoft YaHei"/>
+                <w:color w:val="000000"/>
+                <w:sz w:val="17"/>
+              </w:rPr>
+              <w:t>错误提示或遗漏关键条款</w:t>
+            </w:r>
+          </w:p>
+        </w:tc>
+        <w:tc>
+          <w:tcPr>
+            <w:tcW w:type="dxa" w:w="3528"/>
+            <w:tcMar>
+              <w:top w:w="100" w:type="dxa"/>
+              <w:start w:w="120" w:type="dxa"/>
+              <w:bottom w:w="100" w:type="dxa"/>
+              <w:end w:w="120" w:type="dxa"/>
+            </w:tcMar>
+            <w:vAlign w:val="center"/>
+            <w:shd w:fill="EAF2F8"/>
+          </w:tcPr>
+          <w:p>
+            <w:pPr>
+              <w:spacing w:after="0" w:line="259" w:lineRule="auto"/>
+            </w:pPr>
+            <w:r>
+              <w:rPr>
+                <w:rFonts w:ascii="Aptos" w:hAnsi="Aptos" w:eastAsia="Microsoft YaHei"/>
+                <w:color w:val="000000"/>
+                <w:sz w:val="17"/>
+              </w:rPr>
+              <w:t>模型只生成草稿并保存版本 页码和原文</w:t>
+            </w:r>
+          </w:p>
+        </w:tc>
+        <w:tc>
+          <w:tcPr>
+            <w:tcW w:type="dxa" w:w="2088"/>
+            <w:tcMar>
+              <w:top w:w="100" w:type="dxa"/>
+              <w:start w:w="120" w:type="dxa"/>
+              <w:bottom w:w="100" w:type="dxa"/>
+              <w:end w:w="120" w:type="dxa"/>
+            </w:tcMar>
+            <w:vAlign w:val="center"/>
+            <w:shd w:fill="EAF2F8"/>
+          </w:tcPr>
+          <w:p>
+            <w:pPr>
+              <w:spacing w:after="0" w:line="259" w:lineRule="auto"/>
+            </w:pPr>
+            <w:r>
+              <w:rPr>
+                <w:rFonts w:ascii="Aptos" w:hAnsi="Aptos" w:eastAsia="Microsoft YaHei"/>
+                <w:color w:val="000000"/>
+                <w:sz w:val="17"/>
+              </w:rPr>
+              <w:t>建立引用准确率和风险召回评测集</w:t>
+            </w:r>
+          </w:p>
+        </w:tc>
+      </w:tr>
+      <w:tr>
+        <w:trPr>
+          <w:cantSplit/>
+        </w:trPr>
+        <w:tc>
+          <w:tcPr>
+            <w:tcW w:type="dxa" w:w="2088"/>
+            <w:tcMar>
+              <w:top w:w="100" w:type="dxa"/>
+              <w:start w:w="120" w:type="dxa"/>
+              <w:bottom w:w="100" w:type="dxa"/>
+              <w:end w:w="120" w:type="dxa"/>
+            </w:tcMar>
+            <w:vAlign w:val="center"/>
+          </w:tcPr>
+          <w:p>
+            <w:pPr>
+              <w:spacing w:after="0" w:line="259" w:lineRule="auto"/>
+              <w:jc w:val="center"/>
+            </w:pPr>
+            <w:r>
+              <w:rPr>
+                <w:rFonts w:ascii="Aptos" w:hAnsi="Aptos" w:eastAsia="Microsoft YaHei"/>
+                <w:color w:val="000000"/>
+                <w:sz w:val="17"/>
+              </w:rPr>
+              <w:t>跨租户数据泄露</w:t>
+            </w:r>
+          </w:p>
+        </w:tc>
+        <w:tc>
+          <w:tcPr>
+            <w:tcW w:type="dxa" w:w="2232"/>
+            <w:tcMar>
+              <w:top w:w="100" w:type="dxa"/>
+              <w:start w:w="120" w:type="dxa"/>
+              <w:bottom w:w="100" w:type="dxa"/>
+              <w:end w:w="120" w:type="dxa"/>
+            </w:tcMar>
+            <w:vAlign w:val="center"/>
+          </w:tcPr>
+          <w:p>
+            <w:pPr>
+              <w:spacing w:after="0" w:line="259" w:lineRule="auto"/>
+            </w:pPr>
+            <w:r>
+              <w:rPr>
+                <w:rFonts w:ascii="Aptos" w:hAnsi="Aptos" w:eastAsia="Microsoft YaHei"/>
+                <w:color w:val="000000"/>
+                <w:sz w:val="17"/>
+              </w:rPr>
+              <w:t>合同和商业信息外泄</w:t>
+            </w:r>
+          </w:p>
+        </w:tc>
+        <w:tc>
+          <w:tcPr>
+            <w:tcW w:type="dxa" w:w="3528"/>
+            <w:tcMar>
+              <w:top w:w="100" w:type="dxa"/>
+              <w:start w:w="120" w:type="dxa"/>
+              <w:bottom w:w="100" w:type="dxa"/>
+              <w:end w:w="120" w:type="dxa"/>
+            </w:tcMar>
+            <w:vAlign w:val="center"/>
+          </w:tcPr>
+          <w:p>
+            <w:pPr>
+              <w:spacing w:after="0" w:line="259" w:lineRule="auto"/>
+            </w:pPr>
+            <w:r>
+              <w:rPr>
+                <w:rFonts w:ascii="Aptos" w:hAnsi="Aptos" w:eastAsia="Microsoft YaHei"/>
+                <w:color w:val="000000"/>
+                <w:sz w:val="17"/>
+              </w:rPr>
+              <w:t>独立应用角色 FORCE RLS 对象键带租户</w:t>
+            </w:r>
+          </w:p>
+        </w:tc>
+        <w:tc>
+          <w:tcPr>
+            <w:tcW w:type="dxa" w:w="2088"/>
+            <w:tcMar>
+              <w:top w:w="100" w:type="dxa"/>
+              <w:start w:w="120" w:type="dxa"/>
+              <w:bottom w:w="100" w:type="dxa"/>
+              <w:end w:w="120" w:type="dxa"/>
+            </w:tcMar>
+            <w:vAlign w:val="center"/>
+          </w:tcPr>
+          <w:p>
+            <w:pPr>
+              <w:spacing w:after="0" w:line="259" w:lineRule="auto"/>
+            </w:pPr>
+            <w:r>
+              <w:rPr>
+                <w:rFonts w:ascii="Aptos" w:hAnsi="Aptos" w:eastAsia="Microsoft YaHei"/>
+                <w:color w:val="000000"/>
+                <w:sz w:val="17"/>
+              </w:rPr>
+              <w:t>集成测试和恶意越权测试</w:t>
+            </w:r>
+          </w:p>
+        </w:tc>
+      </w:tr>
+      <w:tr>
+        <w:trPr>
+          <w:cantSplit/>
+        </w:trPr>
+        <w:tc>
+          <w:tcPr>
+            <w:tcW w:type="dxa" w:w="2088"/>
+            <w:tcMar>
+              <w:top w:w="100" w:type="dxa"/>
+              <w:start w:w="120" w:type="dxa"/>
+              <w:bottom w:w="100" w:type="dxa"/>
+              <w:end w:w="120" w:type="dxa"/>
+            </w:tcMar>
+            <w:vAlign w:val="center"/>
+            <w:shd w:fill="EAF2F8"/>
+          </w:tcPr>
+          <w:p>
+            <w:pPr>
+              <w:spacing w:after="0" w:line="259" w:lineRule="auto"/>
+              <w:jc w:val="center"/>
+            </w:pPr>
+            <w:r>
+              <w:rPr>
+                <w:rFonts w:ascii="Aptos" w:hAnsi="Aptos" w:eastAsia="Microsoft YaHei"/>
+                <w:color w:val="000000"/>
+                <w:sz w:val="17"/>
+              </w:rPr>
+              <w:t>恶意合同内容</w:t>
+            </w:r>
+          </w:p>
+        </w:tc>
+        <w:tc>
+          <w:tcPr>
+            <w:tcW w:type="dxa" w:w="2232"/>
+            <w:tcMar>
+              <w:top w:w="100" w:type="dxa"/>
+              <w:start w:w="120" w:type="dxa"/>
+              <w:bottom w:w="100" w:type="dxa"/>
+              <w:end w:w="120" w:type="dxa"/>
+            </w:tcMar>
+            <w:vAlign w:val="center"/>
+            <w:shd w:fill="EAF2F8"/>
+          </w:tcPr>
+          <w:p>
+            <w:pPr>
+              <w:spacing w:after="0" w:line="259" w:lineRule="auto"/>
+            </w:pPr>
+            <w:r>
+              <w:rPr>
+                <w:rFonts w:ascii="Aptos" w:hAnsi="Aptos" w:eastAsia="Microsoft YaHei"/>
+                <w:color w:val="000000"/>
+                <w:sz w:val="17"/>
+              </w:rPr>
+              <w:t>Prompt 注入或解析器攻击</w:t>
+            </w:r>
+          </w:p>
+        </w:tc>
+        <w:tc>
+          <w:tcPr>
+            <w:tcW w:type="dxa" w:w="3528"/>
+            <w:tcMar>
+              <w:top w:w="100" w:type="dxa"/>
+              <w:start w:w="120" w:type="dxa"/>
+              <w:bottom w:w="100" w:type="dxa"/>
+              <w:end w:w="120" w:type="dxa"/>
+            </w:tcMar>
+            <w:vAlign w:val="center"/>
+            <w:shd w:fill="EAF2F8"/>
+          </w:tcPr>
+          <w:p>
+            <w:pPr>
+              <w:spacing w:after="0" w:line="259" w:lineRule="auto"/>
+            </w:pPr>
+            <w:r>
+              <w:rPr>
+                <w:rFonts w:ascii="Aptos" w:hAnsi="Aptos" w:eastAsia="Microsoft YaHei"/>
+                <w:color w:val="000000"/>
+                <w:sz w:val="17"/>
+              </w:rPr>
+              <w:t>模型不执行合同内指令 工具默认关闭</w:t>
+            </w:r>
+          </w:p>
+        </w:tc>
+        <w:tc>
+          <w:tcPr>
+            <w:tcW w:type="dxa" w:w="2088"/>
+            <w:tcMar>
+              <w:top w:w="100" w:type="dxa"/>
+              <w:start w:w="120" w:type="dxa"/>
+              <w:bottom w:w="100" w:type="dxa"/>
+              <w:end w:w="120" w:type="dxa"/>
+            </w:tcMar>
+            <w:vAlign w:val="center"/>
+            <w:shd w:fill="EAF2F8"/>
+          </w:tcPr>
+          <w:p>
+            <w:pPr>
+              <w:spacing w:after="0" w:line="259" w:lineRule="auto"/>
+            </w:pPr>
+            <w:r>
+              <w:rPr>
+                <w:rFonts w:ascii="Aptos" w:hAnsi="Aptos" w:eastAsia="Microsoft YaHei"/>
+                <w:color w:val="000000"/>
+                <w:sz w:val="17"/>
+              </w:rPr>
+              <w:t>恶意样本和文件沙箱测试</w:t>
+            </w:r>
+          </w:p>
+        </w:tc>
+      </w:tr>
+      <w:tr>
+        <w:trPr>
+          <w:cantSplit/>
+        </w:trPr>
+        <w:tc>
+          <w:tcPr>
+            <w:tcW w:type="dxa" w:w="2088"/>
+            <w:tcMar>
+              <w:top w:w="100" w:type="dxa"/>
+              <w:start w:w="120" w:type="dxa"/>
+              <w:bottom w:w="100" w:type="dxa"/>
+              <w:end w:w="120" w:type="dxa"/>
+            </w:tcMar>
+            <w:vAlign w:val="center"/>
+          </w:tcPr>
+          <w:p>
+            <w:pPr>
+              <w:spacing w:after="0" w:line="259" w:lineRule="auto"/>
+              <w:jc w:val="center"/>
+            </w:pPr>
+            <w:r>
+              <w:rPr>
+                <w:rFonts w:ascii="Aptos" w:hAnsi="Aptos" w:eastAsia="Microsoft YaHei"/>
+                <w:color w:val="000000"/>
+                <w:sz w:val="17"/>
+              </w:rPr>
+              <w:t>重复任务和提醒</w:t>
+            </w:r>
+          </w:p>
+        </w:tc>
+        <w:tc>
+          <w:tcPr>
+            <w:tcW w:type="dxa" w:w="2232"/>
+            <w:tcMar>
+              <w:top w:w="100" w:type="dxa"/>
+              <w:start w:w="120" w:type="dxa"/>
+              <w:bottom w:w="100" w:type="dxa"/>
+              <w:end w:w="120" w:type="dxa"/>
+            </w:tcMar>
+            <w:vAlign w:val="center"/>
+          </w:tcPr>
+          <w:p>
+            <w:pPr>
+              <w:spacing w:after="0" w:line="259" w:lineRule="auto"/>
+            </w:pPr>
+            <w:r>
+              <w:rPr>
+                <w:rFonts w:ascii="Aptos" w:hAnsi="Aptos" w:eastAsia="Microsoft YaHei"/>
+                <w:color w:val="000000"/>
+                <w:sz w:val="17"/>
+              </w:rPr>
+              <w:t>重复审查 重复通知</w:t>
+            </w:r>
+          </w:p>
+        </w:tc>
+        <w:tc>
+          <w:tcPr>
+            <w:tcW w:type="dxa" w:w="3528"/>
+            <w:tcMar>
+              <w:top w:w="100" w:type="dxa"/>
+              <w:start w:w="120" w:type="dxa"/>
+              <w:bottom w:w="100" w:type="dxa"/>
+              <w:end w:w="120" w:type="dxa"/>
+            </w:tcMar>
+            <w:vAlign w:val="center"/>
+          </w:tcPr>
+          <w:p>
+            <w:pPr>
+              <w:spacing w:after="0" w:line="259" w:lineRule="auto"/>
+            </w:pPr>
+            <w:r>
+              <w:rPr>
+                <w:rFonts w:ascii="Aptos" w:hAnsi="Aptos" w:eastAsia="Microsoft YaHei"/>
+                <w:color w:val="000000"/>
+                <w:sz w:val="17"/>
+              </w:rPr>
+              <w:t>幂等表 Outbox 唯一键设计</w:t>
+            </w:r>
+          </w:p>
+        </w:tc>
+        <w:tc>
+          <w:tcPr>
+            <w:tcW w:type="dxa" w:w="2088"/>
+            <w:tcMar>
+              <w:top w:w="100" w:type="dxa"/>
+              <w:start w:w="120" w:type="dxa"/>
+              <w:bottom w:w="100" w:type="dxa"/>
+              <w:end w:w="120" w:type="dxa"/>
+            </w:tcMar>
+            <w:vAlign w:val="center"/>
+          </w:tcPr>
+          <w:p>
+            <w:pPr>
+              <w:spacing w:after="0" w:line="259" w:lineRule="auto"/>
+            </w:pPr>
+            <w:r>
+              <w:rPr>
+                <w:rFonts w:ascii="Aptos" w:hAnsi="Aptos" w:eastAsia="Microsoft YaHei"/>
+                <w:color w:val="000000"/>
+                <w:sz w:val="17"/>
+              </w:rPr>
+              <w:t>Worker 崩溃和重复投递测试</w:t>
+            </w:r>
+          </w:p>
+        </w:tc>
+      </w:tr>
+      <w:tr>
+        <w:trPr>
+          <w:cantSplit/>
+        </w:trPr>
+        <w:tc>
+          <w:tcPr>
+            <w:tcW w:type="dxa" w:w="2088"/>
+            <w:tcMar>
+              <w:top w:w="100" w:type="dxa"/>
+              <w:start w:w="120" w:type="dxa"/>
+              <w:bottom w:w="100" w:type="dxa"/>
+              <w:end w:w="120" w:type="dxa"/>
+            </w:tcMar>
+            <w:vAlign w:val="center"/>
+            <w:shd w:fill="EAF2F8"/>
+          </w:tcPr>
+          <w:p>
+            <w:pPr>
+              <w:spacing w:after="0" w:line="259" w:lineRule="auto"/>
+              <w:jc w:val="center"/>
+            </w:pPr>
+            <w:r>
+              <w:rPr>
+                <w:rFonts w:ascii="Aptos" w:hAnsi="Aptos" w:eastAsia="Microsoft YaHei"/>
+                <w:color w:val="000000"/>
+                <w:sz w:val="17"/>
+              </w:rPr>
+              <w:t>解析定位错误</w:t>
+            </w:r>
+          </w:p>
+        </w:tc>
+        <w:tc>
+          <w:tcPr>
+            <w:tcW w:type="dxa" w:w="2232"/>
+            <w:tcMar>
+              <w:top w:w="100" w:type="dxa"/>
+              <w:start w:w="120" w:type="dxa"/>
+              <w:bottom w:w="100" w:type="dxa"/>
+              <w:end w:w="120" w:type="dxa"/>
+            </w:tcMar>
+            <w:vAlign w:val="center"/>
+            <w:shd w:fill="EAF2F8"/>
+          </w:tcPr>
+          <w:p>
+            <w:pPr>
+              <w:spacing w:after="0" w:line="259" w:lineRule="auto"/>
+            </w:pPr>
+            <w:r>
+              <w:rPr>
+                <w:rFonts w:ascii="Aptos" w:hAnsi="Aptos" w:eastAsia="Microsoft YaHei"/>
+                <w:color w:val="000000"/>
+                <w:sz w:val="17"/>
+              </w:rPr>
+              <w:t>引用页码不准确</w:t>
+            </w:r>
+          </w:p>
+        </w:tc>
+        <w:tc>
+          <w:tcPr>
+            <w:tcW w:type="dxa" w:w="3528"/>
+            <w:tcMar>
+              <w:top w:w="100" w:type="dxa"/>
+              <w:start w:w="120" w:type="dxa"/>
+              <w:bottom w:w="100" w:type="dxa"/>
+              <w:end w:w="120" w:type="dxa"/>
+            </w:tcMar>
+            <w:vAlign w:val="center"/>
+            <w:shd w:fill="EAF2F8"/>
+          </w:tcPr>
+          <w:p>
+            <w:pPr>
+              <w:spacing w:after="0" w:line="259" w:lineRule="auto"/>
+            </w:pPr>
+            <w:r>
+              <w:rPr>
+                <w:rFonts w:ascii="Aptos" w:hAnsi="Aptos" w:eastAsia="Microsoft YaHei"/>
+                <w:color w:val="000000"/>
+                <w:sz w:val="17"/>
+              </w:rPr>
+              <w:t>保存版本 Chunk 页码和 parser version</w:t>
+            </w:r>
+          </w:p>
+        </w:tc>
+        <w:tc>
+          <w:tcPr>
+            <w:tcW w:type="dxa" w:w="2088"/>
+            <w:tcMar>
+              <w:top w:w="100" w:type="dxa"/>
+              <w:start w:w="120" w:type="dxa"/>
+              <w:bottom w:w="100" w:type="dxa"/>
+              <w:end w:w="120" w:type="dxa"/>
+            </w:tcMar>
+            <w:vAlign w:val="center"/>
+            <w:shd w:fill="EAF2F8"/>
+          </w:tcPr>
+          <w:p>
+            <w:pPr>
+              <w:spacing w:after="0" w:line="259" w:lineRule="auto"/>
+            </w:pPr>
+            <w:r>
+              <w:rPr>
+                <w:rFonts w:ascii="Aptos" w:hAnsi="Aptos" w:eastAsia="Microsoft YaHei"/>
+                <w:color w:val="000000"/>
+                <w:sz w:val="17"/>
+              </w:rPr>
+              <w:t>人工标注样本比对</w:t>
+            </w:r>
+          </w:p>
+        </w:tc>
+      </w:tr>
+      <w:tr>
+        <w:trPr>
+          <w:cantSplit/>
+        </w:trPr>
+        <w:tc>
+          <w:tcPr>
+            <w:tcW w:type="dxa" w:w="2088"/>
+            <w:tcMar>
+              <w:top w:w="100" w:type="dxa"/>
+              <w:start w:w="120" w:type="dxa"/>
+              <w:bottom w:w="100" w:type="dxa"/>
+              <w:end w:w="120" w:type="dxa"/>
+            </w:tcMar>
+            <w:vAlign w:val="center"/>
+          </w:tcPr>
+          <w:p>
+            <w:pPr>
+              <w:spacing w:after="0" w:line="259" w:lineRule="auto"/>
+              <w:jc w:val="center"/>
+            </w:pPr>
+            <w:r>
+              <w:rPr>
+                <w:rFonts w:ascii="Aptos" w:hAnsi="Aptos" w:eastAsia="Microsoft YaHei"/>
+                <w:color w:val="000000"/>
+                <w:sz w:val="17"/>
+              </w:rPr>
+              <w:t>合同修订覆盖历史</w:t>
+            </w:r>
+          </w:p>
+        </w:tc>
+        <w:tc>
+          <w:tcPr>
+            <w:tcW w:type="dxa" w:w="2232"/>
+            <w:tcMar>
+              <w:top w:w="100" w:type="dxa"/>
+              <w:start w:w="120" w:type="dxa"/>
+              <w:bottom w:w="100" w:type="dxa"/>
+              <w:end w:w="120" w:type="dxa"/>
+            </w:tcMar>
+            <w:vAlign w:val="center"/>
+          </w:tcPr>
+          <w:p>
+            <w:pPr>
+              <w:spacing w:after="0" w:line="259" w:lineRule="auto"/>
+            </w:pPr>
+            <w:r>
+              <w:rPr>
+                <w:rFonts w:ascii="Aptos" w:hAnsi="Aptos" w:eastAsia="Microsoft YaHei"/>
+                <w:color w:val="000000"/>
+                <w:sz w:val="17"/>
+              </w:rPr>
+              <w:t>审计链丢失</w:t>
+            </w:r>
+          </w:p>
+        </w:tc>
+        <w:tc>
+          <w:tcPr>
+            <w:tcW w:type="dxa" w:w="3528"/>
+            <w:tcMar>
+              <w:top w:w="100" w:type="dxa"/>
+              <w:start w:w="120" w:type="dxa"/>
+              <w:bottom w:w="100" w:type="dxa"/>
+              <w:end w:w="120" w:type="dxa"/>
+            </w:tcMar>
+            <w:vAlign w:val="center"/>
+          </w:tcPr>
+          <w:p>
+            <w:pPr>
+              <w:spacing w:after="0" w:line="259" w:lineRule="auto"/>
+            </w:pPr>
+            <w:r>
+              <w:rPr>
+                <w:rFonts w:ascii="Aptos" w:hAnsi="Aptos" w:eastAsia="Microsoft YaHei"/>
+                <w:color w:val="000000"/>
+                <w:sz w:val="17"/>
+              </w:rPr>
+              <w:t>版本不可变 驳回后创建新版本</w:t>
+            </w:r>
+          </w:p>
+        </w:tc>
+        <w:tc>
+          <w:tcPr>
+            <w:tcW w:type="dxa" w:w="2088"/>
+            <w:tcMar>
+              <w:top w:w="100" w:type="dxa"/>
+              <w:start w:w="120" w:type="dxa"/>
+              <w:bottom w:w="100" w:type="dxa"/>
+              <w:end w:w="120" w:type="dxa"/>
+            </w:tcMar>
+            <w:vAlign w:val="center"/>
+          </w:tcPr>
+          <w:p>
+            <w:pPr>
+              <w:spacing w:after="0" w:line="259" w:lineRule="auto"/>
+            </w:pPr>
+            <w:r>
+              <w:rPr>
+                <w:rFonts w:ascii="Aptos" w:hAnsi="Aptos" w:eastAsia="Microsoft YaHei"/>
+                <w:color w:val="000000"/>
+                <w:sz w:val="17"/>
+              </w:rPr>
+              <w:t>版本 Diff 和回滚测试</w:t>
+            </w:r>
+          </w:p>
+        </w:tc>
+      </w:tr>
+      <w:tr>
+        <w:trPr>
+          <w:cantSplit/>
+        </w:trPr>
+        <w:tc>
+          <w:tcPr>
+            <w:tcW w:type="dxa" w:w="2088"/>
+            <w:tcMar>
+              <w:top w:w="100" w:type="dxa"/>
+              <w:start w:w="120" w:type="dxa"/>
+              <w:bottom w:w="100" w:type="dxa"/>
+              <w:end w:w="120" w:type="dxa"/>
+            </w:tcMar>
+            <w:vAlign w:val="center"/>
+            <w:shd w:fill="EAF2F8"/>
+          </w:tcPr>
+          <w:p>
+            <w:pPr>
+              <w:spacing w:after="0" w:line="259" w:lineRule="auto"/>
+              <w:jc w:val="center"/>
+            </w:pPr>
+            <w:r>
+              <w:rPr>
+                <w:rFonts w:ascii="Aptos" w:hAnsi="Aptos" w:eastAsia="Microsoft YaHei"/>
+                <w:color w:val="000000"/>
+                <w:sz w:val="17"/>
+              </w:rPr>
+              <w:t>迁移权限泄露给运行服务</w:t>
+            </w:r>
+          </w:p>
+        </w:tc>
+        <w:tc>
+          <w:tcPr>
+            <w:tcW w:type="dxa" w:w="2232"/>
+            <w:tcMar>
+              <w:top w:w="100" w:type="dxa"/>
+              <w:start w:w="120" w:type="dxa"/>
+              <w:bottom w:w="100" w:type="dxa"/>
+              <w:end w:w="120" w:type="dxa"/>
+            </w:tcMar>
+            <w:vAlign w:val="center"/>
+            <w:shd w:fill="EAF2F8"/>
+          </w:tcPr>
+          <w:p>
+            <w:pPr>
+              <w:spacing w:after="0" w:line="259" w:lineRule="auto"/>
+            </w:pPr>
+            <w:r>
+              <w:rPr>
+                <w:rFonts w:ascii="Aptos" w:hAnsi="Aptos" w:eastAsia="Microsoft YaHei"/>
+                <w:color w:val="000000"/>
+                <w:sz w:val="17"/>
+              </w:rPr>
+              <w:t>应用漏洞可能修改结构或绕过隔离</w:t>
+            </w:r>
+          </w:p>
+        </w:tc>
+        <w:tc>
+          <w:tcPr>
+            <w:tcW w:type="dxa" w:w="3528"/>
+            <w:tcMar>
+              <w:top w:w="100" w:type="dxa"/>
+              <w:start w:w="120" w:type="dxa"/>
+              <w:bottom w:w="100" w:type="dxa"/>
+              <w:end w:w="120" w:type="dxa"/>
+            </w:tcMar>
+            <w:vAlign w:val="center"/>
+            <w:shd w:fill="EAF2F8"/>
+          </w:tcPr>
+          <w:p>
+            <w:pPr>
+              <w:spacing w:after="0" w:line="259" w:lineRule="auto"/>
+            </w:pPr>
+            <w:r>
+              <w:rPr>
+                <w:rFonts w:ascii="Aptos" w:hAnsi="Aptos" w:eastAsia="Microsoft YaHei"/>
+                <w:color w:val="000000"/>
+                <w:sz w:val="17"/>
+              </w:rPr>
+              <w:t>迁移 URL 与运行 URL 分离 migrate 服务短期运行</w:t>
+            </w:r>
+          </w:p>
+        </w:tc>
+        <w:tc>
+          <w:tcPr>
+            <w:tcW w:type="dxa" w:w="2088"/>
+            <w:tcMar>
+              <w:top w:w="100" w:type="dxa"/>
+              <w:start w:w="120" w:type="dxa"/>
+              <w:bottom w:w="100" w:type="dxa"/>
+              <w:end w:w="120" w:type="dxa"/>
+            </w:tcMar>
+            <w:vAlign w:val="center"/>
+            <w:shd w:fill="EAF2F8"/>
+          </w:tcPr>
+          <w:p>
+            <w:pPr>
+              <w:spacing w:after="0" w:line="259" w:lineRule="auto"/>
+            </w:pPr>
+            <w:r>
+              <w:rPr>
+                <w:rFonts w:ascii="Aptos" w:hAnsi="Aptos" w:eastAsia="Microsoft YaHei"/>
+                <w:color w:val="000000"/>
+                <w:sz w:val="17"/>
+              </w:rPr>
+              <w:t>CI 检查运行角色权限和生产密钥配置</w:t>
+            </w:r>
+          </w:p>
+        </w:tc>
+      </w:tr>
+      <w:tr>
+        <w:trPr>
+          <w:cantSplit/>
+        </w:trPr>
+        <w:tc>
+          <w:tcPr>
+            <w:tcW w:type="dxa" w:w="2088"/>
+            <w:tcMar>
+              <w:top w:w="100" w:type="dxa"/>
+              <w:start w:w="120" w:type="dxa"/>
+              <w:bottom w:w="100" w:type="dxa"/>
+              <w:end w:w="120" w:type="dxa"/>
+            </w:tcMar>
+            <w:vAlign w:val="center"/>
+          </w:tcPr>
+          <w:p>
+            <w:pPr>
+              <w:spacing w:after="0" w:line="259" w:lineRule="auto"/>
+              <w:jc w:val="center"/>
+            </w:pPr>
+            <w:r>
+              <w:rPr>
+                <w:rFonts w:ascii="Aptos" w:hAnsi="Aptos" w:eastAsia="Microsoft YaHei"/>
+                <w:color w:val="000000"/>
+                <w:sz w:val="17"/>
+              </w:rPr>
+              <w:t>跨平台文件模式丢失</w:t>
+            </w:r>
+          </w:p>
+        </w:tc>
+        <w:tc>
+          <w:tcPr>
+            <w:tcW w:type="dxa" w:w="2232"/>
+            <w:tcMar>
+              <w:top w:w="100" w:type="dxa"/>
+              <w:start w:w="120" w:type="dxa"/>
+              <w:bottom w:w="100" w:type="dxa"/>
+              <w:end w:w="120" w:type="dxa"/>
+            </w:tcMar>
+            <w:vAlign w:val="center"/>
+          </w:tcPr>
+          <w:p>
+            <w:pPr>
+              <w:spacing w:after="0" w:line="259" w:lineRule="auto"/>
+            </w:pPr>
+            <w:r>
+              <w:rPr>
+                <w:rFonts w:ascii="Aptos" w:hAnsi="Aptos" w:eastAsia="Microsoft YaHei"/>
+                <w:color w:val="000000"/>
+                <w:sz w:val="17"/>
+              </w:rPr>
+              <w:t>Linux CI 脚本在任务开始时退出 126</w:t>
+            </w:r>
+          </w:p>
+        </w:tc>
+        <w:tc>
+          <w:tcPr>
+            <w:tcW w:type="dxa" w:w="3528"/>
+            <w:tcMar>
+              <w:top w:w="100" w:type="dxa"/>
+              <w:start w:w="120" w:type="dxa"/>
+              <w:bottom w:w="100" w:type="dxa"/>
+              <w:end w:w="120" w:type="dxa"/>
+            </w:tcMar>
+            <w:vAlign w:val="center"/>
+          </w:tcPr>
+          <w:p>
+            <w:pPr>
+              <w:spacing w:after="0" w:line="259" w:lineRule="auto"/>
+            </w:pPr>
+            <w:r>
+              <w:rPr>
+                <w:rFonts w:ascii="Aptos" w:hAnsi="Aptos" w:eastAsia="Microsoft YaHei"/>
+                <w:color w:val="000000"/>
+                <w:sz w:val="17"/>
+              </w:rPr>
+              <w:t>工作流显式使用 Bash 调用脚本</w:t>
+            </w:r>
+          </w:p>
+        </w:tc>
+        <w:tc>
+          <w:tcPr>
+            <w:tcW w:type="dxa" w:w="2088"/>
+            <w:tcMar>
+              <w:top w:w="100" w:type="dxa"/>
+              <w:start w:w="120" w:type="dxa"/>
+              <w:bottom w:w="100" w:type="dxa"/>
+              <w:end w:w="120" w:type="dxa"/>
+            </w:tcMar>
+            <w:vAlign w:val="center"/>
+          </w:tcPr>
+          <w:p>
+            <w:pPr>
+              <w:spacing w:after="0" w:line="259" w:lineRule="auto"/>
+            </w:pPr>
+            <w:r>
+              <w:rPr>
+                <w:rFonts w:ascii="Aptos" w:hAnsi="Aptos" w:eastAsia="Microsoft YaHei"/>
+                <w:color w:val="000000"/>
+                <w:sz w:val="17"/>
+              </w:rPr>
+              <w:t>每次迁移上传方式后观察 CI 自检</w:t>
+            </w:r>
+          </w:p>
+        </w:tc>
+      </w:tr>
+      <w:tr>
+        <w:trPr>
+          <w:cantSplit/>
+        </w:trPr>
+        <w:tc>
+          <w:tcPr>
+            <w:tcW w:type="dxa" w:w="2088"/>
+            <w:tcMar>
+              <w:top w:w="100" w:type="dxa"/>
+              <w:start w:w="120" w:type="dxa"/>
+              <w:bottom w:w="100" w:type="dxa"/>
+              <w:end w:w="120" w:type="dxa"/>
+            </w:tcMar>
+            <w:vAlign w:val="center"/>
+            <w:shd w:fill="EAF2F8"/>
+          </w:tcPr>
+          <w:p>
+            <w:pPr>
+              <w:spacing w:after="0" w:line="259" w:lineRule="auto"/>
+              <w:jc w:val="center"/>
+            </w:pPr>
+            <w:r>
+              <w:rPr>
+                <w:rFonts w:ascii="Aptos" w:hAnsi="Aptos" w:eastAsia="Microsoft YaHei"/>
+                <w:color w:val="000000"/>
+                <w:sz w:val="17"/>
+              </w:rPr>
+              <w:t>上游格式债阻断阶段交付</w:t>
+            </w:r>
+          </w:p>
+        </w:tc>
+        <w:tc>
+          <w:tcPr>
+            <w:tcW w:type="dxa" w:w="2232"/>
+            <w:tcMar>
+              <w:top w:w="100" w:type="dxa"/>
+              <w:start w:w="120" w:type="dxa"/>
+              <w:bottom w:w="100" w:type="dxa"/>
+              <w:end w:w="120" w:type="dxa"/>
+            </w:tcMar>
+            <w:vAlign w:val="center"/>
+            <w:shd w:fill="EAF2F8"/>
+          </w:tcPr>
+          <w:p>
+            <w:pPr>
+              <w:spacing w:after="0" w:line="259" w:lineRule="auto"/>
+            </w:pPr>
+            <w:r>
+              <w:rPr>
+                <w:rFonts w:ascii="Aptos" w:hAnsi="Aptos" w:eastAsia="Microsoft YaHei"/>
+                <w:color w:val="000000"/>
+                <w:sz w:val="17"/>
+              </w:rPr>
+              <w:t>业务代码通过但根仓库质量门禁失败</w:t>
+            </w:r>
+          </w:p>
+        </w:tc>
+        <w:tc>
+          <w:tcPr>
+            <w:tcW w:type="dxa" w:w="3528"/>
+            <w:tcMar>
+              <w:top w:w="100" w:type="dxa"/>
+              <w:start w:w="120" w:type="dxa"/>
+              <w:bottom w:w="100" w:type="dxa"/>
+              <w:end w:w="120" w:type="dxa"/>
+            </w:tcMar>
+            <w:vAlign w:val="center"/>
+            <w:shd w:fill="EAF2F8"/>
+          </w:tcPr>
+          <w:p>
+            <w:pPr>
+              <w:spacing w:after="0" w:line="259" w:lineRule="auto"/>
+            </w:pPr>
+            <w:r>
+              <w:rPr>
+                <w:rFonts w:ascii="Aptos" w:hAnsi="Aptos" w:eastAsia="Microsoft YaHei"/>
+                <w:color w:val="000000"/>
+                <w:sz w:val="17"/>
+              </w:rPr>
+              <w:t>按日志修复具体文件 不扩大忽略范围</w:t>
+            </w:r>
+          </w:p>
+        </w:tc>
+        <w:tc>
+          <w:tcPr>
+            <w:tcW w:type="dxa" w:w="2088"/>
+            <w:tcMar>
+              <w:top w:w="100" w:type="dxa"/>
+              <w:start w:w="120" w:type="dxa"/>
+              <w:bottom w:w="100" w:type="dxa"/>
+              <w:end w:w="120" w:type="dxa"/>
+            </w:tcMar>
+            <w:vAlign w:val="center"/>
+            <w:shd w:fill="EAF2F8"/>
+          </w:tcPr>
+          <w:p>
+            <w:pPr>
+              <w:spacing w:after="0" w:line="259" w:lineRule="auto"/>
+            </w:pPr>
+            <w:r>
+              <w:rPr>
+                <w:rFonts w:ascii="Aptos" w:hAnsi="Aptos" w:eastAsia="Microsoft YaHei"/>
+                <w:color w:val="000000"/>
+                <w:sz w:val="17"/>
+              </w:rPr>
+              <w:t>PR 中运行完整 Prettier 和现有 CI</w:t>
+            </w:r>
+          </w:p>
+        </w:tc>
+      </w:tr>
+      <w:tr>
+        <w:trPr>
+          <w:cantSplit/>
+        </w:trPr>
+        <w:tc>
+          <w:tcPr>
+            <w:tcW w:type="dxa" w:w="2088"/>
+            <w:tcMar>
+              <w:top w:w="100" w:type="dxa"/>
+              <w:start w:w="120" w:type="dxa"/>
+              <w:bottom w:w="100" w:type="dxa"/>
+              <w:end w:w="120" w:type="dxa"/>
+            </w:tcMar>
+            <w:vAlign w:val="center"/>
+          </w:tcPr>
+          <w:p>
+            <w:pPr>
+              <w:spacing w:after="0" w:line="259" w:lineRule="auto"/>
+              <w:jc w:val="center"/>
+            </w:pPr>
+            <w:r>
+              <w:rPr>
+                <w:rFonts w:ascii="Aptos" w:hAnsi="Aptos" w:eastAsia="Microsoft YaHei"/>
+                <w:color w:val="000000"/>
+                <w:sz w:val="17"/>
+              </w:rPr>
+              <w:t>删除入口后遗留测试和脚本</w:t>
+            </w:r>
+          </w:p>
+        </w:tc>
+        <w:tc>
+          <w:tcPr>
+            <w:tcW w:type="dxa" w:w="2232"/>
+            <w:tcMar>
+              <w:top w:w="100" w:type="dxa"/>
+              <w:start w:w="120" w:type="dxa"/>
+              <w:bottom w:w="100" w:type="dxa"/>
+              <w:end w:w="120" w:type="dxa"/>
+            </w:tcMar>
+            <w:vAlign w:val="center"/>
+          </w:tcPr>
+          <w:p>
+            <w:pPr>
+              <w:spacing w:after="0" w:line="259" w:lineRule="auto"/>
+            </w:pPr>
+            <w:r>
+              <w:rPr>
+                <w:rFonts w:ascii="Aptos" w:hAnsi="Aptos" w:eastAsia="Microsoft YaHei"/>
+                <w:color w:val="000000"/>
+                <w:sz w:val="17"/>
+              </w:rPr>
+              <w:t>后续单测读取不存在文件或死代码持续维护</w:t>
+            </w:r>
+          </w:p>
+        </w:tc>
+        <w:tc>
+          <w:tcPr>
+            <w:tcW w:type="dxa" w:w="3528"/>
+            <w:tcMar>
+              <w:top w:w="100" w:type="dxa"/>
+              <w:start w:w="120" w:type="dxa"/>
+              <w:bottom w:w="100" w:type="dxa"/>
+              <w:end w:w="120" w:type="dxa"/>
+            </w:tcMar>
+            <w:vAlign w:val="center"/>
+          </w:tcPr>
+          <w:p>
+            <w:pPr>
+              <w:spacing w:after="0" w:line="259" w:lineRule="auto"/>
+            </w:pPr>
+            <w:r>
+              <w:rPr>
+                <w:rFonts w:ascii="Aptos" w:hAnsi="Aptos" w:eastAsia="Microsoft YaHei"/>
+                <w:color w:val="000000"/>
+                <w:sz w:val="17"/>
+              </w:rPr>
+              <w:t>删除功能时同步清理脚本 测试和引用</w:t>
+            </w:r>
+          </w:p>
+        </w:tc>
+        <w:tc>
+          <w:tcPr>
+            <w:tcW w:type="dxa" w:w="2088"/>
+            <w:tcMar>
+              <w:top w:w="100" w:type="dxa"/>
+              <w:start w:w="120" w:type="dxa"/>
+              <w:bottom w:w="100" w:type="dxa"/>
+              <w:end w:w="120" w:type="dxa"/>
+            </w:tcMar>
+            <w:vAlign w:val="center"/>
+          </w:tcPr>
+          <w:p>
+            <w:pPr>
+              <w:spacing w:after="0" w:line="259" w:lineRule="auto"/>
+            </w:pPr>
+            <w:r>
+              <w:rPr>
+                <w:rFonts w:ascii="Aptos" w:hAnsi="Aptos" w:eastAsia="Microsoft YaHei"/>
+                <w:color w:val="000000"/>
+                <w:sz w:val="17"/>
+              </w:rPr>
+              <w:t>PR 完整单测和全仓引用搜索</w:t>
+            </w:r>
+          </w:p>
+        </w:tc>
+      </w:tr>
+    </w:tbl>
+    <w:p>
+      <w:pPr>
+        <w:spacing w:after="40"/>
+      </w:pPr>
+    </w:p>
+    <w:p>
+      <w:pPr>
+        <w:pStyle w:val="Heading1"/>
+        <w:keepNext/>
+        <w:keepLines/>
+      </w:pPr>
+      <w:r>
+        <w:rPr>
+          <w:rFonts w:ascii="Aptos" w:hAnsi="Aptos" w:eastAsia="Microsoft YaHei"/>
+          <w:b/>
+          <w:color w:val="000000"/>
+          <w:sz w:val="32"/>
+        </w:rPr>
+        <w:t>十三 后续更新记录模板</w:t>
       </w:r>
     </w:p>
     <w:p>
@@ -17715,7 +19291,7 @@
         <w:color w:val="000000"/>
         <w:sz w:val="17"/>
       </w:rPr>
-      <w:t>ContractOps 项目更新记录  版本 0.5</w:t>
+      <w:t>ContractOps 项目更新记录  版本 0.6</w:t>
     </w:r>
   </w:p>
 </w:hdr>

</xml_diff>

<commit_message>
feat(contractops): add M2 approval workflow
</commit_message>
<xml_diff>
--- a/architecture/ContractOps-项目更新记录.docx
+++ b/architecture/ContractOps-项目更新记录.docx
@@ -209,16 +209,8 @@
             <w:shd w:fill="EAF2F8"/>
           </w:tcPr>
           <w:p>
-            <w:pPr>
-              <w:spacing w:after="0" w:line="259" w:lineRule="auto"/>
-            </w:pPr>
-            <w:r>
-              <w:rPr>
-                <w:rFonts w:ascii="Aptos" w:hAnsi="Aptos" w:eastAsia="Microsoft YaHei"/>
-                <w:color w:val="000000"/>
-                <w:sz w:val="19"/>
-              </w:rPr>
-              <w:t>0.7</w:t>
+            <w:r>
+              <w:t>0.8</w:t>
             </w:r>
           </w:p>
         </w:tc>
@@ -264,15 +256,7 @@
             <w:vAlign w:val="center"/>
           </w:tcPr>
           <w:p>
-            <w:pPr>
-              <w:spacing w:after="0" w:line="259" w:lineRule="auto"/>
-            </w:pPr>
-            <w:r>
-              <w:rPr>
-                <w:rFonts w:ascii="Aptos" w:hAnsi="Aptos" w:eastAsia="Microsoft YaHei"/>
-                <w:color w:val="000000"/>
-                <w:sz w:val="19"/>
-              </w:rPr>
+            <w:r>
               <w:t>2026 年 9 月 26 日</w:t>
             </w:r>
           </w:p>
@@ -2406,16 +2390,60 @@
             <w:vAlign w:val="center"/>
           </w:tcPr>
           <w:p>
-            <w:pPr>
-              <w:spacing w:after="0" w:line="259" w:lineRule="auto"/>
-            </w:pPr>
-            <w:r>
-              <w:rPr>
-                <w:rFonts w:ascii="Aptos" w:hAnsi="Aptos" w:eastAsia="Microsoft YaHei"/>
-                <w:color w:val="000000"/>
-                <w:sz w:val="17"/>
-              </w:rPr>
-              <w:t>本地 37 项通过 PostgreSQL 集成测试待 CI</w:t>
+            <w:r>
+              <w:t>PR 2 全部 7 项检查通过并已合并到 main</w:t>
+            </w:r>
+          </w:p>
+        </w:tc>
+      </w:tr>
+      <w:tr>
+        <w:tc>
+          <w:tcPr>
+            <w:tcW w:type="dxa" w:w="1999"/>
+          </w:tcPr>
+          <w:p>
+            <w:r>
+              <w:t>UPD 008</w:t>
+            </w:r>
+          </w:p>
+        </w:tc>
+        <w:tc>
+          <w:tcPr>
+            <w:tcW w:type="dxa" w:w="1999"/>
+          </w:tcPr>
+          <w:p>
+            <w:r>
+              <w:t>2026 09 26</w:t>
+            </w:r>
+          </w:p>
+        </w:tc>
+        <w:tc>
+          <w:tcPr>
+            <w:tcW w:type="dxa" w:w="1999"/>
+          </w:tcPr>
+          <w:p>
+            <w:r>
+              <w:t>实现 M2 审批策略与个人待办</w:t>
+            </w:r>
+          </w:p>
+        </w:tc>
+        <w:tc>
+          <w:tcPr>
+            <w:tcW w:type="dxa" w:w="1999"/>
+          </w:tcPr>
+          <w:p>
+            <w:r>
+              <w:t>新增不可变策略版本 策略快照 条件审批 顺序流转和并发控制</w:t>
+            </w:r>
+          </w:p>
+        </w:tc>
+        <w:tc>
+          <w:tcPr>
+            <w:tcW w:type="dxa" w:w="1999"/>
+          </w:tcPr>
+          <w:p>
+            <w:r>
+              <w:t>本地 40 项通过 PostgreSQL 集成与全仓 CI 待 PR 验证</w:t>
             </w:r>
           </w:p>
         </w:tc>
@@ -17759,16 +17787,8 @@
             <w:shd w:fill="EAF2F8"/>
           </w:tcPr>
           <w:p>
-            <w:pPr>
-              <w:spacing w:after="0" w:line="259" w:lineRule="auto"/>
-            </w:pPr>
-            <w:r>
-              <w:rPr>
-                <w:rFonts w:ascii="Aptos" w:hAnsi="Aptos" w:eastAsia="Microsoft YaHei"/>
-                <w:color w:val="000000"/>
-                <w:sz w:val="17"/>
-              </w:rPr>
-              <w:t>待 CI</w:t>
+            <w:r>
+              <w:t>通过</w:t>
             </w:r>
           </w:p>
         </w:tc>
@@ -17785,16 +17805,8 @@
             <w:shd w:fill="EAF2F8"/>
           </w:tcPr>
           <w:p>
-            <w:pPr>
-              <w:spacing w:after="0" w:line="259" w:lineRule="auto"/>
-            </w:pPr>
-            <w:r>
-              <w:rPr>
-                <w:rFonts w:ascii="Aptos" w:hAnsi="Aptos" w:eastAsia="Microsoft YaHei"/>
-                <w:color w:val="000000"/>
-                <w:sz w:val="17"/>
-              </w:rPr>
-              <w:t>本机未配置运行和管理员数据库 URL 3 项按条件跳过</w:t>
+            <w:r>
+              <w:t>PR 2 在 PostgreSQL 16 服务中完成 3 项集成测试</w:t>
             </w:r>
           </w:p>
         </w:tc>
@@ -17841,16 +17853,8 @@
             <w:vAlign w:val="center"/>
           </w:tcPr>
           <w:p>
-            <w:pPr>
-              <w:spacing w:after="0" w:line="259" w:lineRule="auto"/>
-            </w:pPr>
-            <w:r>
-              <w:rPr>
-                <w:rFonts w:ascii="Aptos" w:hAnsi="Aptos" w:eastAsia="Microsoft YaHei"/>
-                <w:color w:val="000000"/>
-                <w:sz w:val="17"/>
-              </w:rPr>
-              <w:t>待 CI</w:t>
+            <w:r>
+              <w:t>通过</w:t>
             </w:r>
           </w:p>
         </w:tc>
@@ -17866,16 +17870,8 @@
             <w:vAlign w:val="center"/>
           </w:tcPr>
           <w:p>
-            <w:pPr>
-              <w:spacing w:after="0" w:line="259" w:lineRule="auto"/>
-            </w:pPr>
-            <w:r>
-              <w:rPr>
-                <w:rFonts w:ascii="Aptos" w:hAnsi="Aptos" w:eastAsia="Microsoft YaHei"/>
-                <w:color w:val="000000"/>
-                <w:sz w:val="17"/>
-              </w:rPr>
-              <w:t>GitHub 空库执行升级 回滚 再升级</w:t>
+            <w:r>
+              <w:t>PR 2 完成空库升级 回滚和再升级</w:t>
             </w:r>
           </w:p>
         </w:tc>
@@ -17924,16 +17920,8 @@
             <w:shd w:fill="EAF2F8"/>
           </w:tcPr>
           <w:p>
-            <w:pPr>
-              <w:spacing w:after="0" w:line="259" w:lineRule="auto"/>
-            </w:pPr>
-            <w:r>
-              <w:rPr>
-                <w:rFonts w:ascii="Aptos" w:hAnsi="Aptos" w:eastAsia="Microsoft YaHei"/>
-                <w:color w:val="000000"/>
-                <w:sz w:val="17"/>
-              </w:rPr>
-              <w:t>待执行</w:t>
+            <w:r>
+              <w:t>通过</w:t>
             </w:r>
           </w:p>
         </w:tc>
@@ -17950,16 +17938,8 @@
             <w:shd w:fill="EAF2F8"/>
           </w:tcPr>
           <w:p>
-            <w:pPr>
-              <w:spacing w:after="0" w:line="259" w:lineRule="auto"/>
-            </w:pPr>
-            <w:r>
-              <w:rPr>
-                <w:rFonts w:ascii="Aptos" w:hAnsi="Aptos" w:eastAsia="Microsoft YaHei"/>
-                <w:color w:val="000000"/>
-                <w:sz w:val="17"/>
-              </w:rPr>
-              <w:t>远程分支和 PR 尚待创建</w:t>
+            <w:r>
+              <w:t>PR 2 的 7 项检查全部通过并合并到 main</w:t>
             </w:r>
           </w:p>
         </w:tc>
@@ -18018,11 +17998,7 @@
         <w:spacing w:after="50"/>
       </w:pPr>
       <w:r>
-        <w:rPr>
-          <w:rFonts w:ascii="Aptos" w:hAnsi="Aptos" w:eastAsia="Microsoft YaHei"/>
-          <w:color w:val="000000"/>
-        </w:rPr>
-        <w:t>数据库集成测试和迁移往返必须在 PR CI 通过后才可把 M1 标记为最终完成</w:t>
+        <w:t>后续结果：PR 2 的数据库集成测试和迁移往返均通过，M1 已完成并合并。</w:t>
       </w:r>
     </w:p>
     <w:p>
@@ -18041,17 +18017,1250 @@
     <w:p>
       <w:pPr>
         <w:pStyle w:val="Heading1"/>
+      </w:pPr>
+      <w:r>
+        <w:t>十二 更新记录 UPD 008</w:t>
+      </w:r>
+    </w:p>
+    <w:p>
+      <w:pPr>
+        <w:pStyle w:val="Heading2"/>
+      </w:pPr>
+      <w:r>
+        <w:t>十二之一 更新目标</w:t>
+      </w:r>
+    </w:p>
+    <w:p>
+      <w:r>
+        <w:t>执行实施计划 M2 审批策略和待办。建立可版本化、发布后不可原地修改的审批策略，提交合同时固化策略快照，按照金额等受控条件生成顺序审批步骤，并提供个人待办、领取、批准、驳回、退回修改和转交接口。成功标准包括高金额合同自动进入财务审批、历史实例不受新策略影响，以及并发决策只有一次能够成功。</w:t>
+      </w:r>
+    </w:p>
+    <w:p>
+      <w:pPr>
+        <w:pStyle w:val="Heading2"/>
+      </w:pPr>
+      <w:r>
+        <w:t>十二之二 候选方案和选择过程</w:t>
+      </w:r>
+    </w:p>
+    <w:tbl>
+      <w:tblPr>
+        <w:tblStyle w:val="TableGrid"/>
+        <w:tblW w:type="auto" w:w="0"/>
+        <w:tblLayout w:type="autofit"/>
+        <w:tblLook w:firstColumn="1" w:firstRow="1" w:lastColumn="0" w:lastRow="0" w:noHBand="0" w:noVBand="1" w:val="04A0"/>
+      </w:tblPr>
+      <w:tblGrid>
+        <w:gridCol w:w="2498"/>
+        <w:gridCol w:w="2498"/>
+        <w:gridCol w:w="2498"/>
+        <w:gridCol w:w="2498"/>
+      </w:tblGrid>
+      <w:tr>
+        <w:trPr>
+          <w:tblHeader w:val="true"/>
+        </w:trPr>
+        <w:tc>
+          <w:tcPr>
+            <w:tcW w:type="dxa" w:w="2498"/>
+            <w:shd w:fill="D9EAF7"/>
+            <w:vAlign w:val="center"/>
+          </w:tcPr>
+          <w:p>
+            <w:r>
+              <w:rPr>
+                <w:b/>
+              </w:rPr>
+              <w:t>决策项</w:t>
+            </w:r>
+          </w:p>
+        </w:tc>
+        <w:tc>
+          <w:tcPr>
+            <w:tcW w:type="dxa" w:w="2498"/>
+            <w:shd w:fill="D9EAF7"/>
+            <w:vAlign w:val="center"/>
+          </w:tcPr>
+          <w:p>
+            <w:r>
+              <w:rPr>
+                <w:b/>
+              </w:rPr>
+              <w:t>候选方法</w:t>
+            </w:r>
+          </w:p>
+        </w:tc>
+        <w:tc>
+          <w:tcPr>
+            <w:tcW w:type="dxa" w:w="2498"/>
+            <w:shd w:fill="D9EAF7"/>
+            <w:vAlign w:val="center"/>
+          </w:tcPr>
+          <w:p>
+            <w:r>
+              <w:rPr>
+                <w:b/>
+              </w:rPr>
+              <w:t>最终选择</w:t>
+            </w:r>
+          </w:p>
+        </w:tc>
+        <w:tc>
+          <w:tcPr>
+            <w:tcW w:type="dxa" w:w="2498"/>
+            <w:shd w:fill="D9EAF7"/>
+            <w:vAlign w:val="center"/>
+          </w:tcPr>
+          <w:p>
+            <w:r>
+              <w:rPr>
+                <w:b/>
+              </w:rPr>
+              <w:t>选择依据</w:t>
+            </w:r>
+          </w:p>
+        </w:tc>
+      </w:tr>
+      <w:tr>
+        <w:tc>
+          <w:tcPr>
+            <w:tcW w:type="dxa" w:w="2498"/>
+            <w:vAlign w:val="center"/>
+          </w:tcPr>
+          <w:p>
+            <w:r>
+              <w:t>策略版本</w:t>
+            </w:r>
+          </w:p>
+        </w:tc>
+        <w:tc>
+          <w:tcPr>
+            <w:tcW w:type="dxa" w:w="2498"/>
+            <w:vAlign w:val="center"/>
+          </w:tcPr>
+          <w:p>
+            <w:r>
+              <w:t>单行策略原地更新；不可变版本；仅在实例保存步骤</w:t>
+            </w:r>
+          </w:p>
+        </w:tc>
+        <w:tc>
+          <w:tcPr>
+            <w:tcW w:type="dxa" w:w="2498"/>
+            <w:vAlign w:val="center"/>
+          </w:tcPr>
+          <w:p>
+            <w:r>
+              <w:t>不可变发布版本加实例完整快照</w:t>
+            </w:r>
+          </w:p>
+        </w:tc>
+        <w:tc>
+          <w:tcPr>
+            <w:tcW w:type="dxa" w:w="2498"/>
+            <w:vAlign w:val="center"/>
+          </w:tcPr>
+          <w:p>
+            <w:r>
+              <w:t>发布后可审计，旧流程不依赖后来修改，也能重放当时规则</w:t>
+            </w:r>
+          </w:p>
+        </w:tc>
+      </w:tr>
+      <w:tr>
+        <w:tc>
+          <w:tcPr>
+            <w:tcW w:type="dxa" w:w="2498"/>
+            <w:vAlign w:val="center"/>
+          </w:tcPr>
+          <w:p>
+            <w:r>
+              <w:t>条件表达</w:t>
+            </w:r>
+          </w:p>
+        </w:tc>
+        <w:tc>
+          <w:tcPr>
+            <w:tcW w:type="dxa" w:w="2498"/>
+            <w:vAlign w:val="center"/>
+          </w:tcPr>
+          <w:p>
+            <w:r>
+              <w:t>任意 Python 或 SQL；通用表达式 DSL；受控字段结构</w:t>
+            </w:r>
+          </w:p>
+        </w:tc>
+        <w:tc>
+          <w:tcPr>
+            <w:tcW w:type="dxa" w:w="2498"/>
+            <w:vAlign w:val="center"/>
+          </w:tcPr>
+          <w:p>
+            <w:r>
+              <w:t>合同类型 部门 金额区间 币种的受控结构</w:t>
+            </w:r>
+          </w:p>
+        </w:tc>
+        <w:tc>
+          <w:tcPr>
+            <w:tcW w:type="dxa" w:w="2498"/>
+            <w:vAlign w:val="center"/>
+          </w:tcPr>
+          <w:p>
+            <w:r>
+              <w:t>避免执行注入和不可解释表达式，首版覆盖企业审批最常用维度</w:t>
+            </w:r>
+          </w:p>
+        </w:tc>
+      </w:tr>
+      <w:tr>
+        <w:tc>
+          <w:tcPr>
+            <w:tcW w:type="dxa" w:w="2498"/>
+            <w:vAlign w:val="center"/>
+          </w:tcPr>
+          <w:p>
+            <w:r>
+              <w:t>并发审批</w:t>
+            </w:r>
+          </w:p>
+        </w:tc>
+        <w:tc>
+          <w:tcPr>
+            <w:tcW w:type="dxa" w:w="2498"/>
+            <w:vAlign w:val="center"/>
+          </w:tcPr>
+          <w:p>
+            <w:r>
+              <w:t>长事务悲观锁；只依赖状态；状态版本号加短事务行锁</w:t>
+            </w:r>
+          </w:p>
+        </w:tc>
+        <w:tc>
+          <w:tcPr>
+            <w:tcW w:type="dxa" w:w="2498"/>
+            <w:vAlign w:val="center"/>
+          </w:tcPr>
+          <w:p>
+            <w:r>
+              <w:t>expected version 乐观锁加数据库行锁</w:t>
+            </w:r>
+          </w:p>
+        </w:tc>
+        <w:tc>
+          <w:tcPr>
+            <w:tcW w:type="dxa" w:w="2498"/>
+            <w:vAlign w:val="center"/>
+          </w:tcPr>
+          <w:p>
+            <w:r>
+              <w:t>客户端能得到稳定冲突，同一步骤不会被重复决策，同时缩短持锁时间</w:t>
+            </w:r>
+          </w:p>
+        </w:tc>
+      </w:tr>
+      <w:tr>
+        <w:tc>
+          <w:tcPr>
+            <w:tcW w:type="dxa" w:w="2498"/>
+            <w:vAlign w:val="center"/>
+          </w:tcPr>
+          <w:p>
+            <w:r>
+              <w:t>条件步骤</w:t>
+            </w:r>
+          </w:p>
+        </w:tc>
+        <w:tc>
+          <w:tcPr>
+            <w:tcW w:type="dxa" w:w="2498"/>
+            <w:vAlign w:val="center"/>
+          </w:tcPr>
+          <w:p>
+            <w:r>
+              <w:t>不生成未命中步骤；生成后标记 SKIPPED</w:t>
+            </w:r>
+          </w:p>
+        </w:tc>
+        <w:tc>
+          <w:tcPr>
+            <w:tcW w:type="dxa" w:w="2498"/>
+            <w:vAlign w:val="center"/>
+          </w:tcPr>
+          <w:p>
+            <w:r>
+              <w:t>保存全部模板步骤并显式标记 SKIPPED</w:t>
+            </w:r>
+          </w:p>
+        </w:tc>
+        <w:tc>
+          <w:tcPr>
+            <w:tcW w:type="dxa" w:w="2498"/>
+            <w:vAlign w:val="center"/>
+          </w:tcPr>
+          <w:p>
+            <w:r>
+              <w:t>审批轨迹能解释为什么财务步骤出现或被跳过，便于审计</w:t>
+            </w:r>
+          </w:p>
+        </w:tc>
+      </w:tr>
+      <w:tr>
+        <w:tc>
+          <w:tcPr>
+            <w:tcW w:type="dxa" w:w="2498"/>
+            <w:vAlign w:val="center"/>
+          </w:tcPr>
+          <w:p>
+            <w:r>
+              <w:t>审批步骤表</w:t>
+            </w:r>
+          </w:p>
+        </w:tc>
+        <w:tc>
+          <w:tcPr>
+            <w:tcW w:type="dxa" w:w="2498"/>
+            <w:vAlign w:val="center"/>
+          </w:tcPr>
+          <w:p>
+            <w:r>
+              <w:t>改造 M0 的 review case approval steps；建立工作流专用表</w:t>
+            </w:r>
+          </w:p>
+        </w:tc>
+        <w:tc>
+          <w:tcPr>
+            <w:tcW w:type="dxa" w:w="2498"/>
+            <w:vAlign w:val="center"/>
+          </w:tcPr>
+          <w:p>
+            <w:r>
+              <w:t>新增 approval workflow steps</w:t>
+            </w:r>
+          </w:p>
+        </w:tc>
+        <w:tc>
+          <w:tcPr>
+            <w:tcW w:type="dxa" w:w="2498"/>
+            <w:vAlign w:val="center"/>
+          </w:tcPr>
+          <w:p>
+            <w:r>
+              <w:t>旧表绑定审查案例且角色状态约束不同，独立表避免破坏既有边界和回滚</w:t>
+            </w:r>
+          </w:p>
+        </w:tc>
+      </w:tr>
+      <w:tr>
+        <w:tc>
+          <w:tcPr>
+            <w:tcW w:type="dxa" w:w="2498"/>
+            <w:vAlign w:val="center"/>
+          </w:tcPr>
+          <w:p>
+            <w:r>
+              <w:t>事件发布</w:t>
+            </w:r>
+          </w:p>
+        </w:tc>
+        <w:tc>
+          <w:tcPr>
+            <w:tcW w:type="dxa" w:w="2498"/>
+            <w:vAlign w:val="center"/>
+          </w:tcPr>
+          <w:p>
+            <w:r>
+              <w:t>事务提交后直接发消息；写入既有 Outbox</w:t>
+            </w:r>
+          </w:p>
+        </w:tc>
+        <w:tc>
+          <w:tcPr>
+            <w:tcW w:type="dxa" w:w="2498"/>
+            <w:vAlign w:val="center"/>
+          </w:tcPr>
+          <w:p>
+            <w:r>
+              <w:t>审批启动和决策与业务状态同事务写 Outbox</w:t>
+            </w:r>
+          </w:p>
+        </w:tc>
+        <w:tc>
+          <w:tcPr>
+            <w:tcW w:type="dxa" w:w="2498"/>
+            <w:vAlign w:val="center"/>
+          </w:tcPr>
+          <w:p>
+            <w:r>
+              <w:t>避免业务提交成功但事件发送失败，后续 Worker 可可靠消费</w:t>
+            </w:r>
+          </w:p>
+        </w:tc>
+      </w:tr>
+    </w:tbl>
+    <w:p>
+      <w:pPr>
+        <w:pStyle w:val="Heading2"/>
+      </w:pPr>
+      <w:r>
+        <w:t>十二之三 实现内容</w:t>
+      </w:r>
+    </w:p>
+    <w:tbl>
+      <w:tblPr>
+        <w:tblStyle w:val="TableGrid"/>
+        <w:tblW w:type="auto" w:w="0"/>
+        <w:tblLayout w:type="autofit"/>
+        <w:tblLook w:firstColumn="1" w:firstRow="1" w:lastColumn="0" w:lastRow="0" w:noHBand="0" w:noVBand="1" w:val="04A0"/>
+      </w:tblPr>
+      <w:tblGrid>
+        <w:gridCol w:w="3331"/>
+        <w:gridCol w:w="3331"/>
+        <w:gridCol w:w="3331"/>
+      </w:tblGrid>
+      <w:tr>
+        <w:trPr>
+          <w:tblHeader w:val="true"/>
+        </w:trPr>
+        <w:tc>
+          <w:tcPr>
+            <w:tcW w:type="dxa" w:w="3331"/>
+            <w:shd w:fill="D9EAF7"/>
+            <w:vAlign w:val="center"/>
+          </w:tcPr>
+          <w:p>
+            <w:r>
+              <w:rPr>
+                <w:b/>
+              </w:rPr>
+              <w:t>区域</w:t>
+            </w:r>
+          </w:p>
+        </w:tc>
+        <w:tc>
+          <w:tcPr>
+            <w:tcW w:type="dxa" w:w="3331"/>
+            <w:shd w:fill="D9EAF7"/>
+            <w:vAlign w:val="center"/>
+          </w:tcPr>
+          <w:p>
+            <w:r>
+              <w:rPr>
+                <w:b/>
+              </w:rPr>
+              <w:t>实现内容</w:t>
+            </w:r>
+          </w:p>
+        </w:tc>
+        <w:tc>
+          <w:tcPr>
+            <w:tcW w:type="dxa" w:w="3331"/>
+            <w:shd w:fill="D9EAF7"/>
+            <w:vAlign w:val="center"/>
+          </w:tcPr>
+          <w:p>
+            <w:r>
+              <w:rPr>
+                <w:b/>
+              </w:rPr>
+              <w:t>关键边界</w:t>
+            </w:r>
+          </w:p>
+        </w:tc>
+      </w:tr>
+      <w:tr>
+        <w:tc>
+          <w:tcPr>
+            <w:tcW w:type="dxa" w:w="3331"/>
+            <w:vAlign w:val="center"/>
+          </w:tcPr>
+          <w:p>
+            <w:r>
+              <w:t>领域模型</w:t>
+            </w:r>
+          </w:p>
+        </w:tc>
+        <w:tc>
+          <w:tcPr>
+            <w:tcW w:type="dxa" w:w="3331"/>
+            <w:vAlign w:val="center"/>
+          </w:tcPr>
+          <w:p>
+            <w:r>
+              <w:t>ApprovalPolicy ApprovalInstance ApprovalStep 及策略条件 步骤模板和决策枚举</w:t>
+            </w:r>
+          </w:p>
+        </w:tc>
+        <w:tc>
+          <w:tcPr>
+            <w:tcW w:type="dxa" w:w="3331"/>
+            <w:vAlign w:val="center"/>
+          </w:tcPr>
+          <w:p>
+            <w:r>
+              <w:t>条件只读取合同受控字段，步骤仅按顺序激活</w:t>
+            </w:r>
+          </w:p>
+        </w:tc>
+      </w:tr>
+      <w:tr>
+        <w:tc>
+          <w:tcPr>
+            <w:tcW w:type="dxa" w:w="3331"/>
+            <w:vAlign w:val="center"/>
+          </w:tcPr>
+          <w:p>
+            <w:r>
+              <w:t>策略版本</w:t>
+            </w:r>
+          </w:p>
+        </w:tc>
+        <w:tc>
+          <w:tcPr>
+            <w:tcW w:type="dxa" w:w="3331"/>
+            <w:vAlign w:val="center"/>
+          </w:tcPr>
+          <w:p>
+            <w:r>
+              <w:t>同一 policy key 使用事务级锁串行创建并自动递增版本，草稿发布后由数据库触发器禁止更新或删除</w:t>
+            </w:r>
+          </w:p>
+        </w:tc>
+        <w:tc>
+          <w:tcPr>
+            <w:tcW w:type="dxa" w:w="3331"/>
+            <w:vAlign w:val="center"/>
+          </w:tcPr>
+          <w:p>
+            <w:r>
+              <w:t>发布时不允许夹带修改策略正文</w:t>
+            </w:r>
+          </w:p>
+        </w:tc>
+      </w:tr>
+      <w:tr>
+        <w:tc>
+          <w:tcPr>
+            <w:tcW w:type="dxa" w:w="3331"/>
+            <w:vAlign w:val="center"/>
+          </w:tcPr>
+          <w:p>
+            <w:r>
+              <w:t>策略快照</w:t>
+            </w:r>
+          </w:p>
+        </w:tc>
+        <w:tc>
+          <w:tcPr>
+            <w:tcW w:type="dxa" w:w="3331"/>
+            <w:vAlign w:val="center"/>
+          </w:tcPr>
+          <w:p>
+            <w:r>
+              <w:t>审批实例保存策略编号 版本 条件和步骤的 JSON 快照</w:t>
+            </w:r>
+          </w:p>
+        </w:tc>
+        <w:tc>
+          <w:tcPr>
+            <w:tcW w:type="dxa" w:w="3331"/>
+            <w:vAlign w:val="center"/>
+          </w:tcPr>
+          <w:p>
+            <w:r>
+              <w:t>后来发布新版本时历史实例继续使用原快照</w:t>
+            </w:r>
+          </w:p>
+        </w:tc>
+      </w:tr>
+      <w:tr>
+        <w:tc>
+          <w:tcPr>
+            <w:tcW w:type="dxa" w:w="3331"/>
+            <w:vAlign w:val="center"/>
+          </w:tcPr>
+          <w:p>
+            <w:r>
+              <w:t>工作流</w:t>
+            </w:r>
+          </w:p>
+        </w:tc>
+        <w:tc>
+          <w:tcPr>
+            <w:tcW w:type="dxa" w:w="3331"/>
+            <w:vAlign w:val="center"/>
+          </w:tcPr>
+          <w:p>
+            <w:r>
+              <w:t>合同提交 策略匹配 条件跳过 顺序激活 领取 决策 退回和转交</w:t>
+            </w:r>
+          </w:p>
+        </w:tc>
+        <w:tc>
+          <w:tcPr>
+            <w:tcW w:type="dxa" w:w="3331"/>
+            <w:vAlign w:val="center"/>
+          </w:tcPr>
+          <w:p>
+            <w:r>
+              <w:t>合同状态和审批实例状态在同一事务内推进</w:t>
+            </w:r>
+          </w:p>
+        </w:tc>
+      </w:tr>
+      <w:tr>
+        <w:tc>
+          <w:tcPr>
+            <w:tcW w:type="dxa" w:w="3331"/>
+            <w:vAlign w:val="center"/>
+          </w:tcPr>
+          <w:p>
+            <w:r>
+              <w:t>任务与权限</w:t>
+            </w:r>
+          </w:p>
+        </w:tc>
+        <w:tc>
+          <w:tcPr>
+            <w:tcW w:type="dxa" w:w="3331"/>
+            <w:vAlign w:val="center"/>
+          </w:tcPr>
+          <w:p>
+            <w:r>
+              <w:t>新增法务 财务 业务审批角色，个人待办按角色 指派人和数据范围筛选</w:t>
+            </w:r>
+          </w:p>
+        </w:tc>
+        <w:tc>
+          <w:tcPr>
+            <w:tcW w:type="dxa" w:w="3331"/>
+            <w:vAlign w:val="center"/>
+          </w:tcPr>
+          <w:p>
+            <w:r>
+              <w:t>领取和决策再次校验任务角色 指派关系和租户范围</w:t>
+            </w:r>
+          </w:p>
+        </w:tc>
+      </w:tr>
+      <w:tr>
+        <w:tc>
+          <w:tcPr>
+            <w:tcW w:type="dxa" w:w="3331"/>
+            <w:vAlign w:val="center"/>
+          </w:tcPr>
+          <w:p>
+            <w:r>
+              <w:t>并发与幂等</w:t>
+            </w:r>
+          </w:p>
+        </w:tc>
+        <w:tc>
+          <w:tcPr>
+            <w:tcW w:type="dxa" w:w="3331"/>
+            <w:vAlign w:val="center"/>
+          </w:tcPr>
+          <w:p>
+            <w:r>
+              <w:t>写操作使用 Idempotency Key，步骤动作使用 expected version</w:t>
+            </w:r>
+          </w:p>
+        </w:tc>
+        <w:tc>
+          <w:tcPr>
+            <w:tcW w:type="dxa" w:w="3331"/>
+            <w:vAlign w:val="center"/>
+          </w:tcPr>
+          <w:p>
+            <w:r>
+              <w:t>相同请求安全重放，过期版本返回稳定的 approval step conflict</w:t>
+            </w:r>
+          </w:p>
+        </w:tc>
+      </w:tr>
+      <w:tr>
+        <w:tc>
+          <w:tcPr>
+            <w:tcW w:type="dxa" w:w="3331"/>
+            <w:vAlign w:val="center"/>
+          </w:tcPr>
+          <w:p>
+            <w:r>
+              <w:t>接口</w:t>
+            </w:r>
+          </w:p>
+        </w:tc>
+        <w:tc>
+          <w:tcPr>
+            <w:tcW w:type="dxa" w:w="3331"/>
+            <w:vAlign w:val="center"/>
+          </w:tcPr>
+          <w:p>
+            <w:r>
+              <w:t>策略创建发布 合同提交 实例查询 待办查询 步骤领取 决策和转交共八个接口</w:t>
+            </w:r>
+          </w:p>
+        </w:tc>
+        <w:tc>
+          <w:tcPr>
+            <w:tcW w:type="dxa" w:w="3331"/>
+            <w:vAlign w:val="center"/>
+          </w:tcPr>
+          <w:p>
+            <w:r>
+              <w:t>返回稳定错误码和 X Idempotent Replay 标记</w:t>
+            </w:r>
+          </w:p>
+        </w:tc>
+      </w:tr>
+      <w:tr>
+        <w:tc>
+          <w:tcPr>
+            <w:tcW w:type="dxa" w:w="3331"/>
+            <w:vAlign w:val="center"/>
+          </w:tcPr>
+          <w:p>
+            <w:r>
+              <w:t>数据库</w:t>
+            </w:r>
+          </w:p>
+        </w:tc>
+        <w:tc>
+          <w:tcPr>
+            <w:tcW w:type="dxa" w:w="3331"/>
+            <w:vAlign w:val="center"/>
+          </w:tcPr>
+          <w:p>
+            <w:r>
+              <w:t>新增三张审批工作流表 索引 外键 RLS 不可变触发器和可回滚迁移</w:t>
+            </w:r>
+          </w:p>
+        </w:tc>
+        <w:tc>
+          <w:tcPr>
+            <w:tcW w:type="dxa" w:w="3331"/>
+            <w:vAlign w:val="center"/>
+          </w:tcPr>
+          <w:p>
+            <w:r>
+              <w:t>运行角色继续使用 FORCE RLS，迁移角色与运行角色分离</w:t>
+            </w:r>
+          </w:p>
+        </w:tc>
+      </w:tr>
+      <w:tr>
+        <w:tc>
+          <w:tcPr>
+            <w:tcW w:type="dxa" w:w="3331"/>
+          </w:tcPr>
+          <w:p>
+            <w:r>
+              <w:t>退回重提</w:t>
+            </w:r>
+          </w:p>
+        </w:tc>
+        <w:tc>
+          <w:tcPr>
+            <w:tcW w:type="dxa" w:w="3331"/>
+          </w:tcPr>
+          <w:p>
+            <w:r>
+              <w:t>退回修改或驳回后必须新增不可变合同版本 新版本自动成为当前版本并恢复草稿</w:t>
+            </w:r>
+          </w:p>
+        </w:tc>
+        <w:tc>
+          <w:tcPr>
+            <w:tcW w:type="dxa" w:w="3331"/>
+          </w:tcPr>
+          <w:p>
+            <w:r>
+              <w:t>旧审批文件不能被直接再次提交，审批实例始终绑定明确版本</w:t>
+            </w:r>
+          </w:p>
+        </w:tc>
+      </w:tr>
+    </w:tbl>
+    <w:p>
+      <w:pPr>
+        <w:pStyle w:val="Heading2"/>
+      </w:pPr>
+      <w:r>
+        <w:t>十二之四 问题难点和处理</w:t>
+      </w:r>
+    </w:p>
+    <w:p>
+      <w:pPr>
+        <w:pStyle w:val="Heading3"/>
+      </w:pPr>
+      <w:r>
+        <w:t>策略更新不能改变运行中的审批</w:t>
+      </w:r>
+    </w:p>
+    <w:p>
+      <w:r>
+        <w:t>如果审批实例每一步都查询当前策略，管理员发布新规则后，已经完成一半的流程可能突然增加、删除或改变审批人。实现中在提交事务内选择当时最新发布版本并保存完整快照；实例和策略版本都保留外键，执行轨迹以快照为事实来源。</w:t>
+      </w:r>
+    </w:p>
+    <w:p>
+      <w:pPr>
+        <w:pStyle w:val="Heading3"/>
+      </w:pPr>
+      <w:r>
+        <w:t>条件跳过与顺序激活必须同时可解释</w:t>
+      </w:r>
+    </w:p>
+    <w:p>
+      <w:r>
+        <w:t>直接不生成未命中步骤虽然简单，却无法证明财务步骤为何没有执行。当前实现按模板生成全部步骤，未命中条件标记 SKIPPED，只把第一个适用步骤设为 READY，其余适用步骤保持 PENDING；批准后只激活下一条 PENDING，最终没有待处理步骤时才批准合同。</w:t>
+      </w:r>
+    </w:p>
+    <w:p>
+      <w:pPr>
+        <w:pStyle w:val="Heading3"/>
+      </w:pPr>
+      <w:r>
+        <w:t>幂等不能替代并发状态控制</w:t>
+      </w:r>
+    </w:p>
+    <w:p>
+      <w:r>
+        <w:t>不同客户端可以使用不同幂等键同时审批同一步骤，仅靠幂等记录仍可能产生双决策。因此步骤表增加state version，动作提交客户端看到的版本，并在短事务行锁内用状态、指派人和版本共同作为更新条件；先成功者推进版本，后来者得到 409 冲突。</w:t>
+      </w:r>
+    </w:p>
+    <w:p>
+      <w:pPr>
+        <w:pStyle w:val="Heading3"/>
+      </w:pPr>
+      <w:r>
+        <w:t>旧审查步骤表与业务审批职责冲突</w:t>
+      </w:r>
+    </w:p>
+    <w:p>
+      <w:r>
+        <w:t>M0 已有 approval steps 绑定 review case，并使用 LEGAL FINANCE BUSINESS 角色标签；M2 的合同审批实例有不同外键、状态和并发语义。强行复用会引入大量可空字段和互斥约束，因此新增工作流专用步骤表，保留旧表给后续 AI 审查案例使用。</w:t>
+      </w:r>
+    </w:p>
+    <w:p>
+      <w:pPr>
+        <w:pStyle w:val="Heading3"/>
+      </w:pPr>
+      <w:r>
+        <w:t>转交目标缺少企业目录校验</w:t>
+      </w:r>
+    </w:p>
+    <w:p>
+      <w:r>
+        <w:t>当前仓库没有用户目录服务，因而只校验目标不是当前审批人并保留 transferred by 与转交说明。目标人员是否在租户内、是否具备岗位角色，需要接入企业身份目录后补齐，不能在本阶段伪造成功校验。</w:t>
+      </w:r>
+    </w:p>
+    <w:p>
+      <w:pPr>
+        <w:pStyle w:val="Heading2"/>
+      </w:pPr>
+      <w:r>
+        <w:t>十二之五 验证结果</w:t>
+      </w:r>
+    </w:p>
+    <w:tbl>
+      <w:tblPr>
+        <w:tblStyle w:val="TableGrid"/>
+        <w:tblW w:type="auto" w:w="0"/>
+        <w:tblLayout w:type="autofit"/>
+        <w:tblLook w:firstColumn="1" w:firstRow="1" w:lastColumn="0" w:lastRow="0" w:noHBand="0" w:noVBand="1" w:val="04A0"/>
+      </w:tblPr>
+      <w:tblGrid>
+        <w:gridCol w:w="3331"/>
+        <w:gridCol w:w="3331"/>
+        <w:gridCol w:w="3331"/>
+      </w:tblGrid>
+      <w:tr>
+        <w:trPr>
+          <w:tblHeader w:val="true"/>
+        </w:trPr>
+        <w:tc>
+          <w:tcPr>
+            <w:tcW w:type="dxa" w:w="3331"/>
+            <w:shd w:fill="D9EAF7"/>
+            <w:vAlign w:val="center"/>
+          </w:tcPr>
+          <w:p>
+            <w:r>
+              <w:rPr>
+                <w:b/>
+              </w:rPr>
+              <w:t>验证项</w:t>
+            </w:r>
+          </w:p>
+        </w:tc>
+        <w:tc>
+          <w:tcPr>
+            <w:tcW w:type="dxa" w:w="3331"/>
+            <w:shd w:fill="D9EAF7"/>
+            <w:vAlign w:val="center"/>
+          </w:tcPr>
+          <w:p>
+            <w:r>
+              <w:rPr>
+                <w:b/>
+              </w:rPr>
+              <w:t>结果</w:t>
+            </w:r>
+          </w:p>
+        </w:tc>
+        <w:tc>
+          <w:tcPr>
+            <w:tcW w:type="dxa" w:w="3331"/>
+            <w:shd w:fill="D9EAF7"/>
+            <w:vAlign w:val="center"/>
+          </w:tcPr>
+          <w:p>
+            <w:r>
+              <w:rPr>
+                <w:b/>
+              </w:rPr>
+              <w:t>证据或限制</w:t>
+            </w:r>
+          </w:p>
+        </w:tc>
+      </w:tr>
+      <w:tr>
+        <w:tc>
+          <w:tcPr>
+            <w:tcW w:type="dxa" w:w="3331"/>
+            <w:vAlign w:val="center"/>
+          </w:tcPr>
+          <w:p>
+            <w:r>
+              <w:t>Ruff</w:t>
+            </w:r>
+          </w:p>
+        </w:tc>
+        <w:tc>
+          <w:tcPr>
+            <w:tcW w:type="dxa" w:w="3331"/>
+            <w:vAlign w:val="center"/>
+          </w:tcPr>
+          <w:p>
+            <w:r>
+              <w:t>通过</w:t>
+            </w:r>
+          </w:p>
+        </w:tc>
+        <w:tc>
+          <w:tcPr>
+            <w:tcW w:type="dxa" w:w="3331"/>
+            <w:vAlign w:val="center"/>
+          </w:tcPr>
+          <w:p>
+            <w:r>
+              <w:t>审批源代码 测试 迁移和脚本无规则错误</w:t>
+            </w:r>
+          </w:p>
+        </w:tc>
+      </w:tr>
+      <w:tr>
+        <w:tc>
+          <w:tcPr>
+            <w:tcW w:type="dxa" w:w="3331"/>
+            <w:vAlign w:val="center"/>
+          </w:tcPr>
+          <w:p>
+            <w:r>
+              <w:t>mypy strict</w:t>
+            </w:r>
+          </w:p>
+        </w:tc>
+        <w:tc>
+          <w:tcPr>
+            <w:tcW w:type="dxa" w:w="3331"/>
+            <w:vAlign w:val="center"/>
+          </w:tcPr>
+          <w:p>
+            <w:r>
+              <w:t>通过</w:t>
+            </w:r>
+          </w:p>
+        </w:tc>
+        <w:tc>
+          <w:tcPr>
+            <w:tcW w:type="dxa" w:w="3331"/>
+            <w:vAlign w:val="center"/>
+          </w:tcPr>
+          <w:p>
+            <w:r>
+              <w:t>26 个源代码文件无类型错误</w:t>
+            </w:r>
+          </w:p>
+        </w:tc>
+      </w:tr>
+      <w:tr>
+        <w:tc>
+          <w:tcPr>
+            <w:tcW w:type="dxa" w:w="3331"/>
+            <w:vAlign w:val="center"/>
+          </w:tcPr>
+          <w:p>
+            <w:r>
+              <w:t>本地 pytest</w:t>
+            </w:r>
+          </w:p>
+        </w:tc>
+        <w:tc>
+          <w:tcPr>
+            <w:tcW w:type="dxa" w:w="3331"/>
+            <w:vAlign w:val="center"/>
+          </w:tcPr>
+          <w:p>
+            <w:r>
+              <w:t>通过</w:t>
+            </w:r>
+          </w:p>
+        </w:tc>
+        <w:tc>
+          <w:tcPr>
+            <w:tcW w:type="dxa" w:w="3331"/>
+            <w:vAlign w:val="center"/>
+          </w:tcPr>
+          <w:p>
+            <w:r>
+              <w:t>40 项通过，包括金额条件匹配和条件跳过领域测试</w:t>
+            </w:r>
+          </w:p>
+        </w:tc>
+      </w:tr>
+      <w:tr>
+        <w:tc>
+          <w:tcPr>
+            <w:tcW w:type="dxa" w:w="3331"/>
+            <w:vAlign w:val="center"/>
+          </w:tcPr>
+          <w:p>
+            <w:r>
+              <w:t>PostgreSQL 集成测试</w:t>
+            </w:r>
+          </w:p>
+        </w:tc>
+        <w:tc>
+          <w:tcPr>
+            <w:tcW w:type="dxa" w:w="3331"/>
+            <w:vAlign w:val="center"/>
+          </w:tcPr>
+          <w:p>
+            <w:r>
+              <w:t>待 PR CI</w:t>
+            </w:r>
+          </w:p>
+        </w:tc>
+        <w:tc>
+          <w:tcPr>
+            <w:tcW w:type="dxa" w:w="3331"/>
+            <w:vAlign w:val="center"/>
+          </w:tcPr>
+          <w:p>
+            <w:r>
+              <w:t>本机没有 PostgreSQL 或 Docker，6 项数据库测试按环境条件跳过</w:t>
+            </w:r>
+          </w:p>
+        </w:tc>
+      </w:tr>
+      <w:tr>
+        <w:tc>
+          <w:tcPr>
+            <w:tcW w:type="dxa" w:w="3331"/>
+            <w:vAlign w:val="center"/>
+          </w:tcPr>
+          <w:p>
+            <w:r>
+              <w:t>M2 数据库验收</w:t>
+            </w:r>
+          </w:p>
+        </w:tc>
+        <w:tc>
+          <w:tcPr>
+            <w:tcW w:type="dxa" w:w="3331"/>
+            <w:vAlign w:val="center"/>
+          </w:tcPr>
+          <w:p>
+            <w:r>
+              <w:t>待 PR CI</w:t>
+            </w:r>
+          </w:p>
+        </w:tc>
+        <w:tc>
+          <w:tcPr>
+            <w:tcW w:type="dxa" w:w="3331"/>
+            <w:vAlign w:val="center"/>
+          </w:tcPr>
+          <w:p>
+            <w:r>
+              <w:t>将验证高金额财务步骤 发布策略不可变 旧实例快照和过期并发决策冲突</w:t>
+            </w:r>
+          </w:p>
+        </w:tc>
+      </w:tr>
+      <w:tr>
+        <w:tc>
+          <w:tcPr>
+            <w:tcW w:type="dxa" w:w="3331"/>
+            <w:vAlign w:val="center"/>
+          </w:tcPr>
+          <w:p>
+            <w:r>
+              <w:t>数据库迁移往返</w:t>
+            </w:r>
+          </w:p>
+        </w:tc>
+        <w:tc>
+          <w:tcPr>
+            <w:tcW w:type="dxa" w:w="3331"/>
+            <w:vAlign w:val="center"/>
+          </w:tcPr>
+          <w:p>
+            <w:r>
+              <w:t>待 PR CI</w:t>
+            </w:r>
+          </w:p>
+        </w:tc>
+        <w:tc>
+          <w:tcPr>
+            <w:tcW w:type="dxa" w:w="3331"/>
+            <w:vAlign w:val="center"/>
+          </w:tcPr>
+          <w:p>
+            <w:r>
+              <w:t>空库升级 回滚 再升级由专用工作流执行</w:t>
+            </w:r>
+          </w:p>
+        </w:tc>
+      </w:tr>
+      <w:tr>
+        <w:tc>
+          <w:tcPr>
+            <w:tcW w:type="dxa" w:w="3331"/>
+            <w:vAlign w:val="center"/>
+          </w:tcPr>
+          <w:p>
+            <w:r>
+              <w:t>全仓质量门禁</w:t>
+            </w:r>
+          </w:p>
+        </w:tc>
+        <w:tc>
+          <w:tcPr>
+            <w:tcW w:type="dxa" w:w="3331"/>
+            <w:vAlign w:val="center"/>
+          </w:tcPr>
+          <w:p>
+            <w:r>
+              <w:t>待 PR CI</w:t>
+            </w:r>
+          </w:p>
+        </w:tc>
+        <w:tc>
+          <w:tcPr>
+            <w:tcW w:type="dxa" w:w="3331"/>
+            <w:vAlign w:val="center"/>
+          </w:tcPr>
+          <w:p>
+            <w:r>
+              <w:t>创建阶段 PR 后执行全部 GitHub Actions</w:t>
+            </w:r>
+          </w:p>
+        </w:tc>
+      </w:tr>
+      <w:tr>
+        <w:tc>
+          <w:tcPr>
+            <w:tcW w:type="dxa" w:w="3331"/>
+            <w:vAlign w:val="center"/>
+          </w:tcPr>
+          <w:p>
+            <w:r>
+              <w:t>Word 视觉检查</w:t>
+            </w:r>
+          </w:p>
+        </w:tc>
+        <w:tc>
+          <w:tcPr>
+            <w:tcW w:type="dxa" w:w="3331"/>
+            <w:vAlign w:val="center"/>
+          </w:tcPr>
+          <w:p>
+            <w:r>
+              <w:t>通过</w:t>
+            </w:r>
+          </w:p>
+        </w:tc>
+        <w:tc>
+          <w:tcPr>
+            <w:tcW w:type="dxa" w:w="3331"/>
+            <w:vAlign w:val="center"/>
+          </w:tcPr>
+          <w:p>
+            <w:r>
+              <w:t>官方 LibreOffice 临时运行时渲染 28 页并逐页检查 无溢出或遮挡</w:t>
+            </w:r>
+          </w:p>
+        </w:tc>
+      </w:tr>
+    </w:tbl>
+    <w:p>
+      <w:pPr>
+        <w:pStyle w:val="Heading2"/>
+      </w:pPr>
+      <w:r>
+        <w:t>十二之六 遗留风险和下一步</w:t>
+      </w:r>
+    </w:p>
+    <w:p>
+      <w:pPr>
+        <w:pStyle w:val="ListBullet"/>
+      </w:pPr>
+      <w:r>
+        <w:t>转交目标尚未接入企业用户目录，无法验证目标人员所属租户和岗位角色。</w:t>
+      </w:r>
+    </w:p>
+    <w:p>
+      <w:pPr>
+        <w:pStyle w:val="ListBullet"/>
+      </w:pPr>
+      <w:r>
+        <w:t>条件模型暂不包含风险标签；风险标签将在 M4 规则与模型审查产出稳定后纳入策略匹配。</w:t>
+      </w:r>
+    </w:p>
+    <w:p>
+      <w:pPr>
+        <w:pStyle w:val="ListBullet"/>
+      </w:pPr>
+      <w:r>
+        <w:t>当前通过创建同一 policy key 的新草稿形成下一版本，尚未提供草稿编辑接口。</w:t>
+      </w:r>
+    </w:p>
+    <w:p>
+      <w:pPr>
+        <w:pStyle w:val="ListBullet"/>
+      </w:pPr>
+      <w:r>
+        <w:t>后续结果：PR 2 的数据库集成测试和迁移往返均通过，M1 已完成并合并。</w:t>
+      </w:r>
+    </w:p>
+    <w:p>
+      <w:pPr>
+        <w:pStyle w:val="ListBullet"/>
+      </w:pPr>
+      <w:r>
+        <w:t>下一阶段 M3 将实现可靠事件与通知链路，包括 Outbox 发布器、Redis Streams、消费者幂等、重试退避、死信队列和可观测指标。</w:t>
+      </w:r>
+    </w:p>
+    <w:p>
+      <w:pPr>
+        <w:pStyle w:val="Heading1"/>
         <w:keepNext/>
         <w:keepLines/>
       </w:pPr>
       <w:r>
-        <w:rPr>
-          <w:rFonts w:ascii="Aptos" w:hAnsi="Aptos" w:eastAsia="Microsoft YaHei"/>
-          <w:b/>
-          <w:color w:val="000000"/>
-          <w:sz w:val="32"/>
-        </w:rPr>
-        <w:t>十二 当前决策记录</w:t>
+        <w:t>十三 当前决策记录</w:t>
       </w:r>
     </w:p>
     <w:tbl>
@@ -19921,6 +21130,174 @@
           </w:p>
         </w:tc>
       </w:tr>
+      <w:tr>
+        <w:tc>
+          <w:tcPr>
+            <w:tcW w:type="dxa" w:w="2498"/>
+          </w:tcPr>
+          <w:p>
+            <w:r>
+              <w:t>ADR 017</w:t>
+            </w:r>
+          </w:p>
+        </w:tc>
+        <w:tc>
+          <w:tcPr>
+            <w:tcW w:type="dxa" w:w="2498"/>
+          </w:tcPr>
+          <w:p>
+            <w:r>
+              <w:t>发布策略不可变且审批实例保存完整快照</w:t>
+            </w:r>
+          </w:p>
+        </w:tc>
+        <w:tc>
+          <w:tcPr>
+            <w:tcW w:type="dxa" w:w="2498"/>
+          </w:tcPr>
+          <w:p>
+            <w:r>
+              <w:t>防止规则更新改变运行中流程并保留可审计证据</w:t>
+            </w:r>
+          </w:p>
+        </w:tc>
+        <w:tc>
+          <w:tcPr>
+            <w:tcW w:type="dxa" w:w="2498"/>
+          </w:tcPr>
+          <w:p>
+            <w:r>
+              <w:t>只允许优化快照格式 不允许改为运行时读取当前策略</w:t>
+            </w:r>
+          </w:p>
+        </w:tc>
+      </w:tr>
+      <w:tr>
+        <w:tc>
+          <w:tcPr>
+            <w:tcW w:type="dxa" w:w="2498"/>
+          </w:tcPr>
+          <w:p>
+            <w:r>
+              <w:t>ADR 018</w:t>
+            </w:r>
+          </w:p>
+        </w:tc>
+        <w:tc>
+          <w:tcPr>
+            <w:tcW w:type="dxa" w:w="2498"/>
+          </w:tcPr>
+          <w:p>
+            <w:r>
+              <w:t>审批条件使用受控字段结构</w:t>
+            </w:r>
+          </w:p>
+        </w:tc>
+        <w:tc>
+          <w:tcPr>
+            <w:tcW w:type="dxa" w:w="2498"/>
+          </w:tcPr>
+          <w:p>
+            <w:r>
+              <w:t>降低表达式注入和不可解释规则风险并覆盖首版核心场景</w:t>
+            </w:r>
+          </w:p>
+        </w:tc>
+        <w:tc>
+          <w:tcPr>
+            <w:tcW w:type="dxa" w:w="2498"/>
+          </w:tcPr>
+          <w:p>
+            <w:r>
+              <w:t>受控字段不足且有安全沙箱与版本治理方案时再引入 DSL</w:t>
+            </w:r>
+          </w:p>
+        </w:tc>
+      </w:tr>
+      <w:tr>
+        <w:tc>
+          <w:tcPr>
+            <w:tcW w:type="dxa" w:w="2498"/>
+          </w:tcPr>
+          <w:p>
+            <w:r>
+              <w:t>ADR 019</w:t>
+            </w:r>
+          </w:p>
+        </w:tc>
+        <w:tc>
+          <w:tcPr>
+            <w:tcW w:type="dxa" w:w="2498"/>
+          </w:tcPr>
+          <w:p>
+            <w:r>
+              <w:t>步骤状态版本号加短事务行锁</w:t>
+            </w:r>
+          </w:p>
+        </w:tc>
+        <w:tc>
+          <w:tcPr>
+            <w:tcW w:type="dxa" w:w="2498"/>
+          </w:tcPr>
+          <w:p>
+            <w:r>
+              <w:t>确保并发领取和决策只有一次成功并返回稳定冲突</w:t>
+            </w:r>
+          </w:p>
+        </w:tc>
+        <w:tc>
+          <w:tcPr>
+            <w:tcW w:type="dxa" w:w="2498"/>
+          </w:tcPr>
+          <w:p>
+            <w:r>
+              <w:t>性能测试证明单行争用成为瓶颈时评估任务分片</w:t>
+            </w:r>
+          </w:p>
+        </w:tc>
+      </w:tr>
+      <w:tr>
+        <w:tc>
+          <w:tcPr>
+            <w:tcW w:type="dxa" w:w="2498"/>
+          </w:tcPr>
+          <w:p>
+            <w:r>
+              <w:t>ADR 020</w:t>
+            </w:r>
+          </w:p>
+        </w:tc>
+        <w:tc>
+          <w:tcPr>
+            <w:tcW w:type="dxa" w:w="2498"/>
+          </w:tcPr>
+          <w:p>
+            <w:r>
+              <w:t>业务审批使用独立工作流步骤表</w:t>
+            </w:r>
+          </w:p>
+        </w:tc>
+        <w:tc>
+          <w:tcPr>
+            <w:tcW w:type="dxa" w:w="2498"/>
+          </w:tcPr>
+          <w:p>
+            <w:r>
+              <w:t>避免与绑定 review case 的旧审批步骤混合不同状态和外键语义</w:t>
+            </w:r>
+          </w:p>
+        </w:tc>
+        <w:tc>
+          <w:tcPr>
+            <w:tcW w:type="dxa" w:w="2498"/>
+          </w:tcPr>
+          <w:p>
+            <w:r>
+              <w:t>后续统一领域模型时必须先给出兼容迁移和审计保留方案</w:t>
+            </w:r>
+          </w:p>
+        </w:tc>
+      </w:tr>
     </w:tbl>
     <w:p>
       <w:pPr>
@@ -19934,13 +21311,7 @@
         <w:keepLines/>
       </w:pPr>
       <w:r>
-        <w:rPr>
-          <w:rFonts w:ascii="Aptos" w:hAnsi="Aptos" w:eastAsia="Microsoft YaHei"/>
-          <w:b/>
-          <w:color w:val="000000"/>
-          <w:sz w:val="32"/>
-        </w:rPr>
-        <w:t>十三 风险登记</w:t>
+        <w:t>十四 风险登记</w:t>
       </w:r>
     </w:p>
     <w:tbl>
@@ -21594,6 +22965,132 @@
           </w:p>
         </w:tc>
       </w:tr>
+      <w:tr>
+        <w:tc>
+          <w:tcPr>
+            <w:tcW w:type="dxa" w:w="2498"/>
+          </w:tcPr>
+          <w:p>
+            <w:r>
+              <w:t>转交到错误人员</w:t>
+            </w:r>
+          </w:p>
+        </w:tc>
+        <w:tc>
+          <w:tcPr>
+            <w:tcW w:type="dxa" w:w="2498"/>
+          </w:tcPr>
+          <w:p>
+            <w:r>
+              <w:t>合同审批停滞或越权人员看到待办</w:t>
+            </w:r>
+          </w:p>
+        </w:tc>
+        <w:tc>
+          <w:tcPr>
+            <w:tcW w:type="dxa" w:w="2498"/>
+          </w:tcPr>
+          <w:p>
+            <w:r>
+              <w:t>只有当前领取人可转交并记录转交人 目标和说明</w:t>
+            </w:r>
+          </w:p>
+        </w:tc>
+        <w:tc>
+          <w:tcPr>
+            <w:tcW w:type="dxa" w:w="2498"/>
+          </w:tcPr>
+          <w:p>
+            <w:r>
+              <w:t>接入企业目录后校验租户成员 岗位角色和在职状态</w:t>
+            </w:r>
+          </w:p>
+        </w:tc>
+      </w:tr>
+      <w:tr>
+        <w:tc>
+          <w:tcPr>
+            <w:tcW w:type="dxa" w:w="2498"/>
+          </w:tcPr>
+          <w:p>
+            <w:r>
+              <w:t>策略条件遗漏业务维度</w:t>
+            </w:r>
+          </w:p>
+        </w:tc>
+        <w:tc>
+          <w:tcPr>
+            <w:tcW w:type="dxa" w:w="2498"/>
+          </w:tcPr>
+          <w:p>
+            <w:r>
+              <w:t>合同选择到过宽或过窄的审批链</w:t>
+            </w:r>
+          </w:p>
+        </w:tc>
+        <w:tc>
+          <w:tcPr>
+            <w:tcW w:type="dxa" w:w="2498"/>
+          </w:tcPr>
+          <w:p>
+            <w:r>
+              <w:t>受控字段 优先级 不可变发布和策略快照</w:t>
+            </w:r>
+          </w:p>
+        </w:tc>
+        <w:tc>
+          <w:tcPr>
+            <w:tcW w:type="dxa" w:w="2498"/>
+          </w:tcPr>
+          <w:p>
+            <w:r>
+              <w:t>增加策略模拟接口与样本回放后再扩展风险标签</w:t>
+            </w:r>
+          </w:p>
+        </w:tc>
+      </w:tr>
+      <w:tr>
+        <w:tc>
+          <w:tcPr>
+            <w:tcW w:type="dxa" w:w="2498"/>
+          </w:tcPr>
+          <w:p>
+            <w:r>
+              <w:t>热点审批步骤并发争用</w:t>
+            </w:r>
+          </w:p>
+        </w:tc>
+        <w:tc>
+          <w:tcPr>
+            <w:tcW w:type="dxa" w:w="2498"/>
+          </w:tcPr>
+          <w:p>
+            <w:r>
+              <w:t>大量领取或决策请求返回冲突</w:t>
+            </w:r>
+          </w:p>
+        </w:tc>
+        <w:tc>
+          <w:tcPr>
+            <w:tcW w:type="dxa" w:w="2498"/>
+          </w:tcPr>
+          <w:p>
+            <w:r>
+              <w:t>短事务行锁 expected version 和稳定 409 错误</w:t>
+            </w:r>
+          </w:p>
+        </w:tc>
+        <w:tc>
+          <w:tcPr>
+            <w:tcW w:type="dxa" w:w="2498"/>
+          </w:tcPr>
+          <w:p>
+            <w:r>
+              <w:t>压测冲突率 锁等待和端到端延迟</w:t>
+            </w:r>
+          </w:p>
+        </w:tc>
+      </w:tr>
     </w:tbl>
     <w:p>
       <w:pPr>
@@ -21607,13 +23104,7 @@
         <w:keepLines/>
       </w:pPr>
       <w:r>
-        <w:rPr>
-          <w:rFonts w:ascii="Aptos" w:hAnsi="Aptos" w:eastAsia="Microsoft YaHei"/>
-          <w:b/>
-          <w:color w:val="000000"/>
-          <w:sz w:val="32"/>
-        </w:rPr>
-        <w:t>十四 后续更新记录模板</w:t>
+        <w:t>十五 后续更新记录模板</w:t>
       </w:r>
     </w:p>
     <w:p>
@@ -22328,12 +23819,7 @@
       <w:jc w:val="right"/>
     </w:pPr>
     <w:r>
-      <w:rPr>
-        <w:rFonts w:ascii="Aptos" w:hAnsi="Aptos" w:eastAsia="Microsoft YaHei"/>
-        <w:color w:val="000000"/>
-        <w:sz w:val="17"/>
-      </w:rPr>
-      <w:t>ContractOps 项目更新记录  版本 0.7</w:t>
+      <w:t>ContractOps 项目更新记录  版本 0.8</w:t>
     </w:r>
   </w:p>
 </w:hdr>

</xml_diff>

<commit_message>
docs(contractops): record M2 CI acceptance
</commit_message>
<xml_diff>
--- a/architecture/ContractOps-项目更新记录.docx
+++ b/architecture/ContractOps-项目更新记录.docx
@@ -2443,7 +2443,7 @@
           </w:tcPr>
           <w:p>
             <w:r>
-              <w:t>本地 40 项通过 PostgreSQL 集成与全仓 CI 待 PR 验证</w:t>
+              <w:t>PR 3 全部 7 项检查通过 待项目负责人审批合并</w:t>
             </w:r>
           </w:p>
         </w:tc>
@@ -19048,7 +19048,7 @@
           </w:tcPr>
           <w:p>
             <w:r>
-              <w:t>待 PR CI</w:t>
+              <w:t>通过</w:t>
             </w:r>
           </w:p>
         </w:tc>
@@ -19059,7 +19059,7 @@
           </w:tcPr>
           <w:p>
             <w:r>
-              <w:t>本机没有 PostgreSQL 或 Docker，6 项数据库测试按环境条件跳过</w:t>
+              <w:t>PR 3 在 PostgreSQL 16 服务中完成 M1 和 M2 共 6 项集成测试</w:t>
             </w:r>
           </w:p>
         </w:tc>
@@ -19083,7 +19083,7 @@
           </w:tcPr>
           <w:p>
             <w:r>
-              <w:t>待 PR CI</w:t>
+              <w:t>通过</w:t>
             </w:r>
           </w:p>
         </w:tc>
@@ -19094,7 +19094,7 @@
           </w:tcPr>
           <w:p>
             <w:r>
-              <w:t>将验证高金额财务步骤 发布策略不可变 旧实例快照和过期并发决策冲突</w:t>
+              <w:t>PR 3 验证高金额财务步骤 策略不可变 快照隔离和过期并发冲突</w:t>
             </w:r>
           </w:p>
         </w:tc>
@@ -19118,7 +19118,7 @@
           </w:tcPr>
           <w:p>
             <w:r>
-              <w:t>待 PR CI</w:t>
+              <w:t>通过</w:t>
             </w:r>
           </w:p>
         </w:tc>
@@ -19129,7 +19129,7 @@
           </w:tcPr>
           <w:p>
             <w:r>
-              <w:t>空库升级 回滚 再升级由专用工作流执行</w:t>
+              <w:t>PR 3 完成空库升级 回滚和再升级</w:t>
             </w:r>
           </w:p>
         </w:tc>
@@ -19153,7 +19153,7 @@
           </w:tcPr>
           <w:p>
             <w:r>
-              <w:t>待 PR CI</w:t>
+              <w:t>通过</w:t>
             </w:r>
           </w:p>
         </w:tc>
@@ -19164,7 +19164,7 @@
           </w:tcPr>
           <w:p>
             <w:r>
-              <w:t>创建阶段 PR 后执行全部 GitHub Actions</w:t>
+              <w:t>PR 3 的 7 项 GitHub Actions 检查全部通过</w:t>
             </w:r>
           </w:p>
         </w:tc>
@@ -19242,7 +19242,7 @@
         <w:pStyle w:val="ListBullet"/>
       </w:pPr>
       <w:r>
-        <w:t>后续结果：PR 2 的数据库集成测试和迁移往返均通过，M1 已完成并合并。</w:t>
+        <w:t>后续结果：PR 3 的 PostgreSQL 集成、迁移往返和全部 7 项质量检查均已通过，M2 已具备人工审批合并条件。</w:t>
       </w:r>
     </w:p>
     <w:p>

</xml_diff>

<commit_message>
docs(contractops): record M3 CI acceptance
</commit_message>
<xml_diff>
--- a/architecture/ContractOps-项目更新记录.docx
+++ b/architecture/ContractOps-项目更新记录.docx
@@ -2575,16 +2575,13 @@
             <w:vAlign w:val="center"/>
           </w:tcPr>
           <w:p>
-            <w:pPr>
-              <w:spacing w:after="0" w:line="259" w:lineRule="auto"/>
-            </w:pPr>
-            <w:r>
-              <w:rPr>
-                <w:rFonts w:ascii="Aptos" w:hAnsi="Aptos" w:eastAsia="Microsoft YaHei"/>
-                <w:color w:val="000000"/>
-                <w:sz w:val="17"/>
-              </w:rPr>
-              <w:t>本地 44 项通过，基础设施集成待 PR CI</w:t>
+            <w:r>
+              <w:rPr>
+                <w:rFonts w:ascii="Aptos" w:hAnsi="Aptos" w:eastAsia="Microsoft YaHei"/>
+                <w:color w:val="000000"/>
+                <w:sz w:val="17"/>
+              </w:rPr>
+              <w:t>PR 4 基础设施集成和全部质量检查通过，待审批合并</w:t>
             </w:r>
           </w:p>
         </w:tc>
@@ -21722,16 +21719,13 @@
             <w:shd w:fill="EAF2F8"/>
           </w:tcPr>
           <w:p>
-            <w:pPr>
-              <w:spacing w:after="0" w:line="259" w:lineRule="auto"/>
-            </w:pPr>
-            <w:r>
-              <w:rPr>
-                <w:rFonts w:ascii="Aptos" w:hAnsi="Aptos" w:eastAsia="Microsoft YaHei"/>
-                <w:color w:val="000000"/>
-                <w:sz w:val="17"/>
-              </w:rPr>
-              <w:t>待 CI</w:t>
+            <w:r>
+              <w:rPr>
+                <w:rFonts w:ascii="Aptos" w:hAnsi="Aptos" w:eastAsia="Microsoft YaHei"/>
+                <w:color w:val="000000"/>
+                <w:sz w:val="17"/>
+              </w:rPr>
+              <w:t>通过</w:t>
             </w:r>
           </w:p>
         </w:tc>
@@ -21748,16 +21742,13 @@
             <w:shd w:fill="EAF2F8"/>
           </w:tcPr>
           <w:p>
-            <w:pPr>
-              <w:spacing w:after="0" w:line="259" w:lineRule="auto"/>
-            </w:pPr>
-            <w:r>
-              <w:rPr>
-                <w:rFonts w:ascii="Aptos" w:hAnsi="Aptos" w:eastAsia="Microsoft YaHei"/>
-                <w:color w:val="000000"/>
-                <w:sz w:val="17"/>
-              </w:rPr>
-              <w:t>PR 将运行事务回滚、投递唯一键、死信重放、Consumer Group 接管和确认测试</w:t>
+            <w:r>
+              <w:rPr>
+                <w:rFonts w:ascii="Aptos" w:hAnsi="Aptos" w:eastAsia="Microsoft YaHei"/>
+                <w:color w:val="000000"/>
+                <w:sz w:val="17"/>
+              </w:rPr>
+              <w:t>PR 4 已通过事务回滚、投递唯一键、死信重放、Consumer Group 接管和确认测试</w:t>
             </w:r>
           </w:p>
         </w:tc>
@@ -21804,16 +21795,13 @@
             <w:vAlign w:val="center"/>
           </w:tcPr>
           <w:p>
-            <w:pPr>
-              <w:spacing w:after="0" w:line="259" w:lineRule="auto"/>
-            </w:pPr>
-            <w:r>
-              <w:rPr>
-                <w:rFonts w:ascii="Aptos" w:hAnsi="Aptos" w:eastAsia="Microsoft YaHei"/>
-                <w:color w:val="000000"/>
-                <w:sz w:val="17"/>
-              </w:rPr>
-              <w:t>待 CI</w:t>
+            <w:r>
+              <w:rPr>
+                <w:rFonts w:ascii="Aptos" w:hAnsi="Aptos" w:eastAsia="Microsoft YaHei"/>
+                <w:color w:val="000000"/>
+                <w:sz w:val="17"/>
+              </w:rPr>
+              <w:t>通过</w:t>
             </w:r>
           </w:p>
         </w:tc>
@@ -21829,16 +21817,13 @@
             <w:vAlign w:val="center"/>
           </w:tcPr>
           <w:p>
-            <w:pPr>
-              <w:spacing w:after="0" w:line="259" w:lineRule="auto"/>
-            </w:pPr>
-            <w:r>
-              <w:rPr>
-                <w:rFonts w:ascii="Aptos" w:hAnsi="Aptos" w:eastAsia="Microsoft YaHei"/>
-                <w:color w:val="000000"/>
-                <w:sz w:val="17"/>
-              </w:rPr>
-              <w:t>GitHub 空库升级、回滚和再升级尚未执行</w:t>
+            <w:r>
+              <w:rPr>
+                <w:rFonts w:ascii="Aptos" w:hAnsi="Aptos" w:eastAsia="Microsoft YaHei"/>
+                <w:color w:val="000000"/>
+                <w:sz w:val="17"/>
+              </w:rPr>
+              <w:t>PR 4 完成空库升级、回滚和再升级</w:t>
             </w:r>
           </w:p>
         </w:tc>
@@ -21887,16 +21872,13 @@
             <w:shd w:fill="EAF2F8"/>
           </w:tcPr>
           <w:p>
-            <w:pPr>
-              <w:spacing w:after="0" w:line="259" w:lineRule="auto"/>
-            </w:pPr>
-            <w:r>
-              <w:rPr>
-                <w:rFonts w:ascii="Aptos" w:hAnsi="Aptos" w:eastAsia="Microsoft YaHei"/>
-                <w:color w:val="000000"/>
-                <w:sz w:val="17"/>
-              </w:rPr>
-              <w:t>待执行</w:t>
+            <w:r>
+              <w:rPr>
+                <w:rFonts w:ascii="Aptos" w:hAnsi="Aptos" w:eastAsia="Microsoft YaHei"/>
+                <w:color w:val="000000"/>
+                <w:sz w:val="17"/>
+              </w:rPr>
+              <w:t>通过</w:t>
             </w:r>
           </w:p>
         </w:tc>
@@ -21913,16 +21895,13 @@
             <w:shd w:fill="EAF2F8"/>
           </w:tcPr>
           <w:p>
-            <w:pPr>
-              <w:spacing w:after="0" w:line="259" w:lineRule="auto"/>
-            </w:pPr>
-            <w:r>
-              <w:rPr>
-                <w:rFonts w:ascii="Aptos" w:hAnsi="Aptos" w:eastAsia="Microsoft YaHei"/>
-                <w:color w:val="000000"/>
-                <w:sz w:val="17"/>
-              </w:rPr>
-              <w:t>远程分支和 PR 尚待创建</w:t>
+            <w:r>
+              <w:rPr>
+                <w:rFonts w:ascii="Aptos" w:hAnsi="Aptos" w:eastAsia="Microsoft YaHei"/>
+                <w:color w:val="000000"/>
+                <w:sz w:val="17"/>
+              </w:rPr>
+              <w:t>PR 4 的 GitHub Actions 检查全部通过</w:t>
             </w:r>
           </w:p>
         </w:tc>

</xml_diff>

<commit_message>
feat(contractops): add M4 obligation risk scheduling
</commit_message>
<xml_diff>
--- a/architecture/ContractOps-项目更新记录.docx
+++ b/architecture/ContractOps-项目更新记录.docx
@@ -210,12 +210,7 @@
           </w:tcPr>
           <w:p>
             <w:r>
-              <w:rPr>
-                <w:rFonts w:ascii="Aptos" w:hAnsi="Aptos" w:eastAsia="Microsoft YaHei"/>
-                <w:color w:val="000000"/>
-                <w:sz w:val="19"/>
-              </w:rPr>
-              <w:t>0.9</w:t>
+              <w:t>1.0</w:t>
             </w:r>
           </w:p>
         </w:tc>
@@ -262,7 +257,7 @@
           </w:tcPr>
           <w:p>
             <w:r>
-              <w:t>2026 年 9 月 26 日</w:t>
+              <w:t>2026年9月27日</w:t>
             </w:r>
           </w:p>
         </w:tc>
@@ -2582,6 +2577,148 @@
                 <w:sz w:val="17"/>
               </w:rPr>
               <w:t>PR 4 基础设施集成和全部质量检查通过，待审批合并</w:t>
+            </w:r>
+          </w:p>
+        </w:tc>
+      </w:tr>
+      <w:tr>
+        <w:tc>
+          <w:tcPr>
+            <w:tcW w:type="dxa" w:w="1999"/>
+            <w:vAlign w:val="center"/>
+            <w:tcMar>
+              <w:top w:w="80" w:type="dxa"/>
+              <w:start w:w="100" w:type="dxa"/>
+              <w:bottom w:w="80" w:type="dxa"/>
+              <w:end w:w="100" w:type="dxa"/>
+            </w:tcMar>
+            <w:shd w:fill="FFFFFF"/>
+          </w:tcPr>
+          <w:p>
+            <w:pPr>
+              <w:spacing w:before="0" w:after="0" w:line="240" w:lineRule="auto"/>
+            </w:pPr>
+            <w:r/>
+            <w:r>
+              <w:rPr>
+                <w:rFonts w:ascii="Aptos" w:hAnsi="Aptos" w:eastAsia="微软雅黑"/>
+                <w:b w:val="0"/>
+                <w:color w:val="243746"/>
+                <w:sz w:val="17"/>
+              </w:rPr>
+              <w:t>UPD010</w:t>
+            </w:r>
+          </w:p>
+        </w:tc>
+        <w:tc>
+          <w:tcPr>
+            <w:tcW w:type="dxa" w:w="1999"/>
+            <w:vAlign w:val="center"/>
+            <w:tcMar>
+              <w:top w:w="80" w:type="dxa"/>
+              <w:start w:w="100" w:type="dxa"/>
+              <w:bottom w:w="80" w:type="dxa"/>
+              <w:end w:w="100" w:type="dxa"/>
+            </w:tcMar>
+            <w:shd w:fill="FFFFFF"/>
+          </w:tcPr>
+          <w:p>
+            <w:pPr>
+              <w:spacing w:before="0" w:after="0" w:line="240" w:lineRule="auto"/>
+            </w:pPr>
+            <w:r/>
+            <w:r>
+              <w:rPr>
+                <w:rFonts w:ascii="Aptos" w:hAnsi="Aptos" w:eastAsia="微软雅黑"/>
+                <w:b w:val="0"/>
+                <w:color w:val="243746"/>
+                <w:sz w:val="17"/>
+              </w:rPr>
+              <w:t>2026年9月27日</w:t>
+            </w:r>
+          </w:p>
+        </w:tc>
+        <w:tc>
+          <w:tcPr>
+            <w:tcW w:type="dxa" w:w="1999"/>
+            <w:vAlign w:val="center"/>
+            <w:tcMar>
+              <w:top w:w="80" w:type="dxa"/>
+              <w:start w:w="100" w:type="dxa"/>
+              <w:bottom w:w="80" w:type="dxa"/>
+              <w:end w:w="100" w:type="dxa"/>
+            </w:tcMar>
+            <w:shd w:fill="FFFFFF"/>
+          </w:tcPr>
+          <w:p>
+            <w:pPr>
+              <w:spacing w:before="0" w:after="0" w:line="240" w:lineRule="auto"/>
+            </w:pPr>
+            <w:r/>
+            <w:r>
+              <w:rPr>
+                <w:rFonts w:ascii="Aptos" w:hAnsi="Aptos" w:eastAsia="微软雅黑"/>
+                <w:b w:val="0"/>
+                <w:color w:val="243746"/>
+                <w:sz w:val="17"/>
+              </w:rPr>
+              <w:t>实现 M4 履约与风险事件</w:t>
+            </w:r>
+          </w:p>
+        </w:tc>
+        <w:tc>
+          <w:tcPr>
+            <w:tcW w:type="dxa" w:w="1999"/>
+            <w:vAlign w:val="center"/>
+            <w:tcMar>
+              <w:top w:w="80" w:type="dxa"/>
+              <w:start w:w="100" w:type="dxa"/>
+              <w:bottom w:w="80" w:type="dxa"/>
+              <w:end w:w="100" w:type="dxa"/>
+            </w:tcMar>
+            <w:shd w:fill="FFFFFF"/>
+          </w:tcPr>
+          <w:p>
+            <w:pPr>
+              <w:spacing w:before="0" w:after="0" w:line="240" w:lineRule="auto"/>
+            </w:pPr>
+            <w:r/>
+            <w:r>
+              <w:rPr>
+                <w:rFonts w:ascii="Aptos" w:hAnsi="Aptos" w:eastAsia="微软雅黑"/>
+                <w:b w:val="0"/>
+                <w:color w:val="243746"/>
+                <w:sz w:val="17"/>
+              </w:rPr>
+              <w:t>新增合同生效、履约义务、租约调度、风险升级、提醒去重和终止取消</w:t>
+            </w:r>
+          </w:p>
+        </w:tc>
+        <w:tc>
+          <w:tcPr>
+            <w:tcW w:type="dxa" w:w="1999"/>
+            <w:vAlign w:val="center"/>
+            <w:tcMar>
+              <w:top w:w="80" w:type="dxa"/>
+              <w:start w:w="100" w:type="dxa"/>
+              <w:bottom w:w="80" w:type="dxa"/>
+              <w:end w:w="100" w:type="dxa"/>
+            </w:tcMar>
+            <w:shd w:fill="FFFFFF"/>
+          </w:tcPr>
+          <w:p>
+            <w:pPr>
+              <w:spacing w:before="0" w:after="0" w:line="240" w:lineRule="auto"/>
+            </w:pPr>
+            <w:r/>
+            <w:r>
+              <w:rPr>
+                <w:rFonts w:ascii="Aptos" w:hAnsi="Aptos" w:eastAsia="微软雅黑"/>
+                <w:b w:val="0"/>
+                <w:color w:val="243746"/>
+                <w:sz w:val="17"/>
+              </w:rPr>
+              <w:t>本地 48 项测试及静态检查通过；PR 与 PostgreSQL CI 待网络恢复</w:t>
             </w:r>
           </w:p>
         </w:tc>
@@ -22078,6 +22215,2758 @@
       <w:pPr>
         <w:pStyle w:val="Heading1"/>
         <w:keepNext/>
+        <w:spacing w:before="160" w:after="60"/>
+      </w:pPr>
+      <w:r>
+        <w:rPr>
+          <w:rFonts w:ascii="Aptos" w:hAnsi="Aptos" w:eastAsia="微软雅黑"/>
+          <w:b/>
+          <w:color w:val="1F4E78"/>
+          <w:sz w:val="30"/>
+        </w:rPr>
+        <w:t>十四 更新记录 UPD010</w:t>
+      </w:r>
+    </w:p>
+    <w:p>
+      <w:pPr>
+        <w:pStyle w:val="Heading2"/>
+        <w:keepNext/>
+        <w:spacing w:before="100" w:after="60"/>
+      </w:pPr>
+      <w:r>
+        <w:rPr>
+          <w:rFonts w:ascii="Aptos" w:hAnsi="Aptos" w:eastAsia="微软雅黑"/>
+          <w:b/>
+          <w:color w:val="1F4E78"/>
+          <w:sz w:val="22"/>
+        </w:rPr>
+        <w:t>十四之一 更新目标</w:t>
+      </w:r>
+    </w:p>
+    <w:p>
+      <w:pPr>
+        <w:spacing w:before="0" w:after="80" w:line="276" w:lineRule="auto"/>
+      </w:pPr>
+      <w:r>
+        <w:rPr>
+          <w:rFonts w:ascii="Aptos" w:hAnsi="Aptos" w:eastAsia="微软雅黑"/>
+          <w:b w:val="0"/>
+          <w:color w:val="243746"/>
+          <w:sz w:val="18"/>
+        </w:rPr>
+        <w:t>本阶段完成 M4 履约与风险事件闭环：合同审批通过后可显式生效，登记履约义务；独立调度进程以数据库租约批量领取到期任务，生成可追踪的风险事件与幂等提醒；合同终止时在同一事务内取消后续义务和风险，避免继续发送通知。</w:t>
+      </w:r>
+    </w:p>
+    <w:p>
+      <w:pPr>
+        <w:pStyle w:val="Heading2"/>
+        <w:keepNext/>
+        <w:spacing w:before="100" w:after="60"/>
+      </w:pPr>
+      <w:r>
+        <w:rPr>
+          <w:rFonts w:ascii="Aptos" w:hAnsi="Aptos" w:eastAsia="微软雅黑"/>
+          <w:b/>
+          <w:color w:val="1F4E78"/>
+          <w:sz w:val="22"/>
+        </w:rPr>
+        <w:t>十四之二 候选方案和选择过程</w:t>
+      </w:r>
+    </w:p>
+    <w:tbl>
+      <w:tblPr>
+        <w:tblStyle w:val="TableGrid"/>
+        <w:tblW w:type="auto" w:w="0"/>
+        <w:jc w:val="center"/>
+        <w:tblLayout w:type="fixed"/>
+        <w:tblLook w:firstColumn="1" w:firstRow="1" w:lastColumn="0" w:lastRow="0" w:noHBand="0" w:noVBand="1" w:val="04A0"/>
+      </w:tblPr>
+      <w:tblGrid>
+        <w:gridCol w:w="2498"/>
+        <w:gridCol w:w="2498"/>
+        <w:gridCol w:w="2498"/>
+        <w:gridCol w:w="2498"/>
+      </w:tblGrid>
+      <w:tr>
+        <w:tc>
+          <w:tcPr>
+            <w:tcW w:type="dxa" w:w="1701"/>
+            <w:vAlign w:val="center"/>
+            <w:tcMar>
+              <w:top w:w="80" w:type="dxa"/>
+              <w:start w:w="100" w:type="dxa"/>
+              <w:bottom w:w="80" w:type="dxa"/>
+              <w:end w:w="100" w:type="dxa"/>
+            </w:tcMar>
+            <w:shd w:fill="1F4E78"/>
+          </w:tcPr>
+          <w:p>
+            <w:pPr>
+              <w:spacing w:before="0" w:after="0" w:line="240" w:lineRule="auto"/>
+            </w:pPr>
+            <w:r>
+              <w:rPr>
+                <w:rFonts w:ascii="Aptos" w:hAnsi="Aptos" w:eastAsia="微软雅黑"/>
+                <w:b/>
+                <w:color w:val="FFFFFF"/>
+                <w:sz w:val="17"/>
+              </w:rPr>
+            </w:r>
+            <w:r>
+              <w:rPr>
+                <w:rFonts w:ascii="Aptos" w:hAnsi="Aptos" w:eastAsia="微软雅黑"/>
+                <w:b/>
+                <w:color w:val="FFFFFF"/>
+                <w:sz w:val="17"/>
+              </w:rPr>
+              <w:t>决策点</w:t>
+            </w:r>
+          </w:p>
+        </w:tc>
+        <w:tc>
+          <w:tcPr>
+            <w:tcW w:type="dxa" w:w="2381"/>
+            <w:vAlign w:val="center"/>
+            <w:tcMar>
+              <w:top w:w="80" w:type="dxa"/>
+              <w:start w:w="100" w:type="dxa"/>
+              <w:bottom w:w="80" w:type="dxa"/>
+              <w:end w:w="100" w:type="dxa"/>
+            </w:tcMar>
+            <w:shd w:fill="1F4E78"/>
+          </w:tcPr>
+          <w:p>
+            <w:pPr>
+              <w:spacing w:before="0" w:after="0" w:line="240" w:lineRule="auto"/>
+            </w:pPr>
+            <w:r>
+              <w:rPr>
+                <w:rFonts w:ascii="Aptos" w:hAnsi="Aptos" w:eastAsia="微软雅黑"/>
+                <w:b/>
+                <w:color w:val="FFFFFF"/>
+                <w:sz w:val="17"/>
+              </w:rPr>
+            </w:r>
+            <w:r>
+              <w:rPr>
+                <w:rFonts w:ascii="Aptos" w:hAnsi="Aptos" w:eastAsia="微软雅黑"/>
+                <w:b/>
+                <w:color w:val="FFFFFF"/>
+                <w:sz w:val="17"/>
+              </w:rPr>
+              <w:t>候选方案</w:t>
+            </w:r>
+          </w:p>
+        </w:tc>
+        <w:tc>
+          <w:tcPr>
+            <w:tcW w:type="dxa" w:w="2381"/>
+            <w:vAlign w:val="center"/>
+            <w:tcMar>
+              <w:top w:w="80" w:type="dxa"/>
+              <w:start w:w="100" w:type="dxa"/>
+              <w:bottom w:w="80" w:type="dxa"/>
+              <w:end w:w="100" w:type="dxa"/>
+            </w:tcMar>
+            <w:shd w:fill="1F4E78"/>
+          </w:tcPr>
+          <w:p>
+            <w:pPr>
+              <w:spacing w:before="0" w:after="0" w:line="240" w:lineRule="auto"/>
+            </w:pPr>
+            <w:r>
+              <w:rPr>
+                <w:rFonts w:ascii="Aptos" w:hAnsi="Aptos" w:eastAsia="微软雅黑"/>
+                <w:b/>
+                <w:color w:val="FFFFFF"/>
+                <w:sz w:val="17"/>
+              </w:rPr>
+            </w:r>
+            <w:r>
+              <w:rPr>
+                <w:rFonts w:ascii="Aptos" w:hAnsi="Aptos" w:eastAsia="微软雅黑"/>
+                <w:b/>
+                <w:color w:val="FFFFFF"/>
+                <w:sz w:val="17"/>
+              </w:rPr>
+              <w:t>最终选择</w:t>
+            </w:r>
+          </w:p>
+        </w:tc>
+        <w:tc>
+          <w:tcPr>
+            <w:tcW w:type="dxa" w:w="3402"/>
+            <w:vAlign w:val="center"/>
+            <w:tcMar>
+              <w:top w:w="80" w:type="dxa"/>
+              <w:start w:w="100" w:type="dxa"/>
+              <w:bottom w:w="80" w:type="dxa"/>
+              <w:end w:w="100" w:type="dxa"/>
+            </w:tcMar>
+            <w:shd w:fill="1F4E78"/>
+          </w:tcPr>
+          <w:p>
+            <w:pPr>
+              <w:spacing w:before="0" w:after="0" w:line="240" w:lineRule="auto"/>
+            </w:pPr>
+            <w:r>
+              <w:rPr>
+                <w:rFonts w:ascii="Aptos" w:hAnsi="Aptos" w:eastAsia="微软雅黑"/>
+                <w:b/>
+                <w:color w:val="FFFFFF"/>
+                <w:sz w:val="17"/>
+              </w:rPr>
+            </w:r>
+            <w:r>
+              <w:rPr>
+                <w:rFonts w:ascii="Aptos" w:hAnsi="Aptos" w:eastAsia="微软雅黑"/>
+                <w:b/>
+                <w:color w:val="FFFFFF"/>
+                <w:sz w:val="17"/>
+              </w:rPr>
+              <w:t>选择依据</w:t>
+            </w:r>
+          </w:p>
+        </w:tc>
+      </w:tr>
+      <w:tr>
+        <w:tc>
+          <w:tcPr>
+            <w:tcW w:type="dxa" w:w="1701"/>
+            <w:vAlign w:val="center"/>
+            <w:tcMar>
+              <w:top w:w="80" w:type="dxa"/>
+              <w:start w:w="100" w:type="dxa"/>
+              <w:bottom w:w="80" w:type="dxa"/>
+              <w:end w:w="100" w:type="dxa"/>
+            </w:tcMar>
+            <w:shd w:fill="FFFFFF"/>
+          </w:tcPr>
+          <w:p>
+            <w:pPr>
+              <w:spacing w:before="0" w:after="0" w:line="240" w:lineRule="auto"/>
+            </w:pPr>
+            <w:r>
+              <w:rPr>
+                <w:rFonts w:ascii="Aptos" w:hAnsi="Aptos" w:eastAsia="微软雅黑"/>
+                <w:b w:val="0"/>
+                <w:color w:val="243746"/>
+                <w:sz w:val="17"/>
+              </w:rPr>
+            </w:r>
+            <w:r>
+              <w:rPr>
+                <w:rFonts w:ascii="Aptos" w:hAnsi="Aptos" w:eastAsia="微软雅黑"/>
+                <w:b w:val="0"/>
+                <w:color w:val="243746"/>
+                <w:sz w:val="17"/>
+              </w:rPr>
+              <w:t>到期任务领取</w:t>
+            </w:r>
+          </w:p>
+        </w:tc>
+        <w:tc>
+          <w:tcPr>
+            <w:tcW w:type="dxa" w:w="2381"/>
+            <w:vAlign w:val="center"/>
+            <w:tcMar>
+              <w:top w:w="80" w:type="dxa"/>
+              <w:start w:w="100" w:type="dxa"/>
+              <w:bottom w:w="80" w:type="dxa"/>
+              <w:end w:w="100" w:type="dxa"/>
+            </w:tcMar>
+            <w:shd w:fill="FFFFFF"/>
+          </w:tcPr>
+          <w:p>
+            <w:pPr>
+              <w:spacing w:before="0" w:after="0" w:line="240" w:lineRule="auto"/>
+            </w:pPr>
+            <w:r>
+              <w:rPr>
+                <w:rFonts w:ascii="Aptos" w:hAnsi="Aptos" w:eastAsia="微软雅黑"/>
+                <w:b w:val="0"/>
+                <w:color w:val="243746"/>
+                <w:sz w:val="17"/>
+              </w:rPr>
+            </w:r>
+            <w:r>
+              <w:rPr>
+                <w:rFonts w:ascii="Aptos" w:hAnsi="Aptos" w:eastAsia="微软雅黑"/>
+                <w:b w:val="0"/>
+                <w:color w:val="243746"/>
+                <w:sz w:val="17"/>
+              </w:rPr>
+              <w:t>全表轮询；Redis 延时队列；PostgreSQL 租约</w:t>
+            </w:r>
+          </w:p>
+        </w:tc>
+        <w:tc>
+          <w:tcPr>
+            <w:tcW w:type="dxa" w:w="2381"/>
+            <w:vAlign w:val="center"/>
+            <w:tcMar>
+              <w:top w:w="80" w:type="dxa"/>
+              <w:start w:w="100" w:type="dxa"/>
+              <w:bottom w:w="80" w:type="dxa"/>
+              <w:end w:w="100" w:type="dxa"/>
+            </w:tcMar>
+            <w:shd w:fill="FFFFFF"/>
+          </w:tcPr>
+          <w:p>
+            <w:pPr>
+              <w:spacing w:before="0" w:after="0" w:line="240" w:lineRule="auto"/>
+            </w:pPr>
+            <w:r>
+              <w:rPr>
+                <w:rFonts w:ascii="Aptos" w:hAnsi="Aptos" w:eastAsia="微软雅黑"/>
+                <w:b w:val="0"/>
+                <w:color w:val="243746"/>
+                <w:sz w:val="17"/>
+              </w:rPr>
+            </w:r>
+            <w:r>
+              <w:rPr>
+                <w:rFonts w:ascii="Aptos" w:hAnsi="Aptos" w:eastAsia="微软雅黑"/>
+                <w:b w:val="0"/>
+                <w:color w:val="243746"/>
+                <w:sz w:val="17"/>
+              </w:rPr>
+              <w:t>`FOR UPDATE SKIP LOCKED` + 有时限租约</w:t>
+            </w:r>
+          </w:p>
+        </w:tc>
+        <w:tc>
+          <w:tcPr>
+            <w:tcW w:type="dxa" w:w="3402"/>
+            <w:vAlign w:val="center"/>
+            <w:tcMar>
+              <w:top w:w="80" w:type="dxa"/>
+              <w:start w:w="100" w:type="dxa"/>
+              <w:bottom w:w="80" w:type="dxa"/>
+              <w:end w:w="100" w:type="dxa"/>
+            </w:tcMar>
+            <w:shd w:fill="FFFFFF"/>
+          </w:tcPr>
+          <w:p>
+            <w:pPr>
+              <w:spacing w:before="0" w:after="0" w:line="240" w:lineRule="auto"/>
+            </w:pPr>
+            <w:r>
+              <w:rPr>
+                <w:rFonts w:ascii="Aptos" w:hAnsi="Aptos" w:eastAsia="微软雅黑"/>
+                <w:b w:val="0"/>
+                <w:color w:val="243746"/>
+                <w:sz w:val="17"/>
+              </w:rPr>
+            </w:r>
+            <w:r>
+              <w:rPr>
+                <w:rFonts w:ascii="Aptos" w:hAnsi="Aptos" w:eastAsia="微软雅黑"/>
+                <w:b w:val="0"/>
+                <w:color w:val="243746"/>
+                <w:sz w:val="17"/>
+              </w:rPr>
+              <w:t>数据库保存任务真相，进程重启可恢复；多实例并发领取不相互阻塞。</w:t>
+            </w:r>
+          </w:p>
+        </w:tc>
+      </w:tr>
+      <w:tr>
+        <w:tc>
+          <w:tcPr>
+            <w:tcW w:type="dxa" w:w="1701"/>
+            <w:vAlign w:val="center"/>
+            <w:tcMar>
+              <w:top w:w="80" w:type="dxa"/>
+              <w:start w:w="100" w:type="dxa"/>
+              <w:bottom w:w="80" w:type="dxa"/>
+              <w:end w:w="100" w:type="dxa"/>
+            </w:tcMar>
+            <w:shd w:fill="EEF5FA"/>
+          </w:tcPr>
+          <w:p>
+            <w:pPr>
+              <w:spacing w:before="0" w:after="0" w:line="240" w:lineRule="auto"/>
+            </w:pPr>
+            <w:r>
+              <w:rPr>
+                <w:rFonts w:ascii="Aptos" w:hAnsi="Aptos" w:eastAsia="微软雅黑"/>
+                <w:b w:val="0"/>
+                <w:color w:val="243746"/>
+                <w:sz w:val="17"/>
+              </w:rPr>
+            </w:r>
+            <w:r>
+              <w:rPr>
+                <w:rFonts w:ascii="Aptos" w:hAnsi="Aptos" w:eastAsia="微软雅黑"/>
+                <w:b w:val="0"/>
+                <w:color w:val="243746"/>
+                <w:sz w:val="17"/>
+              </w:rPr>
+              <w:t>风险状态模型</w:t>
+            </w:r>
+          </w:p>
+        </w:tc>
+        <w:tc>
+          <w:tcPr>
+            <w:tcW w:type="dxa" w:w="2381"/>
+            <w:vAlign w:val="center"/>
+            <w:tcMar>
+              <w:top w:w="80" w:type="dxa"/>
+              <w:start w:w="100" w:type="dxa"/>
+              <w:bottom w:w="80" w:type="dxa"/>
+              <w:end w:w="100" w:type="dxa"/>
+            </w:tcMar>
+            <w:shd w:fill="EEF5FA"/>
+          </w:tcPr>
+          <w:p>
+            <w:pPr>
+              <w:spacing w:before="0" w:after="0" w:line="240" w:lineRule="auto"/>
+            </w:pPr>
+            <w:r>
+              <w:rPr>
+                <w:rFonts w:ascii="Aptos" w:hAnsi="Aptos" w:eastAsia="微软雅黑"/>
+                <w:b w:val="0"/>
+                <w:color w:val="243746"/>
+                <w:sz w:val="17"/>
+              </w:rPr>
+            </w:r>
+            <w:r>
+              <w:rPr>
+                <w:rFonts w:ascii="Aptos" w:hAnsi="Aptos" w:eastAsia="微软雅黑"/>
+                <w:b w:val="0"/>
+                <w:color w:val="243746"/>
+                <w:sz w:val="17"/>
+              </w:rPr>
+              <w:t>覆盖当前状态；全量追加事件；活跃事件聚合</w:t>
+            </w:r>
+          </w:p>
+        </w:tc>
+        <w:tc>
+          <w:tcPr>
+            <w:tcW w:type="dxa" w:w="2381"/>
+            <w:vAlign w:val="center"/>
+            <w:tcMar>
+              <w:top w:w="80" w:type="dxa"/>
+              <w:start w:w="100" w:type="dxa"/>
+              <w:bottom w:w="80" w:type="dxa"/>
+              <w:end w:w="100" w:type="dxa"/>
+            </w:tcMar>
+            <w:shd w:fill="EEF5FA"/>
+          </w:tcPr>
+          <w:p>
+            <w:pPr>
+              <w:spacing w:before="0" w:after="0" w:line="240" w:lineRule="auto"/>
+            </w:pPr>
+            <w:r>
+              <w:rPr>
+                <w:rFonts w:ascii="Aptos" w:hAnsi="Aptos" w:eastAsia="微软雅黑"/>
+                <w:b w:val="0"/>
+                <w:color w:val="243746"/>
+                <w:sz w:val="17"/>
+              </w:rPr>
+            </w:r>
+            <w:r>
+              <w:rPr>
+                <w:rFonts w:ascii="Aptos" w:hAnsi="Aptos" w:eastAsia="微软雅黑"/>
+                <w:b w:val="0"/>
+                <w:color w:val="243746"/>
+                <w:sz w:val="17"/>
+              </w:rPr>
+              <w:t>按义务与风险类型聚合活跃 RiskEvent</w:t>
+            </w:r>
+          </w:p>
+        </w:tc>
+        <w:tc>
+          <w:tcPr>
+            <w:tcW w:type="dxa" w:w="3402"/>
+            <w:vAlign w:val="center"/>
+            <w:tcMar>
+              <w:top w:w="80" w:type="dxa"/>
+              <w:start w:w="100" w:type="dxa"/>
+              <w:bottom w:w="80" w:type="dxa"/>
+              <w:end w:w="100" w:type="dxa"/>
+            </w:tcMar>
+            <w:shd w:fill="EEF5FA"/>
+          </w:tcPr>
+          <w:p>
+            <w:pPr>
+              <w:spacing w:before="0" w:after="0" w:line="240" w:lineRule="auto"/>
+            </w:pPr>
+            <w:r>
+              <w:rPr>
+                <w:rFonts w:ascii="Aptos" w:hAnsi="Aptos" w:eastAsia="微软雅黑"/>
+                <w:b w:val="0"/>
+                <w:color w:val="243746"/>
+                <w:sz w:val="17"/>
+              </w:rPr>
+            </w:r>
+            <w:r>
+              <w:rPr>
+                <w:rFonts w:ascii="Aptos" w:hAnsi="Aptos" w:eastAsia="微软雅黑"/>
+                <w:b w:val="0"/>
+                <w:color w:val="243746"/>
+                <w:sz w:val="17"/>
+              </w:rPr>
+              <w:t>保留发生次数、严重度升级和人工动作版本，控制事件数量。</w:t>
+            </w:r>
+          </w:p>
+        </w:tc>
+      </w:tr>
+      <w:tr>
+        <w:tc>
+          <w:tcPr>
+            <w:tcW w:type="dxa" w:w="1701"/>
+            <w:vAlign w:val="center"/>
+            <w:tcMar>
+              <w:top w:w="80" w:type="dxa"/>
+              <w:start w:w="100" w:type="dxa"/>
+              <w:bottom w:w="80" w:type="dxa"/>
+              <w:end w:w="100" w:type="dxa"/>
+            </w:tcMar>
+            <w:shd w:fill="FFFFFF"/>
+          </w:tcPr>
+          <w:p>
+            <w:pPr>
+              <w:spacing w:before="0" w:after="0" w:line="240" w:lineRule="auto"/>
+            </w:pPr>
+            <w:r>
+              <w:rPr>
+                <w:rFonts w:ascii="Aptos" w:hAnsi="Aptos" w:eastAsia="微软雅黑"/>
+                <w:b w:val="0"/>
+                <w:color w:val="243746"/>
+                <w:sz w:val="17"/>
+              </w:rPr>
+            </w:r>
+            <w:r>
+              <w:rPr>
+                <w:rFonts w:ascii="Aptos" w:hAnsi="Aptos" w:eastAsia="微软雅黑"/>
+                <w:b w:val="0"/>
+                <w:color w:val="243746"/>
+                <w:sz w:val="17"/>
+              </w:rPr>
+              <w:t>提醒去重</w:t>
+            </w:r>
+          </w:p>
+        </w:tc>
+        <w:tc>
+          <w:tcPr>
+            <w:tcW w:type="dxa" w:w="2381"/>
+            <w:vAlign w:val="center"/>
+            <w:tcMar>
+              <w:top w:w="80" w:type="dxa"/>
+              <w:start w:w="100" w:type="dxa"/>
+              <w:bottom w:w="80" w:type="dxa"/>
+              <w:end w:w="100" w:type="dxa"/>
+            </w:tcMar>
+            <w:shd w:fill="FFFFFF"/>
+          </w:tcPr>
+          <w:p>
+            <w:pPr>
+              <w:spacing w:before="0" w:after="0" w:line="240" w:lineRule="auto"/>
+            </w:pPr>
+            <w:r>
+              <w:rPr>
+                <w:rFonts w:ascii="Aptos" w:hAnsi="Aptos" w:eastAsia="微软雅黑"/>
+                <w:b w:val="0"/>
+                <w:color w:val="243746"/>
+                <w:sz w:val="17"/>
+              </w:rPr>
+            </w:r>
+            <w:r>
+              <w:rPr>
+                <w:rFonts w:ascii="Aptos" w:hAnsi="Aptos" w:eastAsia="微软雅黑"/>
+                <w:b w:val="0"/>
+                <w:color w:val="243746"/>
+                <w:sz w:val="17"/>
+              </w:rPr>
+              <w:t>进程内集合；Redis SET；数据库唯一约束</w:t>
+            </w:r>
+          </w:p>
+        </w:tc>
+        <w:tc>
+          <w:tcPr>
+            <w:tcW w:type="dxa" w:w="2381"/>
+            <w:vAlign w:val="center"/>
+            <w:tcMar>
+              <w:top w:w="80" w:type="dxa"/>
+              <w:start w:w="100" w:type="dxa"/>
+              <w:bottom w:w="80" w:type="dxa"/>
+              <w:end w:w="100" w:type="dxa"/>
+            </w:tcMar>
+            <w:shd w:fill="FFFFFF"/>
+          </w:tcPr>
+          <w:p>
+            <w:pPr>
+              <w:spacing w:before="0" w:after="0" w:line="240" w:lineRule="auto"/>
+            </w:pPr>
+            <w:r>
+              <w:rPr>
+                <w:rFonts w:ascii="Aptos" w:hAnsi="Aptos" w:eastAsia="微软雅黑"/>
+                <w:b w:val="0"/>
+                <w:color w:val="243746"/>
+                <w:sz w:val="17"/>
+              </w:rPr>
+            </w:r>
+            <w:r>
+              <w:rPr>
+                <w:rFonts w:ascii="Aptos" w:hAnsi="Aptos" w:eastAsia="微软雅黑"/>
+                <w:b w:val="0"/>
+                <w:color w:val="243746"/>
+                <w:sz w:val="17"/>
+              </w:rPr>
+              <w:t>数据库唯一键 `(tenant, obligation, type, scheduled_at)`</w:t>
+            </w:r>
+          </w:p>
+        </w:tc>
+        <w:tc>
+          <w:tcPr>
+            <w:tcW w:type="dxa" w:w="3402"/>
+            <w:vAlign w:val="center"/>
+            <w:tcMar>
+              <w:top w:w="80" w:type="dxa"/>
+              <w:start w:w="100" w:type="dxa"/>
+              <w:bottom w:w="80" w:type="dxa"/>
+              <w:end w:w="100" w:type="dxa"/>
+            </w:tcMar>
+            <w:shd w:fill="FFFFFF"/>
+          </w:tcPr>
+          <w:p>
+            <w:pPr>
+              <w:spacing w:before="0" w:after="0" w:line="240" w:lineRule="auto"/>
+            </w:pPr>
+            <w:r>
+              <w:rPr>
+                <w:rFonts w:ascii="Aptos" w:hAnsi="Aptos" w:eastAsia="微软雅黑"/>
+                <w:b w:val="0"/>
+                <w:color w:val="243746"/>
+                <w:sz w:val="17"/>
+              </w:rPr>
+            </w:r>
+            <w:r>
+              <w:rPr>
+                <w:rFonts w:ascii="Aptos" w:hAnsi="Aptos" w:eastAsia="微软雅黑"/>
+                <w:b w:val="0"/>
+                <w:color w:val="243746"/>
+                <w:sz w:val="17"/>
+              </w:rPr>
+              <w:t>跨重启、跨实例仍能保证同一提醒只入库一次。</w:t>
+            </w:r>
+          </w:p>
+        </w:tc>
+      </w:tr>
+      <w:tr>
+        <w:tc>
+          <w:tcPr>
+            <w:tcW w:type="dxa" w:w="1701"/>
+            <w:vAlign w:val="center"/>
+            <w:tcMar>
+              <w:top w:w="80" w:type="dxa"/>
+              <w:start w:w="100" w:type="dxa"/>
+              <w:bottom w:w="80" w:type="dxa"/>
+              <w:end w:w="100" w:type="dxa"/>
+            </w:tcMar>
+            <w:shd w:fill="EEF5FA"/>
+          </w:tcPr>
+          <w:p>
+            <w:pPr>
+              <w:spacing w:before="0" w:after="0" w:line="240" w:lineRule="auto"/>
+            </w:pPr>
+            <w:r>
+              <w:rPr>
+                <w:rFonts w:ascii="Aptos" w:hAnsi="Aptos" w:eastAsia="微软雅黑"/>
+                <w:b w:val="0"/>
+                <w:color w:val="243746"/>
+                <w:sz w:val="17"/>
+              </w:rPr>
+            </w:r>
+            <w:r>
+              <w:rPr>
+                <w:rFonts w:ascii="Aptos" w:hAnsi="Aptos" w:eastAsia="微软雅黑"/>
+                <w:b w:val="0"/>
+                <w:color w:val="243746"/>
+                <w:sz w:val="17"/>
+              </w:rPr>
+              <w:t>合同终止</w:t>
+            </w:r>
+          </w:p>
+        </w:tc>
+        <w:tc>
+          <w:tcPr>
+            <w:tcW w:type="dxa" w:w="2381"/>
+            <w:vAlign w:val="center"/>
+            <w:tcMar>
+              <w:top w:w="80" w:type="dxa"/>
+              <w:start w:w="100" w:type="dxa"/>
+              <w:bottom w:w="80" w:type="dxa"/>
+              <w:end w:w="100" w:type="dxa"/>
+            </w:tcMar>
+            <w:shd w:fill="EEF5FA"/>
+          </w:tcPr>
+          <w:p>
+            <w:pPr>
+              <w:spacing w:before="0" w:after="0" w:line="240" w:lineRule="auto"/>
+            </w:pPr>
+            <w:r>
+              <w:rPr>
+                <w:rFonts w:ascii="Aptos" w:hAnsi="Aptos" w:eastAsia="微软雅黑"/>
+                <w:b w:val="0"/>
+                <w:color w:val="243746"/>
+                <w:sz w:val="17"/>
+              </w:rPr>
+            </w:r>
+            <w:r>
+              <w:rPr>
+                <w:rFonts w:ascii="Aptos" w:hAnsi="Aptos" w:eastAsia="微软雅黑"/>
+                <w:b w:val="0"/>
+                <w:color w:val="243746"/>
+                <w:sz w:val="17"/>
+              </w:rPr>
+              <w:t>仅由调度器遇到后跳过；API 事务内批量取消</w:t>
+            </w:r>
+          </w:p>
+        </w:tc>
+        <w:tc>
+          <w:tcPr>
+            <w:tcW w:type="dxa" w:w="2381"/>
+            <w:vAlign w:val="center"/>
+            <w:tcMar>
+              <w:top w:w="80" w:type="dxa"/>
+              <w:start w:w="100" w:type="dxa"/>
+              <w:bottom w:w="80" w:type="dxa"/>
+              <w:end w:w="100" w:type="dxa"/>
+            </w:tcMar>
+            <w:shd w:fill="EEF5FA"/>
+          </w:tcPr>
+          <w:p>
+            <w:pPr>
+              <w:spacing w:before="0" w:after="0" w:line="240" w:lineRule="auto"/>
+            </w:pPr>
+            <w:r>
+              <w:rPr>
+                <w:rFonts w:ascii="Aptos" w:hAnsi="Aptos" w:eastAsia="微软雅黑"/>
+                <w:b w:val="0"/>
+                <w:color w:val="243746"/>
+                <w:sz w:val="17"/>
+              </w:rPr>
+            </w:r>
+            <w:r>
+              <w:rPr>
+                <w:rFonts w:ascii="Aptos" w:hAnsi="Aptos" w:eastAsia="微软雅黑"/>
+                <w:b w:val="0"/>
+                <w:color w:val="243746"/>
+                <w:sz w:val="17"/>
+              </w:rPr>
+              <w:t>终止事务内取消义务并关闭活跃风险</w:t>
+            </w:r>
+          </w:p>
+        </w:tc>
+        <w:tc>
+          <w:tcPr>
+            <w:tcW w:type="dxa" w:w="3402"/>
+            <w:vAlign w:val="center"/>
+            <w:tcMar>
+              <w:top w:w="80" w:type="dxa"/>
+              <w:start w:w="100" w:type="dxa"/>
+              <w:bottom w:w="80" w:type="dxa"/>
+              <w:end w:w="100" w:type="dxa"/>
+            </w:tcMar>
+            <w:shd w:fill="EEF5FA"/>
+          </w:tcPr>
+          <w:p>
+            <w:pPr>
+              <w:spacing w:before="0" w:after="0" w:line="240" w:lineRule="auto"/>
+            </w:pPr>
+            <w:r>
+              <w:rPr>
+                <w:rFonts w:ascii="Aptos" w:hAnsi="Aptos" w:eastAsia="微软雅黑"/>
+                <w:b w:val="0"/>
+                <w:color w:val="243746"/>
+                <w:sz w:val="17"/>
+              </w:rPr>
+            </w:r>
+            <w:r>
+              <w:rPr>
+                <w:rFonts w:ascii="Aptos" w:hAnsi="Aptos" w:eastAsia="微软雅黑"/>
+                <w:b w:val="0"/>
+                <w:color w:val="243746"/>
+                <w:sz w:val="17"/>
+              </w:rPr>
+              <w:t>不依赖未来某次扫描，终止响应完成后立即满足业务不变量。</w:t>
+            </w:r>
+          </w:p>
+        </w:tc>
+      </w:tr>
+      <w:tr>
+        <w:tc>
+          <w:tcPr>
+            <w:tcW w:type="dxa" w:w="1701"/>
+            <w:vAlign w:val="center"/>
+            <w:tcMar>
+              <w:top w:w="80" w:type="dxa"/>
+              <w:start w:w="100" w:type="dxa"/>
+              <w:bottom w:w="80" w:type="dxa"/>
+              <w:end w:w="100" w:type="dxa"/>
+            </w:tcMar>
+            <w:shd w:fill="FFFFFF"/>
+          </w:tcPr>
+          <w:p>
+            <w:pPr>
+              <w:spacing w:before="0" w:after="0" w:line="240" w:lineRule="auto"/>
+            </w:pPr>
+            <w:r>
+              <w:rPr>
+                <w:rFonts w:ascii="Aptos" w:hAnsi="Aptos" w:eastAsia="微软雅黑"/>
+                <w:b w:val="0"/>
+                <w:color w:val="243746"/>
+                <w:sz w:val="17"/>
+              </w:rPr>
+            </w:r>
+            <w:r>
+              <w:rPr>
+                <w:rFonts w:ascii="Aptos" w:hAnsi="Aptos" w:eastAsia="微软雅黑"/>
+                <w:b w:val="0"/>
+                <w:color w:val="243746"/>
+                <w:sz w:val="17"/>
+              </w:rPr>
+              <w:t>服务边界</w:t>
+            </w:r>
+          </w:p>
+        </w:tc>
+        <w:tc>
+          <w:tcPr>
+            <w:tcW w:type="dxa" w:w="2381"/>
+            <w:vAlign w:val="center"/>
+            <w:tcMar>
+              <w:top w:w="80" w:type="dxa"/>
+              <w:start w:w="100" w:type="dxa"/>
+              <w:bottom w:w="80" w:type="dxa"/>
+              <w:end w:w="100" w:type="dxa"/>
+            </w:tcMar>
+            <w:shd w:fill="FFFFFF"/>
+          </w:tcPr>
+          <w:p>
+            <w:pPr>
+              <w:spacing w:before="0" w:after="0" w:line="240" w:lineRule="auto"/>
+            </w:pPr>
+            <w:r>
+              <w:rPr>
+                <w:rFonts w:ascii="Aptos" w:hAnsi="Aptos" w:eastAsia="微软雅黑"/>
+                <w:b w:val="0"/>
+                <w:color w:val="243746"/>
+                <w:sz w:val="17"/>
+              </w:rPr>
+            </w:r>
+            <w:r>
+              <w:rPr>
+                <w:rFonts w:ascii="Aptos" w:hAnsi="Aptos" w:eastAsia="微软雅黑"/>
+                <w:b w:val="0"/>
+                <w:color w:val="243746"/>
+                <w:sz w:val="17"/>
+              </w:rPr>
+              <w:t>合并进事件 Worker；独立 Scheduler</w:t>
+            </w:r>
+          </w:p>
+        </w:tc>
+        <w:tc>
+          <w:tcPr>
+            <w:tcW w:type="dxa" w:w="2381"/>
+            <w:vAlign w:val="center"/>
+            <w:tcMar>
+              <w:top w:w="80" w:type="dxa"/>
+              <w:start w:w="100" w:type="dxa"/>
+              <w:bottom w:w="80" w:type="dxa"/>
+              <w:end w:w="100" w:type="dxa"/>
+            </w:tcMar>
+            <w:shd w:fill="FFFFFF"/>
+          </w:tcPr>
+          <w:p>
+            <w:pPr>
+              <w:spacing w:before="0" w:after="0" w:line="240" w:lineRule="auto"/>
+            </w:pPr>
+            <w:r>
+              <w:rPr>
+                <w:rFonts w:ascii="Aptos" w:hAnsi="Aptos" w:eastAsia="微软雅黑"/>
+                <w:b w:val="0"/>
+                <w:color w:val="243746"/>
+                <w:sz w:val="17"/>
+              </w:rPr>
+            </w:r>
+            <w:r>
+              <w:rPr>
+                <w:rFonts w:ascii="Aptos" w:hAnsi="Aptos" w:eastAsia="微软雅黑"/>
+                <w:b w:val="0"/>
+                <w:color w:val="243746"/>
+                <w:sz w:val="17"/>
+              </w:rPr>
+              <w:t>独立 `contractops-scheduler` 进程</w:t>
+            </w:r>
+          </w:p>
+        </w:tc>
+        <w:tc>
+          <w:tcPr>
+            <w:tcW w:type="dxa" w:w="3402"/>
+            <w:vAlign w:val="center"/>
+            <w:tcMar>
+              <w:top w:w="80" w:type="dxa"/>
+              <w:start w:w="100" w:type="dxa"/>
+              <w:bottom w:w="80" w:type="dxa"/>
+              <w:end w:w="100" w:type="dxa"/>
+            </w:tcMar>
+            <w:shd w:fill="FFFFFF"/>
+          </w:tcPr>
+          <w:p>
+            <w:pPr>
+              <w:spacing w:before="0" w:after="0" w:line="240" w:lineRule="auto"/>
+            </w:pPr>
+            <w:r>
+              <w:rPr>
+                <w:rFonts w:ascii="Aptos" w:hAnsi="Aptos" w:eastAsia="微软雅黑"/>
+                <w:b w:val="0"/>
+                <w:color w:val="243746"/>
+                <w:sz w:val="17"/>
+              </w:rPr>
+            </w:r>
+            <w:r>
+              <w:rPr>
+                <w:rFonts w:ascii="Aptos" w:hAnsi="Aptos" w:eastAsia="微软雅黑"/>
+                <w:b w:val="0"/>
+                <w:color w:val="243746"/>
+                <w:sz w:val="17"/>
+              </w:rPr>
+              <w:t>隔离事件投递与到期扫描的节奏、容量和故障域。</w:t>
+            </w:r>
+          </w:p>
+        </w:tc>
+      </w:tr>
+    </w:tbl>
+    <w:p>
+      <w:pPr>
+        <w:pStyle w:val="Heading2"/>
+        <w:keepNext/>
+        <w:spacing w:before="100" w:after="60"/>
+      </w:pPr>
+      <w:r>
+        <w:rPr>
+          <w:rFonts w:ascii="Aptos" w:hAnsi="Aptos" w:eastAsia="微软雅黑"/>
+          <w:b/>
+          <w:color w:val="1F4E78"/>
+          <w:sz w:val="22"/>
+        </w:rPr>
+        <w:t>十四之三 实现内容</w:t>
+      </w:r>
+    </w:p>
+    <w:tbl>
+      <w:tblPr>
+        <w:tblStyle w:val="TableGrid"/>
+        <w:tblW w:type="auto" w:w="0"/>
+        <w:jc w:val="center"/>
+        <w:tblLayout w:type="fixed"/>
+        <w:tblLook w:firstColumn="1" w:firstRow="1" w:lastColumn="0" w:lastRow="0" w:noHBand="0" w:noVBand="1" w:val="04A0"/>
+      </w:tblPr>
+      <w:tblGrid>
+        <w:gridCol w:w="3331"/>
+        <w:gridCol w:w="3331"/>
+        <w:gridCol w:w="3331"/>
+      </w:tblGrid>
+      <w:tr>
+        <w:tc>
+          <w:tcPr>
+            <w:tcW w:type="dxa" w:w="1701"/>
+            <w:vAlign w:val="center"/>
+            <w:tcMar>
+              <w:top w:w="80" w:type="dxa"/>
+              <w:start w:w="100" w:type="dxa"/>
+              <w:bottom w:w="80" w:type="dxa"/>
+              <w:end w:w="100" w:type="dxa"/>
+            </w:tcMar>
+            <w:shd w:fill="1F4E78"/>
+          </w:tcPr>
+          <w:p>
+            <w:pPr>
+              <w:spacing w:before="0" w:after="0" w:line="240" w:lineRule="auto"/>
+            </w:pPr>
+            <w:r>
+              <w:rPr>
+                <w:rFonts w:ascii="Aptos" w:hAnsi="Aptos" w:eastAsia="微软雅黑"/>
+                <w:b/>
+                <w:color w:val="FFFFFF"/>
+                <w:sz w:val="17"/>
+              </w:rPr>
+            </w:r>
+            <w:r>
+              <w:rPr>
+                <w:rFonts w:ascii="Aptos" w:hAnsi="Aptos" w:eastAsia="微软雅黑"/>
+                <w:b/>
+                <w:color w:val="FFFFFF"/>
+                <w:sz w:val="17"/>
+              </w:rPr>
+              <w:t>范围</w:t>
+            </w:r>
+          </w:p>
+        </w:tc>
+        <w:tc>
+          <w:tcPr>
+            <w:tcW w:type="dxa" w:w="4535"/>
+            <w:vAlign w:val="center"/>
+            <w:tcMar>
+              <w:top w:w="80" w:type="dxa"/>
+              <w:start w:w="100" w:type="dxa"/>
+              <w:bottom w:w="80" w:type="dxa"/>
+              <w:end w:w="100" w:type="dxa"/>
+            </w:tcMar>
+            <w:shd w:fill="1F4E78"/>
+          </w:tcPr>
+          <w:p>
+            <w:pPr>
+              <w:spacing w:before="0" w:after="0" w:line="240" w:lineRule="auto"/>
+            </w:pPr>
+            <w:r>
+              <w:rPr>
+                <w:rFonts w:ascii="Aptos" w:hAnsi="Aptos" w:eastAsia="微软雅黑"/>
+                <w:b/>
+                <w:color w:val="FFFFFF"/>
+                <w:sz w:val="17"/>
+              </w:rPr>
+            </w:r>
+            <w:r>
+              <w:rPr>
+                <w:rFonts w:ascii="Aptos" w:hAnsi="Aptos" w:eastAsia="微软雅黑"/>
+                <w:b/>
+                <w:color w:val="FFFFFF"/>
+                <w:sz w:val="17"/>
+              </w:rPr>
+              <w:t>完成内容</w:t>
+            </w:r>
+          </w:p>
+        </w:tc>
+        <w:tc>
+          <w:tcPr>
+            <w:tcW w:type="dxa" w:w="3628"/>
+            <w:vAlign w:val="center"/>
+            <w:tcMar>
+              <w:top w:w="80" w:type="dxa"/>
+              <w:start w:w="100" w:type="dxa"/>
+              <w:bottom w:w="80" w:type="dxa"/>
+              <w:end w:w="100" w:type="dxa"/>
+            </w:tcMar>
+            <w:shd w:fill="1F4E78"/>
+          </w:tcPr>
+          <w:p>
+            <w:pPr>
+              <w:spacing w:before="0" w:after="0" w:line="240" w:lineRule="auto"/>
+            </w:pPr>
+            <w:r>
+              <w:rPr>
+                <w:rFonts w:ascii="Aptos" w:hAnsi="Aptos" w:eastAsia="微软雅黑"/>
+                <w:b/>
+                <w:color w:val="FFFFFF"/>
+                <w:sz w:val="17"/>
+              </w:rPr>
+            </w:r>
+            <w:r>
+              <w:rPr>
+                <w:rFonts w:ascii="Aptos" w:hAnsi="Aptos" w:eastAsia="微软雅黑"/>
+                <w:b/>
+                <w:color w:val="FFFFFF"/>
+                <w:sz w:val="17"/>
+              </w:rPr>
+              <w:t>后端服务化价值</w:t>
+            </w:r>
+          </w:p>
+        </w:tc>
+      </w:tr>
+      <w:tr>
+        <w:tc>
+          <w:tcPr>
+            <w:tcW w:type="dxa" w:w="1701"/>
+            <w:vAlign w:val="center"/>
+            <w:tcMar>
+              <w:top w:w="80" w:type="dxa"/>
+              <w:start w:w="100" w:type="dxa"/>
+              <w:bottom w:w="80" w:type="dxa"/>
+              <w:end w:w="100" w:type="dxa"/>
+            </w:tcMar>
+            <w:shd w:fill="FFFFFF"/>
+          </w:tcPr>
+          <w:p>
+            <w:pPr>
+              <w:spacing w:before="0" w:after="0" w:line="240" w:lineRule="auto"/>
+            </w:pPr>
+            <w:r>
+              <w:rPr>
+                <w:rFonts w:ascii="Aptos" w:hAnsi="Aptos" w:eastAsia="微软雅黑"/>
+                <w:b w:val="0"/>
+                <w:color w:val="243746"/>
+                <w:sz w:val="17"/>
+              </w:rPr>
+            </w:r>
+            <w:r>
+              <w:rPr>
+                <w:rFonts w:ascii="Aptos" w:hAnsi="Aptos" w:eastAsia="微软雅黑"/>
+                <w:b w:val="0"/>
+                <w:color w:val="243746"/>
+                <w:sz w:val="17"/>
+              </w:rPr>
+              <w:t>领域模型</w:t>
+            </w:r>
+          </w:p>
+        </w:tc>
+        <w:tc>
+          <w:tcPr>
+            <w:tcW w:type="dxa" w:w="4535"/>
+            <w:vAlign w:val="center"/>
+            <w:tcMar>
+              <w:top w:w="80" w:type="dxa"/>
+              <w:start w:w="100" w:type="dxa"/>
+              <w:bottom w:w="80" w:type="dxa"/>
+              <w:end w:w="100" w:type="dxa"/>
+            </w:tcMar>
+            <w:shd w:fill="FFFFFF"/>
+          </w:tcPr>
+          <w:p>
+            <w:pPr>
+              <w:spacing w:before="0" w:after="0" w:line="240" w:lineRule="auto"/>
+            </w:pPr>
+            <w:r>
+              <w:rPr>
+                <w:rFonts w:ascii="Aptos" w:hAnsi="Aptos" w:eastAsia="微软雅黑"/>
+                <w:b w:val="0"/>
+                <w:color w:val="243746"/>
+                <w:sz w:val="17"/>
+              </w:rPr>
+            </w:r>
+            <w:r>
+              <w:rPr>
+                <w:rFonts w:ascii="Aptos" w:hAnsi="Aptos" w:eastAsia="微软雅黑"/>
+                <w:b w:val="0"/>
+                <w:color w:val="243746"/>
+                <w:sz w:val="17"/>
+              </w:rPr>
+              <w:t>新增义务类型、履约状态、风险类型、严重度、处置动作与状态迁移规则。</w:t>
+            </w:r>
+          </w:p>
+        </w:tc>
+        <w:tc>
+          <w:tcPr>
+            <w:tcW w:type="dxa" w:w="3628"/>
+            <w:vAlign w:val="center"/>
+            <w:tcMar>
+              <w:top w:w="80" w:type="dxa"/>
+              <w:start w:w="100" w:type="dxa"/>
+              <w:bottom w:w="80" w:type="dxa"/>
+              <w:end w:w="100" w:type="dxa"/>
+            </w:tcMar>
+            <w:shd w:fill="FFFFFF"/>
+          </w:tcPr>
+          <w:p>
+            <w:pPr>
+              <w:spacing w:before="0" w:after="0" w:line="240" w:lineRule="auto"/>
+            </w:pPr>
+            <w:r>
+              <w:rPr>
+                <w:rFonts w:ascii="Aptos" w:hAnsi="Aptos" w:eastAsia="微软雅黑"/>
+                <w:b w:val="0"/>
+                <w:color w:val="243746"/>
+                <w:sz w:val="17"/>
+              </w:rPr>
+            </w:r>
+            <w:r>
+              <w:rPr>
+                <w:rFonts w:ascii="Aptos" w:hAnsi="Aptos" w:eastAsia="微软雅黑"/>
+                <w:b w:val="0"/>
+                <w:color w:val="243746"/>
+                <w:sz w:val="17"/>
+              </w:rPr>
+              <w:t>将履约判断从接口分支收敛为可单测的领域规则。</w:t>
+            </w:r>
+          </w:p>
+        </w:tc>
+      </w:tr>
+      <w:tr>
+        <w:tc>
+          <w:tcPr>
+            <w:tcW w:type="dxa" w:w="1701"/>
+            <w:vAlign w:val="center"/>
+            <w:tcMar>
+              <w:top w:w="80" w:type="dxa"/>
+              <w:start w:w="100" w:type="dxa"/>
+              <w:bottom w:w="80" w:type="dxa"/>
+              <w:end w:w="100" w:type="dxa"/>
+            </w:tcMar>
+            <w:shd w:fill="EEF5FA"/>
+          </w:tcPr>
+          <w:p>
+            <w:pPr>
+              <w:spacing w:before="0" w:after="0" w:line="240" w:lineRule="auto"/>
+            </w:pPr>
+            <w:r>
+              <w:rPr>
+                <w:rFonts w:ascii="Aptos" w:hAnsi="Aptos" w:eastAsia="微软雅黑"/>
+                <w:b w:val="0"/>
+                <w:color w:val="243746"/>
+                <w:sz w:val="17"/>
+              </w:rPr>
+            </w:r>
+            <w:r>
+              <w:rPr>
+                <w:rFonts w:ascii="Aptos" w:hAnsi="Aptos" w:eastAsia="微软雅黑"/>
+                <w:b w:val="0"/>
+                <w:color w:val="243746"/>
+                <w:sz w:val="17"/>
+              </w:rPr>
+              <w:t>业务 API</w:t>
+            </w:r>
+          </w:p>
+        </w:tc>
+        <w:tc>
+          <w:tcPr>
+            <w:tcW w:type="dxa" w:w="4535"/>
+            <w:vAlign w:val="center"/>
+            <w:tcMar>
+              <w:top w:w="80" w:type="dxa"/>
+              <w:start w:w="100" w:type="dxa"/>
+              <w:bottom w:w="80" w:type="dxa"/>
+              <w:end w:w="100" w:type="dxa"/>
+            </w:tcMar>
+            <w:shd w:fill="EEF5FA"/>
+          </w:tcPr>
+          <w:p>
+            <w:pPr>
+              <w:spacing w:before="0" w:after="0" w:line="240" w:lineRule="auto"/>
+            </w:pPr>
+            <w:r>
+              <w:rPr>
+                <w:rFonts w:ascii="Aptos" w:hAnsi="Aptos" w:eastAsia="微软雅黑"/>
+                <w:b w:val="0"/>
+                <w:color w:val="243746"/>
+                <w:sz w:val="17"/>
+              </w:rPr>
+            </w:r>
+            <w:r>
+              <w:rPr>
+                <w:rFonts w:ascii="Aptos" w:hAnsi="Aptos" w:eastAsia="微软雅黑"/>
+                <w:b w:val="0"/>
+                <w:color w:val="243746"/>
+                <w:sz w:val="17"/>
+              </w:rPr>
+              <w:t>合同生效、义务登记/完成、风险列表与确认/延期/解决、合同终止。</w:t>
+            </w:r>
+          </w:p>
+        </w:tc>
+        <w:tc>
+          <w:tcPr>
+            <w:tcW w:type="dxa" w:w="3628"/>
+            <w:vAlign w:val="center"/>
+            <w:tcMar>
+              <w:top w:w="80" w:type="dxa"/>
+              <w:start w:w="100" w:type="dxa"/>
+              <w:bottom w:w="80" w:type="dxa"/>
+              <w:end w:w="100" w:type="dxa"/>
+            </w:tcMar>
+            <w:shd w:fill="EEF5FA"/>
+          </w:tcPr>
+          <w:p>
+            <w:pPr>
+              <w:spacing w:before="0" w:after="0" w:line="240" w:lineRule="auto"/>
+            </w:pPr>
+            <w:r>
+              <w:rPr>
+                <w:rFonts w:ascii="Aptos" w:hAnsi="Aptos" w:eastAsia="微软雅黑"/>
+                <w:b w:val="0"/>
+                <w:color w:val="243746"/>
+                <w:sz w:val="17"/>
+              </w:rPr>
+            </w:r>
+            <w:r>
+              <w:rPr>
+                <w:rFonts w:ascii="Aptos" w:hAnsi="Aptos" w:eastAsia="微软雅黑"/>
+                <w:b w:val="0"/>
+                <w:color w:val="243746"/>
+                <w:sz w:val="17"/>
+              </w:rPr>
+              <w:t>覆盖合同从审批到履约闭环的最小服务接口。</w:t>
+            </w:r>
+          </w:p>
+        </w:tc>
+      </w:tr>
+      <w:tr>
+        <w:tc>
+          <w:tcPr>
+            <w:tcW w:type="dxa" w:w="1701"/>
+            <w:vAlign w:val="center"/>
+            <w:tcMar>
+              <w:top w:w="80" w:type="dxa"/>
+              <w:start w:w="100" w:type="dxa"/>
+              <w:bottom w:w="80" w:type="dxa"/>
+              <w:end w:w="100" w:type="dxa"/>
+            </w:tcMar>
+            <w:shd w:fill="FFFFFF"/>
+          </w:tcPr>
+          <w:p>
+            <w:pPr>
+              <w:spacing w:before="0" w:after="0" w:line="240" w:lineRule="auto"/>
+            </w:pPr>
+            <w:r>
+              <w:rPr>
+                <w:rFonts w:ascii="Aptos" w:hAnsi="Aptos" w:eastAsia="微软雅黑"/>
+                <w:b w:val="0"/>
+                <w:color w:val="243746"/>
+                <w:sz w:val="17"/>
+              </w:rPr>
+            </w:r>
+            <w:r>
+              <w:rPr>
+                <w:rFonts w:ascii="Aptos" w:hAnsi="Aptos" w:eastAsia="微软雅黑"/>
+                <w:b w:val="0"/>
+                <w:color w:val="243746"/>
+                <w:sz w:val="17"/>
+              </w:rPr>
+              <w:t>持久化</w:t>
+            </w:r>
+          </w:p>
+        </w:tc>
+        <w:tc>
+          <w:tcPr>
+            <w:tcW w:type="dxa" w:w="4535"/>
+            <w:vAlign w:val="center"/>
+            <w:tcMar>
+              <w:top w:w="80" w:type="dxa"/>
+              <w:start w:w="100" w:type="dxa"/>
+              <w:bottom w:w="80" w:type="dxa"/>
+              <w:end w:w="100" w:type="dxa"/>
+            </w:tcMar>
+            <w:shd w:fill="FFFFFF"/>
+          </w:tcPr>
+          <w:p>
+            <w:pPr>
+              <w:spacing w:before="0" w:after="0" w:line="240" w:lineRule="auto"/>
+            </w:pPr>
+            <w:r>
+              <w:rPr>
+                <w:rFonts w:ascii="Aptos" w:hAnsi="Aptos" w:eastAsia="微软雅黑"/>
+                <w:b w:val="0"/>
+                <w:color w:val="243746"/>
+                <w:sz w:val="17"/>
+              </w:rPr>
+            </w:r>
+            <w:r>
+              <w:rPr>
+                <w:rFonts w:ascii="Aptos" w:hAnsi="Aptos" w:eastAsia="微软雅黑"/>
+                <w:b w:val="0"/>
+                <w:color w:val="243746"/>
+                <w:sz w:val="17"/>
+              </w:rPr>
+              <w:t>新增 obligations、risk_events、obligation_reminders 表，带租户隔离、乐观锁、审计和 Outbox。</w:t>
+            </w:r>
+          </w:p>
+        </w:tc>
+        <w:tc>
+          <w:tcPr>
+            <w:tcW w:type="dxa" w:w="3628"/>
+            <w:vAlign w:val="center"/>
+            <w:tcMar>
+              <w:top w:w="80" w:type="dxa"/>
+              <w:start w:w="100" w:type="dxa"/>
+              <w:bottom w:w="80" w:type="dxa"/>
+              <w:end w:w="100" w:type="dxa"/>
+            </w:tcMar>
+            <w:shd w:fill="FFFFFF"/>
+          </w:tcPr>
+          <w:p>
+            <w:pPr>
+              <w:spacing w:before="0" w:after="0" w:line="240" w:lineRule="auto"/>
+            </w:pPr>
+            <w:r>
+              <w:rPr>
+                <w:rFonts w:ascii="Aptos" w:hAnsi="Aptos" w:eastAsia="微软雅黑"/>
+                <w:b w:val="0"/>
+                <w:color w:val="243746"/>
+                <w:sz w:val="17"/>
+              </w:rPr>
+            </w:r>
+            <w:r>
+              <w:rPr>
+                <w:rFonts w:ascii="Aptos" w:hAnsi="Aptos" w:eastAsia="微软雅黑"/>
+                <w:b w:val="0"/>
+                <w:color w:val="243746"/>
+                <w:sz w:val="17"/>
+              </w:rPr>
+              <w:t>业务写入、审计与下游通知在同一事务中提交。</w:t>
+            </w:r>
+          </w:p>
+        </w:tc>
+      </w:tr>
+      <w:tr>
+        <w:tc>
+          <w:tcPr>
+            <w:tcW w:type="dxa" w:w="1701"/>
+            <w:vAlign w:val="center"/>
+            <w:tcMar>
+              <w:top w:w="80" w:type="dxa"/>
+              <w:start w:w="100" w:type="dxa"/>
+              <w:bottom w:w="80" w:type="dxa"/>
+              <w:end w:w="100" w:type="dxa"/>
+            </w:tcMar>
+            <w:shd w:fill="EEF5FA"/>
+          </w:tcPr>
+          <w:p>
+            <w:pPr>
+              <w:spacing w:before="0" w:after="0" w:line="240" w:lineRule="auto"/>
+            </w:pPr>
+            <w:r>
+              <w:rPr>
+                <w:rFonts w:ascii="Aptos" w:hAnsi="Aptos" w:eastAsia="微软雅黑"/>
+                <w:b w:val="0"/>
+                <w:color w:val="243746"/>
+                <w:sz w:val="17"/>
+              </w:rPr>
+            </w:r>
+            <w:r>
+              <w:rPr>
+                <w:rFonts w:ascii="Aptos" w:hAnsi="Aptos" w:eastAsia="微软雅黑"/>
+                <w:b w:val="0"/>
+                <w:color w:val="243746"/>
+                <w:sz w:val="17"/>
+              </w:rPr>
+              <w:t>调度服务</w:t>
+            </w:r>
+          </w:p>
+        </w:tc>
+        <w:tc>
+          <w:tcPr>
+            <w:tcW w:type="dxa" w:w="4535"/>
+            <w:vAlign w:val="center"/>
+            <w:tcMar>
+              <w:top w:w="80" w:type="dxa"/>
+              <w:start w:w="100" w:type="dxa"/>
+              <w:bottom w:w="80" w:type="dxa"/>
+              <w:end w:w="100" w:type="dxa"/>
+            </w:tcMar>
+            <w:shd w:fill="EEF5FA"/>
+          </w:tcPr>
+          <w:p>
+            <w:pPr>
+              <w:spacing w:before="0" w:after="0" w:line="240" w:lineRule="auto"/>
+            </w:pPr>
+            <w:r>
+              <w:rPr>
+                <w:rFonts w:ascii="Aptos" w:hAnsi="Aptos" w:eastAsia="微软雅黑"/>
+                <w:b w:val="0"/>
+                <w:color w:val="243746"/>
+                <w:sz w:val="17"/>
+              </w:rPr>
+            </w:r>
+            <w:r>
+              <w:rPr>
+                <w:rFonts w:ascii="Aptos" w:hAnsi="Aptos" w:eastAsia="微软雅黑"/>
+                <w:b w:val="0"/>
+                <w:color w:val="243746"/>
+                <w:sz w:val="17"/>
+              </w:rPr>
+              <w:t>批量领取到期义务、租约续期边界、风险评估、提醒生成与下一次执行时间更新。</w:t>
+            </w:r>
+          </w:p>
+        </w:tc>
+        <w:tc>
+          <w:tcPr>
+            <w:tcW w:type="dxa" w:w="3628"/>
+            <w:vAlign w:val="center"/>
+            <w:tcMar>
+              <w:top w:w="80" w:type="dxa"/>
+              <w:start w:w="100" w:type="dxa"/>
+              <w:bottom w:w="80" w:type="dxa"/>
+              <w:end w:w="100" w:type="dxa"/>
+            </w:tcMar>
+            <w:shd w:fill="EEF5FA"/>
+          </w:tcPr>
+          <w:p>
+            <w:pPr>
+              <w:spacing w:before="0" w:after="0" w:line="240" w:lineRule="auto"/>
+            </w:pPr>
+            <w:r>
+              <w:rPr>
+                <w:rFonts w:ascii="Aptos" w:hAnsi="Aptos" w:eastAsia="微软雅黑"/>
+                <w:b w:val="0"/>
+                <w:color w:val="243746"/>
+                <w:sz w:val="17"/>
+              </w:rPr>
+            </w:r>
+            <w:r>
+              <w:rPr>
+                <w:rFonts w:ascii="Aptos" w:hAnsi="Aptos" w:eastAsia="微软雅黑"/>
+                <w:b w:val="0"/>
+                <w:color w:val="243746"/>
+                <w:sz w:val="17"/>
+              </w:rPr>
+              <w:t>支持多副本竞争消费、崩溃重领和积压恢复。</w:t>
+            </w:r>
+          </w:p>
+        </w:tc>
+      </w:tr>
+      <w:tr>
+        <w:tc>
+          <w:tcPr>
+            <w:tcW w:type="dxa" w:w="1701"/>
+            <w:vAlign w:val="center"/>
+            <w:tcMar>
+              <w:top w:w="80" w:type="dxa"/>
+              <w:start w:w="100" w:type="dxa"/>
+              <w:bottom w:w="80" w:type="dxa"/>
+              <w:end w:w="100" w:type="dxa"/>
+            </w:tcMar>
+            <w:shd w:fill="FFFFFF"/>
+          </w:tcPr>
+          <w:p>
+            <w:pPr>
+              <w:spacing w:before="0" w:after="0" w:line="240" w:lineRule="auto"/>
+            </w:pPr>
+            <w:r>
+              <w:rPr>
+                <w:rFonts w:ascii="Aptos" w:hAnsi="Aptos" w:eastAsia="微软雅黑"/>
+                <w:b w:val="0"/>
+                <w:color w:val="243746"/>
+                <w:sz w:val="17"/>
+              </w:rPr>
+            </w:r>
+            <w:r>
+              <w:rPr>
+                <w:rFonts w:ascii="Aptos" w:hAnsi="Aptos" w:eastAsia="微软雅黑"/>
+                <w:b w:val="0"/>
+                <w:color w:val="243746"/>
+                <w:sz w:val="17"/>
+              </w:rPr>
+              <w:t>风险处理</w:t>
+            </w:r>
+          </w:p>
+        </w:tc>
+        <w:tc>
+          <w:tcPr>
+            <w:tcW w:type="dxa" w:w="4535"/>
+            <w:vAlign w:val="center"/>
+            <w:tcMar>
+              <w:top w:w="80" w:type="dxa"/>
+              <w:start w:w="100" w:type="dxa"/>
+              <w:bottom w:w="80" w:type="dxa"/>
+              <w:end w:w="100" w:type="dxa"/>
+            </w:tcMar>
+            <w:shd w:fill="FFFFFF"/>
+          </w:tcPr>
+          <w:p>
+            <w:pPr>
+              <w:spacing w:before="0" w:after="0" w:line="240" w:lineRule="auto"/>
+            </w:pPr>
+            <w:r>
+              <w:rPr>
+                <w:rFonts w:ascii="Aptos" w:hAnsi="Aptos" w:eastAsia="微软雅黑"/>
+                <w:b w:val="0"/>
+                <w:color w:val="243746"/>
+                <w:sz w:val="17"/>
+              </w:rPr>
+            </w:r>
+            <w:r>
+              <w:rPr>
+                <w:rFonts w:ascii="Aptos" w:hAnsi="Aptos" w:eastAsia="微软雅黑"/>
+                <w:b w:val="0"/>
+                <w:color w:val="243746"/>
+                <w:sz w:val="17"/>
+              </w:rPr>
+              <w:t>逾期严重度升级、确认、延期、解决；延期期间暂停重复提醒。</w:t>
+            </w:r>
+          </w:p>
+        </w:tc>
+        <w:tc>
+          <w:tcPr>
+            <w:tcW w:type="dxa" w:w="3628"/>
+            <w:vAlign w:val="center"/>
+            <w:tcMar>
+              <w:top w:w="80" w:type="dxa"/>
+              <w:start w:w="100" w:type="dxa"/>
+              <w:bottom w:w="80" w:type="dxa"/>
+              <w:end w:w="100" w:type="dxa"/>
+            </w:tcMar>
+            <w:shd w:fill="FFFFFF"/>
+          </w:tcPr>
+          <w:p>
+            <w:pPr>
+              <w:spacing w:before="0" w:after="0" w:line="240" w:lineRule="auto"/>
+            </w:pPr>
+            <w:r>
+              <w:rPr>
+                <w:rFonts w:ascii="Aptos" w:hAnsi="Aptos" w:eastAsia="微软雅黑"/>
+                <w:b w:val="0"/>
+                <w:color w:val="243746"/>
+                <w:sz w:val="17"/>
+              </w:rPr>
+            </w:r>
+            <w:r>
+              <w:rPr>
+                <w:rFonts w:ascii="Aptos" w:hAnsi="Aptos" w:eastAsia="微软雅黑"/>
+                <w:b w:val="0"/>
+                <w:color w:val="243746"/>
+                <w:sz w:val="17"/>
+              </w:rPr>
+              <w:t>既能自动发现风险，也保留人工风控决策边界。</w:t>
+            </w:r>
+          </w:p>
+        </w:tc>
+      </w:tr>
+      <w:tr>
+        <w:tc>
+          <w:tcPr>
+            <w:tcW w:type="dxa" w:w="1701"/>
+            <w:vAlign w:val="center"/>
+            <w:tcMar>
+              <w:top w:w="80" w:type="dxa"/>
+              <w:start w:w="100" w:type="dxa"/>
+              <w:bottom w:w="80" w:type="dxa"/>
+              <w:end w:w="100" w:type="dxa"/>
+            </w:tcMar>
+            <w:shd w:fill="EEF5FA"/>
+          </w:tcPr>
+          <w:p>
+            <w:pPr>
+              <w:spacing w:before="0" w:after="0" w:line="240" w:lineRule="auto"/>
+            </w:pPr>
+            <w:r>
+              <w:rPr>
+                <w:rFonts w:ascii="Aptos" w:hAnsi="Aptos" w:eastAsia="微软雅黑"/>
+                <w:b w:val="0"/>
+                <w:color w:val="243746"/>
+                <w:sz w:val="17"/>
+              </w:rPr>
+            </w:r>
+            <w:r>
+              <w:rPr>
+                <w:rFonts w:ascii="Aptos" w:hAnsi="Aptos" w:eastAsia="微软雅黑"/>
+                <w:b w:val="0"/>
+                <w:color w:val="243746"/>
+                <w:sz w:val="17"/>
+              </w:rPr>
+              <w:t>终止一致性</w:t>
+            </w:r>
+          </w:p>
+        </w:tc>
+        <w:tc>
+          <w:tcPr>
+            <w:tcW w:type="dxa" w:w="4535"/>
+            <w:vAlign w:val="center"/>
+            <w:tcMar>
+              <w:top w:w="80" w:type="dxa"/>
+              <w:start w:w="100" w:type="dxa"/>
+              <w:bottom w:w="80" w:type="dxa"/>
+              <w:end w:w="100" w:type="dxa"/>
+            </w:tcMar>
+            <w:shd w:fill="EEF5FA"/>
+          </w:tcPr>
+          <w:p>
+            <w:pPr>
+              <w:spacing w:before="0" w:after="0" w:line="240" w:lineRule="auto"/>
+            </w:pPr>
+            <w:r>
+              <w:rPr>
+                <w:rFonts w:ascii="Aptos" w:hAnsi="Aptos" w:eastAsia="微软雅黑"/>
+                <w:b w:val="0"/>
+                <w:color w:val="243746"/>
+                <w:sz w:val="17"/>
+              </w:rPr>
+            </w:r>
+            <w:r>
+              <w:rPr>
+                <w:rFonts w:ascii="Aptos" w:hAnsi="Aptos" w:eastAsia="微软雅黑"/>
+                <w:b w:val="0"/>
+                <w:color w:val="243746"/>
+                <w:sz w:val="17"/>
+              </w:rPr>
+              <w:t>终止合同时原子取消计划中/活跃/逾期义务，并解决相关活跃风险。</w:t>
+            </w:r>
+          </w:p>
+        </w:tc>
+        <w:tc>
+          <w:tcPr>
+            <w:tcW w:type="dxa" w:w="3628"/>
+            <w:vAlign w:val="center"/>
+            <w:tcMar>
+              <w:top w:w="80" w:type="dxa"/>
+              <w:start w:w="100" w:type="dxa"/>
+              <w:bottom w:w="80" w:type="dxa"/>
+              <w:end w:w="100" w:type="dxa"/>
+            </w:tcMar>
+            <w:shd w:fill="EEF5FA"/>
+          </w:tcPr>
+          <w:p>
+            <w:pPr>
+              <w:spacing w:before="0" w:after="0" w:line="240" w:lineRule="auto"/>
+            </w:pPr>
+            <w:r>
+              <w:rPr>
+                <w:rFonts w:ascii="Aptos" w:hAnsi="Aptos" w:eastAsia="微软雅黑"/>
+                <w:b w:val="0"/>
+                <w:color w:val="243746"/>
+                <w:sz w:val="17"/>
+              </w:rPr>
+            </w:r>
+            <w:r>
+              <w:rPr>
+                <w:rFonts w:ascii="Aptos" w:hAnsi="Aptos" w:eastAsia="微软雅黑"/>
+                <w:b w:val="0"/>
+                <w:color w:val="243746"/>
+                <w:sz w:val="17"/>
+              </w:rPr>
+              <w:t>保证终止合同不再产生后续提醒。</w:t>
+            </w:r>
+          </w:p>
+        </w:tc>
+      </w:tr>
+      <w:tr>
+        <w:tc>
+          <w:tcPr>
+            <w:tcW w:type="dxa" w:w="1701"/>
+            <w:vAlign w:val="center"/>
+            <w:tcMar>
+              <w:top w:w="80" w:type="dxa"/>
+              <w:start w:w="100" w:type="dxa"/>
+              <w:bottom w:w="80" w:type="dxa"/>
+              <w:end w:w="100" w:type="dxa"/>
+            </w:tcMar>
+            <w:shd w:fill="FFFFFF"/>
+          </w:tcPr>
+          <w:p>
+            <w:pPr>
+              <w:spacing w:before="0" w:after="0" w:line="240" w:lineRule="auto"/>
+            </w:pPr>
+            <w:r>
+              <w:rPr>
+                <w:rFonts w:ascii="Aptos" w:hAnsi="Aptos" w:eastAsia="微软雅黑"/>
+                <w:b w:val="0"/>
+                <w:color w:val="243746"/>
+                <w:sz w:val="17"/>
+              </w:rPr>
+            </w:r>
+            <w:r>
+              <w:rPr>
+                <w:rFonts w:ascii="Aptos" w:hAnsi="Aptos" w:eastAsia="微软雅黑"/>
+                <w:b w:val="0"/>
+                <w:color w:val="243746"/>
+                <w:sz w:val="17"/>
+              </w:rPr>
+              <w:t>部署与测试</w:t>
+            </w:r>
+          </w:p>
+        </w:tc>
+        <w:tc>
+          <w:tcPr>
+            <w:tcW w:type="dxa" w:w="4535"/>
+            <w:vAlign w:val="center"/>
+            <w:tcMar>
+              <w:top w:w="80" w:type="dxa"/>
+              <w:start w:w="100" w:type="dxa"/>
+              <w:bottom w:w="80" w:type="dxa"/>
+              <w:end w:w="100" w:type="dxa"/>
+            </w:tcMar>
+            <w:shd w:fill="FFFFFF"/>
+          </w:tcPr>
+          <w:p>
+            <w:pPr>
+              <w:spacing w:before="0" w:after="0" w:line="240" w:lineRule="auto"/>
+            </w:pPr>
+            <w:r>
+              <w:rPr>
+                <w:rFonts w:ascii="Aptos" w:hAnsi="Aptos" w:eastAsia="微软雅黑"/>
+                <w:b w:val="0"/>
+                <w:color w:val="243746"/>
+                <w:sz w:val="17"/>
+              </w:rPr>
+            </w:r>
+            <w:r>
+              <w:rPr>
+                <w:rFonts w:ascii="Aptos" w:hAnsi="Aptos" w:eastAsia="微软雅黑"/>
+                <w:b w:val="0"/>
+                <w:color w:val="243746"/>
+                <w:sz w:val="17"/>
+              </w:rPr>
+              <w:t>Compose 增加 scheduler 服务；补充领域测试、迁移检查和 PostgreSQL 集成验收。</w:t>
+            </w:r>
+          </w:p>
+        </w:tc>
+        <w:tc>
+          <w:tcPr>
+            <w:tcW w:type="dxa" w:w="3628"/>
+            <w:vAlign w:val="center"/>
+            <w:tcMar>
+              <w:top w:w="80" w:type="dxa"/>
+              <w:start w:w="100" w:type="dxa"/>
+              <w:bottom w:w="80" w:type="dxa"/>
+              <w:end w:w="100" w:type="dxa"/>
+            </w:tcMar>
+            <w:shd w:fill="FFFFFF"/>
+          </w:tcPr>
+          <w:p>
+            <w:pPr>
+              <w:spacing w:before="0" w:after="0" w:line="240" w:lineRule="auto"/>
+            </w:pPr>
+            <w:r>
+              <w:rPr>
+                <w:rFonts w:ascii="Aptos" w:hAnsi="Aptos" w:eastAsia="微软雅黑"/>
+                <w:b w:val="0"/>
+                <w:color w:val="243746"/>
+                <w:sz w:val="17"/>
+              </w:rPr>
+            </w:r>
+            <w:r>
+              <w:rPr>
+                <w:rFonts w:ascii="Aptos" w:hAnsi="Aptos" w:eastAsia="微软雅黑"/>
+                <w:b w:val="0"/>
+                <w:color w:val="243746"/>
+                <w:sz w:val="17"/>
+              </w:rPr>
+              <w:t>形成可独立部署、扩容和监控的后台服务。</w:t>
+            </w:r>
+          </w:p>
+        </w:tc>
+      </w:tr>
+    </w:tbl>
+    <w:p>
+      <w:pPr>
+        <w:pStyle w:val="Heading2"/>
+        <w:keepNext/>
+        <w:spacing w:before="100" w:after="60"/>
+      </w:pPr>
+      <w:r>
+        <w:rPr>
+          <w:rFonts w:ascii="Aptos" w:hAnsi="Aptos" w:eastAsia="微软雅黑"/>
+          <w:b/>
+          <w:color w:val="1F4E78"/>
+          <w:sz w:val="22"/>
+        </w:rPr>
+        <w:t>十四之四 问题难点和处理</w:t>
+      </w:r>
+    </w:p>
+    <w:p>
+      <w:pPr>
+        <w:pStyle w:val="ListBullet"/>
+        <w:spacing w:after="40"/>
+        <w:ind w:left="340" w:hanging="142"/>
+      </w:pPr>
+      <w:r>
+        <w:rPr>
+          <w:rFonts w:ascii="Aptos" w:hAnsi="Aptos" w:eastAsia="微软雅黑"/>
+          <w:b w:val="0"/>
+          <w:color w:val="243746"/>
+          <w:sz w:val="18"/>
+        </w:rPr>
+        <w:t>租约与消息幂等是两层问题：租约避免同一时刻重复执行，数据库唯一键负责处理进程崩溃、租约过期后的再次执行。</w:t>
+      </w:r>
+    </w:p>
+    <w:p>
+      <w:pPr>
+        <w:pStyle w:val="ListBullet"/>
+        <w:spacing w:after="40"/>
+        <w:ind w:left="340" w:hanging="142"/>
+      </w:pPr>
+      <w:r>
+        <w:rPr>
+          <w:rFonts w:ascii="Aptos" w:hAnsi="Aptos" w:eastAsia="微软雅黑"/>
+          <w:b w:val="0"/>
+          <w:color w:val="243746"/>
+          <w:sz w:val="18"/>
+        </w:rPr>
+        <w:t>提醒去重必须使用确定性计划时间，不能使用每次扫描的当前时间，否则唯一键无法命中同一次业务提醒。</w:t>
+      </w:r>
+    </w:p>
+    <w:p>
+      <w:pPr>
+        <w:pStyle w:val="ListBullet"/>
+        <w:spacing w:after="40"/>
+        <w:ind w:left="340" w:hanging="142"/>
+      </w:pPr>
+      <w:r>
+        <w:rPr>
+          <w:rFonts w:ascii="Aptos" w:hAnsi="Aptos" w:eastAsia="微软雅黑"/>
+          <w:b w:val="0"/>
+          <w:color w:val="243746"/>
+          <w:sz w:val="18"/>
+        </w:rPr>
+        <w:t>代码复核时发现“风险延期”若只保存延期时间仍会继续提醒；已在调度查询和处理逻辑中同时阻断延期窗口内的提醒。</w:t>
+      </w:r>
+    </w:p>
+    <w:p>
+      <w:pPr>
+        <w:pStyle w:val="ListBullet"/>
+        <w:spacing w:after="40"/>
+        <w:ind w:left="340" w:hanging="142"/>
+      </w:pPr>
+      <w:r>
+        <w:rPr>
+          <w:rFonts w:ascii="Aptos" w:hAnsi="Aptos" w:eastAsia="微软雅黑"/>
+          <w:b w:val="0"/>
+          <w:color w:val="243746"/>
+          <w:sz w:val="18"/>
+        </w:rPr>
+        <w:t>合同终止不能依赖调度器下一轮观察；采用 API 事务内批量取消义务与关闭风险，建立立即生效的不变量。</w:t>
+      </w:r>
+    </w:p>
+    <w:p>
+      <w:pPr>
+        <w:pStyle w:val="ListBullet"/>
+        <w:spacing w:after="40"/>
+        <w:ind w:left="340" w:hanging="142"/>
+      </w:pPr>
+      <w:r>
+        <w:rPr>
+          <w:rFonts w:ascii="Aptos" w:hAnsi="Aptos" w:eastAsia="微软雅黑"/>
+          <w:b w:val="0"/>
+          <w:color w:val="243746"/>
+          <w:sz w:val="18"/>
+        </w:rPr>
+        <w:t>调度进程需跨租户扫描，使用受限 worker 角色和明确表级授权；其 BYPASSRLS 权限被记录为需持续审计的生产风险。</w:t>
+      </w:r>
+    </w:p>
+    <w:p>
+      <w:pPr>
+        <w:pStyle w:val="ListBullet"/>
+        <w:spacing w:after="40"/>
+        <w:ind w:left="340" w:hanging="142"/>
+      </w:pPr>
+      <w:r>
+        <w:rPr>
+          <w:rFonts w:ascii="Aptos" w:hAnsi="Aptos" w:eastAsia="微软雅黑"/>
+          <w:b w:val="0"/>
+          <w:color w:val="243746"/>
+          <w:sz w:val="18"/>
+        </w:rPr>
+        <w:t>原审批流程缺少 approved 到 active 的公共入口；新增显式合同生效命令，避免履约模块绕过合同状态机。</w:t>
+      </w:r>
+    </w:p>
+    <w:p>
+      <w:pPr>
+        <w:pStyle w:val="Heading2"/>
+        <w:keepNext/>
+        <w:spacing w:before="100" w:after="60"/>
+      </w:pPr>
+      <w:r>
+        <w:rPr>
+          <w:rFonts w:ascii="Aptos" w:hAnsi="Aptos" w:eastAsia="微软雅黑"/>
+          <w:b/>
+          <w:color w:val="1F4E78"/>
+          <w:sz w:val="22"/>
+        </w:rPr>
+        <w:t>十四之五 验证结果</w:t>
+      </w:r>
+    </w:p>
+    <w:tbl>
+      <w:tblPr>
+        <w:tblStyle w:val="TableGrid"/>
+        <w:tblW w:type="auto" w:w="0"/>
+        <w:jc w:val="center"/>
+        <w:tblLayout w:type="fixed"/>
+        <w:tblLook w:firstColumn="1" w:firstRow="1" w:lastColumn="0" w:lastRow="0" w:noHBand="0" w:noVBand="1" w:val="04A0"/>
+      </w:tblPr>
+      <w:tblGrid>
+        <w:gridCol w:w="3331"/>
+        <w:gridCol w:w="3331"/>
+        <w:gridCol w:w="3331"/>
+      </w:tblGrid>
+      <w:tr>
+        <w:tc>
+          <w:tcPr>
+            <w:tcW w:type="dxa" w:w="2381"/>
+            <w:vAlign w:val="center"/>
+            <w:tcMar>
+              <w:top w:w="80" w:type="dxa"/>
+              <w:start w:w="100" w:type="dxa"/>
+              <w:bottom w:w="80" w:type="dxa"/>
+              <w:end w:w="100" w:type="dxa"/>
+            </w:tcMar>
+            <w:shd w:fill="1F4E78"/>
+          </w:tcPr>
+          <w:p>
+            <w:pPr>
+              <w:spacing w:before="0" w:after="0" w:line="240" w:lineRule="auto"/>
+            </w:pPr>
+            <w:r>
+              <w:rPr>
+                <w:rFonts w:ascii="Aptos" w:hAnsi="Aptos" w:eastAsia="微软雅黑"/>
+                <w:b/>
+                <w:color w:val="FFFFFF"/>
+                <w:sz w:val="17"/>
+              </w:rPr>
+            </w:r>
+            <w:r>
+              <w:rPr>
+                <w:rFonts w:ascii="Aptos" w:hAnsi="Aptos" w:eastAsia="微软雅黑"/>
+                <w:b/>
+                <w:color w:val="FFFFFF"/>
+                <w:sz w:val="17"/>
+              </w:rPr>
+              <w:t>验证项</w:t>
+            </w:r>
+          </w:p>
+        </w:tc>
+        <w:tc>
+          <w:tcPr>
+            <w:tcW w:type="dxa" w:w="1928"/>
+            <w:vAlign w:val="center"/>
+            <w:tcMar>
+              <w:top w:w="80" w:type="dxa"/>
+              <w:start w:w="100" w:type="dxa"/>
+              <w:bottom w:w="80" w:type="dxa"/>
+              <w:end w:w="100" w:type="dxa"/>
+            </w:tcMar>
+            <w:shd w:fill="1F4E78"/>
+          </w:tcPr>
+          <w:p>
+            <w:pPr>
+              <w:spacing w:before="0" w:after="0" w:line="240" w:lineRule="auto"/>
+            </w:pPr>
+            <w:r>
+              <w:rPr>
+                <w:rFonts w:ascii="Aptos" w:hAnsi="Aptos" w:eastAsia="微软雅黑"/>
+                <w:b/>
+                <w:color w:val="FFFFFF"/>
+                <w:sz w:val="17"/>
+              </w:rPr>
+            </w:r>
+            <w:r>
+              <w:rPr>
+                <w:rFonts w:ascii="Aptos" w:hAnsi="Aptos" w:eastAsia="微软雅黑"/>
+                <w:b/>
+                <w:color w:val="FFFFFF"/>
+                <w:sz w:val="17"/>
+              </w:rPr>
+              <w:t>结果</w:t>
+            </w:r>
+          </w:p>
+        </w:tc>
+        <w:tc>
+          <w:tcPr>
+            <w:tcW w:type="dxa" w:w="5556"/>
+            <w:vAlign w:val="center"/>
+            <w:tcMar>
+              <w:top w:w="80" w:type="dxa"/>
+              <w:start w:w="100" w:type="dxa"/>
+              <w:bottom w:w="80" w:type="dxa"/>
+              <w:end w:w="100" w:type="dxa"/>
+            </w:tcMar>
+            <w:shd w:fill="1F4E78"/>
+          </w:tcPr>
+          <w:p>
+            <w:pPr>
+              <w:spacing w:before="0" w:after="0" w:line="240" w:lineRule="auto"/>
+            </w:pPr>
+            <w:r>
+              <w:rPr>
+                <w:rFonts w:ascii="Aptos" w:hAnsi="Aptos" w:eastAsia="微软雅黑"/>
+                <w:b/>
+                <w:color w:val="FFFFFF"/>
+                <w:sz w:val="17"/>
+              </w:rPr>
+            </w:r>
+            <w:r>
+              <w:rPr>
+                <w:rFonts w:ascii="Aptos" w:hAnsi="Aptos" w:eastAsia="微软雅黑"/>
+                <w:b/>
+                <w:color w:val="FFFFFF"/>
+                <w:sz w:val="17"/>
+              </w:rPr>
+              <w:t>说明</w:t>
+            </w:r>
+          </w:p>
+        </w:tc>
+      </w:tr>
+      <w:tr>
+        <w:tc>
+          <w:tcPr>
+            <w:tcW w:type="dxa" w:w="2381"/>
+            <w:vAlign w:val="center"/>
+            <w:tcMar>
+              <w:top w:w="80" w:type="dxa"/>
+              <w:start w:w="100" w:type="dxa"/>
+              <w:bottom w:w="80" w:type="dxa"/>
+              <w:end w:w="100" w:type="dxa"/>
+            </w:tcMar>
+            <w:shd w:fill="FFFFFF"/>
+          </w:tcPr>
+          <w:p>
+            <w:pPr>
+              <w:spacing w:before="0" w:after="0" w:line="240" w:lineRule="auto"/>
+            </w:pPr>
+            <w:r>
+              <w:rPr>
+                <w:rFonts w:ascii="Aptos" w:hAnsi="Aptos" w:eastAsia="微软雅黑"/>
+                <w:b w:val="0"/>
+                <w:color w:val="243746"/>
+                <w:sz w:val="17"/>
+              </w:rPr>
+            </w:r>
+            <w:r>
+              <w:rPr>
+                <w:rFonts w:ascii="Aptos" w:hAnsi="Aptos" w:eastAsia="微软雅黑"/>
+                <w:b w:val="0"/>
+                <w:color w:val="243746"/>
+                <w:sz w:val="17"/>
+              </w:rPr>
+              <w:t>Ruff</w:t>
+            </w:r>
+          </w:p>
+        </w:tc>
+        <w:tc>
+          <w:tcPr>
+            <w:tcW w:type="dxa" w:w="1928"/>
+            <w:vAlign w:val="center"/>
+            <w:tcMar>
+              <w:top w:w="80" w:type="dxa"/>
+              <w:start w:w="100" w:type="dxa"/>
+              <w:bottom w:w="80" w:type="dxa"/>
+              <w:end w:w="100" w:type="dxa"/>
+            </w:tcMar>
+            <w:shd w:fill="FFFFFF"/>
+          </w:tcPr>
+          <w:p>
+            <w:pPr>
+              <w:spacing w:before="0" w:after="0" w:line="240" w:lineRule="auto"/>
+            </w:pPr>
+            <w:r>
+              <w:rPr>
+                <w:rFonts w:ascii="Aptos" w:hAnsi="Aptos" w:eastAsia="微软雅黑"/>
+                <w:b w:val="0"/>
+                <w:color w:val="243746"/>
+                <w:sz w:val="17"/>
+              </w:rPr>
+            </w:r>
+            <w:r>
+              <w:rPr>
+                <w:rFonts w:ascii="Aptos" w:hAnsi="Aptos" w:eastAsia="微软雅黑"/>
+                <w:b w:val="0"/>
+                <w:color w:val="243746"/>
+                <w:sz w:val="17"/>
+              </w:rPr>
+              <w:t>通过</w:t>
+            </w:r>
+          </w:p>
+        </w:tc>
+        <w:tc>
+          <w:tcPr>
+            <w:tcW w:type="dxa" w:w="5556"/>
+            <w:vAlign w:val="center"/>
+            <w:tcMar>
+              <w:top w:w="80" w:type="dxa"/>
+              <w:start w:w="100" w:type="dxa"/>
+              <w:bottom w:w="80" w:type="dxa"/>
+              <w:end w:w="100" w:type="dxa"/>
+            </w:tcMar>
+            <w:shd w:fill="FFFFFF"/>
+          </w:tcPr>
+          <w:p>
+            <w:pPr>
+              <w:spacing w:before="0" w:after="0" w:line="240" w:lineRule="auto"/>
+            </w:pPr>
+            <w:r>
+              <w:rPr>
+                <w:rFonts w:ascii="Aptos" w:hAnsi="Aptos" w:eastAsia="微软雅黑"/>
+                <w:b w:val="0"/>
+                <w:color w:val="243746"/>
+                <w:sz w:val="17"/>
+              </w:rPr>
+            </w:r>
+            <w:r>
+              <w:rPr>
+                <w:rFonts w:ascii="Aptos" w:hAnsi="Aptos" w:eastAsia="微软雅黑"/>
+                <w:b w:val="0"/>
+                <w:color w:val="243746"/>
+                <w:sz w:val="17"/>
+              </w:rPr>
+              <w:t>新增和既有 Python 代码无格式与静态规则问题。</w:t>
+            </w:r>
+          </w:p>
+        </w:tc>
+      </w:tr>
+      <w:tr>
+        <w:tc>
+          <w:tcPr>
+            <w:tcW w:type="dxa" w:w="2381"/>
+            <w:vAlign w:val="center"/>
+            <w:tcMar>
+              <w:top w:w="80" w:type="dxa"/>
+              <w:start w:w="100" w:type="dxa"/>
+              <w:bottom w:w="80" w:type="dxa"/>
+              <w:end w:w="100" w:type="dxa"/>
+            </w:tcMar>
+            <w:shd w:fill="EEF5FA"/>
+          </w:tcPr>
+          <w:p>
+            <w:pPr>
+              <w:spacing w:before="0" w:after="0" w:line="240" w:lineRule="auto"/>
+            </w:pPr>
+            <w:r>
+              <w:rPr>
+                <w:rFonts w:ascii="Aptos" w:hAnsi="Aptos" w:eastAsia="微软雅黑"/>
+                <w:b w:val="0"/>
+                <w:color w:val="243746"/>
+                <w:sz w:val="17"/>
+              </w:rPr>
+            </w:r>
+            <w:r>
+              <w:rPr>
+                <w:rFonts w:ascii="Aptos" w:hAnsi="Aptos" w:eastAsia="微软雅黑"/>
+                <w:b w:val="0"/>
+                <w:color w:val="243746"/>
+                <w:sz w:val="17"/>
+              </w:rPr>
+              <w:t>mypy strict</w:t>
+            </w:r>
+          </w:p>
+        </w:tc>
+        <w:tc>
+          <w:tcPr>
+            <w:tcW w:type="dxa" w:w="1928"/>
+            <w:vAlign w:val="center"/>
+            <w:tcMar>
+              <w:top w:w="80" w:type="dxa"/>
+              <w:start w:w="100" w:type="dxa"/>
+              <w:bottom w:w="80" w:type="dxa"/>
+              <w:end w:w="100" w:type="dxa"/>
+            </w:tcMar>
+            <w:shd w:fill="EEF5FA"/>
+          </w:tcPr>
+          <w:p>
+            <w:pPr>
+              <w:spacing w:before="0" w:after="0" w:line="240" w:lineRule="auto"/>
+            </w:pPr>
+            <w:r>
+              <w:rPr>
+                <w:rFonts w:ascii="Aptos" w:hAnsi="Aptos" w:eastAsia="微软雅黑"/>
+                <w:b w:val="0"/>
+                <w:color w:val="243746"/>
+                <w:sz w:val="17"/>
+              </w:rPr>
+            </w:r>
+            <w:r>
+              <w:rPr>
+                <w:rFonts w:ascii="Aptos" w:hAnsi="Aptos" w:eastAsia="微软雅黑"/>
+                <w:b w:val="0"/>
+                <w:color w:val="243746"/>
+                <w:sz w:val="17"/>
+              </w:rPr>
+              <w:t>通过</w:t>
+            </w:r>
+          </w:p>
+        </w:tc>
+        <w:tc>
+          <w:tcPr>
+            <w:tcW w:type="dxa" w:w="5556"/>
+            <w:vAlign w:val="center"/>
+            <w:tcMar>
+              <w:top w:w="80" w:type="dxa"/>
+              <w:start w:w="100" w:type="dxa"/>
+              <w:bottom w:w="80" w:type="dxa"/>
+              <w:end w:w="100" w:type="dxa"/>
+            </w:tcMar>
+            <w:shd w:fill="EEF5FA"/>
+          </w:tcPr>
+          <w:p>
+            <w:pPr>
+              <w:spacing w:before="0" w:after="0" w:line="240" w:lineRule="auto"/>
+            </w:pPr>
+            <w:r>
+              <w:rPr>
+                <w:rFonts w:ascii="Aptos" w:hAnsi="Aptos" w:eastAsia="微软雅黑"/>
+                <w:b w:val="0"/>
+                <w:color w:val="243746"/>
+                <w:sz w:val="17"/>
+              </w:rPr>
+            </w:r>
+            <w:r>
+              <w:rPr>
+                <w:rFonts w:ascii="Aptos" w:hAnsi="Aptos" w:eastAsia="微软雅黑"/>
+                <w:b w:val="0"/>
+                <w:color w:val="243746"/>
+                <w:sz w:val="17"/>
+              </w:rPr>
+              <w:t>38 个源文件类型检查无错误。</w:t>
+            </w:r>
+          </w:p>
+        </w:tc>
+      </w:tr>
+      <w:tr>
+        <w:tc>
+          <w:tcPr>
+            <w:tcW w:type="dxa" w:w="2381"/>
+            <w:vAlign w:val="center"/>
+            <w:tcMar>
+              <w:top w:w="80" w:type="dxa"/>
+              <w:start w:w="100" w:type="dxa"/>
+              <w:bottom w:w="80" w:type="dxa"/>
+              <w:end w:w="100" w:type="dxa"/>
+            </w:tcMar>
+            <w:shd w:fill="FFFFFF"/>
+          </w:tcPr>
+          <w:p>
+            <w:pPr>
+              <w:spacing w:before="0" w:after="0" w:line="240" w:lineRule="auto"/>
+            </w:pPr>
+            <w:r>
+              <w:rPr>
+                <w:rFonts w:ascii="Aptos" w:hAnsi="Aptos" w:eastAsia="微软雅黑"/>
+                <w:b w:val="0"/>
+                <w:color w:val="243746"/>
+                <w:sz w:val="17"/>
+              </w:rPr>
+            </w:r>
+            <w:r>
+              <w:rPr>
+                <w:rFonts w:ascii="Aptos" w:hAnsi="Aptos" w:eastAsia="微软雅黑"/>
+                <w:b w:val="0"/>
+                <w:color w:val="243746"/>
+                <w:sz w:val="17"/>
+              </w:rPr>
+              <w:t>pytest</w:t>
+            </w:r>
+          </w:p>
+        </w:tc>
+        <w:tc>
+          <w:tcPr>
+            <w:tcW w:type="dxa" w:w="1928"/>
+            <w:vAlign w:val="center"/>
+            <w:tcMar>
+              <w:top w:w="80" w:type="dxa"/>
+              <w:start w:w="100" w:type="dxa"/>
+              <w:bottom w:w="80" w:type="dxa"/>
+              <w:end w:w="100" w:type="dxa"/>
+            </w:tcMar>
+            <w:shd w:fill="FFFFFF"/>
+          </w:tcPr>
+          <w:p>
+            <w:pPr>
+              <w:spacing w:before="0" w:after="0" w:line="240" w:lineRule="auto"/>
+            </w:pPr>
+            <w:r>
+              <w:rPr>
+                <w:rFonts w:ascii="Aptos" w:hAnsi="Aptos" w:eastAsia="微软雅黑"/>
+                <w:b w:val="0"/>
+                <w:color w:val="243746"/>
+                <w:sz w:val="17"/>
+              </w:rPr>
+            </w:r>
+            <w:r>
+              <w:rPr>
+                <w:rFonts w:ascii="Aptos" w:hAnsi="Aptos" w:eastAsia="微软雅黑"/>
+                <w:b w:val="0"/>
+                <w:color w:val="243746"/>
+                <w:sz w:val="17"/>
+              </w:rPr>
+              <w:t>48 passed，10 skipped</w:t>
+            </w:r>
+          </w:p>
+        </w:tc>
+        <w:tc>
+          <w:tcPr>
+            <w:tcW w:type="dxa" w:w="5556"/>
+            <w:vAlign w:val="center"/>
+            <w:tcMar>
+              <w:top w:w="80" w:type="dxa"/>
+              <w:start w:w="100" w:type="dxa"/>
+              <w:bottom w:w="80" w:type="dxa"/>
+              <w:end w:w="100" w:type="dxa"/>
+            </w:tcMar>
+            <w:shd w:fill="FFFFFF"/>
+          </w:tcPr>
+          <w:p>
+            <w:pPr>
+              <w:spacing w:before="0" w:after="0" w:line="240" w:lineRule="auto"/>
+            </w:pPr>
+            <w:r>
+              <w:rPr>
+                <w:rFonts w:ascii="Aptos" w:hAnsi="Aptos" w:eastAsia="微软雅黑"/>
+                <w:b w:val="0"/>
+                <w:color w:val="243746"/>
+                <w:sz w:val="17"/>
+              </w:rPr>
+            </w:r>
+            <w:r>
+              <w:rPr>
+                <w:rFonts w:ascii="Aptos" w:hAnsi="Aptos" w:eastAsia="微软雅黑"/>
+                <w:b w:val="0"/>
+                <w:color w:val="243746"/>
+                <w:sz w:val="17"/>
+              </w:rPr>
+              <w:t>本地缺少 PostgreSQL/Redis 时仅跳过基础设施集成用例。</w:t>
+            </w:r>
+          </w:p>
+        </w:tc>
+      </w:tr>
+      <w:tr>
+        <w:tc>
+          <w:tcPr>
+            <w:tcW w:type="dxa" w:w="2381"/>
+            <w:vAlign w:val="center"/>
+            <w:tcMar>
+              <w:top w:w="80" w:type="dxa"/>
+              <w:start w:w="100" w:type="dxa"/>
+              <w:bottom w:w="80" w:type="dxa"/>
+              <w:end w:w="100" w:type="dxa"/>
+            </w:tcMar>
+            <w:shd w:fill="EEF5FA"/>
+          </w:tcPr>
+          <w:p>
+            <w:pPr>
+              <w:spacing w:before="0" w:after="0" w:line="240" w:lineRule="auto"/>
+            </w:pPr>
+            <w:r>
+              <w:rPr>
+                <w:rFonts w:ascii="Aptos" w:hAnsi="Aptos" w:eastAsia="微软雅黑"/>
+                <w:b w:val="0"/>
+                <w:color w:val="243746"/>
+                <w:sz w:val="17"/>
+              </w:rPr>
+            </w:r>
+            <w:r>
+              <w:rPr>
+                <w:rFonts w:ascii="Aptos" w:hAnsi="Aptos" w:eastAsia="微软雅黑"/>
+                <w:b w:val="0"/>
+                <w:color w:val="243746"/>
+                <w:sz w:val="17"/>
+              </w:rPr>
+              <w:t>项目检查脚本</w:t>
+            </w:r>
+          </w:p>
+        </w:tc>
+        <w:tc>
+          <w:tcPr>
+            <w:tcW w:type="dxa" w:w="1928"/>
+            <w:vAlign w:val="center"/>
+            <w:tcMar>
+              <w:top w:w="80" w:type="dxa"/>
+              <w:start w:w="100" w:type="dxa"/>
+              <w:bottom w:w="80" w:type="dxa"/>
+              <w:end w:w="100" w:type="dxa"/>
+            </w:tcMar>
+            <w:shd w:fill="EEF5FA"/>
+          </w:tcPr>
+          <w:p>
+            <w:pPr>
+              <w:spacing w:before="0" w:after="0" w:line="240" w:lineRule="auto"/>
+            </w:pPr>
+            <w:r>
+              <w:rPr>
+                <w:rFonts w:ascii="Aptos" w:hAnsi="Aptos" w:eastAsia="微软雅黑"/>
+                <w:b w:val="0"/>
+                <w:color w:val="243746"/>
+                <w:sz w:val="17"/>
+              </w:rPr>
+            </w:r>
+            <w:r>
+              <w:rPr>
+                <w:rFonts w:ascii="Aptos" w:hAnsi="Aptos" w:eastAsia="微软雅黑"/>
+                <w:b w:val="0"/>
+                <w:color w:val="243746"/>
+                <w:sz w:val="17"/>
+              </w:rPr>
+              <w:t>通过</w:t>
+            </w:r>
+          </w:p>
+        </w:tc>
+        <w:tc>
+          <w:tcPr>
+            <w:tcW w:type="dxa" w:w="5556"/>
+            <w:vAlign w:val="center"/>
+            <w:tcMar>
+              <w:top w:w="80" w:type="dxa"/>
+              <w:start w:w="100" w:type="dxa"/>
+              <w:bottom w:w="80" w:type="dxa"/>
+              <w:end w:w="100" w:type="dxa"/>
+            </w:tcMar>
+            <w:shd w:fill="EEF5FA"/>
+          </w:tcPr>
+          <w:p>
+            <w:pPr>
+              <w:spacing w:before="0" w:after="0" w:line="240" w:lineRule="auto"/>
+            </w:pPr>
+            <w:r>
+              <w:rPr>
+                <w:rFonts w:ascii="Aptos" w:hAnsi="Aptos" w:eastAsia="微软雅黑"/>
+                <w:b w:val="0"/>
+                <w:color w:val="243746"/>
+                <w:sz w:val="17"/>
+              </w:rPr>
+            </w:r>
+            <w:r>
+              <w:rPr>
+                <w:rFonts w:ascii="Aptos" w:hAnsi="Aptos" w:eastAsia="微软雅黑"/>
+                <w:b w:val="0"/>
+                <w:color w:val="243746"/>
+                <w:sz w:val="17"/>
+              </w:rPr>
+              <w:t>配置、迁移清单、Compose 与仓库约束检查通过。</w:t>
+            </w:r>
+          </w:p>
+        </w:tc>
+      </w:tr>
+      <w:tr>
+        <w:tc>
+          <w:tcPr>
+            <w:tcW w:type="dxa" w:w="2381"/>
+            <w:vAlign w:val="center"/>
+            <w:tcMar>
+              <w:top w:w="80" w:type="dxa"/>
+              <w:start w:w="100" w:type="dxa"/>
+              <w:bottom w:w="80" w:type="dxa"/>
+              <w:end w:w="100" w:type="dxa"/>
+            </w:tcMar>
+            <w:shd w:fill="FFFFFF"/>
+          </w:tcPr>
+          <w:p>
+            <w:pPr>
+              <w:spacing w:before="0" w:after="0" w:line="240" w:lineRule="auto"/>
+            </w:pPr>
+            <w:r>
+              <w:rPr>
+                <w:rFonts w:ascii="Aptos" w:hAnsi="Aptos" w:eastAsia="微软雅黑"/>
+                <w:b w:val="0"/>
+                <w:color w:val="243746"/>
+                <w:sz w:val="17"/>
+              </w:rPr>
+            </w:r>
+            <w:r>
+              <w:rPr>
+                <w:rFonts w:ascii="Aptos" w:hAnsi="Aptos" w:eastAsia="微软雅黑"/>
+                <w:b w:val="0"/>
+                <w:color w:val="243746"/>
+                <w:sz w:val="17"/>
+              </w:rPr>
+              <w:t>PostgreSQL 迁移与验收</w:t>
+            </w:r>
+          </w:p>
+        </w:tc>
+        <w:tc>
+          <w:tcPr>
+            <w:tcW w:type="dxa" w:w="1928"/>
+            <w:vAlign w:val="center"/>
+            <w:tcMar>
+              <w:top w:w="80" w:type="dxa"/>
+              <w:start w:w="100" w:type="dxa"/>
+              <w:bottom w:w="80" w:type="dxa"/>
+              <w:end w:w="100" w:type="dxa"/>
+            </w:tcMar>
+            <w:shd w:fill="FFFFFF"/>
+          </w:tcPr>
+          <w:p>
+            <w:pPr>
+              <w:spacing w:before="0" w:after="0" w:line="240" w:lineRule="auto"/>
+            </w:pPr>
+            <w:r>
+              <w:rPr>
+                <w:rFonts w:ascii="Aptos" w:hAnsi="Aptos" w:eastAsia="微软雅黑"/>
+                <w:b w:val="0"/>
+                <w:color w:val="243746"/>
+                <w:sz w:val="17"/>
+              </w:rPr>
+            </w:r>
+            <w:r>
+              <w:rPr>
+                <w:rFonts w:ascii="Aptos" w:hAnsi="Aptos" w:eastAsia="微软雅黑"/>
+                <w:b w:val="0"/>
+                <w:color w:val="243746"/>
+                <w:sz w:val="17"/>
+              </w:rPr>
+              <w:t>待远程 CI</w:t>
+            </w:r>
+          </w:p>
+        </w:tc>
+        <w:tc>
+          <w:tcPr>
+            <w:tcW w:type="dxa" w:w="5556"/>
+            <w:vAlign w:val="center"/>
+            <w:tcMar>
+              <w:top w:w="80" w:type="dxa"/>
+              <w:start w:w="100" w:type="dxa"/>
+              <w:bottom w:w="80" w:type="dxa"/>
+              <w:end w:w="100" w:type="dxa"/>
+            </w:tcMar>
+            <w:shd w:fill="FFFFFF"/>
+          </w:tcPr>
+          <w:p>
+            <w:pPr>
+              <w:spacing w:before="0" w:after="0" w:line="240" w:lineRule="auto"/>
+            </w:pPr>
+            <w:r>
+              <w:rPr>
+                <w:rFonts w:ascii="Aptos" w:hAnsi="Aptos" w:eastAsia="微软雅黑"/>
+                <w:b w:val="0"/>
+                <w:color w:val="243746"/>
+                <w:sz w:val="17"/>
+              </w:rPr>
+            </w:r>
+            <w:r>
+              <w:rPr>
+                <w:rFonts w:ascii="Aptos" w:hAnsi="Aptos" w:eastAsia="微软雅黑"/>
+                <w:b w:val="0"/>
+                <w:color w:val="243746"/>
+                <w:sz w:val="17"/>
+              </w:rPr>
+              <w:t>网络恢复后由 PR 环境执行升级/降级及完整集成场景。</w:t>
+            </w:r>
+          </w:p>
+        </w:tc>
+      </w:tr>
+      <w:tr>
+        <w:tc>
+          <w:tcPr>
+            <w:tcW w:type="dxa" w:w="2381"/>
+            <w:vAlign w:val="center"/>
+            <w:tcMar>
+              <w:top w:w="80" w:type="dxa"/>
+              <w:start w:w="100" w:type="dxa"/>
+              <w:bottom w:w="80" w:type="dxa"/>
+              <w:end w:w="100" w:type="dxa"/>
+            </w:tcMar>
+            <w:shd w:fill="EEF5FA"/>
+          </w:tcPr>
+          <w:p>
+            <w:pPr>
+              <w:spacing w:before="0" w:after="0" w:line="240" w:lineRule="auto"/>
+            </w:pPr>
+            <w:r>
+              <w:rPr>
+                <w:rFonts w:ascii="Aptos" w:hAnsi="Aptos" w:eastAsia="微软雅黑"/>
+                <w:b w:val="0"/>
+                <w:color w:val="243746"/>
+                <w:sz w:val="17"/>
+              </w:rPr>
+            </w:r>
+            <w:r>
+              <w:rPr>
+                <w:rFonts w:ascii="Aptos" w:hAnsi="Aptos" w:eastAsia="微软雅黑"/>
+                <w:b w:val="0"/>
+                <w:color w:val="243746"/>
+                <w:sz w:val="17"/>
+              </w:rPr>
+              <w:t>Word 渲染</w:t>
+            </w:r>
+          </w:p>
+        </w:tc>
+        <w:tc>
+          <w:tcPr>
+            <w:tcW w:type="dxa" w:w="1928"/>
+            <w:vAlign w:val="center"/>
+            <w:tcMar>
+              <w:top w:w="80" w:type="dxa"/>
+              <w:start w:w="100" w:type="dxa"/>
+              <w:bottom w:w="80" w:type="dxa"/>
+              <w:end w:w="100" w:type="dxa"/>
+            </w:tcMar>
+            <w:shd w:fill="EEF5FA"/>
+          </w:tcPr>
+          <w:p>
+            <w:r>
+              <w:t>通过</w:t>
+            </w:r>
+          </w:p>
+        </w:tc>
+        <w:tc>
+          <w:tcPr>
+            <w:tcW w:type="dxa" w:w="5556"/>
+            <w:vAlign w:val="center"/>
+            <w:tcMar>
+              <w:top w:w="80" w:type="dxa"/>
+              <w:start w:w="100" w:type="dxa"/>
+              <w:bottom w:w="80" w:type="dxa"/>
+              <w:end w:w="100" w:type="dxa"/>
+            </w:tcMar>
+            <w:shd w:fill="EEF5FA"/>
+          </w:tcPr>
+          <w:p>
+            <w:r>
+              <w:t>使用文档运行时渲染 35 页并逐页检查；标题、表格、分页和页眉版本无溢出或遮挡。</w:t>
+            </w:r>
+          </w:p>
+        </w:tc>
+      </w:tr>
+    </w:tbl>
+    <w:p>
+      <w:pPr>
+        <w:pStyle w:val="Heading2"/>
+        <w:keepNext/>
+        <w:spacing w:before="100" w:after="60"/>
+      </w:pPr>
+      <w:r>
+        <w:rPr>
+          <w:rFonts w:ascii="Aptos" w:hAnsi="Aptos" w:eastAsia="微软雅黑"/>
+          <w:b/>
+          <w:color w:val="1F4E78"/>
+          <w:sz w:val="22"/>
+        </w:rPr>
+        <w:t>十四之六 遗留风险和下一步</w:t>
+      </w:r>
+    </w:p>
+    <w:p>
+      <w:pPr>
+        <w:pStyle w:val="ListBullet"/>
+        <w:spacing w:after="40"/>
+        <w:ind w:left="340" w:hanging="142"/>
+      </w:pPr>
+      <w:r>
+        <w:rPr>
+          <w:rFonts w:ascii="Aptos" w:hAnsi="Aptos" w:eastAsia="微软雅黑"/>
+          <w:b w:val="0"/>
+          <w:color w:val="243746"/>
+          <w:sz w:val="18"/>
+        </w:rPr>
+        <w:t>GitHub 网络与身份验证暂不可用，M3 文档提交和 M4 分支尚未推送；恢复后应按 M3、M4 顺序推送、跑完 CI 并自动合并。</w:t>
+      </w:r>
+    </w:p>
+    <w:p>
+      <w:pPr>
+        <w:pStyle w:val="ListBullet"/>
+        <w:spacing w:after="40"/>
+        <w:ind w:left="340" w:hanging="142"/>
+      </w:pPr>
+      <w:r>
+        <w:rPr>
+          <w:rFonts w:ascii="Aptos" w:hAnsi="Aptos" w:eastAsia="微软雅黑"/>
+          <w:b w:val="0"/>
+          <w:color w:val="243746"/>
+          <w:sz w:val="18"/>
+        </w:rPr>
+        <w:t>本地没有 PostgreSQL 容器，0005 迁移往返和并发租约验收以远程 CI 结果为最终证据。</w:t>
+      </w:r>
+    </w:p>
+    <w:p>
+      <w:pPr>
+        <w:pStyle w:val="ListBullet"/>
+        <w:spacing w:after="40"/>
+        <w:ind w:left="340" w:hanging="142"/>
+      </w:pPr>
+      <w:r>
+        <w:rPr>
+          <w:rFonts w:ascii="Aptos" w:hAnsi="Aptos" w:eastAsia="微软雅黑"/>
+          <w:b w:val="0"/>
+          <w:color w:val="243746"/>
+          <w:sz w:val="18"/>
+        </w:rPr>
+        <w:t>生产部署需要统一 UTC 时钟并监控租约积压、最老到期时间和抢占失败率。</w:t>
+      </w:r>
+    </w:p>
+    <w:p>
+      <w:pPr>
+        <w:pStyle w:val="ListBullet"/>
+        <w:spacing w:after="40"/>
+        <w:ind w:left="340" w:hanging="142"/>
+      </w:pPr>
+      <w:r>
+        <w:rPr>
+          <w:rFonts w:ascii="Aptos" w:hAnsi="Aptos" w:eastAsia="微软雅黑"/>
+          <w:b w:val="0"/>
+          <w:color w:val="243746"/>
+          <w:sz w:val="18"/>
+        </w:rPr>
+        <w:t>当前风险阈值写在领域规则中；M5 后续可纳入租户级策略配置和审计可观测性。</w:t>
+      </w:r>
+    </w:p>
+    <w:p>
+      <w:pPr>
+        <w:pStyle w:val="Heading1"/>
+        <w:keepNext/>
         <w:keepLines/>
       </w:pPr>
       <w:r>
@@ -22087,7 +24976,7 @@
           <w:color w:val="000000"/>
           <w:sz w:val="32"/>
         </w:rPr>
-        <w:t>十四 当前决策记录</w:t>
+        <w:t>十五 当前决策记录</w:t>
       </w:r>
     </w:p>
     <w:tbl>
@@ -24663,6 +27552,576 @@
           </w:p>
         </w:tc>
       </w:tr>
+      <w:tr>
+        <w:tc>
+          <w:tcPr>
+            <w:tcW w:type="dxa" w:w="2498"/>
+            <w:vAlign w:val="center"/>
+            <w:tcMar>
+              <w:top w:w="80" w:type="dxa"/>
+              <w:start w:w="100" w:type="dxa"/>
+              <w:bottom w:w="80" w:type="dxa"/>
+              <w:end w:w="100" w:type="dxa"/>
+            </w:tcMar>
+            <w:shd w:fill="FFFFFF"/>
+          </w:tcPr>
+          <w:p>
+            <w:pPr>
+              <w:spacing w:before="0" w:after="0" w:line="240" w:lineRule="auto"/>
+            </w:pPr>
+            <w:r/>
+            <w:r>
+              <w:rPr>
+                <w:rFonts w:ascii="Aptos" w:hAnsi="Aptos" w:eastAsia="微软雅黑"/>
+                <w:b w:val="0"/>
+                <w:color w:val="243746"/>
+                <w:sz w:val="17"/>
+              </w:rPr>
+              <w:t>ADR 026</w:t>
+            </w:r>
+          </w:p>
+        </w:tc>
+        <w:tc>
+          <w:tcPr>
+            <w:tcW w:type="dxa" w:w="2498"/>
+            <w:vAlign w:val="center"/>
+            <w:tcMar>
+              <w:top w:w="80" w:type="dxa"/>
+              <w:start w:w="100" w:type="dxa"/>
+              <w:bottom w:w="80" w:type="dxa"/>
+              <w:end w:w="100" w:type="dxa"/>
+            </w:tcMar>
+            <w:shd w:fill="FFFFFF"/>
+          </w:tcPr>
+          <w:p>
+            <w:pPr>
+              <w:spacing w:before="0" w:after="0" w:line="240" w:lineRule="auto"/>
+            </w:pPr>
+            <w:r/>
+            <w:r>
+              <w:rPr>
+                <w:rFonts w:ascii="Aptos" w:hAnsi="Aptos" w:eastAsia="微软雅黑"/>
+                <w:b w:val="0"/>
+                <w:color w:val="243746"/>
+                <w:sz w:val="17"/>
+              </w:rPr>
+              <w:t>到期任务采用 PostgreSQL 租约与 SKIP LOCKED</w:t>
+            </w:r>
+          </w:p>
+        </w:tc>
+        <w:tc>
+          <w:tcPr>
+            <w:tcW w:type="dxa" w:w="2498"/>
+            <w:vAlign w:val="center"/>
+            <w:tcMar>
+              <w:top w:w="80" w:type="dxa"/>
+              <w:start w:w="100" w:type="dxa"/>
+              <w:bottom w:w="80" w:type="dxa"/>
+              <w:end w:w="100" w:type="dxa"/>
+            </w:tcMar>
+            <w:shd w:fill="FFFFFF"/>
+          </w:tcPr>
+          <w:p>
+            <w:pPr>
+              <w:spacing w:before="0" w:after="0" w:line="240" w:lineRule="auto"/>
+            </w:pPr>
+            <w:r/>
+            <w:r>
+              <w:rPr>
+                <w:rFonts w:ascii="Aptos" w:hAnsi="Aptos" w:eastAsia="微软雅黑"/>
+                <w:b w:val="0"/>
+                <w:color w:val="243746"/>
+                <w:sz w:val="17"/>
+              </w:rPr>
+              <w:t>接受数据库扫描成本，换取持久恢复和多实例安全领取</w:t>
+            </w:r>
+          </w:p>
+        </w:tc>
+        <w:tc>
+          <w:tcPr>
+            <w:tcW w:type="dxa" w:w="2498"/>
+            <w:vAlign w:val="center"/>
+            <w:tcMar>
+              <w:top w:w="80" w:type="dxa"/>
+              <w:start w:w="100" w:type="dxa"/>
+              <w:bottom w:w="80" w:type="dxa"/>
+              <w:end w:w="100" w:type="dxa"/>
+            </w:tcMar>
+            <w:shd w:fill="FFFFFF"/>
+          </w:tcPr>
+          <w:p>
+            <w:pPr>
+              <w:spacing w:before="0" w:after="0" w:line="240" w:lineRule="auto"/>
+            </w:pPr>
+            <w:r/>
+            <w:r>
+              <w:rPr>
+                <w:rFonts w:ascii="Aptos" w:hAnsi="Aptos" w:eastAsia="微软雅黑"/>
+                <w:b w:val="0"/>
+                <w:color w:val="243746"/>
+                <w:sz w:val="17"/>
+              </w:rPr>
+              <w:t>义务规模或扫描延迟超过单库容量时重新评估</w:t>
+            </w:r>
+          </w:p>
+        </w:tc>
+      </w:tr>
+      <w:tr>
+        <w:tc>
+          <w:tcPr>
+            <w:tcW w:type="dxa" w:w="2498"/>
+            <w:vAlign w:val="center"/>
+            <w:tcMar>
+              <w:top w:w="80" w:type="dxa"/>
+              <w:start w:w="100" w:type="dxa"/>
+              <w:bottom w:w="80" w:type="dxa"/>
+              <w:end w:w="100" w:type="dxa"/>
+            </w:tcMar>
+            <w:shd w:fill="EEF5FA"/>
+          </w:tcPr>
+          <w:p>
+            <w:pPr>
+              <w:spacing w:before="0" w:after="0" w:line="240" w:lineRule="auto"/>
+            </w:pPr>
+            <w:r/>
+            <w:r>
+              <w:rPr>
+                <w:rFonts w:ascii="Aptos" w:hAnsi="Aptos" w:eastAsia="微软雅黑"/>
+                <w:b w:val="0"/>
+                <w:color w:val="243746"/>
+                <w:sz w:val="17"/>
+              </w:rPr>
+              <w:t>ADR 027</w:t>
+            </w:r>
+          </w:p>
+        </w:tc>
+        <w:tc>
+          <w:tcPr>
+            <w:tcW w:type="dxa" w:w="2498"/>
+            <w:vAlign w:val="center"/>
+            <w:tcMar>
+              <w:top w:w="80" w:type="dxa"/>
+              <w:start w:w="100" w:type="dxa"/>
+              <w:bottom w:w="80" w:type="dxa"/>
+              <w:end w:w="100" w:type="dxa"/>
+            </w:tcMar>
+            <w:shd w:fill="EEF5FA"/>
+          </w:tcPr>
+          <w:p>
+            <w:pPr>
+              <w:spacing w:before="0" w:after="0" w:line="240" w:lineRule="auto"/>
+            </w:pPr>
+            <w:r/>
+            <w:r>
+              <w:rPr>
+                <w:rFonts w:ascii="Aptos" w:hAnsi="Aptos" w:eastAsia="微软雅黑"/>
+                <w:b w:val="0"/>
+                <w:color w:val="243746"/>
+                <w:sz w:val="17"/>
+              </w:rPr>
+              <w:t>提醒由数据库业务唯一键去重</w:t>
+            </w:r>
+          </w:p>
+        </w:tc>
+        <w:tc>
+          <w:tcPr>
+            <w:tcW w:type="dxa" w:w="2498"/>
+            <w:vAlign w:val="center"/>
+            <w:tcMar>
+              <w:top w:w="80" w:type="dxa"/>
+              <w:start w:w="100" w:type="dxa"/>
+              <w:bottom w:w="80" w:type="dxa"/>
+              <w:end w:w="100" w:type="dxa"/>
+            </w:tcMar>
+            <w:shd w:fill="EEF5FA"/>
+          </w:tcPr>
+          <w:p>
+            <w:pPr>
+              <w:spacing w:before="0" w:after="0" w:line="240" w:lineRule="auto"/>
+            </w:pPr>
+            <w:r/>
+            <w:r>
+              <w:rPr>
+                <w:rFonts w:ascii="Aptos" w:hAnsi="Aptos" w:eastAsia="微软雅黑"/>
+                <w:b w:val="0"/>
+                <w:color w:val="243746"/>
+                <w:sz w:val="17"/>
+              </w:rPr>
+              <w:t>去重必须跨进程、跨重启，不能依赖本地缓存</w:t>
+            </w:r>
+          </w:p>
+        </w:tc>
+        <w:tc>
+          <w:tcPr>
+            <w:tcW w:type="dxa" w:w="2498"/>
+            <w:vAlign w:val="center"/>
+            <w:tcMar>
+              <w:top w:w="80" w:type="dxa"/>
+              <w:start w:w="100" w:type="dxa"/>
+              <w:bottom w:w="80" w:type="dxa"/>
+              <w:end w:w="100" w:type="dxa"/>
+            </w:tcMar>
+            <w:shd w:fill="EEF5FA"/>
+          </w:tcPr>
+          <w:p>
+            <w:pPr>
+              <w:spacing w:before="0" w:after="0" w:line="240" w:lineRule="auto"/>
+            </w:pPr>
+            <w:r/>
+            <w:r>
+              <w:rPr>
+                <w:rFonts w:ascii="Aptos" w:hAnsi="Aptos" w:eastAsia="微软雅黑"/>
+                <w:b w:val="0"/>
+                <w:color w:val="243746"/>
+                <w:sz w:val="17"/>
+              </w:rPr>
+              <w:t>提醒需要撤销、重排或多渠道独立版本时重新评估</w:t>
+            </w:r>
+          </w:p>
+        </w:tc>
+      </w:tr>
+      <w:tr>
+        <w:tc>
+          <w:tcPr>
+            <w:tcW w:type="dxa" w:w="2498"/>
+            <w:vAlign w:val="center"/>
+            <w:tcMar>
+              <w:top w:w="80" w:type="dxa"/>
+              <w:start w:w="100" w:type="dxa"/>
+              <w:bottom w:w="80" w:type="dxa"/>
+              <w:end w:w="100" w:type="dxa"/>
+            </w:tcMar>
+            <w:shd w:fill="FFFFFF"/>
+          </w:tcPr>
+          <w:p>
+            <w:pPr>
+              <w:spacing w:before="0" w:after="0" w:line="240" w:lineRule="auto"/>
+            </w:pPr>
+            <w:r/>
+            <w:r>
+              <w:rPr>
+                <w:rFonts w:ascii="Aptos" w:hAnsi="Aptos" w:eastAsia="微软雅黑"/>
+                <w:b w:val="0"/>
+                <w:color w:val="243746"/>
+                <w:sz w:val="17"/>
+              </w:rPr>
+              <w:t>ADR 028</w:t>
+            </w:r>
+          </w:p>
+        </w:tc>
+        <w:tc>
+          <w:tcPr>
+            <w:tcW w:type="dxa" w:w="2498"/>
+            <w:vAlign w:val="center"/>
+            <w:tcMar>
+              <w:top w:w="80" w:type="dxa"/>
+              <w:start w:w="100" w:type="dxa"/>
+              <w:bottom w:w="80" w:type="dxa"/>
+              <w:end w:w="100" w:type="dxa"/>
+            </w:tcMar>
+            <w:shd w:fill="FFFFFF"/>
+          </w:tcPr>
+          <w:p>
+            <w:pPr>
+              <w:spacing w:before="0" w:after="0" w:line="240" w:lineRule="auto"/>
+            </w:pPr>
+            <w:r/>
+            <w:r>
+              <w:rPr>
+                <w:rFonts w:ascii="Aptos" w:hAnsi="Aptos" w:eastAsia="微软雅黑"/>
+                <w:b w:val="0"/>
+                <w:color w:val="243746"/>
+                <w:sz w:val="17"/>
+              </w:rPr>
+              <w:t>风险事件自动发现、人工确认处置</w:t>
+            </w:r>
+          </w:p>
+        </w:tc>
+        <w:tc>
+          <w:tcPr>
+            <w:tcW w:type="dxa" w:w="2498"/>
+            <w:vAlign w:val="center"/>
+            <w:tcMar>
+              <w:top w:w="80" w:type="dxa"/>
+              <w:start w:w="100" w:type="dxa"/>
+              <w:bottom w:w="80" w:type="dxa"/>
+              <w:end w:w="100" w:type="dxa"/>
+            </w:tcMar>
+            <w:shd w:fill="FFFFFF"/>
+          </w:tcPr>
+          <w:p>
+            <w:pPr>
+              <w:spacing w:before="0" w:after="0" w:line="240" w:lineRule="auto"/>
+            </w:pPr>
+            <w:r/>
+            <w:r>
+              <w:rPr>
+                <w:rFonts w:ascii="Aptos" w:hAnsi="Aptos" w:eastAsia="微软雅黑"/>
+                <w:b w:val="0"/>
+                <w:color w:val="243746"/>
+                <w:sz w:val="17"/>
+              </w:rPr>
+              <w:t>自动化负责发现和升级，不代替法务作最终风险判断</w:t>
+            </w:r>
+          </w:p>
+        </w:tc>
+        <w:tc>
+          <w:tcPr>
+            <w:tcW w:type="dxa" w:w="2498"/>
+            <w:vAlign w:val="center"/>
+            <w:tcMar>
+              <w:top w:w="80" w:type="dxa"/>
+              <w:start w:w="100" w:type="dxa"/>
+              <w:bottom w:w="80" w:type="dxa"/>
+              <w:end w:w="100" w:type="dxa"/>
+            </w:tcMar>
+            <w:shd w:fill="FFFFFF"/>
+          </w:tcPr>
+          <w:p>
+            <w:pPr>
+              <w:spacing w:before="0" w:after="0" w:line="240" w:lineRule="auto"/>
+            </w:pPr>
+            <w:r/>
+            <w:r>
+              <w:rPr>
+                <w:rFonts w:ascii="Aptos" w:hAnsi="Aptos" w:eastAsia="微软雅黑"/>
+                <w:b w:val="0"/>
+                <w:color w:val="243746"/>
+                <w:sz w:val="17"/>
+              </w:rPr>
+              <w:t>风险策略经治理后允许全自动处置时重新评估</w:t>
+            </w:r>
+          </w:p>
+        </w:tc>
+      </w:tr>
+      <w:tr>
+        <w:tc>
+          <w:tcPr>
+            <w:tcW w:type="dxa" w:w="2498"/>
+            <w:vAlign w:val="center"/>
+            <w:tcMar>
+              <w:top w:w="80" w:type="dxa"/>
+              <w:start w:w="100" w:type="dxa"/>
+              <w:bottom w:w="80" w:type="dxa"/>
+              <w:end w:w="100" w:type="dxa"/>
+            </w:tcMar>
+            <w:shd w:fill="EEF5FA"/>
+          </w:tcPr>
+          <w:p>
+            <w:pPr>
+              <w:spacing w:before="0" w:after="0" w:line="240" w:lineRule="auto"/>
+            </w:pPr>
+            <w:r/>
+            <w:r>
+              <w:rPr>
+                <w:rFonts w:ascii="Aptos" w:hAnsi="Aptos" w:eastAsia="微软雅黑"/>
+                <w:b w:val="0"/>
+                <w:color w:val="243746"/>
+                <w:sz w:val="17"/>
+              </w:rPr>
+              <w:t>ADR 029</w:t>
+            </w:r>
+          </w:p>
+        </w:tc>
+        <w:tc>
+          <w:tcPr>
+            <w:tcW w:type="dxa" w:w="2498"/>
+            <w:vAlign w:val="center"/>
+            <w:tcMar>
+              <w:top w:w="80" w:type="dxa"/>
+              <w:start w:w="100" w:type="dxa"/>
+              <w:bottom w:w="80" w:type="dxa"/>
+              <w:end w:w="100" w:type="dxa"/>
+            </w:tcMar>
+            <w:shd w:fill="EEF5FA"/>
+          </w:tcPr>
+          <w:p>
+            <w:pPr>
+              <w:spacing w:before="0" w:after="0" w:line="240" w:lineRule="auto"/>
+            </w:pPr>
+            <w:r/>
+            <w:r>
+              <w:rPr>
+                <w:rFonts w:ascii="Aptos" w:hAnsi="Aptos" w:eastAsia="微软雅黑"/>
+                <w:b w:val="0"/>
+                <w:color w:val="243746"/>
+                <w:sz w:val="17"/>
+              </w:rPr>
+              <w:t>合同终止事务内取消后续履约</w:t>
+            </w:r>
+          </w:p>
+        </w:tc>
+        <w:tc>
+          <w:tcPr>
+            <w:tcW w:type="dxa" w:w="2498"/>
+            <w:vAlign w:val="center"/>
+            <w:tcMar>
+              <w:top w:w="80" w:type="dxa"/>
+              <w:start w:w="100" w:type="dxa"/>
+              <w:bottom w:w="80" w:type="dxa"/>
+              <w:end w:w="100" w:type="dxa"/>
+            </w:tcMar>
+            <w:shd w:fill="EEF5FA"/>
+          </w:tcPr>
+          <w:p>
+            <w:pPr>
+              <w:spacing w:before="0" w:after="0" w:line="240" w:lineRule="auto"/>
+            </w:pPr>
+            <w:r/>
+            <w:r>
+              <w:rPr>
+                <w:rFonts w:ascii="Aptos" w:hAnsi="Aptos" w:eastAsia="微软雅黑"/>
+                <w:b w:val="0"/>
+                <w:color w:val="243746"/>
+                <w:sz w:val="17"/>
+              </w:rPr>
+              <w:t>将“不再提醒”固化为写入后立即成立的业务不变量</w:t>
+            </w:r>
+          </w:p>
+        </w:tc>
+        <w:tc>
+          <w:tcPr>
+            <w:tcW w:type="dxa" w:w="2498"/>
+            <w:vAlign w:val="center"/>
+            <w:tcMar>
+              <w:top w:w="80" w:type="dxa"/>
+              <w:start w:w="100" w:type="dxa"/>
+              <w:bottom w:w="80" w:type="dxa"/>
+              <w:end w:w="100" w:type="dxa"/>
+            </w:tcMar>
+            <w:shd w:fill="EEF5FA"/>
+          </w:tcPr>
+          <w:p>
+            <w:pPr>
+              <w:spacing w:before="0" w:after="0" w:line="240" w:lineRule="auto"/>
+            </w:pPr>
+            <w:r/>
+            <w:r>
+              <w:rPr>
+                <w:rFonts w:ascii="Aptos" w:hAnsi="Aptos" w:eastAsia="微软雅黑"/>
+                <w:b w:val="0"/>
+                <w:color w:val="243746"/>
+                <w:sz w:val="17"/>
+              </w:rPr>
+              <w:t>终止流程拆分为外部编排或 Saga 时重新评估</w:t>
+            </w:r>
+          </w:p>
+        </w:tc>
+      </w:tr>
+      <w:tr>
+        <w:tc>
+          <w:tcPr>
+            <w:tcW w:type="dxa" w:w="2498"/>
+            <w:vAlign w:val="center"/>
+            <w:tcMar>
+              <w:top w:w="80" w:type="dxa"/>
+              <w:start w:w="100" w:type="dxa"/>
+              <w:bottom w:w="80" w:type="dxa"/>
+              <w:end w:w="100" w:type="dxa"/>
+            </w:tcMar>
+            <w:shd w:fill="FFFFFF"/>
+          </w:tcPr>
+          <w:p>
+            <w:pPr>
+              <w:spacing w:before="0" w:after="0" w:line="240" w:lineRule="auto"/>
+            </w:pPr>
+            <w:r/>
+            <w:r>
+              <w:rPr>
+                <w:rFonts w:ascii="Aptos" w:hAnsi="Aptos" w:eastAsia="微软雅黑"/>
+                <w:b w:val="0"/>
+                <w:color w:val="243746"/>
+                <w:sz w:val="17"/>
+              </w:rPr>
+              <w:t>ADR 030</w:t>
+            </w:r>
+          </w:p>
+        </w:tc>
+        <w:tc>
+          <w:tcPr>
+            <w:tcW w:type="dxa" w:w="2498"/>
+            <w:vAlign w:val="center"/>
+            <w:tcMar>
+              <w:top w:w="80" w:type="dxa"/>
+              <w:start w:w="100" w:type="dxa"/>
+              <w:bottom w:w="80" w:type="dxa"/>
+              <w:end w:w="100" w:type="dxa"/>
+            </w:tcMar>
+            <w:shd w:fill="FFFFFF"/>
+          </w:tcPr>
+          <w:p>
+            <w:pPr>
+              <w:spacing w:before="0" w:after="0" w:line="240" w:lineRule="auto"/>
+            </w:pPr>
+            <w:r/>
+            <w:r>
+              <w:rPr>
+                <w:rFonts w:ascii="Aptos" w:hAnsi="Aptos" w:eastAsia="微软雅黑"/>
+                <w:b w:val="0"/>
+                <w:color w:val="243746"/>
+                <w:sz w:val="17"/>
+              </w:rPr>
+              <w:t>履约调度独立部署</w:t>
+            </w:r>
+          </w:p>
+        </w:tc>
+        <w:tc>
+          <w:tcPr>
+            <w:tcW w:type="dxa" w:w="2498"/>
+            <w:vAlign w:val="center"/>
+            <w:tcMar>
+              <w:top w:w="80" w:type="dxa"/>
+              <w:start w:w="100" w:type="dxa"/>
+              <w:bottom w:w="80" w:type="dxa"/>
+              <w:end w:w="100" w:type="dxa"/>
+            </w:tcMar>
+            <w:shd w:fill="FFFFFF"/>
+          </w:tcPr>
+          <w:p>
+            <w:pPr>
+              <w:spacing w:before="0" w:after="0" w:line="240" w:lineRule="auto"/>
+            </w:pPr>
+            <w:r/>
+            <w:r>
+              <w:rPr>
+                <w:rFonts w:ascii="Aptos" w:hAnsi="Aptos" w:eastAsia="微软雅黑"/>
+                <w:b w:val="0"/>
+                <w:color w:val="243746"/>
+                <w:sz w:val="17"/>
+              </w:rPr>
+              <w:t>与事件投递分离节奏、容量和故障域，便于单独扩容</w:t>
+            </w:r>
+          </w:p>
+        </w:tc>
+        <w:tc>
+          <w:tcPr>
+            <w:tcW w:type="dxa" w:w="2498"/>
+            <w:vAlign w:val="center"/>
+            <w:tcMar>
+              <w:top w:w="80" w:type="dxa"/>
+              <w:start w:w="100" w:type="dxa"/>
+              <w:bottom w:w="80" w:type="dxa"/>
+              <w:end w:w="100" w:type="dxa"/>
+            </w:tcMar>
+            <w:shd w:fill="FFFFFF"/>
+          </w:tcPr>
+          <w:p>
+            <w:pPr>
+              <w:spacing w:before="0" w:after="0" w:line="240" w:lineRule="auto"/>
+            </w:pPr>
+            <w:r/>
+            <w:r>
+              <w:rPr>
+                <w:rFonts w:ascii="Aptos" w:hAnsi="Aptos" w:eastAsia="微软雅黑"/>
+                <w:b w:val="0"/>
+                <w:color w:val="243746"/>
+                <w:sz w:val="17"/>
+              </w:rPr>
+              <w:t>统一任务平台可提供同等租约与可观测能力时重新评估</w:t>
+            </w:r>
+          </w:p>
+        </w:tc>
+      </w:tr>
     </w:tbl>
     <w:p>
       <w:pPr>
@@ -24682,7 +28141,7 @@
           <w:color w:val="000000"/>
           <w:sz w:val="32"/>
         </w:rPr>
-        <w:t>十五 风险登记</w:t>
+        <w:t>十六 风险登记</w:t>
       </w:r>
     </w:p>
     <w:tbl>
@@ -26788,6 +30247,462 @@
           </w:p>
         </w:tc>
       </w:tr>
+      <w:tr>
+        <w:tc>
+          <w:tcPr>
+            <w:tcW w:type="dxa" w:w="2498"/>
+            <w:vAlign w:val="center"/>
+            <w:tcMar>
+              <w:top w:w="80" w:type="dxa"/>
+              <w:start w:w="100" w:type="dxa"/>
+              <w:bottom w:w="80" w:type="dxa"/>
+              <w:end w:w="100" w:type="dxa"/>
+            </w:tcMar>
+            <w:shd w:fill="EEF5FA"/>
+          </w:tcPr>
+          <w:p>
+            <w:pPr>
+              <w:spacing w:before="0" w:after="0" w:line="240" w:lineRule="auto"/>
+            </w:pPr>
+            <w:r/>
+            <w:r>
+              <w:rPr>
+                <w:rFonts w:ascii="Aptos" w:hAnsi="Aptos" w:eastAsia="微软雅黑"/>
+                <w:b w:val="0"/>
+                <w:color w:val="243746"/>
+                <w:sz w:val="17"/>
+              </w:rPr>
+              <w:t>节点时钟偏差</w:t>
+            </w:r>
+          </w:p>
+        </w:tc>
+        <w:tc>
+          <w:tcPr>
+            <w:tcW w:type="dxa" w:w="2498"/>
+            <w:vAlign w:val="center"/>
+            <w:tcMar>
+              <w:top w:w="80" w:type="dxa"/>
+              <w:start w:w="100" w:type="dxa"/>
+              <w:bottom w:w="80" w:type="dxa"/>
+              <w:end w:w="100" w:type="dxa"/>
+            </w:tcMar>
+            <w:shd w:fill="EEF5FA"/>
+          </w:tcPr>
+          <w:p>
+            <w:pPr>
+              <w:spacing w:before="0" w:after="0" w:line="240" w:lineRule="auto"/>
+            </w:pPr>
+            <w:r/>
+            <w:r>
+              <w:rPr>
+                <w:rFonts w:ascii="Aptos" w:hAnsi="Aptos" w:eastAsia="微软雅黑"/>
+                <w:b w:val="0"/>
+                <w:color w:val="243746"/>
+                <w:sz w:val="17"/>
+              </w:rPr>
+              <w:t>到期判断偏移或租约提前失效，产生延迟或重复处理</w:t>
+            </w:r>
+          </w:p>
+        </w:tc>
+        <w:tc>
+          <w:tcPr>
+            <w:tcW w:type="dxa" w:w="2498"/>
+            <w:vAlign w:val="center"/>
+            <w:tcMar>
+              <w:top w:w="80" w:type="dxa"/>
+              <w:start w:w="100" w:type="dxa"/>
+              <w:bottom w:w="80" w:type="dxa"/>
+              <w:end w:w="100" w:type="dxa"/>
+            </w:tcMar>
+            <w:shd w:fill="EEF5FA"/>
+          </w:tcPr>
+          <w:p>
+            <w:pPr>
+              <w:spacing w:before="0" w:after="0" w:line="240" w:lineRule="auto"/>
+            </w:pPr>
+            <w:r/>
+            <w:r>
+              <w:rPr>
+                <w:rFonts w:ascii="Aptos" w:hAnsi="Aptos" w:eastAsia="微软雅黑"/>
+                <w:b w:val="0"/>
+                <w:color w:val="243746"/>
+                <w:sz w:val="17"/>
+              </w:rPr>
+              <w:t>统一 UTC/NTP；监控租约争抢和重复率；数据库时间优先</w:t>
+            </w:r>
+          </w:p>
+        </w:tc>
+        <w:tc>
+          <w:tcPr>
+            <w:tcW w:type="dxa" w:w="2498"/>
+            <w:vAlign w:val="center"/>
+            <w:tcMar>
+              <w:top w:w="80" w:type="dxa"/>
+              <w:start w:w="100" w:type="dxa"/>
+              <w:bottom w:w="80" w:type="dxa"/>
+              <w:end w:w="100" w:type="dxa"/>
+            </w:tcMar>
+            <w:shd w:fill="EEF5FA"/>
+          </w:tcPr>
+          <w:p>
+            <w:pPr>
+              <w:spacing w:before="0" w:after="0" w:line="240" w:lineRule="auto"/>
+            </w:pPr>
+            <w:r/>
+            <w:r>
+              <w:rPr>
+                <w:rFonts w:ascii="Aptos" w:hAnsi="Aptos" w:eastAsia="微软雅黑"/>
+                <w:b w:val="0"/>
+                <w:color w:val="243746"/>
+                <w:sz w:val="17"/>
+              </w:rPr>
+              <w:t>故障注入验证时钟偏差与租约恢复</w:t>
+            </w:r>
+          </w:p>
+        </w:tc>
+      </w:tr>
+      <w:tr>
+        <w:tc>
+          <w:tcPr>
+            <w:tcW w:type="dxa" w:w="2498"/>
+            <w:vAlign w:val="center"/>
+            <w:tcMar>
+              <w:top w:w="80" w:type="dxa"/>
+              <w:start w:w="100" w:type="dxa"/>
+              <w:bottom w:w="80" w:type="dxa"/>
+              <w:end w:w="100" w:type="dxa"/>
+            </w:tcMar>
+            <w:shd w:fill="FFFFFF"/>
+          </w:tcPr>
+          <w:p>
+            <w:pPr>
+              <w:spacing w:before="0" w:after="0" w:line="240" w:lineRule="auto"/>
+            </w:pPr>
+            <w:r/>
+            <w:r>
+              <w:rPr>
+                <w:rFonts w:ascii="Aptos" w:hAnsi="Aptos" w:eastAsia="微软雅黑"/>
+                <w:b w:val="0"/>
+                <w:color w:val="243746"/>
+                <w:sz w:val="17"/>
+              </w:rPr>
+              <w:t>固定风险阈值不适配租户</w:t>
+            </w:r>
+          </w:p>
+        </w:tc>
+        <w:tc>
+          <w:tcPr>
+            <w:tcW w:type="dxa" w:w="2498"/>
+            <w:vAlign w:val="center"/>
+            <w:tcMar>
+              <w:top w:w="80" w:type="dxa"/>
+              <w:start w:w="100" w:type="dxa"/>
+              <w:bottom w:w="80" w:type="dxa"/>
+              <w:end w:w="100" w:type="dxa"/>
+            </w:tcMar>
+            <w:shd w:fill="FFFFFF"/>
+          </w:tcPr>
+          <w:p>
+            <w:pPr>
+              <w:spacing w:before="0" w:after="0" w:line="240" w:lineRule="auto"/>
+            </w:pPr>
+            <w:r/>
+            <w:r>
+              <w:rPr>
+                <w:rFonts w:ascii="Aptos" w:hAnsi="Aptos" w:eastAsia="微软雅黑"/>
+                <w:b w:val="0"/>
+                <w:color w:val="243746"/>
+                <w:sz w:val="17"/>
+              </w:rPr>
+              <w:t>合同可能过早或过晚进入高风险状态</w:t>
+            </w:r>
+          </w:p>
+        </w:tc>
+        <w:tc>
+          <w:tcPr>
+            <w:tcW w:type="dxa" w:w="2498"/>
+            <w:vAlign w:val="center"/>
+            <w:tcMar>
+              <w:top w:w="80" w:type="dxa"/>
+              <w:start w:w="100" w:type="dxa"/>
+              <w:bottom w:w="80" w:type="dxa"/>
+              <w:end w:w="100" w:type="dxa"/>
+            </w:tcMar>
+            <w:shd w:fill="FFFFFF"/>
+          </w:tcPr>
+          <w:p>
+            <w:pPr>
+              <w:spacing w:before="0" w:after="0" w:line="240" w:lineRule="auto"/>
+            </w:pPr>
+            <w:r/>
+            <w:r>
+              <w:rPr>
+                <w:rFonts w:ascii="Aptos" w:hAnsi="Aptos" w:eastAsia="微软雅黑"/>
+                <w:b w:val="0"/>
+                <w:color w:val="243746"/>
+                <w:sz w:val="17"/>
+              </w:rPr>
+              <w:t>M5 设计租户级策略版本与变更审计，领域默认值兜底</w:t>
+            </w:r>
+          </w:p>
+        </w:tc>
+        <w:tc>
+          <w:tcPr>
+            <w:tcW w:type="dxa" w:w="2498"/>
+            <w:vAlign w:val="center"/>
+            <w:tcMar>
+              <w:top w:w="80" w:type="dxa"/>
+              <w:start w:w="100" w:type="dxa"/>
+              <w:bottom w:w="80" w:type="dxa"/>
+              <w:end w:w="100" w:type="dxa"/>
+            </w:tcMar>
+            <w:shd w:fill="FFFFFF"/>
+          </w:tcPr>
+          <w:p>
+            <w:pPr>
+              <w:spacing w:before="0" w:after="0" w:line="240" w:lineRule="auto"/>
+            </w:pPr>
+            <w:r/>
+            <w:r>
+              <w:rPr>
+                <w:rFonts w:ascii="Aptos" w:hAnsi="Aptos" w:eastAsia="微软雅黑"/>
+                <w:b w:val="0"/>
+                <w:color w:val="243746"/>
+                <w:sz w:val="17"/>
+              </w:rPr>
+              <w:t>使用多类合同样本回放评估阈值</w:t>
+            </w:r>
+          </w:p>
+        </w:tc>
+      </w:tr>
+      <w:tr>
+        <w:tc>
+          <w:tcPr>
+            <w:tcW w:type="dxa" w:w="2498"/>
+            <w:vAlign w:val="center"/>
+            <w:tcMar>
+              <w:top w:w="80" w:type="dxa"/>
+              <w:start w:w="100" w:type="dxa"/>
+              <w:bottom w:w="80" w:type="dxa"/>
+              <w:end w:w="100" w:type="dxa"/>
+            </w:tcMar>
+            <w:shd w:fill="EEF5FA"/>
+          </w:tcPr>
+          <w:p>
+            <w:pPr>
+              <w:spacing w:before="0" w:after="0" w:line="240" w:lineRule="auto"/>
+            </w:pPr>
+            <w:r/>
+            <w:r>
+              <w:rPr>
+                <w:rFonts w:ascii="Aptos" w:hAnsi="Aptos" w:eastAsia="微软雅黑"/>
+                <w:b w:val="0"/>
+                <w:color w:val="243746"/>
+                <w:sz w:val="17"/>
+              </w:rPr>
+              <w:t>Scheduler BYPASSRLS 凭据泄漏</w:t>
+            </w:r>
+          </w:p>
+        </w:tc>
+        <w:tc>
+          <w:tcPr>
+            <w:tcW w:type="dxa" w:w="2498"/>
+            <w:vAlign w:val="center"/>
+            <w:tcMar>
+              <w:top w:w="80" w:type="dxa"/>
+              <w:start w:w="100" w:type="dxa"/>
+              <w:bottom w:w="80" w:type="dxa"/>
+              <w:end w:w="100" w:type="dxa"/>
+            </w:tcMar>
+            <w:shd w:fill="EEF5FA"/>
+          </w:tcPr>
+          <w:p>
+            <w:pPr>
+              <w:spacing w:before="0" w:after="0" w:line="240" w:lineRule="auto"/>
+            </w:pPr>
+            <w:r/>
+            <w:r>
+              <w:rPr>
+                <w:rFonts w:ascii="Aptos" w:hAnsi="Aptos" w:eastAsia="微软雅黑"/>
+                <w:b w:val="0"/>
+                <w:color w:val="243746"/>
+                <w:sz w:val="17"/>
+              </w:rPr>
+              <w:t>攻击者可跨租户读取履约与风险元数据</w:t>
+            </w:r>
+          </w:p>
+        </w:tc>
+        <w:tc>
+          <w:tcPr>
+            <w:tcW w:type="dxa" w:w="2498"/>
+            <w:vAlign w:val="center"/>
+            <w:tcMar>
+              <w:top w:w="80" w:type="dxa"/>
+              <w:start w:w="100" w:type="dxa"/>
+              <w:bottom w:w="80" w:type="dxa"/>
+              <w:end w:w="100" w:type="dxa"/>
+            </w:tcMar>
+            <w:shd w:fill="EEF5FA"/>
+          </w:tcPr>
+          <w:p>
+            <w:pPr>
+              <w:spacing w:before="0" w:after="0" w:line="240" w:lineRule="auto"/>
+            </w:pPr>
+            <w:r/>
+            <w:r>
+              <w:rPr>
+                <w:rFonts w:ascii="Aptos" w:hAnsi="Aptos" w:eastAsia="微软雅黑"/>
+                <w:b w:val="0"/>
+                <w:color w:val="243746"/>
+                <w:sz w:val="17"/>
+              </w:rPr>
+              <w:t>独立账号、最小表授权、网络隔离、SQL 审计和密钥轮换</w:t>
+            </w:r>
+          </w:p>
+        </w:tc>
+        <w:tc>
+          <w:tcPr>
+            <w:tcW w:type="dxa" w:w="2498"/>
+            <w:vAlign w:val="center"/>
+            <w:tcMar>
+              <w:top w:w="80" w:type="dxa"/>
+              <w:start w:w="100" w:type="dxa"/>
+              <w:bottom w:w="80" w:type="dxa"/>
+              <w:end w:w="100" w:type="dxa"/>
+            </w:tcMar>
+            <w:shd w:fill="EEF5FA"/>
+          </w:tcPr>
+          <w:p>
+            <w:pPr>
+              <w:spacing w:before="0" w:after="0" w:line="240" w:lineRule="auto"/>
+            </w:pPr>
+            <w:r/>
+            <w:r>
+              <w:rPr>
+                <w:rFonts w:ascii="Aptos" w:hAnsi="Aptos" w:eastAsia="微软雅黑"/>
+                <w:b w:val="0"/>
+                <w:color w:val="243746"/>
+                <w:sz w:val="17"/>
+              </w:rPr>
+              <w:t>权限回归测试与生产凭据轮换演练</w:t>
+            </w:r>
+          </w:p>
+        </w:tc>
+      </w:tr>
+      <w:tr>
+        <w:tc>
+          <w:tcPr>
+            <w:tcW w:type="dxa" w:w="2498"/>
+            <w:vAlign w:val="center"/>
+            <w:tcMar>
+              <w:top w:w="80" w:type="dxa"/>
+              <w:start w:w="100" w:type="dxa"/>
+              <w:bottom w:w="80" w:type="dxa"/>
+              <w:end w:w="100" w:type="dxa"/>
+            </w:tcMar>
+            <w:shd w:fill="FFFFFF"/>
+          </w:tcPr>
+          <w:p>
+            <w:pPr>
+              <w:spacing w:before="0" w:after="0" w:line="240" w:lineRule="auto"/>
+            </w:pPr>
+            <w:r/>
+            <w:r>
+              <w:rPr>
+                <w:rFonts w:ascii="Aptos" w:hAnsi="Aptos" w:eastAsia="微软雅黑"/>
+                <w:b w:val="0"/>
+                <w:color w:val="243746"/>
+                <w:sz w:val="17"/>
+              </w:rPr>
+              <w:t>长时间停机后的到期积压</w:t>
+            </w:r>
+          </w:p>
+        </w:tc>
+        <w:tc>
+          <w:tcPr>
+            <w:tcW w:type="dxa" w:w="2498"/>
+            <w:vAlign w:val="center"/>
+            <w:tcMar>
+              <w:top w:w="80" w:type="dxa"/>
+              <w:start w:w="100" w:type="dxa"/>
+              <w:bottom w:w="80" w:type="dxa"/>
+              <w:end w:w="100" w:type="dxa"/>
+            </w:tcMar>
+            <w:shd w:fill="FFFFFF"/>
+          </w:tcPr>
+          <w:p>
+            <w:pPr>
+              <w:spacing w:before="0" w:after="0" w:line="240" w:lineRule="auto"/>
+            </w:pPr>
+            <w:r/>
+            <w:r>
+              <w:rPr>
+                <w:rFonts w:ascii="Aptos" w:hAnsi="Aptos" w:eastAsia="微软雅黑"/>
+                <w:b w:val="0"/>
+                <w:color w:val="243746"/>
+                <w:sz w:val="17"/>
+              </w:rPr>
+              <w:t>恢复时形成提醒洪峰并挤压在线数据库</w:t>
+            </w:r>
+          </w:p>
+        </w:tc>
+        <w:tc>
+          <w:tcPr>
+            <w:tcW w:type="dxa" w:w="2498"/>
+            <w:vAlign w:val="center"/>
+            <w:tcMar>
+              <w:top w:w="80" w:type="dxa"/>
+              <w:start w:w="100" w:type="dxa"/>
+              <w:bottom w:w="80" w:type="dxa"/>
+              <w:end w:w="100" w:type="dxa"/>
+            </w:tcMar>
+            <w:shd w:fill="FFFFFF"/>
+          </w:tcPr>
+          <w:p>
+            <w:pPr>
+              <w:spacing w:before="0" w:after="0" w:line="240" w:lineRule="auto"/>
+            </w:pPr>
+            <w:r/>
+            <w:r>
+              <w:rPr>
+                <w:rFonts w:ascii="Aptos" w:hAnsi="Aptos" w:eastAsia="微软雅黑"/>
+                <w:b w:val="0"/>
+                <w:color w:val="243746"/>
+                <w:sz w:val="17"/>
+              </w:rPr>
+              <w:t>批次上限、退避、积压水位告警和按租户公平调度</w:t>
+            </w:r>
+          </w:p>
+        </w:tc>
+        <w:tc>
+          <w:tcPr>
+            <w:tcW w:type="dxa" w:w="2498"/>
+            <w:vAlign w:val="center"/>
+            <w:tcMar>
+              <w:top w:w="80" w:type="dxa"/>
+              <w:start w:w="100" w:type="dxa"/>
+              <w:bottom w:w="80" w:type="dxa"/>
+              <w:end w:w="100" w:type="dxa"/>
+            </w:tcMar>
+            <w:shd w:fill="FFFFFF"/>
+          </w:tcPr>
+          <w:p>
+            <w:pPr>
+              <w:spacing w:before="0" w:after="0" w:line="240" w:lineRule="auto"/>
+            </w:pPr>
+            <w:r/>
+            <w:r>
+              <w:rPr>
+                <w:rFonts w:ascii="Aptos" w:hAnsi="Aptos" w:eastAsia="微软雅黑"/>
+                <w:b w:val="0"/>
+                <w:color w:val="243746"/>
+                <w:sz w:val="17"/>
+              </w:rPr>
+              <w:t>M7 压测停机恢复与积压排空时间</w:t>
+            </w:r>
+          </w:p>
+        </w:tc>
+      </w:tr>
     </w:tbl>
     <w:p>
       <w:pPr>
@@ -26807,7 +30722,7 @@
           <w:color w:val="000000"/>
           <w:sz w:val="32"/>
         </w:rPr>
-        <w:t>十六 后续更新记录模板</w:t>
+        <w:t>十七 后续更新记录模板</w:t>
       </w:r>
     </w:p>
     <w:p>
@@ -27528,7 +31443,7 @@
         <w:color w:val="000000"/>
         <w:sz w:val="17"/>
       </w:rPr>
-      <w:t>ContractOps 项目更新记录  版本 0.9</w:t>
+      <w:t>ContractOps 项目更新记录  版本 1.0</w:t>
     </w:r>
   </w:p>
 </w:hdr>

</xml_diff>

<commit_message>
fix(contractops): evolve obligation schema in place
</commit_message>
<xml_diff>
--- a/architecture/ContractOps-项目更新记录.docx
+++ b/architecture/ContractOps-项目更新记录.docx
@@ -2397,6 +2397,9 @@
         </w:tc>
       </w:tr>
       <w:tr>
+        <w:trPr>
+          <w:cantSplit/>
+        </w:trPr>
         <w:tc>
           <w:tcPr>
             <w:tcW w:type="dxa" w:w="1999"/>
@@ -2582,6 +2585,9 @@
         </w:tc>
       </w:tr>
       <w:tr>
+        <w:trPr>
+          <w:cantSplit/>
+        </w:trPr>
         <w:tc>
           <w:tcPr>
             <w:tcW w:type="dxa" w:w="1999"/>
@@ -2719,6 +2725,136 @@
                 <w:sz w:val="17"/>
               </w:rPr>
               <w:t>本地 48 项测试及静态检查通过；PR 与 PostgreSQL CI 待网络恢复</w:t>
+            </w:r>
+          </w:p>
+        </w:tc>
+      </w:tr>
+      <w:tr>
+        <w:trPr>
+          <w:cantSplit/>
+        </w:trPr>
+        <w:tc>
+          <w:tcPr>
+            <w:tcW w:type="dxa" w:w="1999"/>
+            <w:vAlign w:val="center"/>
+            <w:tcMar>
+              <w:top w:w="80" w:type="dxa"/>
+              <w:start w:w="100" w:type="dxa"/>
+              <w:bottom w:w="80" w:type="dxa"/>
+              <w:end w:w="100" w:type="dxa"/>
+            </w:tcMar>
+            <w:shd w:fill="FFFFFF"/>
+          </w:tcPr>
+          <w:p>
+            <w:pPr>
+              <w:spacing w:after="0"/>
+            </w:pPr>
+            <w:r>
+              <w:rPr>
+                <w:rFonts w:ascii="Microsoft YaHei" w:hAnsi="Microsoft YaHei" w:eastAsia="Microsoft YaHei"/>
+                <w:sz w:val="18"/>
+              </w:rPr>
+              <w:t>UPD010.1</w:t>
+            </w:r>
+          </w:p>
+        </w:tc>
+        <w:tc>
+          <w:tcPr>
+            <w:tcW w:type="dxa" w:w="1999"/>
+            <w:vAlign w:val="center"/>
+            <w:tcMar>
+              <w:top w:w="80" w:type="dxa"/>
+              <w:start w:w="100" w:type="dxa"/>
+              <w:bottom w:w="80" w:type="dxa"/>
+              <w:end w:w="100" w:type="dxa"/>
+            </w:tcMar>
+            <w:shd w:fill="FFFFFF"/>
+          </w:tcPr>
+          <w:p>
+            <w:pPr>
+              <w:spacing w:after="0"/>
+            </w:pPr>
+            <w:r>
+              <w:rPr>
+                <w:rFonts w:ascii="Microsoft YaHei" w:hAnsi="Microsoft YaHei" w:eastAsia="Microsoft YaHei"/>
+                <w:sz w:val="18"/>
+              </w:rPr>
+              <w:t>2026年9月27日</w:t>
+            </w:r>
+          </w:p>
+        </w:tc>
+        <w:tc>
+          <w:tcPr>
+            <w:tcW w:type="dxa" w:w="1999"/>
+            <w:vAlign w:val="center"/>
+            <w:tcMar>
+              <w:top w:w="80" w:type="dxa"/>
+              <w:start w:w="100" w:type="dxa"/>
+              <w:bottom w:w="80" w:type="dxa"/>
+              <w:end w:w="100" w:type="dxa"/>
+            </w:tcMar>
+            <w:shd w:fill="FFFFFF"/>
+          </w:tcPr>
+          <w:p>
+            <w:pPr>
+              <w:spacing w:after="0"/>
+            </w:pPr>
+            <w:r>
+              <w:rPr>
+                <w:rFonts w:ascii="Microsoft YaHei" w:hAnsi="Microsoft YaHei" w:eastAsia="Microsoft YaHei"/>
+                <w:sz w:val="18"/>
+              </w:rPr>
+              <w:t>修复 M4 增量迁移重复建表</w:t>
+            </w:r>
+          </w:p>
+        </w:tc>
+        <w:tc>
+          <w:tcPr>
+            <w:tcW w:type="dxa" w:w="1999"/>
+            <w:vAlign w:val="center"/>
+            <w:tcMar>
+              <w:top w:w="80" w:type="dxa"/>
+              <w:start w:w="100" w:type="dxa"/>
+              <w:bottom w:w="80" w:type="dxa"/>
+              <w:end w:w="100" w:type="dxa"/>
+            </w:tcMar>
+            <w:shd w:fill="FFFFFF"/>
+          </w:tcPr>
+          <w:p>
+            <w:pPr>
+              <w:spacing w:after="0"/>
+            </w:pPr>
+            <w:r>
+              <w:rPr>
+                <w:rFonts w:ascii="Microsoft YaHei" w:hAnsi="Microsoft YaHei" w:eastAsia="Microsoft YaHei"/>
+                <w:sz w:val="18"/>
+              </w:rPr>
+              <w:t>将 obligations 从重复 CREATE TABLE 改为保留数据的原表演进，并补全可逆降级</w:t>
+            </w:r>
+          </w:p>
+        </w:tc>
+        <w:tc>
+          <w:tcPr>
+            <w:tcW w:type="dxa" w:w="1999"/>
+            <w:vAlign w:val="center"/>
+            <w:tcMar>
+              <w:top w:w="80" w:type="dxa"/>
+              <w:start w:w="100" w:type="dxa"/>
+              <w:bottom w:w="80" w:type="dxa"/>
+              <w:end w:w="100" w:type="dxa"/>
+            </w:tcMar>
+            <w:shd w:fill="FFFFFF"/>
+          </w:tcPr>
+          <w:p>
+            <w:pPr>
+              <w:spacing w:after="0"/>
+            </w:pPr>
+            <w:r>
+              <w:rPr>
+                <w:rFonts w:ascii="Microsoft YaHei" w:hAnsi="Microsoft YaHei" w:eastAsia="Microsoft YaHei"/>
+                <w:sz w:val="18"/>
+              </w:rPr>
+              <w:t>本地 48 项测试通过；等待 PR 5 重新执行 PostgreSQL 迁移门禁</w:t>
             </w:r>
           </w:p>
         </w:tc>
@@ -18334,6 +18470,7 @@
       <w:tr>
         <w:trPr>
           <w:tblHeader w:val="true"/>
+          <w:cantSplit/>
         </w:trPr>
         <w:tc>
           <w:tcPr>
@@ -18397,6 +18534,9 @@
         </w:tc>
       </w:tr>
       <w:tr>
+        <w:trPr>
+          <w:cantSplit/>
+        </w:trPr>
         <w:tc>
           <w:tcPr>
             <w:tcW w:type="dxa" w:w="2498"/>
@@ -18443,6 +18583,9 @@
         </w:tc>
       </w:tr>
       <w:tr>
+        <w:trPr>
+          <w:cantSplit/>
+        </w:trPr>
         <w:tc>
           <w:tcPr>
             <w:tcW w:type="dxa" w:w="2498"/>
@@ -18489,6 +18632,9 @@
         </w:tc>
       </w:tr>
       <w:tr>
+        <w:trPr>
+          <w:cantSplit/>
+        </w:trPr>
         <w:tc>
           <w:tcPr>
             <w:tcW w:type="dxa" w:w="2498"/>
@@ -18535,6 +18681,9 @@
         </w:tc>
       </w:tr>
       <w:tr>
+        <w:trPr>
+          <w:cantSplit/>
+        </w:trPr>
         <w:tc>
           <w:tcPr>
             <w:tcW w:type="dxa" w:w="2498"/>
@@ -18581,6 +18730,9 @@
         </w:tc>
       </w:tr>
       <w:tr>
+        <w:trPr>
+          <w:cantSplit/>
+        </w:trPr>
         <w:tc>
           <w:tcPr>
             <w:tcW w:type="dxa" w:w="2498"/>
@@ -18627,6 +18779,9 @@
         </w:tc>
       </w:tr>
       <w:tr>
+        <w:trPr>
+          <w:cantSplit/>
+        </w:trPr>
         <w:tc>
           <w:tcPr>
             <w:tcW w:type="dxa" w:w="2498"/>
@@ -18696,6 +18851,7 @@
       <w:tr>
         <w:trPr>
           <w:tblHeader w:val="true"/>
+          <w:cantSplit/>
         </w:trPr>
         <w:tc>
           <w:tcPr>
@@ -18744,6 +18900,9 @@
         </w:tc>
       </w:tr>
       <w:tr>
+        <w:trPr>
+          <w:cantSplit/>
+        </w:trPr>
         <w:tc>
           <w:tcPr>
             <w:tcW w:type="dxa" w:w="3331"/>
@@ -18779,6 +18938,9 @@
         </w:tc>
       </w:tr>
       <w:tr>
+        <w:trPr>
+          <w:cantSplit/>
+        </w:trPr>
         <w:tc>
           <w:tcPr>
             <w:tcW w:type="dxa" w:w="3331"/>
@@ -18814,6 +18976,9 @@
         </w:tc>
       </w:tr>
       <w:tr>
+        <w:trPr>
+          <w:cantSplit/>
+        </w:trPr>
         <w:tc>
           <w:tcPr>
             <w:tcW w:type="dxa" w:w="3331"/>
@@ -18849,6 +19014,9 @@
         </w:tc>
       </w:tr>
       <w:tr>
+        <w:trPr>
+          <w:cantSplit/>
+        </w:trPr>
         <w:tc>
           <w:tcPr>
             <w:tcW w:type="dxa" w:w="3331"/>
@@ -18884,6 +19052,9 @@
         </w:tc>
       </w:tr>
       <w:tr>
+        <w:trPr>
+          <w:cantSplit/>
+        </w:trPr>
         <w:tc>
           <w:tcPr>
             <w:tcW w:type="dxa" w:w="3331"/>
@@ -18919,6 +19090,9 @@
         </w:tc>
       </w:tr>
       <w:tr>
+        <w:trPr>
+          <w:cantSplit/>
+        </w:trPr>
         <w:tc>
           <w:tcPr>
             <w:tcW w:type="dxa" w:w="3331"/>
@@ -18954,6 +19128,9 @@
         </w:tc>
       </w:tr>
       <w:tr>
+        <w:trPr>
+          <w:cantSplit/>
+        </w:trPr>
         <w:tc>
           <w:tcPr>
             <w:tcW w:type="dxa" w:w="3331"/>
@@ -18989,6 +19166,9 @@
         </w:tc>
       </w:tr>
       <w:tr>
+        <w:trPr>
+          <w:cantSplit/>
+        </w:trPr>
         <w:tc>
           <w:tcPr>
             <w:tcW w:type="dxa" w:w="3331"/>
@@ -19024,6 +19204,9 @@
         </w:tc>
       </w:tr>
       <w:tr>
+        <w:trPr>
+          <w:cantSplit/>
+        </w:trPr>
         <w:tc>
           <w:tcPr>
             <w:tcW w:type="dxa" w:w="3331"/>
@@ -19152,6 +19335,7 @@
       <w:tr>
         <w:trPr>
           <w:tblHeader w:val="true"/>
+          <w:cantSplit/>
         </w:trPr>
         <w:tc>
           <w:tcPr>
@@ -19200,6 +19384,9 @@
         </w:tc>
       </w:tr>
       <w:tr>
+        <w:trPr>
+          <w:cantSplit/>
+        </w:trPr>
         <w:tc>
           <w:tcPr>
             <w:tcW w:type="dxa" w:w="3331"/>
@@ -19235,6 +19422,9 @@
         </w:tc>
       </w:tr>
       <w:tr>
+        <w:trPr>
+          <w:cantSplit/>
+        </w:trPr>
         <w:tc>
           <w:tcPr>
             <w:tcW w:type="dxa" w:w="3331"/>
@@ -19270,6 +19460,9 @@
         </w:tc>
       </w:tr>
       <w:tr>
+        <w:trPr>
+          <w:cantSplit/>
+        </w:trPr>
         <w:tc>
           <w:tcPr>
             <w:tcW w:type="dxa" w:w="3331"/>
@@ -19305,6 +19498,9 @@
         </w:tc>
       </w:tr>
       <w:tr>
+        <w:trPr>
+          <w:cantSplit/>
+        </w:trPr>
         <w:tc>
           <w:tcPr>
             <w:tcW w:type="dxa" w:w="3331"/>
@@ -19340,6 +19536,9 @@
         </w:tc>
       </w:tr>
       <w:tr>
+        <w:trPr>
+          <w:cantSplit/>
+        </w:trPr>
         <w:tc>
           <w:tcPr>
             <w:tcW w:type="dxa" w:w="3331"/>
@@ -19375,6 +19574,9 @@
         </w:tc>
       </w:tr>
       <w:tr>
+        <w:trPr>
+          <w:cantSplit/>
+        </w:trPr>
         <w:tc>
           <w:tcPr>
             <w:tcW w:type="dxa" w:w="3331"/>
@@ -19410,6 +19612,9 @@
         </w:tc>
       </w:tr>
       <w:tr>
+        <w:trPr>
+          <w:cantSplit/>
+        </w:trPr>
         <w:tc>
           <w:tcPr>
             <w:tcW w:type="dxa" w:w="3331"/>
@@ -19445,6 +19650,9 @@
         </w:tc>
       </w:tr>
       <w:tr>
+        <w:trPr>
+          <w:cantSplit/>
+        </w:trPr>
         <w:tc>
           <w:tcPr>
             <w:tcW w:type="dxa" w:w="3331"/>
@@ -22288,6 +22496,9 @@
         <w:gridCol w:w="2498"/>
       </w:tblGrid>
       <w:tr>
+        <w:trPr>
+          <w:cantSplit/>
+        </w:trPr>
         <w:tc>
           <w:tcPr>
             <w:tcW w:type="dxa" w:w="1701"/>
@@ -22430,6 +22641,9 @@
         </w:tc>
       </w:tr>
       <w:tr>
+        <w:trPr>
+          <w:cantSplit/>
+        </w:trPr>
         <w:tc>
           <w:tcPr>
             <w:tcW w:type="dxa" w:w="1701"/>
@@ -22572,6 +22786,9 @@
         </w:tc>
       </w:tr>
       <w:tr>
+        <w:trPr>
+          <w:cantSplit/>
+        </w:trPr>
         <w:tc>
           <w:tcPr>
             <w:tcW w:type="dxa" w:w="1701"/>
@@ -22714,6 +22931,9 @@
         </w:tc>
       </w:tr>
       <w:tr>
+        <w:trPr>
+          <w:cantSplit/>
+        </w:trPr>
         <w:tc>
           <w:tcPr>
             <w:tcW w:type="dxa" w:w="1701"/>
@@ -22856,6 +23076,9 @@
         </w:tc>
       </w:tr>
       <w:tr>
+        <w:trPr>
+          <w:cantSplit/>
+        </w:trPr>
         <w:tc>
           <w:tcPr>
             <w:tcW w:type="dxa" w:w="1701"/>
@@ -22998,6 +23221,9 @@
         </w:tc>
       </w:tr>
       <w:tr>
+        <w:trPr>
+          <w:cantSplit/>
+        </w:trPr>
         <w:tc>
           <w:tcPr>
             <w:tcW w:type="dxa" w:w="1701"/>
@@ -23170,6 +23396,9 @@
         <w:gridCol w:w="3331"/>
       </w:tblGrid>
       <w:tr>
+        <w:trPr>
+          <w:cantSplit/>
+        </w:trPr>
         <w:tc>
           <w:tcPr>
             <w:tcW w:type="dxa" w:w="1701"/>
@@ -23277,6 +23506,9 @@
         </w:tc>
       </w:tr>
       <w:tr>
+        <w:trPr>
+          <w:cantSplit/>
+        </w:trPr>
         <w:tc>
           <w:tcPr>
             <w:tcW w:type="dxa" w:w="1701"/>
@@ -23384,6 +23616,9 @@
         </w:tc>
       </w:tr>
       <w:tr>
+        <w:trPr>
+          <w:cantSplit/>
+        </w:trPr>
         <w:tc>
           <w:tcPr>
             <w:tcW w:type="dxa" w:w="1701"/>
@@ -23491,6 +23726,9 @@
         </w:tc>
       </w:tr>
       <w:tr>
+        <w:trPr>
+          <w:cantSplit/>
+        </w:trPr>
         <w:tc>
           <w:tcPr>
             <w:tcW w:type="dxa" w:w="1701"/>
@@ -23598,6 +23836,9 @@
         </w:tc>
       </w:tr>
       <w:tr>
+        <w:trPr>
+          <w:cantSplit/>
+        </w:trPr>
         <w:tc>
           <w:tcPr>
             <w:tcW w:type="dxa" w:w="1701"/>
@@ -23705,6 +23946,9 @@
         </w:tc>
       </w:tr>
       <w:tr>
+        <w:trPr>
+          <w:cantSplit/>
+        </w:trPr>
         <w:tc>
           <w:tcPr>
             <w:tcW w:type="dxa" w:w="1701"/>
@@ -23812,6 +24056,9 @@
         </w:tc>
       </w:tr>
       <w:tr>
+        <w:trPr>
+          <w:cantSplit/>
+        </w:trPr>
         <w:tc>
           <w:tcPr>
             <w:tcW w:type="dxa" w:w="1701"/>
@@ -23919,6 +24166,9 @@
         </w:tc>
       </w:tr>
       <w:tr>
+        <w:trPr>
+          <w:cantSplit/>
+        </w:trPr>
         <w:tc>
           <w:tcPr>
             <w:tcW w:type="dxa" w:w="1701"/>
@@ -24168,6 +24418,9 @@
         <w:gridCol w:w="3331"/>
       </w:tblGrid>
       <w:tr>
+        <w:trPr>
+          <w:cantSplit/>
+        </w:trPr>
         <w:tc>
           <w:tcPr>
             <w:tcW w:type="dxa" w:w="2381"/>
@@ -24275,6 +24528,9 @@
         </w:tc>
       </w:tr>
       <w:tr>
+        <w:trPr>
+          <w:cantSplit/>
+        </w:trPr>
         <w:tc>
           <w:tcPr>
             <w:tcW w:type="dxa" w:w="2381"/>
@@ -24382,6 +24638,9 @@
         </w:tc>
       </w:tr>
       <w:tr>
+        <w:trPr>
+          <w:cantSplit/>
+        </w:trPr>
         <w:tc>
           <w:tcPr>
             <w:tcW w:type="dxa" w:w="2381"/>
@@ -24489,6 +24748,9 @@
         </w:tc>
       </w:tr>
       <w:tr>
+        <w:trPr>
+          <w:cantSplit/>
+        </w:trPr>
         <w:tc>
           <w:tcPr>
             <w:tcW w:type="dxa" w:w="2381"/>
@@ -24596,6 +24858,9 @@
         </w:tc>
       </w:tr>
       <w:tr>
+        <w:trPr>
+          <w:cantSplit/>
+        </w:trPr>
         <w:tc>
           <w:tcPr>
             <w:tcW w:type="dxa" w:w="2381"/>
@@ -24703,6 +24968,9 @@
         </w:tc>
       </w:tr>
       <w:tr>
+        <w:trPr>
+          <w:cantSplit/>
+        </w:trPr>
         <w:tc>
           <w:tcPr>
             <w:tcW w:type="dxa" w:w="2381"/>
@@ -24810,6 +25078,9 @@
         </w:tc>
       </w:tr>
       <w:tr>
+        <w:trPr>
+          <w:cantSplit/>
+        </w:trPr>
         <w:tc>
           <w:tcPr>
             <w:tcW w:type="dxa" w:w="2381"/>
@@ -24878,6 +25149,86 @@
           <w:p>
             <w:r>
               <w:t>使用文档运行时渲染 35 页并逐页检查；标题、表格、分页和页眉版本无溢出或遮挡。</w:t>
+            </w:r>
+          </w:p>
+        </w:tc>
+      </w:tr>
+      <w:tr>
+        <w:trPr>
+          <w:cantSplit/>
+        </w:trPr>
+        <w:tc>
+          <w:tcPr>
+            <w:tcW w:type="dxa" w:w="2381"/>
+            <w:vAlign w:val="center"/>
+            <w:tcMar>
+              <w:top w:w="80" w:type="dxa"/>
+              <w:start w:w="100" w:type="dxa"/>
+              <w:bottom w:w="80" w:type="dxa"/>
+              <w:end w:w="100" w:type="dxa"/>
+            </w:tcMar>
+            <w:shd w:fill="EEF5FA"/>
+          </w:tcPr>
+          <w:p>
+            <w:pPr>
+              <w:spacing w:after="0"/>
+            </w:pPr>
+            <w:r>
+              <w:rPr>
+                <w:rFonts w:ascii="Microsoft YaHei" w:hAnsi="Microsoft YaHei" w:eastAsia="Microsoft YaHei"/>
+                <w:sz w:val="18"/>
+              </w:rPr>
+              <w:t>M4 迁移故障回归</w:t>
+            </w:r>
+          </w:p>
+        </w:tc>
+        <w:tc>
+          <w:tcPr>
+            <w:tcW w:type="dxa" w:w="1928"/>
+            <w:vAlign w:val="center"/>
+            <w:tcMar>
+              <w:top w:w="80" w:type="dxa"/>
+              <w:start w:w="100" w:type="dxa"/>
+              <w:bottom w:w="80" w:type="dxa"/>
+              <w:end w:w="100" w:type="dxa"/>
+            </w:tcMar>
+            <w:shd w:fill="EEF5FA"/>
+          </w:tcPr>
+          <w:p>
+            <w:pPr>
+              <w:spacing w:after="0"/>
+            </w:pPr>
+            <w:r>
+              <w:rPr>
+                <w:rFonts w:ascii="Microsoft YaHei" w:hAnsi="Microsoft YaHei" w:eastAsia="Microsoft YaHei"/>
+                <w:sz w:val="18"/>
+              </w:rPr>
+              <w:t>本地通过，远程重跑中</w:t>
+            </w:r>
+          </w:p>
+        </w:tc>
+        <w:tc>
+          <w:tcPr>
+            <w:tcW w:type="dxa" w:w="5556"/>
+            <w:vAlign w:val="center"/>
+            <w:tcMar>
+              <w:top w:w="80" w:type="dxa"/>
+              <w:start w:w="100" w:type="dxa"/>
+              <w:bottom w:w="80" w:type="dxa"/>
+              <w:end w:w="100" w:type="dxa"/>
+            </w:tcMar>
+            <w:shd w:fill="EEF5FA"/>
+          </w:tcPr>
+          <w:p>
+            <w:pPr>
+              <w:spacing w:after="0"/>
+            </w:pPr>
+            <w:r>
+              <w:rPr>
+                <w:rFonts w:ascii="Microsoft YaHei" w:hAnsi="Microsoft YaHei" w:eastAsia="Microsoft YaHei"/>
+                <w:sz w:val="18"/>
+              </w:rPr>
+              <w:t>定位到 0001 已创建 obligations；0005 现改为 ALTER TABLE，保留既有合同、版本和租户关联。</w:t>
             </w:r>
           </w:p>
         </w:tc>
@@ -26847,6 +27198,9 @@
         </w:tc>
       </w:tr>
       <w:tr>
+        <w:trPr>
+          <w:cantSplit/>
+        </w:trPr>
         <w:tc>
           <w:tcPr>
             <w:tcW w:type="dxa" w:w="2498"/>
@@ -26884,132 +27238,6 @@
           <w:p>
             <w:r>
               <w:t>只允许优化快照格式 不允许改为运行时读取当前策略</w:t>
-            </w:r>
-          </w:p>
-        </w:tc>
-      </w:tr>
-      <w:tr>
-        <w:tc>
-          <w:tcPr>
-            <w:tcW w:type="dxa" w:w="2498"/>
-          </w:tcPr>
-          <w:p>
-            <w:r>
-              <w:t>ADR 018</w:t>
-            </w:r>
-          </w:p>
-        </w:tc>
-        <w:tc>
-          <w:tcPr>
-            <w:tcW w:type="dxa" w:w="2498"/>
-          </w:tcPr>
-          <w:p>
-            <w:r>
-              <w:t>审批条件使用受控字段结构</w:t>
-            </w:r>
-          </w:p>
-        </w:tc>
-        <w:tc>
-          <w:tcPr>
-            <w:tcW w:type="dxa" w:w="2498"/>
-          </w:tcPr>
-          <w:p>
-            <w:r>
-              <w:t>降低表达式注入和不可解释规则风险并覆盖首版核心场景</w:t>
-            </w:r>
-          </w:p>
-        </w:tc>
-        <w:tc>
-          <w:tcPr>
-            <w:tcW w:type="dxa" w:w="2498"/>
-          </w:tcPr>
-          <w:p>
-            <w:r>
-              <w:t>受控字段不足且有安全沙箱与版本治理方案时再引入 DSL</w:t>
-            </w:r>
-          </w:p>
-        </w:tc>
-      </w:tr>
-      <w:tr>
-        <w:tc>
-          <w:tcPr>
-            <w:tcW w:type="dxa" w:w="2498"/>
-          </w:tcPr>
-          <w:p>
-            <w:r>
-              <w:t>ADR 019</w:t>
-            </w:r>
-          </w:p>
-        </w:tc>
-        <w:tc>
-          <w:tcPr>
-            <w:tcW w:type="dxa" w:w="2498"/>
-          </w:tcPr>
-          <w:p>
-            <w:r>
-              <w:t>步骤状态版本号加短事务行锁</w:t>
-            </w:r>
-          </w:p>
-        </w:tc>
-        <w:tc>
-          <w:tcPr>
-            <w:tcW w:type="dxa" w:w="2498"/>
-          </w:tcPr>
-          <w:p>
-            <w:r>
-              <w:t>确保并发领取和决策只有一次成功并返回稳定冲突</w:t>
-            </w:r>
-          </w:p>
-        </w:tc>
-        <w:tc>
-          <w:tcPr>
-            <w:tcW w:type="dxa" w:w="2498"/>
-          </w:tcPr>
-          <w:p>
-            <w:r>
-              <w:t>性能测试证明单行争用成为瓶颈时评估任务分片</w:t>
-            </w:r>
-          </w:p>
-        </w:tc>
-      </w:tr>
-      <w:tr>
-        <w:tc>
-          <w:tcPr>
-            <w:tcW w:type="dxa" w:w="2498"/>
-          </w:tcPr>
-          <w:p>
-            <w:r>
-              <w:t>ADR 020</w:t>
-            </w:r>
-          </w:p>
-        </w:tc>
-        <w:tc>
-          <w:tcPr>
-            <w:tcW w:type="dxa" w:w="2498"/>
-          </w:tcPr>
-          <w:p>
-            <w:r>
-              <w:t>业务审批使用独立工作流步骤表</w:t>
-            </w:r>
-          </w:p>
-        </w:tc>
-        <w:tc>
-          <w:tcPr>
-            <w:tcW w:type="dxa" w:w="2498"/>
-          </w:tcPr>
-          <w:p>
-            <w:r>
-              <w:t>避免与绑定 review case 的旧审批步骤混合不同状态和外键语义</w:t>
-            </w:r>
-          </w:p>
-        </w:tc>
-        <w:tc>
-          <w:tcPr>
-            <w:tcW w:type="dxa" w:w="2498"/>
-          </w:tcPr>
-          <w:p>
-            <w:r>
-              <w:t>后续统一领域模型时必须先给出兼容迁移和审计保留方案</w:t>
             </w:r>
           </w:p>
         </w:tc>
@@ -27021,101 +27249,40 @@
         <w:tc>
           <w:tcPr>
             <w:tcW w:type="dxa" w:w="2498"/>
-            <w:tcMar>
-              <w:top w:w="100" w:type="dxa"/>
-              <w:start w:w="120" w:type="dxa"/>
-              <w:bottom w:w="100" w:type="dxa"/>
-              <w:end w:w="120" w:type="dxa"/>
-            </w:tcMar>
-            <w:vAlign w:val="center"/>
-          </w:tcPr>
-          <w:p>
-            <w:pPr>
-              <w:spacing w:after="0" w:line="259" w:lineRule="auto"/>
-              <w:jc w:val="center"/>
-            </w:pPr>
-            <w:r>
-              <w:rPr>
-                <w:rFonts w:ascii="Aptos" w:hAnsi="Aptos" w:eastAsia="Microsoft YaHei"/>
-                <w:color w:val="000000"/>
-                <w:sz w:val="17"/>
-              </w:rPr>
-              <w:t>ADR 021</w:t>
+          </w:tcPr>
+          <w:p>
+            <w:r>
+              <w:t>ADR 018</w:t>
             </w:r>
           </w:p>
         </w:tc>
         <w:tc>
           <w:tcPr>
             <w:tcW w:type="dxa" w:w="2498"/>
-            <w:tcMar>
-              <w:top w:w="100" w:type="dxa"/>
-              <w:start w:w="120" w:type="dxa"/>
-              <w:bottom w:w="100" w:type="dxa"/>
-              <w:end w:w="120" w:type="dxa"/>
-            </w:tcMar>
-            <w:vAlign w:val="center"/>
-          </w:tcPr>
-          <w:p>
-            <w:pPr>
-              <w:spacing w:after="0" w:line="259" w:lineRule="auto"/>
-            </w:pPr>
-            <w:r>
-              <w:rPr>
-                <w:rFonts w:ascii="Aptos" w:hAnsi="Aptos" w:eastAsia="Microsoft YaHei"/>
-                <w:color w:val="000000"/>
-                <w:sz w:val="17"/>
-              </w:rPr>
-              <w:t>事件链路采用 Transactional Outbox 和至少一次投递</w:t>
+          </w:tcPr>
+          <w:p>
+            <w:r>
+              <w:t>审批条件使用受控字段结构</w:t>
             </w:r>
           </w:p>
         </w:tc>
         <w:tc>
           <w:tcPr>
             <w:tcW w:type="dxa" w:w="2498"/>
-            <w:tcMar>
-              <w:top w:w="100" w:type="dxa"/>
-              <w:start w:w="120" w:type="dxa"/>
-              <w:bottom w:w="100" w:type="dxa"/>
-              <w:end w:w="120" w:type="dxa"/>
-            </w:tcMar>
-            <w:vAlign w:val="center"/>
-          </w:tcPr>
-          <w:p>
-            <w:pPr>
-              <w:spacing w:after="0" w:line="259" w:lineRule="auto"/>
-            </w:pPr>
-            <w:r>
-              <w:rPr>
-                <w:rFonts w:ascii="Aptos" w:hAnsi="Aptos" w:eastAsia="Microsoft YaHei"/>
-                <w:color w:val="000000"/>
-                <w:sz w:val="17"/>
-              </w:rPr>
-              <w:t>数据库和 Redis 无法共享事务，优先保证事件不丢并通过消费者幂等吸收重复</w:t>
+          </w:tcPr>
+          <w:p>
+            <w:r>
+              <w:t>降低表达式注入和不可解释规则风险并覆盖首版核心场景</w:t>
             </w:r>
           </w:p>
         </w:tc>
         <w:tc>
           <w:tcPr>
             <w:tcW w:type="dxa" w:w="2498"/>
-            <w:tcMar>
-              <w:top w:w="100" w:type="dxa"/>
-              <w:start w:w="120" w:type="dxa"/>
-              <w:bottom w:w="100" w:type="dxa"/>
-              <w:end w:w="120" w:type="dxa"/>
-            </w:tcMar>
-            <w:vAlign w:val="center"/>
-          </w:tcPr>
-          <w:p>
-            <w:pPr>
-              <w:spacing w:after="0" w:line="259" w:lineRule="auto"/>
-            </w:pPr>
-            <w:r>
-              <w:rPr>
-                <w:rFonts w:ascii="Aptos" w:hAnsi="Aptos" w:eastAsia="Microsoft YaHei"/>
-                <w:color w:val="000000"/>
-                <w:sz w:val="17"/>
-              </w:rPr>
-              <w:t>只有引入可验证的事务消息基础设施时重新评估</w:t>
+          </w:tcPr>
+          <w:p>
+            <w:r>
+              <w:t>受控字段不足且有安全沙箱与版本治理方案时再引入 DSL</w:t>
             </w:r>
           </w:p>
         </w:tc>
@@ -27127,105 +27294,40 @@
         <w:tc>
           <w:tcPr>
             <w:tcW w:type="dxa" w:w="2498"/>
-            <w:tcMar>
-              <w:top w:w="100" w:type="dxa"/>
-              <w:start w:w="120" w:type="dxa"/>
-              <w:bottom w:w="100" w:type="dxa"/>
-              <w:end w:w="120" w:type="dxa"/>
-            </w:tcMar>
-            <w:vAlign w:val="center"/>
-            <w:shd w:fill="EAF2F8"/>
-          </w:tcPr>
-          <w:p>
-            <w:pPr>
-              <w:spacing w:after="0" w:line="259" w:lineRule="auto"/>
-              <w:jc w:val="center"/>
-            </w:pPr>
-            <w:r>
-              <w:rPr>
-                <w:rFonts w:ascii="Aptos" w:hAnsi="Aptos" w:eastAsia="Microsoft YaHei"/>
-                <w:color w:val="000000"/>
-                <w:sz w:val="17"/>
-              </w:rPr>
-              <w:t>ADR 022</w:t>
+          </w:tcPr>
+          <w:p>
+            <w:r>
+              <w:t>ADR 019</w:t>
             </w:r>
           </w:p>
         </w:tc>
         <w:tc>
           <w:tcPr>
             <w:tcW w:type="dxa" w:w="2498"/>
-            <w:tcMar>
-              <w:top w:w="100" w:type="dxa"/>
-              <w:start w:w="120" w:type="dxa"/>
-              <w:bottom w:w="100" w:type="dxa"/>
-              <w:end w:w="120" w:type="dxa"/>
-            </w:tcMar>
-            <w:vAlign w:val="center"/>
-            <w:shd w:fill="EAF2F8"/>
-          </w:tcPr>
-          <w:p>
-            <w:pPr>
-              <w:spacing w:after="0" w:line="259" w:lineRule="auto"/>
-            </w:pPr>
-            <w:r>
-              <w:rPr>
-                <w:rFonts w:ascii="Aptos" w:hAnsi="Aptos" w:eastAsia="Microsoft YaHei"/>
-                <w:color w:val="000000"/>
-                <w:sz w:val="17"/>
-              </w:rPr>
-              <w:t>Redis Streams Consumer Group 承担首版事件总线</w:t>
+          </w:tcPr>
+          <w:p>
+            <w:r>
+              <w:t>步骤状态版本号加短事务行锁</w:t>
             </w:r>
           </w:p>
         </w:tc>
         <w:tc>
           <w:tcPr>
             <w:tcW w:type="dxa" w:w="2498"/>
-            <w:tcMar>
-              <w:top w:w="100" w:type="dxa"/>
-              <w:start w:w="120" w:type="dxa"/>
-              <w:bottom w:w="100" w:type="dxa"/>
-              <w:end w:w="120" w:type="dxa"/>
-            </w:tcMar>
-            <w:vAlign w:val="center"/>
-            <w:shd w:fill="EAF2F8"/>
-          </w:tcPr>
-          <w:p>
-            <w:pPr>
-              <w:spacing w:after="0" w:line="259" w:lineRule="auto"/>
-            </w:pPr>
-            <w:r>
-              <w:rPr>
-                <w:rFonts w:ascii="Aptos" w:hAnsi="Aptos" w:eastAsia="Microsoft YaHei"/>
-                <w:color w:val="000000"/>
-                <w:sz w:val="17"/>
-              </w:rPr>
-              <w:t>复用现有 Redis 并获得 Pending 消息接管能力，适合当前规模</w:t>
+          </w:tcPr>
+          <w:p>
+            <w:r>
+              <w:t>确保并发领取和决策只有一次成功并返回稳定冲突</w:t>
             </w:r>
           </w:p>
         </w:tc>
         <w:tc>
           <w:tcPr>
             <w:tcW w:type="dxa" w:w="2498"/>
-            <w:tcMar>
-              <w:top w:w="100" w:type="dxa"/>
-              <w:start w:w="120" w:type="dxa"/>
-              <w:bottom w:w="100" w:type="dxa"/>
-              <w:end w:w="120" w:type="dxa"/>
-            </w:tcMar>
-            <w:vAlign w:val="center"/>
-            <w:shd w:fill="EAF2F8"/>
-          </w:tcPr>
-          <w:p>
-            <w:pPr>
-              <w:spacing w:after="0" w:line="259" w:lineRule="auto"/>
-            </w:pPr>
-            <w:r>
-              <w:rPr>
-                <w:rFonts w:ascii="Aptos" w:hAnsi="Aptos" w:eastAsia="Microsoft YaHei"/>
-                <w:color w:val="000000"/>
-                <w:sz w:val="17"/>
-              </w:rPr>
-              <w:t>吞吐、保留周期或多订阅者需求达到明确瓶颈时评估 Kafka</w:t>
+          </w:tcPr>
+          <w:p>
+            <w:r>
+              <w:t>性能测试证明单行争用成为瓶颈时评估任务分片</w:t>
             </w:r>
           </w:p>
         </w:tc>
@@ -27237,101 +27339,40 @@
         <w:tc>
           <w:tcPr>
             <w:tcW w:type="dxa" w:w="2498"/>
-            <w:tcMar>
-              <w:top w:w="100" w:type="dxa"/>
-              <w:start w:w="120" w:type="dxa"/>
-              <w:bottom w:w="100" w:type="dxa"/>
-              <w:end w:w="120" w:type="dxa"/>
-            </w:tcMar>
-            <w:vAlign w:val="center"/>
-          </w:tcPr>
-          <w:p>
-            <w:pPr>
-              <w:spacing w:after="0" w:line="259" w:lineRule="auto"/>
-              <w:jc w:val="center"/>
-            </w:pPr>
-            <w:r>
-              <w:rPr>
-                <w:rFonts w:ascii="Aptos" w:hAnsi="Aptos" w:eastAsia="Microsoft YaHei"/>
-                <w:color w:val="000000"/>
-                <w:sz w:val="17"/>
-              </w:rPr>
-              <w:t>ADR 023</w:t>
+          </w:tcPr>
+          <w:p>
+            <w:r>
+              <w:t>ADR 020</w:t>
             </w:r>
           </w:p>
         </w:tc>
         <w:tc>
           <w:tcPr>
             <w:tcW w:type="dxa" w:w="2498"/>
-            <w:tcMar>
-              <w:top w:w="100" w:type="dxa"/>
-              <w:start w:w="120" w:type="dxa"/>
-              <w:bottom w:w="100" w:type="dxa"/>
-              <w:end w:w="120" w:type="dxa"/>
-            </w:tcMar>
-            <w:vAlign w:val="center"/>
-          </w:tcPr>
-          <w:p>
-            <w:pPr>
-              <w:spacing w:after="0" w:line="259" w:lineRule="auto"/>
-            </w:pPr>
-            <w:r>
-              <w:rPr>
-                <w:rFonts w:ascii="Aptos" w:hAnsi="Aptos" w:eastAsia="Microsoft YaHei"/>
-                <w:color w:val="000000"/>
-                <w:sz w:val="17"/>
-              </w:rPr>
-              <w:t>通知幂等状态和处理租约持久化到 PostgreSQL</w:t>
+          </w:tcPr>
+          <w:p>
+            <w:r>
+              <w:t>业务审批使用独立工作流步骤表</w:t>
             </w:r>
           </w:p>
         </w:tc>
         <w:tc>
           <w:tcPr>
             <w:tcW w:type="dxa" w:w="2498"/>
-            <w:tcMar>
-              <w:top w:w="100" w:type="dxa"/>
-              <w:start w:w="120" w:type="dxa"/>
-              <w:bottom w:w="100" w:type="dxa"/>
-              <w:end w:w="120" w:type="dxa"/>
-            </w:tcMar>
-            <w:vAlign w:val="center"/>
-          </w:tcPr>
-          <w:p>
-            <w:pPr>
-              <w:spacing w:after="0" w:line="259" w:lineRule="auto"/>
-            </w:pPr>
-            <w:r>
-              <w:rPr>
-                <w:rFonts w:ascii="Aptos" w:hAnsi="Aptos" w:eastAsia="Microsoft YaHei"/>
-                <w:color w:val="000000"/>
-                <w:sz w:val="17"/>
-              </w:rPr>
-              <w:t>服务重启后仍能识别已完成副作用，并协调多个 Worker</w:t>
+          </w:tcPr>
+          <w:p>
+            <w:r>
+              <w:t>避免与绑定 review case 的旧审批步骤混合不同状态和外键语义</w:t>
             </w:r>
           </w:p>
         </w:tc>
         <w:tc>
           <w:tcPr>
             <w:tcW w:type="dxa" w:w="2498"/>
-            <w:tcMar>
-              <w:top w:w="100" w:type="dxa"/>
-              <w:start w:w="120" w:type="dxa"/>
-              <w:bottom w:w="100" w:type="dxa"/>
-              <w:end w:w="120" w:type="dxa"/>
-            </w:tcMar>
-            <w:vAlign w:val="center"/>
-          </w:tcPr>
-          <w:p>
-            <w:pPr>
-              <w:spacing w:after="0" w:line="259" w:lineRule="auto"/>
-            </w:pPr>
-            <w:r>
-              <w:rPr>
-                <w:rFonts w:ascii="Aptos" w:hAnsi="Aptos" w:eastAsia="Microsoft YaHei"/>
-                <w:color w:val="000000"/>
-                <w:sz w:val="17"/>
-              </w:rPr>
-              <w:t>数据库写放大成为瓶颈且有等价持久幂等方案时调整</w:t>
+          </w:tcPr>
+          <w:p>
+            <w:r>
+              <w:t>后续统一领域模型时必须先给出兼容迁移和审计保留方案</w:t>
             </w:r>
           </w:p>
         </w:tc>
@@ -27350,7 +27391,6 @@
               <w:end w:w="120" w:type="dxa"/>
             </w:tcMar>
             <w:vAlign w:val="center"/>
-            <w:shd w:fill="EAF2F8"/>
           </w:tcPr>
           <w:p>
             <w:pPr>
@@ -27363,7 +27403,7 @@
                 <w:color w:val="000000"/>
                 <w:sz w:val="17"/>
               </w:rPr>
-              <w:t>ADR 024</w:t>
+              <w:t>ADR 021</w:t>
             </w:r>
           </w:p>
         </w:tc>
@@ -27377,19 +27417,18 @@
               <w:end w:w="120" w:type="dxa"/>
             </w:tcMar>
             <w:vAlign w:val="center"/>
-            <w:shd w:fill="EAF2F8"/>
-          </w:tcPr>
-          <w:p>
-            <w:pPr>
-              <w:spacing w:after="0" w:line="259" w:lineRule="auto"/>
-            </w:pPr>
-            <w:r>
-              <w:rPr>
-                <w:rFonts w:ascii="Aptos" w:hAnsi="Aptos" w:eastAsia="Microsoft YaHei"/>
-                <w:color w:val="000000"/>
-                <w:sz w:val="17"/>
-              </w:rPr>
-              <w:t>跨租户事件 Worker 使用受限 BYPASSRLS 专用角色</w:t>
+          </w:tcPr>
+          <w:p>
+            <w:pPr>
+              <w:spacing w:after="0" w:line="259" w:lineRule="auto"/>
+            </w:pPr>
+            <w:r>
+              <w:rPr>
+                <w:rFonts w:ascii="Aptos" w:hAnsi="Aptos" w:eastAsia="Microsoft YaHei"/>
+                <w:color w:val="000000"/>
+                <w:sz w:val="17"/>
+              </w:rPr>
+              <w:t>事件链路采用 Transactional Outbox 和至少一次投递</w:t>
             </w:r>
           </w:p>
         </w:tc>
@@ -27403,19 +27442,18 @@
               <w:end w:w="120" w:type="dxa"/>
             </w:tcMar>
             <w:vAlign w:val="center"/>
-            <w:shd w:fill="EAF2F8"/>
-          </w:tcPr>
-          <w:p>
-            <w:pPr>
-              <w:spacing w:after="0" w:line="259" w:lineRule="auto"/>
-            </w:pPr>
-            <w:r>
-              <w:rPr>
-                <w:rFonts w:ascii="Aptos" w:hAnsi="Aptos" w:eastAsia="Microsoft YaHei"/>
-                <w:color w:val="000000"/>
-                <w:sz w:val="17"/>
-              </w:rPr>
-              <w:t>允许扫描全局 Outbox，同时避免复用迁移管理员和业务表权限</w:t>
+          </w:tcPr>
+          <w:p>
+            <w:pPr>
+              <w:spacing w:after="0" w:line="259" w:lineRule="auto"/>
+            </w:pPr>
+            <w:r>
+              <w:rPr>
+                <w:rFonts w:ascii="Aptos" w:hAnsi="Aptos" w:eastAsia="Microsoft YaHei"/>
+                <w:color w:val="000000"/>
+                <w:sz w:val="17"/>
+              </w:rPr>
+              <w:t>数据库和 Redis 无法共享事务，优先保证事件不丢并通过消费者幂等吸收重复</w:t>
             </w:r>
           </w:p>
         </w:tc>
@@ -27429,19 +27467,18 @@
               <w:end w:w="120" w:type="dxa"/>
             </w:tcMar>
             <w:vAlign w:val="center"/>
-            <w:shd w:fill="EAF2F8"/>
-          </w:tcPr>
-          <w:p>
-            <w:pPr>
-              <w:spacing w:after="0" w:line="259" w:lineRule="auto"/>
-            </w:pPr>
-            <w:r>
-              <w:rPr>
-                <w:rFonts w:ascii="Aptos" w:hAnsi="Aptos" w:eastAsia="Microsoft YaHei"/>
-                <w:color w:val="000000"/>
-                <w:sz w:val="17"/>
-              </w:rPr>
-              <w:t>引入按租户分片 Worker 后重新评估是否取消 BYPASSRLS</w:t>
+          </w:tcPr>
+          <w:p>
+            <w:pPr>
+              <w:spacing w:after="0" w:line="259" w:lineRule="auto"/>
+            </w:pPr>
+            <w:r>
+              <w:rPr>
+                <w:rFonts w:ascii="Aptos" w:hAnsi="Aptos" w:eastAsia="Microsoft YaHei"/>
+                <w:color w:val="000000"/>
+                <w:sz w:val="17"/>
+              </w:rPr>
+              <w:t>只有引入可验证的事务消息基础设施时重新评估</w:t>
             </w:r>
           </w:p>
         </w:tc>
@@ -27460,6 +27497,7 @@
               <w:end w:w="120" w:type="dxa"/>
             </w:tcMar>
             <w:vAlign w:val="center"/>
+            <w:shd w:fill="EAF2F8"/>
           </w:tcPr>
           <w:p>
             <w:pPr>
@@ -27472,7 +27510,7 @@
                 <w:color w:val="000000"/>
                 <w:sz w:val="17"/>
               </w:rPr>
-              <w:t>ADR 025</w:t>
+              <w:t>ADR 022</w:t>
             </w:r>
           </w:p>
         </w:tc>
@@ -27486,18 +27524,19 @@
               <w:end w:w="120" w:type="dxa"/>
             </w:tcMar>
             <w:vAlign w:val="center"/>
-          </w:tcPr>
-          <w:p>
-            <w:pPr>
-              <w:spacing w:after="0" w:line="259" w:lineRule="auto"/>
-            </w:pPr>
-            <w:r>
-              <w:rPr>
-                <w:rFonts w:ascii="Aptos" w:hAnsi="Aptos" w:eastAsia="Microsoft YaHei"/>
-                <w:color w:val="000000"/>
-                <w:sz w:val="17"/>
-              </w:rPr>
-              <w:t>死信保存在 PostgreSQL 并由租户管理员人工重放</w:t>
+            <w:shd w:fill="EAF2F8"/>
+          </w:tcPr>
+          <w:p>
+            <w:pPr>
+              <w:spacing w:after="0" w:line="259" w:lineRule="auto"/>
+            </w:pPr>
+            <w:r>
+              <w:rPr>
+                <w:rFonts w:ascii="Aptos" w:hAnsi="Aptos" w:eastAsia="Microsoft YaHei"/>
+                <w:color w:val="000000"/>
+                <w:sz w:val="17"/>
+              </w:rPr>
+              <w:t>Redis Streams Consumer Group 承担首版事件总线</w:t>
             </w:r>
           </w:p>
         </w:tc>
@@ -27511,18 +27550,19 @@
               <w:end w:w="120" w:type="dxa"/>
             </w:tcMar>
             <w:vAlign w:val="center"/>
-          </w:tcPr>
-          <w:p>
-            <w:pPr>
-              <w:spacing w:after="0" w:line="259" w:lineRule="auto"/>
-            </w:pPr>
-            <w:r>
-              <w:rPr>
-                <w:rFonts w:ascii="Aptos" w:hAnsi="Aptos" w:eastAsia="Microsoft YaHei"/>
-                <w:color w:val="000000"/>
-                <w:sz w:val="17"/>
-              </w:rPr>
-              <w:t>失败记录与租户和事件保持关系，可受 RLS 隔离并记录重放审计</w:t>
+            <w:shd w:fill="EAF2F8"/>
+          </w:tcPr>
+          <w:p>
+            <w:pPr>
+              <w:spacing w:after="0" w:line="259" w:lineRule="auto"/>
+            </w:pPr>
+            <w:r>
+              <w:rPr>
+                <w:rFonts w:ascii="Aptos" w:hAnsi="Aptos" w:eastAsia="Microsoft YaHei"/>
+                <w:color w:val="000000"/>
+                <w:sz w:val="17"/>
+              </w:rPr>
+              <w:t>复用现有 Redis 并获得 Pending 消息接管能力，适合当前规模</w:t>
             </w:r>
           </w:p>
         </w:tc>
@@ -27536,23 +27576,349 @@
               <w:end w:w="120" w:type="dxa"/>
             </w:tcMar>
             <w:vAlign w:val="center"/>
-          </w:tcPr>
-          <w:p>
-            <w:pPr>
-              <w:spacing w:after="0" w:line="259" w:lineRule="auto"/>
-            </w:pPr>
-            <w:r>
-              <w:rPr>
-                <w:rFonts w:ascii="Aptos" w:hAnsi="Aptos" w:eastAsia="Microsoft YaHei"/>
-                <w:color w:val="000000"/>
-                <w:sz w:val="17"/>
-              </w:rPr>
-              <w:t>死信规模需要独立归档服务时迁移存储</w:t>
+            <w:shd w:fill="EAF2F8"/>
+          </w:tcPr>
+          <w:p>
+            <w:pPr>
+              <w:spacing w:after="0" w:line="259" w:lineRule="auto"/>
+            </w:pPr>
+            <w:r>
+              <w:rPr>
+                <w:rFonts w:ascii="Aptos" w:hAnsi="Aptos" w:eastAsia="Microsoft YaHei"/>
+                <w:color w:val="000000"/>
+                <w:sz w:val="17"/>
+              </w:rPr>
+              <w:t>吞吐、保留周期或多订阅者需求达到明确瓶颈时评估 Kafka</w:t>
             </w:r>
           </w:p>
         </w:tc>
       </w:tr>
       <w:tr>
+        <w:trPr>
+          <w:cantSplit/>
+        </w:trPr>
+        <w:tc>
+          <w:tcPr>
+            <w:tcW w:type="dxa" w:w="2498"/>
+            <w:tcMar>
+              <w:top w:w="100" w:type="dxa"/>
+              <w:start w:w="120" w:type="dxa"/>
+              <w:bottom w:w="100" w:type="dxa"/>
+              <w:end w:w="120" w:type="dxa"/>
+            </w:tcMar>
+            <w:vAlign w:val="center"/>
+          </w:tcPr>
+          <w:p>
+            <w:pPr>
+              <w:spacing w:after="0" w:line="259" w:lineRule="auto"/>
+              <w:jc w:val="center"/>
+            </w:pPr>
+            <w:r>
+              <w:rPr>
+                <w:rFonts w:ascii="Aptos" w:hAnsi="Aptos" w:eastAsia="Microsoft YaHei"/>
+                <w:color w:val="000000"/>
+                <w:sz w:val="17"/>
+              </w:rPr>
+              <w:t>ADR 023</w:t>
+            </w:r>
+          </w:p>
+        </w:tc>
+        <w:tc>
+          <w:tcPr>
+            <w:tcW w:type="dxa" w:w="2498"/>
+            <w:tcMar>
+              <w:top w:w="100" w:type="dxa"/>
+              <w:start w:w="120" w:type="dxa"/>
+              <w:bottom w:w="100" w:type="dxa"/>
+              <w:end w:w="120" w:type="dxa"/>
+            </w:tcMar>
+            <w:vAlign w:val="center"/>
+          </w:tcPr>
+          <w:p>
+            <w:pPr>
+              <w:spacing w:after="0" w:line="259" w:lineRule="auto"/>
+            </w:pPr>
+            <w:r>
+              <w:rPr>
+                <w:rFonts w:ascii="Aptos" w:hAnsi="Aptos" w:eastAsia="Microsoft YaHei"/>
+                <w:color w:val="000000"/>
+                <w:sz w:val="17"/>
+              </w:rPr>
+              <w:t>通知幂等状态和处理租约持久化到 PostgreSQL</w:t>
+            </w:r>
+          </w:p>
+        </w:tc>
+        <w:tc>
+          <w:tcPr>
+            <w:tcW w:type="dxa" w:w="2498"/>
+            <w:tcMar>
+              <w:top w:w="100" w:type="dxa"/>
+              <w:start w:w="120" w:type="dxa"/>
+              <w:bottom w:w="100" w:type="dxa"/>
+              <w:end w:w="120" w:type="dxa"/>
+            </w:tcMar>
+            <w:vAlign w:val="center"/>
+          </w:tcPr>
+          <w:p>
+            <w:pPr>
+              <w:spacing w:after="0" w:line="259" w:lineRule="auto"/>
+            </w:pPr>
+            <w:r>
+              <w:rPr>
+                <w:rFonts w:ascii="Aptos" w:hAnsi="Aptos" w:eastAsia="Microsoft YaHei"/>
+                <w:color w:val="000000"/>
+                <w:sz w:val="17"/>
+              </w:rPr>
+              <w:t>服务重启后仍能识别已完成副作用，并协调多个 Worker</w:t>
+            </w:r>
+          </w:p>
+        </w:tc>
+        <w:tc>
+          <w:tcPr>
+            <w:tcW w:type="dxa" w:w="2498"/>
+            <w:tcMar>
+              <w:top w:w="100" w:type="dxa"/>
+              <w:start w:w="120" w:type="dxa"/>
+              <w:bottom w:w="100" w:type="dxa"/>
+              <w:end w:w="120" w:type="dxa"/>
+            </w:tcMar>
+            <w:vAlign w:val="center"/>
+          </w:tcPr>
+          <w:p>
+            <w:pPr>
+              <w:spacing w:after="0" w:line="259" w:lineRule="auto"/>
+            </w:pPr>
+            <w:r>
+              <w:rPr>
+                <w:rFonts w:ascii="Aptos" w:hAnsi="Aptos" w:eastAsia="Microsoft YaHei"/>
+                <w:color w:val="000000"/>
+                <w:sz w:val="17"/>
+              </w:rPr>
+              <w:t>数据库写放大成为瓶颈且有等价持久幂等方案时调整</w:t>
+            </w:r>
+          </w:p>
+        </w:tc>
+      </w:tr>
+      <w:tr>
+        <w:trPr>
+          <w:cantSplit/>
+        </w:trPr>
+        <w:tc>
+          <w:tcPr>
+            <w:tcW w:type="dxa" w:w="2498"/>
+            <w:tcMar>
+              <w:top w:w="100" w:type="dxa"/>
+              <w:start w:w="120" w:type="dxa"/>
+              <w:bottom w:w="100" w:type="dxa"/>
+              <w:end w:w="120" w:type="dxa"/>
+            </w:tcMar>
+            <w:vAlign w:val="center"/>
+            <w:shd w:fill="EAF2F8"/>
+          </w:tcPr>
+          <w:p>
+            <w:pPr>
+              <w:spacing w:after="0" w:line="259" w:lineRule="auto"/>
+              <w:jc w:val="center"/>
+            </w:pPr>
+            <w:r>
+              <w:rPr>
+                <w:rFonts w:ascii="Aptos" w:hAnsi="Aptos" w:eastAsia="Microsoft YaHei"/>
+                <w:color w:val="000000"/>
+                <w:sz w:val="17"/>
+              </w:rPr>
+              <w:t>ADR 024</w:t>
+            </w:r>
+          </w:p>
+        </w:tc>
+        <w:tc>
+          <w:tcPr>
+            <w:tcW w:type="dxa" w:w="2498"/>
+            <w:tcMar>
+              <w:top w:w="100" w:type="dxa"/>
+              <w:start w:w="120" w:type="dxa"/>
+              <w:bottom w:w="100" w:type="dxa"/>
+              <w:end w:w="120" w:type="dxa"/>
+            </w:tcMar>
+            <w:vAlign w:val="center"/>
+            <w:shd w:fill="EAF2F8"/>
+          </w:tcPr>
+          <w:p>
+            <w:pPr>
+              <w:spacing w:after="0" w:line="259" w:lineRule="auto"/>
+            </w:pPr>
+            <w:r>
+              <w:rPr>
+                <w:rFonts w:ascii="Aptos" w:hAnsi="Aptos" w:eastAsia="Microsoft YaHei"/>
+                <w:color w:val="000000"/>
+                <w:sz w:val="17"/>
+              </w:rPr>
+              <w:t>跨租户事件 Worker 使用受限 BYPASSRLS 专用角色</w:t>
+            </w:r>
+          </w:p>
+        </w:tc>
+        <w:tc>
+          <w:tcPr>
+            <w:tcW w:type="dxa" w:w="2498"/>
+            <w:tcMar>
+              <w:top w:w="100" w:type="dxa"/>
+              <w:start w:w="120" w:type="dxa"/>
+              <w:bottom w:w="100" w:type="dxa"/>
+              <w:end w:w="120" w:type="dxa"/>
+            </w:tcMar>
+            <w:vAlign w:val="center"/>
+            <w:shd w:fill="EAF2F8"/>
+          </w:tcPr>
+          <w:p>
+            <w:pPr>
+              <w:spacing w:after="0" w:line="259" w:lineRule="auto"/>
+            </w:pPr>
+            <w:r>
+              <w:rPr>
+                <w:rFonts w:ascii="Aptos" w:hAnsi="Aptos" w:eastAsia="Microsoft YaHei"/>
+                <w:color w:val="000000"/>
+                <w:sz w:val="17"/>
+              </w:rPr>
+              <w:t>允许扫描全局 Outbox，同时避免复用迁移管理员和业务表权限</w:t>
+            </w:r>
+          </w:p>
+        </w:tc>
+        <w:tc>
+          <w:tcPr>
+            <w:tcW w:type="dxa" w:w="2498"/>
+            <w:tcMar>
+              <w:top w:w="100" w:type="dxa"/>
+              <w:start w:w="120" w:type="dxa"/>
+              <w:bottom w:w="100" w:type="dxa"/>
+              <w:end w:w="120" w:type="dxa"/>
+            </w:tcMar>
+            <w:vAlign w:val="center"/>
+            <w:shd w:fill="EAF2F8"/>
+          </w:tcPr>
+          <w:p>
+            <w:pPr>
+              <w:spacing w:after="0" w:line="259" w:lineRule="auto"/>
+            </w:pPr>
+            <w:r>
+              <w:rPr>
+                <w:rFonts w:ascii="Aptos" w:hAnsi="Aptos" w:eastAsia="Microsoft YaHei"/>
+                <w:color w:val="000000"/>
+                <w:sz w:val="17"/>
+              </w:rPr>
+              <w:t>引入按租户分片 Worker 后重新评估是否取消 BYPASSRLS</w:t>
+            </w:r>
+          </w:p>
+        </w:tc>
+      </w:tr>
+      <w:tr>
+        <w:trPr>
+          <w:cantSplit/>
+        </w:trPr>
+        <w:tc>
+          <w:tcPr>
+            <w:tcW w:type="dxa" w:w="2498"/>
+            <w:tcMar>
+              <w:top w:w="100" w:type="dxa"/>
+              <w:start w:w="120" w:type="dxa"/>
+              <w:bottom w:w="100" w:type="dxa"/>
+              <w:end w:w="120" w:type="dxa"/>
+            </w:tcMar>
+            <w:vAlign w:val="center"/>
+          </w:tcPr>
+          <w:p>
+            <w:pPr>
+              <w:spacing w:after="0" w:line="259" w:lineRule="auto"/>
+              <w:jc w:val="center"/>
+            </w:pPr>
+            <w:r>
+              <w:rPr>
+                <w:rFonts w:ascii="Aptos" w:hAnsi="Aptos" w:eastAsia="Microsoft YaHei"/>
+                <w:color w:val="000000"/>
+                <w:sz w:val="17"/>
+              </w:rPr>
+              <w:t>ADR 025</w:t>
+            </w:r>
+          </w:p>
+        </w:tc>
+        <w:tc>
+          <w:tcPr>
+            <w:tcW w:type="dxa" w:w="2498"/>
+            <w:tcMar>
+              <w:top w:w="100" w:type="dxa"/>
+              <w:start w:w="120" w:type="dxa"/>
+              <w:bottom w:w="100" w:type="dxa"/>
+              <w:end w:w="120" w:type="dxa"/>
+            </w:tcMar>
+            <w:vAlign w:val="center"/>
+          </w:tcPr>
+          <w:p>
+            <w:pPr>
+              <w:spacing w:after="0" w:line="259" w:lineRule="auto"/>
+            </w:pPr>
+            <w:r>
+              <w:rPr>
+                <w:rFonts w:ascii="Aptos" w:hAnsi="Aptos" w:eastAsia="Microsoft YaHei"/>
+                <w:color w:val="000000"/>
+                <w:sz w:val="17"/>
+              </w:rPr>
+              <w:t>死信保存在 PostgreSQL 并由租户管理员人工重放</w:t>
+            </w:r>
+          </w:p>
+        </w:tc>
+        <w:tc>
+          <w:tcPr>
+            <w:tcW w:type="dxa" w:w="2498"/>
+            <w:tcMar>
+              <w:top w:w="100" w:type="dxa"/>
+              <w:start w:w="120" w:type="dxa"/>
+              <w:bottom w:w="100" w:type="dxa"/>
+              <w:end w:w="120" w:type="dxa"/>
+            </w:tcMar>
+            <w:vAlign w:val="center"/>
+          </w:tcPr>
+          <w:p>
+            <w:pPr>
+              <w:spacing w:after="0" w:line="259" w:lineRule="auto"/>
+            </w:pPr>
+            <w:r>
+              <w:rPr>
+                <w:rFonts w:ascii="Aptos" w:hAnsi="Aptos" w:eastAsia="Microsoft YaHei"/>
+                <w:color w:val="000000"/>
+                <w:sz w:val="17"/>
+              </w:rPr>
+              <w:t>失败记录与租户和事件保持关系，可受 RLS 隔离并记录重放审计</w:t>
+            </w:r>
+          </w:p>
+        </w:tc>
+        <w:tc>
+          <w:tcPr>
+            <w:tcW w:type="dxa" w:w="2498"/>
+            <w:tcMar>
+              <w:top w:w="100" w:type="dxa"/>
+              <w:start w:w="120" w:type="dxa"/>
+              <w:bottom w:w="100" w:type="dxa"/>
+              <w:end w:w="120" w:type="dxa"/>
+            </w:tcMar>
+            <w:vAlign w:val="center"/>
+          </w:tcPr>
+          <w:p>
+            <w:pPr>
+              <w:spacing w:after="0" w:line="259" w:lineRule="auto"/>
+            </w:pPr>
+            <w:r>
+              <w:rPr>
+                <w:rFonts w:ascii="Aptos" w:hAnsi="Aptos" w:eastAsia="Microsoft YaHei"/>
+                <w:color w:val="000000"/>
+                <w:sz w:val="17"/>
+              </w:rPr>
+              <w:t>死信规模需要独立归档服务时迁移存储</w:t>
+            </w:r>
+          </w:p>
+        </w:tc>
+      </w:tr>
+      <w:tr>
+        <w:trPr>
+          <w:cantSplit/>
+        </w:trPr>
         <w:tc>
           <w:tcPr>
             <w:tcW w:type="dxa" w:w="2498"/>
@@ -27667,6 +28033,9 @@
         </w:tc>
       </w:tr>
       <w:tr>
+        <w:trPr>
+          <w:cantSplit/>
+        </w:trPr>
         <w:tc>
           <w:tcPr>
             <w:tcW w:type="dxa" w:w="2498"/>
@@ -27781,6 +28150,9 @@
         </w:tc>
       </w:tr>
       <w:tr>
+        <w:trPr>
+          <w:cantSplit/>
+        </w:trPr>
         <w:tc>
           <w:tcPr>
             <w:tcW w:type="dxa" w:w="2498"/>
@@ -27895,6 +28267,9 @@
         </w:tc>
       </w:tr>
       <w:tr>
+        <w:trPr>
+          <w:cantSplit/>
+        </w:trPr>
         <w:tc>
           <w:tcPr>
             <w:tcW w:type="dxa" w:w="2498"/>
@@ -28009,6 +28384,9 @@
         </w:tc>
       </w:tr>
       <w:tr>
+        <w:trPr>
+          <w:cantSplit/>
+        </w:trPr>
         <w:tc>
           <w:tcPr>
             <w:tcW w:type="dxa" w:w="2498"/>
@@ -29796,6 +30174,9 @@
         </w:tc>
       </w:tr>
       <w:tr>
+        <w:trPr>
+          <w:cantSplit/>
+        </w:trPr>
         <w:tc>
           <w:tcPr>
             <w:tcW w:type="dxa" w:w="2498"/>
@@ -29833,90 +30214,6 @@
           <w:p>
             <w:r>
               <w:t>接入企业目录后校验租户成员 岗位角色和在职状态</w:t>
-            </w:r>
-          </w:p>
-        </w:tc>
-      </w:tr>
-      <w:tr>
-        <w:tc>
-          <w:tcPr>
-            <w:tcW w:type="dxa" w:w="2498"/>
-          </w:tcPr>
-          <w:p>
-            <w:r>
-              <w:t>策略条件遗漏业务维度</w:t>
-            </w:r>
-          </w:p>
-        </w:tc>
-        <w:tc>
-          <w:tcPr>
-            <w:tcW w:type="dxa" w:w="2498"/>
-          </w:tcPr>
-          <w:p>
-            <w:r>
-              <w:t>合同选择到过宽或过窄的审批链</w:t>
-            </w:r>
-          </w:p>
-        </w:tc>
-        <w:tc>
-          <w:tcPr>
-            <w:tcW w:type="dxa" w:w="2498"/>
-          </w:tcPr>
-          <w:p>
-            <w:r>
-              <w:t>受控字段 优先级 不可变发布和策略快照</w:t>
-            </w:r>
-          </w:p>
-        </w:tc>
-        <w:tc>
-          <w:tcPr>
-            <w:tcW w:type="dxa" w:w="2498"/>
-          </w:tcPr>
-          <w:p>
-            <w:r>
-              <w:t>增加策略模拟接口与样本回放后再扩展风险标签</w:t>
-            </w:r>
-          </w:p>
-        </w:tc>
-      </w:tr>
-      <w:tr>
-        <w:tc>
-          <w:tcPr>
-            <w:tcW w:type="dxa" w:w="2498"/>
-          </w:tcPr>
-          <w:p>
-            <w:r>
-              <w:t>热点审批步骤并发争用</w:t>
-            </w:r>
-          </w:p>
-        </w:tc>
-        <w:tc>
-          <w:tcPr>
-            <w:tcW w:type="dxa" w:w="2498"/>
-          </w:tcPr>
-          <w:p>
-            <w:r>
-              <w:t>大量领取或决策请求返回冲突</w:t>
-            </w:r>
-          </w:p>
-        </w:tc>
-        <w:tc>
-          <w:tcPr>
-            <w:tcW w:type="dxa" w:w="2498"/>
-          </w:tcPr>
-          <w:p>
-            <w:r>
-              <w:t>短事务行锁 expected version 和稳定 409 错误</w:t>
-            </w:r>
-          </w:p>
-        </w:tc>
-        <w:tc>
-          <w:tcPr>
-            <w:tcW w:type="dxa" w:w="2498"/>
-          </w:tcPr>
-          <w:p>
-            <w:r>
-              <w:t>压测冲突率 锁等待和端到端延迟</w:t>
             </w:r>
           </w:p>
         </w:tc>
@@ -29928,105 +30225,40 @@
         <w:tc>
           <w:tcPr>
             <w:tcW w:type="dxa" w:w="2498"/>
-            <w:tcMar>
-              <w:top w:w="100" w:type="dxa"/>
-              <w:start w:w="120" w:type="dxa"/>
-              <w:bottom w:w="100" w:type="dxa"/>
-              <w:end w:w="120" w:type="dxa"/>
-            </w:tcMar>
-            <w:vAlign w:val="center"/>
-            <w:shd w:fill="EAF2F8"/>
-          </w:tcPr>
-          <w:p>
-            <w:pPr>
-              <w:spacing w:after="0" w:line="259" w:lineRule="auto"/>
-              <w:jc w:val="center"/>
-            </w:pPr>
-            <w:r>
-              <w:rPr>
-                <w:rFonts w:ascii="Aptos" w:hAnsi="Aptos" w:eastAsia="Microsoft YaHei"/>
-                <w:color w:val="000000"/>
-                <w:sz w:val="17"/>
-              </w:rPr>
-              <w:t>Webhook 远端重复副作用</w:t>
+          </w:tcPr>
+          <w:p>
+            <w:r>
+              <w:t>策略条件遗漏业务维度</w:t>
             </w:r>
           </w:p>
         </w:tc>
         <w:tc>
           <w:tcPr>
             <w:tcW w:type="dxa" w:w="2498"/>
-            <w:tcMar>
-              <w:top w:w="100" w:type="dxa"/>
-              <w:start w:w="120" w:type="dxa"/>
-              <w:bottom w:w="100" w:type="dxa"/>
-              <w:end w:w="120" w:type="dxa"/>
-            </w:tcMar>
-            <w:vAlign w:val="center"/>
-            <w:shd w:fill="EAF2F8"/>
-          </w:tcPr>
-          <w:p>
-            <w:pPr>
-              <w:spacing w:after="0" w:line="259" w:lineRule="auto"/>
-            </w:pPr>
-            <w:r>
-              <w:rPr>
-                <w:rFonts w:ascii="Aptos" w:hAnsi="Aptos" w:eastAsia="Microsoft YaHei"/>
-                <w:color w:val="000000"/>
-                <w:sz w:val="17"/>
-              </w:rPr>
-              <w:t>接收系统可能重复发信或创建任务</w:t>
+          </w:tcPr>
+          <w:p>
+            <w:r>
+              <w:t>合同选择到过宽或过窄的审批链</w:t>
             </w:r>
           </w:p>
         </w:tc>
         <w:tc>
           <w:tcPr>
             <w:tcW w:type="dxa" w:w="2498"/>
-            <w:tcMar>
-              <w:top w:w="100" w:type="dxa"/>
-              <w:start w:w="120" w:type="dxa"/>
-              <w:bottom w:w="100" w:type="dxa"/>
-              <w:end w:w="120" w:type="dxa"/>
-            </w:tcMar>
-            <w:vAlign w:val="center"/>
-            <w:shd w:fill="EAF2F8"/>
-          </w:tcPr>
-          <w:p>
-            <w:pPr>
-              <w:spacing w:after="0" w:line="259" w:lineRule="auto"/>
-            </w:pPr>
-            <w:r>
-              <w:rPr>
-                <w:rFonts w:ascii="Aptos" w:hAnsi="Aptos" w:eastAsia="Microsoft YaHei"/>
-                <w:color w:val="000000"/>
-                <w:sz w:val="17"/>
-              </w:rPr>
-              <w:t>稳定 Idempotency Key、本地投递唯一键和有限重试</w:t>
+          </w:tcPr>
+          <w:p>
+            <w:r>
+              <w:t>受控字段 优先级 不可变发布和策略快照</w:t>
             </w:r>
           </w:p>
         </w:tc>
         <w:tc>
           <w:tcPr>
             <w:tcW w:type="dxa" w:w="2498"/>
-            <w:tcMar>
-              <w:top w:w="100" w:type="dxa"/>
-              <w:start w:w="120" w:type="dxa"/>
-              <w:bottom w:w="100" w:type="dxa"/>
-              <w:end w:w="120" w:type="dxa"/>
-            </w:tcMar>
-            <w:vAlign w:val="center"/>
-            <w:shd w:fill="EAF2F8"/>
-          </w:tcPr>
-          <w:p>
-            <w:pPr>
-              <w:spacing w:after="0" w:line="259" w:lineRule="auto"/>
-            </w:pPr>
-            <w:r>
-              <w:rPr>
-                <w:rFonts w:ascii="Aptos" w:hAnsi="Aptos" w:eastAsia="Microsoft YaHei"/>
-                <w:color w:val="000000"/>
-                <w:sz w:val="17"/>
-              </w:rPr>
-              <w:t>使用故障注入覆盖发送成功后进程退出，并验证接收方去重</w:t>
+          </w:tcPr>
+          <w:p>
+            <w:r>
+              <w:t>增加策略模拟接口与样本回放后再扩展风险标签</w:t>
             </w:r>
           </w:p>
         </w:tc>
@@ -30038,101 +30270,40 @@
         <w:tc>
           <w:tcPr>
             <w:tcW w:type="dxa" w:w="2498"/>
-            <w:tcMar>
-              <w:top w:w="100" w:type="dxa"/>
-              <w:start w:w="120" w:type="dxa"/>
-              <w:bottom w:w="100" w:type="dxa"/>
-              <w:end w:w="120" w:type="dxa"/>
-            </w:tcMar>
-            <w:vAlign w:val="center"/>
-          </w:tcPr>
-          <w:p>
-            <w:pPr>
-              <w:spacing w:after="0" w:line="259" w:lineRule="auto"/>
-              <w:jc w:val="center"/>
-            </w:pPr>
-            <w:r>
-              <w:rPr>
-                <w:rFonts w:ascii="Aptos" w:hAnsi="Aptos" w:eastAsia="Microsoft YaHei"/>
-                <w:color w:val="000000"/>
-                <w:sz w:val="17"/>
-              </w:rPr>
-              <w:t>Worker BYPASSRLS 凭据泄漏</w:t>
+          </w:tcPr>
+          <w:p>
+            <w:r>
+              <w:t>热点审批步骤并发争用</w:t>
             </w:r>
           </w:p>
         </w:tc>
         <w:tc>
           <w:tcPr>
             <w:tcW w:type="dxa" w:w="2498"/>
-            <w:tcMar>
-              <w:top w:w="100" w:type="dxa"/>
-              <w:start w:w="120" w:type="dxa"/>
-              <w:bottom w:w="100" w:type="dxa"/>
-              <w:end w:w="120" w:type="dxa"/>
-            </w:tcMar>
-            <w:vAlign w:val="center"/>
-          </w:tcPr>
-          <w:p>
-            <w:pPr>
-              <w:spacing w:after="0" w:line="259" w:lineRule="auto"/>
-            </w:pPr>
-            <w:r>
-              <w:rPr>
-                <w:rFonts w:ascii="Aptos" w:hAnsi="Aptos" w:eastAsia="Microsoft YaHei"/>
-                <w:color w:val="000000"/>
-                <w:sz w:val="17"/>
-              </w:rPr>
-              <w:t>攻击者可跨租户读取事件元数据或篡改投递状态</w:t>
+          </w:tcPr>
+          <w:p>
+            <w:r>
+              <w:t>大量领取或决策请求返回冲突</w:t>
             </w:r>
           </w:p>
         </w:tc>
         <w:tc>
           <w:tcPr>
             <w:tcW w:type="dxa" w:w="2498"/>
-            <w:tcMar>
-              <w:top w:w="100" w:type="dxa"/>
-              <w:start w:w="120" w:type="dxa"/>
-              <w:bottom w:w="100" w:type="dxa"/>
-              <w:end w:w="120" w:type="dxa"/>
-            </w:tcMar>
-            <w:vAlign w:val="center"/>
-          </w:tcPr>
-          <w:p>
-            <w:pPr>
-              <w:spacing w:after="0" w:line="259" w:lineRule="auto"/>
-            </w:pPr>
-            <w:r>
-              <w:rPr>
-                <w:rFonts w:ascii="Aptos" w:hAnsi="Aptos" w:eastAsia="Microsoft YaHei"/>
-                <w:color w:val="000000"/>
-                <w:sz w:val="17"/>
-              </w:rPr>
-              <w:t>独立角色、事件表最小授权、不授予合同和迁移权限</w:t>
+          </w:tcPr>
+          <w:p>
+            <w:r>
+              <w:t>短事务行锁 expected version 和稳定 409 错误</w:t>
             </w:r>
           </w:p>
         </w:tc>
         <w:tc>
           <w:tcPr>
             <w:tcW w:type="dxa" w:w="2498"/>
-            <w:tcMar>
-              <w:top w:w="100" w:type="dxa"/>
-              <w:start w:w="120" w:type="dxa"/>
-              <w:bottom w:w="100" w:type="dxa"/>
-              <w:end w:w="120" w:type="dxa"/>
-            </w:tcMar>
-            <w:vAlign w:val="center"/>
-          </w:tcPr>
-          <w:p>
-            <w:pPr>
-              <w:spacing w:after="0" w:line="259" w:lineRule="auto"/>
-            </w:pPr>
-            <w:r>
-              <w:rPr>
-                <w:rFonts w:ascii="Aptos" w:hAnsi="Aptos" w:eastAsia="Microsoft YaHei"/>
-                <w:color w:val="000000"/>
-                <w:sz w:val="17"/>
-              </w:rPr>
-              <w:t>生产密钥轮换、网络策略和权限回归测试</w:t>
+          </w:tcPr>
+          <w:p>
+            <w:r>
+              <w:t>压测冲突率 锁等待和端到端延迟</w:t>
             </w:r>
           </w:p>
         </w:tc>
@@ -30164,7 +30335,7 @@
                 <w:color w:val="000000"/>
                 <w:sz w:val="17"/>
               </w:rPr>
-              <w:t>Redis Stream 无界增长</w:t>
+              <w:t>Webhook 远端重复副作用</w:t>
             </w:r>
           </w:p>
         </w:tc>
@@ -30190,7 +30361,7 @@
                 <w:color w:val="000000"/>
                 <w:sz w:val="17"/>
               </w:rPr>
-              <w:t>内存和持久化文件持续膨胀</w:t>
+              <w:t>接收系统可能重复发信或创建任务</w:t>
             </w:r>
           </w:p>
         </w:tc>
@@ -30216,7 +30387,7 @@
                 <w:color w:val="000000"/>
                 <w:sz w:val="17"/>
               </w:rPr>
-              <w:t>当前事件只保存最小路由字段</w:t>
+              <w:t>稳定 Idempotency Key、本地投递唯一键和有限重试</w:t>
             </w:r>
           </w:p>
         </w:tc>
@@ -30242,12 +30413,231 @@
                 <w:color w:val="000000"/>
                 <w:sz w:val="17"/>
               </w:rPr>
-              <w:t>M7 压测后确定 MAXLEN、保留周期和归档策略</w:t>
+              <w:t>使用故障注入覆盖发送成功后进程退出，并验证接收方去重</w:t>
             </w:r>
           </w:p>
         </w:tc>
       </w:tr>
       <w:tr>
+        <w:trPr>
+          <w:cantSplit/>
+        </w:trPr>
+        <w:tc>
+          <w:tcPr>
+            <w:tcW w:type="dxa" w:w="2498"/>
+            <w:tcMar>
+              <w:top w:w="100" w:type="dxa"/>
+              <w:start w:w="120" w:type="dxa"/>
+              <w:bottom w:w="100" w:type="dxa"/>
+              <w:end w:w="120" w:type="dxa"/>
+            </w:tcMar>
+            <w:vAlign w:val="center"/>
+          </w:tcPr>
+          <w:p>
+            <w:pPr>
+              <w:spacing w:after="0" w:line="259" w:lineRule="auto"/>
+              <w:jc w:val="center"/>
+            </w:pPr>
+            <w:r>
+              <w:rPr>
+                <w:rFonts w:ascii="Aptos" w:hAnsi="Aptos" w:eastAsia="Microsoft YaHei"/>
+                <w:color w:val="000000"/>
+                <w:sz w:val="17"/>
+              </w:rPr>
+              <w:t>Worker BYPASSRLS 凭据泄漏</w:t>
+            </w:r>
+          </w:p>
+        </w:tc>
+        <w:tc>
+          <w:tcPr>
+            <w:tcW w:type="dxa" w:w="2498"/>
+            <w:tcMar>
+              <w:top w:w="100" w:type="dxa"/>
+              <w:start w:w="120" w:type="dxa"/>
+              <w:bottom w:w="100" w:type="dxa"/>
+              <w:end w:w="120" w:type="dxa"/>
+            </w:tcMar>
+            <w:vAlign w:val="center"/>
+          </w:tcPr>
+          <w:p>
+            <w:pPr>
+              <w:spacing w:after="0" w:line="259" w:lineRule="auto"/>
+            </w:pPr>
+            <w:r>
+              <w:rPr>
+                <w:rFonts w:ascii="Aptos" w:hAnsi="Aptos" w:eastAsia="Microsoft YaHei"/>
+                <w:color w:val="000000"/>
+                <w:sz w:val="17"/>
+              </w:rPr>
+              <w:t>攻击者可跨租户读取事件元数据或篡改投递状态</w:t>
+            </w:r>
+          </w:p>
+        </w:tc>
+        <w:tc>
+          <w:tcPr>
+            <w:tcW w:type="dxa" w:w="2498"/>
+            <w:tcMar>
+              <w:top w:w="100" w:type="dxa"/>
+              <w:start w:w="120" w:type="dxa"/>
+              <w:bottom w:w="100" w:type="dxa"/>
+              <w:end w:w="120" w:type="dxa"/>
+            </w:tcMar>
+            <w:vAlign w:val="center"/>
+          </w:tcPr>
+          <w:p>
+            <w:pPr>
+              <w:spacing w:after="0" w:line="259" w:lineRule="auto"/>
+            </w:pPr>
+            <w:r>
+              <w:rPr>
+                <w:rFonts w:ascii="Aptos" w:hAnsi="Aptos" w:eastAsia="Microsoft YaHei"/>
+                <w:color w:val="000000"/>
+                <w:sz w:val="17"/>
+              </w:rPr>
+              <w:t>独立角色、事件表最小授权、不授予合同和迁移权限</w:t>
+            </w:r>
+          </w:p>
+        </w:tc>
+        <w:tc>
+          <w:tcPr>
+            <w:tcW w:type="dxa" w:w="2498"/>
+            <w:tcMar>
+              <w:top w:w="100" w:type="dxa"/>
+              <w:start w:w="120" w:type="dxa"/>
+              <w:bottom w:w="100" w:type="dxa"/>
+              <w:end w:w="120" w:type="dxa"/>
+            </w:tcMar>
+            <w:vAlign w:val="center"/>
+          </w:tcPr>
+          <w:p>
+            <w:pPr>
+              <w:spacing w:after="0" w:line="259" w:lineRule="auto"/>
+            </w:pPr>
+            <w:r>
+              <w:rPr>
+                <w:rFonts w:ascii="Aptos" w:hAnsi="Aptos" w:eastAsia="Microsoft YaHei"/>
+                <w:color w:val="000000"/>
+                <w:sz w:val="17"/>
+              </w:rPr>
+              <w:t>生产密钥轮换、网络策略和权限回归测试</w:t>
+            </w:r>
+          </w:p>
+        </w:tc>
+      </w:tr>
+      <w:tr>
+        <w:trPr>
+          <w:cantSplit/>
+        </w:trPr>
+        <w:tc>
+          <w:tcPr>
+            <w:tcW w:type="dxa" w:w="2498"/>
+            <w:tcMar>
+              <w:top w:w="100" w:type="dxa"/>
+              <w:start w:w="120" w:type="dxa"/>
+              <w:bottom w:w="100" w:type="dxa"/>
+              <w:end w:w="120" w:type="dxa"/>
+            </w:tcMar>
+            <w:vAlign w:val="center"/>
+            <w:shd w:fill="EAF2F8"/>
+          </w:tcPr>
+          <w:p>
+            <w:pPr>
+              <w:spacing w:after="0" w:line="259" w:lineRule="auto"/>
+              <w:jc w:val="center"/>
+            </w:pPr>
+            <w:r>
+              <w:rPr>
+                <w:rFonts w:ascii="Aptos" w:hAnsi="Aptos" w:eastAsia="Microsoft YaHei"/>
+                <w:color w:val="000000"/>
+                <w:sz w:val="17"/>
+              </w:rPr>
+              <w:t>Redis Stream 无界增长</w:t>
+            </w:r>
+          </w:p>
+        </w:tc>
+        <w:tc>
+          <w:tcPr>
+            <w:tcW w:type="dxa" w:w="2498"/>
+            <w:tcMar>
+              <w:top w:w="100" w:type="dxa"/>
+              <w:start w:w="120" w:type="dxa"/>
+              <w:bottom w:w="100" w:type="dxa"/>
+              <w:end w:w="120" w:type="dxa"/>
+            </w:tcMar>
+            <w:vAlign w:val="center"/>
+            <w:shd w:fill="EAF2F8"/>
+          </w:tcPr>
+          <w:p>
+            <w:pPr>
+              <w:spacing w:after="0" w:line="259" w:lineRule="auto"/>
+            </w:pPr>
+            <w:r>
+              <w:rPr>
+                <w:rFonts w:ascii="Aptos" w:hAnsi="Aptos" w:eastAsia="Microsoft YaHei"/>
+                <w:color w:val="000000"/>
+                <w:sz w:val="17"/>
+              </w:rPr>
+              <w:t>内存和持久化文件持续膨胀</w:t>
+            </w:r>
+          </w:p>
+        </w:tc>
+        <w:tc>
+          <w:tcPr>
+            <w:tcW w:type="dxa" w:w="2498"/>
+            <w:tcMar>
+              <w:top w:w="100" w:type="dxa"/>
+              <w:start w:w="120" w:type="dxa"/>
+              <w:bottom w:w="100" w:type="dxa"/>
+              <w:end w:w="120" w:type="dxa"/>
+            </w:tcMar>
+            <w:vAlign w:val="center"/>
+            <w:shd w:fill="EAF2F8"/>
+          </w:tcPr>
+          <w:p>
+            <w:pPr>
+              <w:spacing w:after="0" w:line="259" w:lineRule="auto"/>
+            </w:pPr>
+            <w:r>
+              <w:rPr>
+                <w:rFonts w:ascii="Aptos" w:hAnsi="Aptos" w:eastAsia="Microsoft YaHei"/>
+                <w:color w:val="000000"/>
+                <w:sz w:val="17"/>
+              </w:rPr>
+              <w:t>当前事件只保存最小路由字段</w:t>
+            </w:r>
+          </w:p>
+        </w:tc>
+        <w:tc>
+          <w:tcPr>
+            <w:tcW w:type="dxa" w:w="2498"/>
+            <w:tcMar>
+              <w:top w:w="100" w:type="dxa"/>
+              <w:start w:w="120" w:type="dxa"/>
+              <w:bottom w:w="100" w:type="dxa"/>
+              <w:end w:w="120" w:type="dxa"/>
+            </w:tcMar>
+            <w:vAlign w:val="center"/>
+            <w:shd w:fill="EAF2F8"/>
+          </w:tcPr>
+          <w:p>
+            <w:pPr>
+              <w:spacing w:after="0" w:line="259" w:lineRule="auto"/>
+            </w:pPr>
+            <w:r>
+              <w:rPr>
+                <w:rFonts w:ascii="Aptos" w:hAnsi="Aptos" w:eastAsia="Microsoft YaHei"/>
+                <w:color w:val="000000"/>
+                <w:sz w:val="17"/>
+              </w:rPr>
+              <w:t>M7 压测后确定 MAXLEN、保留周期和归档策略</w:t>
+            </w:r>
+          </w:p>
+        </w:tc>
+      </w:tr>
+      <w:tr>
+        <w:trPr>
+          <w:cantSplit/>
+        </w:trPr>
         <w:tc>
           <w:tcPr>
             <w:tcW w:type="dxa" w:w="2498"/>
@@ -30362,6 +30752,9 @@
         </w:tc>
       </w:tr>
       <w:tr>
+        <w:trPr>
+          <w:cantSplit/>
+        </w:trPr>
         <w:tc>
           <w:tcPr>
             <w:tcW w:type="dxa" w:w="2498"/>
@@ -30476,6 +30869,9 @@
         </w:tc>
       </w:tr>
       <w:tr>
+        <w:trPr>
+          <w:cantSplit/>
+        </w:trPr>
         <w:tc>
           <w:tcPr>
             <w:tcW w:type="dxa" w:w="2498"/>
@@ -30590,6 +30986,9 @@
         </w:tc>
       </w:tr>
       <w:tr>
+        <w:trPr>
+          <w:cantSplit/>
+        </w:trPr>
         <w:tc>
           <w:tcPr>
             <w:tcW w:type="dxa" w:w="2498"/>
@@ -30699,6 +31098,111 @@
                 <w:sz w:val="17"/>
               </w:rPr>
               <w:t>M7 压测停机恢复与积压排空时间</w:t>
+            </w:r>
+          </w:p>
+        </w:tc>
+      </w:tr>
+      <w:tr>
+        <w:trPr>
+          <w:cantSplit/>
+        </w:trPr>
+        <w:tc>
+          <w:tcPr>
+            <w:tcW w:type="dxa" w:w="2498"/>
+            <w:vAlign w:val="center"/>
+            <w:tcMar>
+              <w:top w:w="80" w:type="dxa"/>
+              <w:start w:w="100" w:type="dxa"/>
+              <w:bottom w:w="80" w:type="dxa"/>
+              <w:end w:w="100" w:type="dxa"/>
+            </w:tcMar>
+            <w:shd w:fill="FFFFFF"/>
+          </w:tcPr>
+          <w:p>
+            <w:pPr>
+              <w:spacing w:after="0"/>
+            </w:pPr>
+            <w:r>
+              <w:rPr>
+                <w:rFonts w:ascii="Microsoft YaHei" w:hAnsi="Microsoft YaHei" w:eastAsia="Microsoft YaHei"/>
+                <w:sz w:val="18"/>
+              </w:rPr>
+              <w:t>增量迁移重复定义基础表</w:t>
+            </w:r>
+          </w:p>
+        </w:tc>
+        <w:tc>
+          <w:tcPr>
+            <w:tcW w:type="dxa" w:w="2498"/>
+            <w:vAlign w:val="center"/>
+            <w:tcMar>
+              <w:top w:w="80" w:type="dxa"/>
+              <w:start w:w="100" w:type="dxa"/>
+              <w:bottom w:w="80" w:type="dxa"/>
+              <w:end w:w="100" w:type="dxa"/>
+            </w:tcMar>
+            <w:shd w:fill="FFFFFF"/>
+          </w:tcPr>
+          <w:p>
+            <w:pPr>
+              <w:spacing w:after="0"/>
+            </w:pPr>
+            <w:r>
+              <w:rPr>
+                <w:rFonts w:ascii="Microsoft YaHei" w:hAnsi="Microsoft YaHei" w:eastAsia="Microsoft YaHei"/>
+                <w:sz w:val="18"/>
+              </w:rPr>
+              <w:t>空库从 0001 升级到 0005 时 DuplicateTable，发布被阻断</w:t>
+            </w:r>
+          </w:p>
+        </w:tc>
+        <w:tc>
+          <w:tcPr>
+            <w:tcW w:type="dxa" w:w="2498"/>
+            <w:vAlign w:val="center"/>
+            <w:tcMar>
+              <w:top w:w="80" w:type="dxa"/>
+              <w:start w:w="100" w:type="dxa"/>
+              <w:bottom w:w="80" w:type="dxa"/>
+              <w:end w:w="100" w:type="dxa"/>
+            </w:tcMar>
+            <w:shd w:fill="FFFFFF"/>
+          </w:tcPr>
+          <w:p>
+            <w:pPr>
+              <w:spacing w:after="0"/>
+            </w:pPr>
+            <w:r>
+              <w:rPr>
+                <w:rFonts w:ascii="Microsoft YaHei" w:hAnsi="Microsoft YaHei" w:eastAsia="Microsoft YaHei"/>
+                <w:sz w:val="18"/>
+              </w:rPr>
+              <w:t>禁止阶段迁移重建基础表；采用原地字段演进、数据映射、命名约束和对称降级</w:t>
+            </w:r>
+          </w:p>
+        </w:tc>
+        <w:tc>
+          <w:tcPr>
+            <w:tcW w:type="dxa" w:w="2498"/>
+            <w:vAlign w:val="center"/>
+            <w:tcMar>
+              <w:top w:w="80" w:type="dxa"/>
+              <w:start w:w="100" w:type="dxa"/>
+              <w:bottom w:w="80" w:type="dxa"/>
+              <w:end w:w="100" w:type="dxa"/>
+            </w:tcMar>
+            <w:shd w:fill="FFFFFF"/>
+          </w:tcPr>
+          <w:p>
+            <w:pPr>
+              <w:spacing w:after="0"/>
+            </w:pPr>
+            <w:r>
+              <w:rPr>
+                <w:rFonts w:ascii="Microsoft YaHei" w:hAnsi="Microsoft YaHei" w:eastAsia="Microsoft YaHei"/>
+                <w:sz w:val="18"/>
+              </w:rPr>
+              <w:t>以 PR 5 的空库升级、重复升级、降级到 base、再次升级作为验收证据</w:t>
             </w:r>
           </w:p>
         </w:tc>

</xml_diff>

<commit_message>
fix(contractops): replace existing obligation RLS policy
</commit_message>
<xml_diff>
--- a/architecture/ContractOps-项目更新记录.docx
+++ b/architecture/ContractOps-项目更新记录.docx
@@ -2829,7 +2829,7 @@
                 <w:rFonts w:ascii="Microsoft YaHei" w:hAnsi="Microsoft YaHei" w:eastAsia="Microsoft YaHei"/>
                 <w:sz w:val="18"/>
               </w:rPr>
-              <w:t>将 obligations 从重复 CREATE TABLE 改为保留数据的原表演进，并补全可逆降级</w:t>
+              <w:t>将 obligations 从重复 CREATE TABLE 改为保留数据的原表演进；升级时替换同名 RLS 策略，并补全可逆降级</w:t>
             </w:r>
           </w:p>
         </w:tc>
@@ -25228,7 +25228,7 @@
                 <w:rFonts w:ascii="Microsoft YaHei" w:hAnsi="Microsoft YaHei" w:eastAsia="Microsoft YaHei"/>
                 <w:sz w:val="18"/>
               </w:rPr>
-              <w:t>定位到 0001 已创建 obligations；0005 现改为 ALTER TABLE，保留既有合同、版本和租户关联。</w:t>
+              <w:t>定位到 0001 已创建 obligations 及 tenant_isolation；0005 现采用 ALTER TABLE，并显式替换同名策略。</w:t>
             </w:r>
           </w:p>
         </w:tc>
@@ -31177,7 +31177,7 @@
                 <w:rFonts w:ascii="Microsoft YaHei" w:hAnsi="Microsoft YaHei" w:eastAsia="Microsoft YaHei"/>
                 <w:sz w:val="18"/>
               </w:rPr>
-              <w:t>禁止阶段迁移重建基础表；采用原地字段演进、数据映射、命名约束和对称降级</w:t>
+              <w:t>禁止阶段迁移重建基础表；采用原地字段演进、数据映射、命名约束、RLS 策略替换和对称降级</w:t>
             </w:r>
           </w:p>
         </w:tc>

</xml_diff>

<commit_message>
chore(contractops): sync M4 migration acceptance into M5
</commit_message>
<xml_diff>
--- a/architecture/ContractOps-项目更新记录.docx
+++ b/architecture/ContractOps-项目更新记录.docx
@@ -2585,13 +2585,15 @@
             <w:vAlign w:val="center"/>
           </w:tcPr>
           <w:p>
-            <w:r>
-              <w:rPr>
-                <w:rFonts w:ascii="Aptos" w:hAnsi="Aptos" w:eastAsia="Microsoft YaHei"/>
-                <w:color w:val="000000"/>
-                <w:sz w:val="17"/>
-              </w:rPr>
-              <w:t>PR 4 基础设施集成和全部质量检查通过，待审批合并</w:t>
+            <w:pPr>
+              <w:spacing w:after="0"/>
+            </w:pPr>
+            <w:r>
+              <w:rPr>
+                <w:rFonts w:ascii="Microsoft YaHei" w:hAnsi="Microsoft YaHei" w:eastAsia="Microsoft YaHei"/>
+                <w:sz w:val="18"/>
+              </w:rPr>
+              <w:t>PR 4 全部 7 项检查通过并已合并到 main</w:t>
             </w:r>
           </w:p>
         </w:tc>
@@ -2726,17 +2728,109 @@
           </w:tcPr>
           <w:p>
             <w:pPr>
-              <w:spacing w:before="0" w:after="0" w:line="240" w:lineRule="auto"/>
-            </w:pPr>
-            <w:r/>
-            <w:r>
-              <w:rPr>
-                <w:rFonts w:ascii="Aptos" w:hAnsi="Aptos" w:eastAsia="微软雅黑"/>
-                <w:b w:val="0"/>
-                <w:color w:val="243746"/>
-                <w:sz w:val="17"/>
-              </w:rPr>
-              <w:t>本地 48 项测试及静态检查通过；PR 与 PostgreSQL CI 待网络恢复</w:t>
+              <w:spacing w:after="0"/>
+            </w:pPr>
+            <w:r>
+              <w:rPr>
+                <w:rFonts w:ascii="Microsoft YaHei" w:hAnsi="Microsoft YaHei" w:eastAsia="Microsoft YaHei"/>
+                <w:sz w:val="18"/>
+              </w:rPr>
+              <w:t>PR 5 全部 7 项检查通过并已合并到 main</w:t>
+            </w:r>
+          </w:p>
+        </w:tc>
+      </w:tr>
+      <w:tr>
+        <w:trPr>
+          <w:cantSplit/>
+        </w:trPr>
+        <w:tc>
+          <w:tcPr>
+            <w:tcW w:type="dxa" w:w="1999"/>
+            <w:vAlign w:val="center"/>
+          </w:tcPr>
+          <w:p>
+            <w:pPr>
+              <w:spacing w:after="0"/>
+            </w:pPr>
+            <w:r>
+              <w:rPr>
+                <w:rFonts w:ascii="Microsoft YaHei" w:hAnsi="Microsoft YaHei" w:eastAsia="Microsoft YaHei"/>
+                <w:sz w:val="18"/>
+              </w:rPr>
+              <w:t>UPD010.1</w:t>
+            </w:r>
+          </w:p>
+        </w:tc>
+        <w:tc>
+          <w:tcPr>
+            <w:tcW w:type="dxa" w:w="1999"/>
+            <w:vAlign w:val="center"/>
+          </w:tcPr>
+          <w:p>
+            <w:pPr>
+              <w:spacing w:after="0"/>
+            </w:pPr>
+            <w:r>
+              <w:rPr>
+                <w:rFonts w:ascii="Microsoft YaHei" w:hAnsi="Microsoft YaHei" w:eastAsia="Microsoft YaHei"/>
+                <w:sz w:val="18"/>
+              </w:rPr>
+              <w:t>2026年9月27日</w:t>
+            </w:r>
+          </w:p>
+        </w:tc>
+        <w:tc>
+          <w:tcPr>
+            <w:tcW w:type="dxa" w:w="1999"/>
+            <w:vAlign w:val="center"/>
+          </w:tcPr>
+          <w:p>
+            <w:pPr>
+              <w:spacing w:after="0"/>
+            </w:pPr>
+            <w:r>
+              <w:rPr>
+                <w:rFonts w:ascii="Microsoft YaHei" w:hAnsi="Microsoft YaHei" w:eastAsia="Microsoft YaHei"/>
+                <w:sz w:val="18"/>
+              </w:rPr>
+              <w:t>修复 M4 增量迁移兼容性</w:t>
+            </w:r>
+          </w:p>
+        </w:tc>
+        <w:tc>
+          <w:tcPr>
+            <w:tcW w:type="dxa" w:w="1999"/>
+            <w:vAlign w:val="center"/>
+          </w:tcPr>
+          <w:p>
+            <w:pPr>
+              <w:spacing w:after="0"/>
+            </w:pPr>
+            <w:r>
+              <w:rPr>
+                <w:rFonts w:ascii="Microsoft YaHei" w:hAnsi="Microsoft YaHei" w:eastAsia="Microsoft YaHei"/>
+                <w:sz w:val="18"/>
+              </w:rPr>
+              <w:t>将 obligations 改为原表演进，替换同名 RLS 策略并保留可逆降级</w:t>
+            </w:r>
+          </w:p>
+        </w:tc>
+        <w:tc>
+          <w:tcPr>
+            <w:tcW w:type="dxa" w:w="1999"/>
+            <w:vAlign w:val="center"/>
+          </w:tcPr>
+          <w:p>
+            <w:pPr>
+              <w:spacing w:after="0"/>
+            </w:pPr>
+            <w:r>
+              <w:rPr>
+                <w:rFonts w:ascii="Microsoft YaHei" w:hAnsi="Microsoft YaHei" w:eastAsia="Microsoft YaHei"/>
+                <w:sz w:val="18"/>
+              </w:rPr>
+              <w:t>PR 5 空库升级、重复升级、降级再升级和 PostgreSQL 集成均通过</w:t>
             </w:r>
           </w:p>
         </w:tc>
@@ -25147,13 +25241,7 @@
         <w:ind w:left="340" w:hanging="142"/>
       </w:pPr>
       <w:r>
-        <w:rPr>
-          <w:rFonts w:ascii="Aptos" w:hAnsi="Aptos" w:eastAsia="微软雅黑"/>
-          <w:b w:val="0"/>
-          <w:color w:val="243746"/>
-          <w:sz w:val="18"/>
-        </w:rPr>
-        <w:t>GitHub 网络与身份验证暂不可用，M3 文档提交和 M4 分支尚未推送；恢复后应按 M3、M4 顺序推送、跑完 CI 并自动合并。</w:t>
+        <w:t>M3 与 M4 已分别通过 PR 4、PR 5 的全部 7 项检查并自动合并到 main；M5 在上游验收结果基础上进入独立 PR 验收。</w:t>
       </w:r>
     </w:p>
     <w:p>
@@ -25163,13 +25251,7 @@
         <w:ind w:left="340" w:hanging="142"/>
       </w:pPr>
       <w:r>
-        <w:rPr>
-          <w:rFonts w:ascii="Aptos" w:hAnsi="Aptos" w:eastAsia="微软雅黑"/>
-          <w:b w:val="0"/>
-          <w:color w:val="243746"/>
-          <w:sz w:val="18"/>
-        </w:rPr>
-        <w:t>本地没有 PostgreSQL 容器，0005 迁移往返和并发租约验收以远程 CI 结果为最终证据。</w:t>
+        <w:t>0005 迁移已由 PR 5 验证空库升级、重复升级、降级到 base、再次升级与 PostgreSQL 集成；原表演进方案成为后续迁移的基线。</w:t>
       </w:r>
     </w:p>
     <w:p>
@@ -25195,13 +25277,7 @@
         <w:ind w:left="340" w:hanging="142"/>
       </w:pPr>
       <w:r>
-        <w:rPr>
-          <w:rFonts w:ascii="Aptos" w:hAnsi="Aptos" w:eastAsia="微软雅黑"/>
-          <w:b w:val="0"/>
-          <w:color w:val="243746"/>
-          <w:sz w:val="18"/>
-        </w:rPr>
-        <w:t>当前风险阈值写在领域规则中；M5 后续可纳入租户级策略配置和审计可观测性。</w:t>
+        <w:t>当前风险阈值仍由领域默认值托底；M5 已补齐审计与可观测性，租户级策略版本配置留待后续增强。</w:t>
       </w:r>
     </w:p>
     <w:p>
@@ -27153,14 +27229,67 @@
             <w:vAlign w:val="center"/>
           </w:tcPr>
           <w:p>
-            <w:pPr>
-              <w:keepLines/>
+            <w:r>
+              <w:t>使用临时文档运行时渲染 40 页并逐页检查；修复表格跨页拆行后，无溢出、遮挡或孤立碎片。</w:t>
+            </w:r>
+          </w:p>
+        </w:tc>
+      </w:tr>
+      <w:tr>
+        <w:trPr>
+          <w:cantSplit/>
+        </w:trPr>
+        <w:tc>
+          <w:tcPr>
+            <w:tcW w:type="dxa" w:w="3331"/>
+            <w:vAlign w:val="center"/>
+          </w:tcPr>
+          <w:p>
+            <w:pPr>
+              <w:spacing w:after="0"/>
             </w:pPr>
             <w:r>
               <w:rPr>
                 <w:rFonts w:ascii="Microsoft YaHei" w:hAnsi="Microsoft YaHei" w:eastAsia="Microsoft YaHei"/>
-              </w:rPr>
-              <w:t>使用临时文档运行时渲染 39 页并逐页检查；修复表格跨页拆行后无溢出、遮挡或孤立碎片。</w:t>
+                <w:sz w:val="18"/>
+              </w:rPr>
+              <w:t>上游 M4 迁移验收</w:t>
+            </w:r>
+          </w:p>
+        </w:tc>
+        <w:tc>
+          <w:tcPr>
+            <w:tcW w:type="dxa" w:w="3331"/>
+            <w:vAlign w:val="center"/>
+          </w:tcPr>
+          <w:p>
+            <w:pPr>
+              <w:spacing w:after="0"/>
+            </w:pPr>
+            <w:r>
+              <w:rPr>
+                <w:rFonts w:ascii="Microsoft YaHei" w:hAnsi="Microsoft YaHei" w:eastAsia="Microsoft YaHei"/>
+                <w:sz w:val="18"/>
+              </w:rPr>
+              <w:t>通过</w:t>
+            </w:r>
+          </w:p>
+        </w:tc>
+        <w:tc>
+          <w:tcPr>
+            <w:tcW w:type="dxa" w:w="3331"/>
+            <w:vAlign w:val="center"/>
+          </w:tcPr>
+          <w:p>
+            <w:pPr>
+              <w:spacing w:after="0"/>
+            </w:pPr>
+            <w:r>
+              <w:rPr>
+                <w:rFonts w:ascii="Microsoft YaHei" w:hAnsi="Microsoft YaHei" w:eastAsia="Microsoft YaHei"/>
+                <w:sz w:val="18"/>
+              </w:rPr>
+              <w:t>PR 5 的 7 项检查全部通过并合并；M5 同步原表演进与 RLS 策略替换修复。</w:t>
             </w:r>
           </w:p>
         </w:tc>
@@ -33643,6 +33772,83 @@
                 <w:rFonts w:ascii="Microsoft YaHei" w:hAnsi="Microsoft YaHei" w:eastAsia="Microsoft YaHei"/>
               </w:rPr>
               <w:t>部署验收检查入口路由与未授权访问</w:t>
+            </w:r>
+          </w:p>
+        </w:tc>
+      </w:tr>
+      <w:tr>
+        <w:trPr>
+          <w:cantSplit/>
+        </w:trPr>
+        <w:tc>
+          <w:tcPr>
+            <w:tcW w:type="dxa" w:w="2498"/>
+            <w:vAlign w:val="center"/>
+          </w:tcPr>
+          <w:p>
+            <w:pPr>
+              <w:spacing w:after="0"/>
+            </w:pPr>
+            <w:r>
+              <w:rPr>
+                <w:rFonts w:ascii="Microsoft YaHei" w:hAnsi="Microsoft YaHei" w:eastAsia="Microsoft YaHei"/>
+                <w:sz w:val="18"/>
+              </w:rPr>
+              <w:t>增量迁移重复定义基础表</w:t>
+            </w:r>
+          </w:p>
+        </w:tc>
+        <w:tc>
+          <w:tcPr>
+            <w:tcW w:type="dxa" w:w="2498"/>
+            <w:vAlign w:val="center"/>
+          </w:tcPr>
+          <w:p>
+            <w:pPr>
+              <w:spacing w:after="0"/>
+            </w:pPr>
+            <w:r>
+              <w:rPr>
+                <w:rFonts w:ascii="Microsoft YaHei" w:hAnsi="Microsoft YaHei" w:eastAsia="Microsoft YaHei"/>
+                <w:sz w:val="18"/>
+              </w:rPr>
+              <w:t>空库从 0001 升级到 0005 时重复创建表或策略，发布被阻断</w:t>
+            </w:r>
+          </w:p>
+        </w:tc>
+        <w:tc>
+          <w:tcPr>
+            <w:tcW w:type="dxa" w:w="2498"/>
+            <w:vAlign w:val="center"/>
+          </w:tcPr>
+          <w:p>
+            <w:pPr>
+              <w:spacing w:after="0"/>
+            </w:pPr>
+            <w:r>
+              <w:rPr>
+                <w:rFonts w:ascii="Microsoft YaHei" w:hAnsi="Microsoft YaHei" w:eastAsia="Microsoft YaHei"/>
+                <w:sz w:val="18"/>
+              </w:rPr>
+              <w:t>采用原地字段演进、数据映射、命名约束、RLS 策略替换和对称降级</w:t>
+            </w:r>
+          </w:p>
+        </w:tc>
+        <w:tc>
+          <w:tcPr>
+            <w:tcW w:type="dxa" w:w="2498"/>
+            <w:vAlign w:val="center"/>
+          </w:tcPr>
+          <w:p>
+            <w:pPr>
+              <w:spacing w:after="0"/>
+            </w:pPr>
+            <w:r>
+              <w:rPr>
+                <w:rFonts w:ascii="Microsoft YaHei" w:hAnsi="Microsoft YaHei" w:eastAsia="Microsoft YaHei"/>
+                <w:sz w:val="18"/>
+              </w:rPr>
+              <w:t>PR 5 已覆盖空库升级、重复升级、降级到 base 和再次升级</w:t>
             </w:r>
           </w:p>
         </w:tc>

</xml_diff>